<commit_message>
[Brief] add global map and regulatoryAreas resume table
</commit_message>
<xml_diff>
--- a/backend/src/main/resources/template_export_brief.docx
+++ b/backend/src/main/resources/template_export_brief.docx
@@ -251,12 +251,12 @@
               <wp:inline distB="0" distT="0" distL="0" distR="0">
                 <wp:extent cx="6738122" cy="36750"/>
                 <wp:effectExtent b="0" l="0" r="0" t="0"/>
-                <wp:docPr id="2" name="image4.png"/>
+                <wp:docPr id="2" name="image3.png"/>
                 <a:graphic>
                   <a:graphicData uri="http://schemas.openxmlformats.org/drawingml/2006/picture">
                     <pic:pic>
                       <pic:nvPicPr>
-                        <pic:cNvPr id="0" name="image4.png"/>
+                        <pic:cNvPr id="0" name="image3.png"/>
                         <pic:cNvPicPr preferRelativeResize="0"/>
                       </pic:nvPicPr>
                       <pic:blipFill>
@@ -2371,12 +2371,12 @@
                 <wp:extent cx="6738122" cy="18375"/>
                 <wp:effectExtent b="0" l="0" r="0" t="0"/>
                 <wp:wrapNone/>
-                <wp:docPr id="1" name="image3.png"/>
+                <wp:docPr id="1" name="image2.png"/>
                 <a:graphic>
                   <a:graphicData uri="http://schemas.openxmlformats.org/drawingml/2006/picture">
                     <pic:pic>
                       <pic:nvPicPr>
-                        <pic:cNvPr id="0" name="image3.png"/>
+                        <pic:cNvPr id="0" name="image2.png"/>
                         <pic:cNvPicPr preferRelativeResize="0"/>
                       </pic:nvPicPr>
                       <pic:blipFill>
@@ -2421,7 +2421,7 @@
             <wp:extent cx="923726" cy="923726"/>
             <wp:effectExtent b="0" l="0" r="0" t="0"/>
             <wp:wrapNone/>
-            <wp:docPr id="4" name="image1.jpg"/>
+            <wp:docPr id="3" name="image1.jpg"/>
             <a:graphic>
               <a:graphicData uri="http://schemas.openxmlformats.org/drawingml/2006/picture">
                 <pic:pic>
@@ -3033,64 +3033,28 @@
         <w:jc w:val="left"/>
         <w:rPr>
           <w:rFonts w:ascii="Arial" w:cs="Arial" w:eastAsia="Arial" w:hAnsi="Arial"/>
-          <w:b w:val="1"/>
-          <w:i w:val="0"/>
-          <w:smallCaps w:val="0"/>
-          <w:strike w:val="0"/>
-          <w:color w:val="000000"/>
-          <w:sz w:val="36"/>
-          <w:szCs w:val="36"/>
-          <w:u w:val="none"/>
-          <w:shd w:fill="auto" w:val="clear"/>
-          <w:vertAlign w:val="baseline"/>
         </w:rPr>
       </w:pPr>
       <w:r>
         <w:rPr>
-          <w:rtl w:val="0"/>
-        </w:rPr>
-      </w:r>
-      <w:r>
-        <w:drawing>
-          <wp:anchor allowOverlap="1" behindDoc="0" distB="0" distT="0" distL="114300" distR="114300" hidden="0" layoutInCell="1" locked="0" relativeHeight="0" simplePos="0">
-            <wp:simplePos x="0" y="0"/>
-            <wp:positionH relativeFrom="column">
-              <wp:posOffset>1</wp:posOffset>
-            </wp:positionH>
-            <wp:positionV relativeFrom="paragraph">
-              <wp:posOffset>171358</wp:posOffset>
-            </wp:positionV>
-            <wp:extent cx="6834591" cy="4093220"/>
-            <wp:effectExtent b="0" l="0" r="0" t="0"/>
-            <wp:wrapTopAndBottom distB="0" distT="0"/>
-            <wp:docPr id="3" name="image2.png"/>
-            <a:graphic>
-              <a:graphicData uri="http://schemas.openxmlformats.org/drawingml/2006/picture">
-                <pic:pic>
-                  <pic:nvPicPr>
-                    <pic:cNvPr id="0" name="image2.png"/>
-                    <pic:cNvPicPr preferRelativeResize="0"/>
-                  </pic:nvPicPr>
-                  <pic:blipFill>
-                    <a:blip r:embed="rId8"/>
-                    <a:srcRect b="0" l="0" r="0" t="0"/>
-                    <a:stretch>
-                      <a:fillRect/>
-                    </a:stretch>
-                  </pic:blipFill>
-                  <pic:spPr>
-                    <a:xfrm>
-                      <a:off x="0" y="0"/>
-                      <a:ext cx="6834591" cy="4093220"/>
-                    </a:xfrm>
-                    <a:prstGeom prst="rect"/>
-                    <a:ln/>
-                  </pic:spPr>
-                </pic:pic>
-              </a:graphicData>
-            </a:graphic>
-          </wp:anchor>
-        </w:drawing>
+          <w:rFonts w:ascii="Arial" w:cs="Arial" w:eastAsia="Arial" w:hAnsi="Arial"/>
+          <w:rtl w:val="0"/>
+        </w:rPr>
+        <w:t xml:space="preserve">${</w:t>
+      </w:r>
+      <w:r>
+        <w:rPr>
+          <w:rFonts w:ascii="Arial" w:cs="Arial" w:eastAsia="Arial" w:hAnsi="Arial"/>
+          <w:rtl w:val="0"/>
+        </w:rPr>
+        <w:t xml:space="preserve">globalMap</w:t>
+      </w:r>
+      <w:r>
+        <w:rPr>
+          <w:rFonts w:ascii="Arial" w:cs="Arial" w:eastAsia="Arial" w:hAnsi="Arial"/>
+          <w:rtl w:val="0"/>
+        </w:rPr>
+        <w:t xml:space="preserve">}</w:t>
       </w:r>
     </w:p>
     <w:p>
@@ -3113,79 +3077,10 @@
         <w:rPr>
           <w:rFonts w:ascii="Arial" w:cs="Arial" w:eastAsia="Arial" w:hAnsi="Arial"/>
           <w:b w:val="1"/>
-          <w:i w:val="0"/>
-          <w:smallCaps w:val="0"/>
-          <w:strike w:val="0"/>
-          <w:color w:val="515151"/>
           <w:sz w:val="36"/>
           <w:szCs w:val="36"/>
-          <w:u w:val="none"/>
-          <w:shd w:fill="auto" w:val="clear"/>
-          <w:vertAlign w:val="baseline"/>
         </w:rPr>
       </w:pPr>
-      <w:r>
-        <w:rPr>
-          <w:rFonts w:ascii="Arial" w:cs="Arial" w:eastAsia="Arial" w:hAnsi="Arial"/>
-          <w:b w:val="0"/>
-          <w:i w:val="0"/>
-          <w:smallCaps w:val="0"/>
-          <w:strike w:val="0"/>
-          <w:color w:val="282f3e"/>
-          <w:sz w:val="32"/>
-          <w:szCs w:val="32"/>
-          <w:u w:val="none"/>
-          <w:shd w:fill="auto" w:val="clear"/>
-          <w:vertAlign w:val="baseline"/>
-          <w:rtl w:val="0"/>
-        </w:rPr>
-        <w:t xml:space="preserve">Zones</w:t>
-      </w:r>
-      <w:r>
-        <w:rPr>
-          <w:rFonts w:ascii="Arial" w:cs="Arial" w:eastAsia="Arial" w:hAnsi="Arial"/>
-          <w:b w:val="0"/>
-          <w:i w:val="0"/>
-          <w:smallCaps w:val="0"/>
-          <w:strike w:val="0"/>
-          <w:color w:val="515151"/>
-          <w:sz w:val="32"/>
-          <w:szCs w:val="32"/>
-          <w:u w:val="none"/>
-          <w:shd w:fill="auto" w:val="clear"/>
-          <w:vertAlign w:val="baseline"/>
-          <w:rtl w:val="0"/>
-        </w:rPr>
-        <w:t xml:space="preserve">   </w:t>
-      </w:r>
-      <w:r>
-        <w:rPr>
-          <w:rFonts w:ascii="Arial" w:cs="Arial" w:eastAsia="Arial" w:hAnsi="Arial"/>
-          <w:b w:val="1"/>
-          <w:color w:val="3b4559"/>
-          <w:sz w:val="22"/>
-          <w:szCs w:val="22"/>
-          <w:rtl w:val="0"/>
-        </w:rPr>
-        <w:t xml:space="preserve">${totalZones}</w:t>
-      </w:r>
-      <w:r>
-        <w:rPr>
-          <w:rFonts w:ascii="Arial" w:cs="Arial" w:eastAsia="Arial" w:hAnsi="Arial"/>
-          <w:b w:val="1"/>
-          <w:i w:val="0"/>
-          <w:smallCaps w:val="0"/>
-          <w:strike w:val="0"/>
-          <w:color w:val="3b4559"/>
-          <w:sz w:val="22"/>
-          <w:szCs w:val="22"/>
-          <w:u w:val="none"/>
-          <w:shd w:fill="auto" w:val="clear"/>
-          <w:vertAlign w:val="baseline"/>
-          <w:rtl w:val="0"/>
-        </w:rPr>
-        <w:t xml:space="preserve"> sélectionnées</w:t>
-      </w:r>
       <w:r>
         <w:rPr>
           <w:rtl w:val="0"/>
@@ -3215,9 +3110,9 @@
           <w:i w:val="0"/>
           <w:smallCaps w:val="0"/>
           <w:strike w:val="0"/>
-          <w:color w:val="000000"/>
-          <w:sz w:val="24"/>
-          <w:szCs w:val="24"/>
+          <w:color w:val="515151"/>
+          <w:sz w:val="36"/>
+          <w:szCs w:val="36"/>
           <w:u w:val="none"/>
           <w:shd w:fill="auto" w:val="clear"/>
           <w:vertAlign w:val="baseline"/>
@@ -3225,1247 +3120,72 @@
       </w:pPr>
       <w:r>
         <w:rPr>
+          <w:rFonts w:ascii="Arial" w:cs="Arial" w:eastAsia="Arial" w:hAnsi="Arial"/>
+          <w:b w:val="0"/>
+          <w:i w:val="0"/>
+          <w:smallCaps w:val="0"/>
+          <w:strike w:val="0"/>
+          <w:color w:val="282f3e"/>
+          <w:sz w:val="32"/>
+          <w:szCs w:val="32"/>
+          <w:u w:val="none"/>
+          <w:shd w:fill="auto" w:val="clear"/>
+          <w:vertAlign w:val="baseline"/>
+          <w:rtl w:val="0"/>
+        </w:rPr>
+        <w:t xml:space="preserve">Zones</w:t>
+      </w:r>
+      <w:r>
+        <w:rPr>
+          <w:rFonts w:ascii="Arial" w:cs="Arial" w:eastAsia="Arial" w:hAnsi="Arial"/>
+          <w:b w:val="0"/>
+          <w:i w:val="0"/>
+          <w:smallCaps w:val="0"/>
+          <w:strike w:val="0"/>
+          <w:color w:val="515151"/>
+          <w:sz w:val="32"/>
+          <w:szCs w:val="32"/>
+          <w:u w:val="none"/>
+          <w:shd w:fill="auto" w:val="clear"/>
+          <w:vertAlign w:val="baseline"/>
+          <w:rtl w:val="0"/>
+        </w:rPr>
+        <w:t xml:space="preserve">   </w:t>
+      </w:r>
+      <w:r>
+        <w:rPr>
+          <w:rFonts w:ascii="Arial" w:cs="Arial" w:eastAsia="Arial" w:hAnsi="Arial"/>
+          <w:b w:val="1"/>
+          <w:color w:val="3b4559"/>
+          <w:sz w:val="22"/>
+          <w:szCs w:val="22"/>
+          <w:rtl w:val="0"/>
+        </w:rPr>
+        <w:t xml:space="preserve">${totalZones}</w:t>
+      </w:r>
+      <w:r>
+        <w:rPr>
+          <w:rFonts w:ascii="Arial" w:cs="Arial" w:eastAsia="Arial" w:hAnsi="Arial"/>
+          <w:b w:val="1"/>
+          <w:i w:val="0"/>
+          <w:smallCaps w:val="0"/>
+          <w:strike w:val="0"/>
+          <w:color w:val="3b4559"/>
+          <w:sz w:val="22"/>
+          <w:szCs w:val="22"/>
+          <w:u w:val="none"/>
+          <w:shd w:fill="auto" w:val="clear"/>
+          <w:vertAlign w:val="baseline"/>
+          <w:rtl w:val="0"/>
+        </w:rPr>
+        <w:t xml:space="preserve"> sélectionnées</w:t>
+      </w:r>
+      <w:r>
+        <w:rPr>
           <w:rtl w:val="0"/>
         </w:rPr>
       </w:r>
     </w:p>
-    <w:tbl>
-      <w:tblPr>
-        <w:tblStyle w:val="Table4"/>
-        <w:tblW w:w="10774.0" w:type="dxa"/>
-        <w:jc w:val="left"/>
-        <w:tblLayout w:type="fixed"/>
-        <w:tblLook w:val="0000"/>
-      </w:tblPr>
-      <w:tblGrid>
-        <w:gridCol w:w="2864"/>
-        <w:gridCol w:w="196"/>
-        <w:gridCol w:w="7714"/>
-        <w:tblGridChange w:id="0">
-          <w:tblGrid>
-            <w:gridCol w:w="2864"/>
-            <w:gridCol w:w="196"/>
-            <w:gridCol w:w="7714"/>
-          </w:tblGrid>
-        </w:tblGridChange>
-      </w:tblGrid>
-      <w:tr>
-        <w:trPr>
-          <w:cantSplit w:val="0"/>
-          <w:trHeight w:val="319" w:hRule="atLeast"/>
-          <w:tblHeader w:val="0"/>
-        </w:trPr>
-        <w:tc>
-          <w:tcPr>
-            <w:gridSpan w:val="3"/>
-            <w:tcBorders>
-              <w:bottom w:color="d4e5f4" w:space="0" w:sz="4" w:val="single"/>
-              <w:right w:color="d4e5f4" w:space="0" w:sz="4" w:val="single"/>
-            </w:tcBorders>
-            <w:shd w:fill="8cc3c0" w:val="clear"/>
-            <w:tcMar>
-              <w:top w:w="85.0" w:type="dxa"/>
-              <w:left w:w="85.0" w:type="dxa"/>
-              <w:bottom w:w="85.0" w:type="dxa"/>
-              <w:right w:w="85.0" w:type="dxa"/>
-            </w:tcMar>
-            <w:vAlign w:val="center"/>
-          </w:tcPr>
-          <w:p>
-            <w:pPr>
-              <w:keepNext w:val="0"/>
-              <w:keepLines w:val="0"/>
-              <w:pageBreakBefore w:val="0"/>
-              <w:widowControl w:val="0"/>
-              <w:pBdr>
-                <w:top w:space="0" w:sz="0" w:val="nil"/>
-                <w:left w:space="0" w:sz="0" w:val="nil"/>
-                <w:bottom w:space="0" w:sz="0" w:val="nil"/>
-                <w:right w:space="0" w:sz="0" w:val="nil"/>
-                <w:between w:space="0" w:sz="0" w:val="nil"/>
-              </w:pBdr>
-              <w:shd w:fill="auto" w:val="clear"/>
-              <w:spacing w:after="0" w:before="0" w:line="240" w:lineRule="auto"/>
-              <w:ind w:left="0" w:right="0" w:firstLine="0"/>
-              <w:jc w:val="left"/>
-              <w:rPr>
-                <w:rFonts w:ascii="Arial" w:cs="Arial" w:eastAsia="Arial" w:hAnsi="Arial"/>
-                <w:b w:val="1"/>
-                <w:i w:val="0"/>
-                <w:smallCaps w:val="0"/>
-                <w:strike w:val="0"/>
-                <w:color w:val="ffffff"/>
-                <w:sz w:val="16"/>
-                <w:szCs w:val="16"/>
-                <w:u w:val="none"/>
-                <w:shd w:fill="auto" w:val="clear"/>
-                <w:vertAlign w:val="baseline"/>
-              </w:rPr>
-            </w:pPr>
-            <w:r>
-              <w:rPr>
-                <w:rFonts w:ascii="Arial" w:cs="Arial" w:eastAsia="Arial" w:hAnsi="Arial"/>
-                <w:b w:val="1"/>
-                <w:i w:val="0"/>
-                <w:smallCaps w:val="0"/>
-                <w:strike w:val="0"/>
-                <w:color w:val="ffffff"/>
-                <w:sz w:val="16"/>
-                <w:szCs w:val="16"/>
-                <w:u w:val="none"/>
-                <w:shd w:fill="auto" w:val="clear"/>
-                <w:vertAlign w:val="baseline"/>
-                <w:rtl w:val="0"/>
-              </w:rPr>
-              <w:t xml:space="preserve">Zones réglementaires                                                                                                                                       </w:t>
-            </w:r>
-            <w:r>
-              <w:rPr>
-                <w:rFonts w:ascii="Arial" w:cs="Arial" w:eastAsia="Arial" w:hAnsi="Arial"/>
-                <w:color w:val="ffffff"/>
-                <w:sz w:val="16"/>
-                <w:szCs w:val="16"/>
-                <w:rtl w:val="0"/>
-              </w:rPr>
-              <w:t xml:space="preserve">${totalRegulatoryAreas}</w:t>
-            </w:r>
-            <w:r>
-              <w:rPr>
-                <w:rFonts w:ascii="Arial" w:cs="Arial" w:eastAsia="Arial" w:hAnsi="Arial"/>
-                <w:b w:val="0"/>
-                <w:i w:val="0"/>
-                <w:smallCaps w:val="0"/>
-                <w:strike w:val="0"/>
-                <w:color w:val="ffffff"/>
-                <w:sz w:val="16"/>
-                <w:szCs w:val="16"/>
-                <w:u w:val="none"/>
-                <w:shd w:fill="auto" w:val="clear"/>
-                <w:vertAlign w:val="baseline"/>
-                <w:rtl w:val="0"/>
-              </w:rPr>
-              <w:t xml:space="preserve"> sélectionnée(s)</w:t>
-            </w:r>
-            <w:r>
-              <w:rPr>
-                <w:rtl w:val="0"/>
-              </w:rPr>
-            </w:r>
-          </w:p>
-        </w:tc>
-      </w:tr>
-      <w:tr>
-        <w:trPr>
-          <w:cantSplit w:val="0"/>
-          <w:trHeight w:val="394" w:hRule="atLeast"/>
-          <w:tblHeader w:val="0"/>
-        </w:trPr>
-        <w:tc>
-          <w:tcPr>
-            <w:vMerge w:val="restart"/>
-            <w:tcBorders>
-              <w:top w:color="d4e5f4" w:space="0" w:sz="4" w:val="single"/>
-              <w:left w:color="d4e5f4" w:space="0" w:sz="4" w:val="single"/>
-              <w:bottom w:color="d4e5f4" w:space="0" w:sz="4" w:val="single"/>
-              <w:right w:color="d4e5f4" w:space="0" w:sz="4" w:val="single"/>
-            </w:tcBorders>
-            <w:shd w:fill="auto" w:val="clear"/>
-            <w:tcMar>
-              <w:top w:w="85.0" w:type="dxa"/>
-              <w:left w:w="85.0" w:type="dxa"/>
-              <w:bottom w:w="85.0" w:type="dxa"/>
-              <w:right w:w="85.0" w:type="dxa"/>
-            </w:tcMar>
-            <w:vAlign w:val="center"/>
-          </w:tcPr>
-          <w:p>
-            <w:pPr>
-              <w:keepNext w:val="0"/>
-              <w:keepLines w:val="0"/>
-              <w:pageBreakBefore w:val="0"/>
-              <w:widowControl w:val="0"/>
-              <w:pBdr>
-                <w:top w:space="0" w:sz="0" w:val="nil"/>
-                <w:left w:space="0" w:sz="0" w:val="nil"/>
-                <w:bottom w:space="0" w:sz="0" w:val="nil"/>
-                <w:right w:space="0" w:sz="0" w:val="nil"/>
-                <w:between w:space="0" w:sz="0" w:val="nil"/>
-              </w:pBdr>
-              <w:shd w:fill="auto" w:val="clear"/>
-              <w:spacing w:after="0" w:before="0" w:line="240" w:lineRule="auto"/>
-              <w:ind w:left="0" w:right="0" w:firstLine="0"/>
-              <w:jc w:val="left"/>
-              <w:rPr>
-                <w:rFonts w:ascii="Arial" w:cs="Arial" w:eastAsia="Arial" w:hAnsi="Arial"/>
-                <w:b w:val="1"/>
-                <w:i w:val="0"/>
-                <w:smallCaps w:val="0"/>
-                <w:strike w:val="0"/>
-                <w:color w:val="000000"/>
-                <w:sz w:val="16"/>
-                <w:szCs w:val="16"/>
-                <w:u w:val="none"/>
-                <w:shd w:fill="auto" w:val="clear"/>
-                <w:vertAlign w:val="baseline"/>
-              </w:rPr>
-            </w:pPr>
-            <w:r>
-              <w:rPr>
-                <w:rFonts w:ascii="Arial" w:cs="Arial" w:eastAsia="Arial" w:hAnsi="Arial"/>
-                <w:b w:val="1"/>
-                <w:i w:val="0"/>
-                <w:smallCaps w:val="0"/>
-                <w:strike w:val="0"/>
-                <w:color w:val="000000"/>
-                <w:sz w:val="16"/>
-                <w:szCs w:val="16"/>
-                <w:u w:val="none"/>
-                <w:shd w:fill="auto" w:val="clear"/>
-                <w:vertAlign w:val="baseline"/>
-                <w:rtl w:val="0"/>
-              </w:rPr>
-              <w:t xml:space="preserve">RNN - TAAF</w:t>
-            </w:r>
-          </w:p>
-        </w:tc>
-        <w:tc>
-          <w:tcPr>
-            <w:tcBorders>
-              <w:top w:color="707785" w:space="0" w:sz="4" w:val="single"/>
-              <w:left w:color="707785" w:space="0" w:sz="4" w:val="single"/>
-              <w:bottom w:color="707785" w:space="0" w:sz="4" w:val="single"/>
-              <w:right w:color="707785" w:space="0" w:sz="4" w:val="single"/>
-            </w:tcBorders>
-            <w:shd w:fill="8cc3c0" w:val="clear"/>
-            <w:tcMar>
-              <w:top w:w="85.0" w:type="dxa"/>
-              <w:left w:w="85.0" w:type="dxa"/>
-              <w:bottom w:w="85.0" w:type="dxa"/>
-              <w:right w:w="85.0" w:type="dxa"/>
-            </w:tcMar>
-          </w:tcPr>
-          <w:p>
-            <w:pPr>
-              <w:keepNext w:val="0"/>
-              <w:keepLines w:val="0"/>
-              <w:pageBreakBefore w:val="0"/>
-              <w:widowControl w:val="0"/>
-              <w:pBdr>
-                <w:top w:space="0" w:sz="0" w:val="nil"/>
-                <w:left w:space="0" w:sz="0" w:val="nil"/>
-                <w:bottom w:space="0" w:sz="0" w:val="nil"/>
-                <w:right w:space="0" w:sz="0" w:val="nil"/>
-                <w:between w:space="0" w:sz="0" w:val="nil"/>
-              </w:pBdr>
-              <w:shd w:fill="auto" w:val="clear"/>
-              <w:spacing w:after="0" w:before="0" w:line="240" w:lineRule="auto"/>
-              <w:ind w:left="0" w:right="0" w:firstLine="0"/>
-              <w:jc w:val="left"/>
-              <w:rPr>
-                <w:rFonts w:ascii="Arial" w:cs="Arial" w:eastAsia="Arial" w:hAnsi="Arial"/>
-                <w:b w:val="0"/>
-                <w:i w:val="0"/>
-                <w:smallCaps w:val="0"/>
-                <w:strike w:val="0"/>
-                <w:color w:val="000000"/>
-                <w:sz w:val="16"/>
-                <w:szCs w:val="16"/>
-                <w:u w:val="none"/>
-                <w:shd w:fill="auto" w:val="clear"/>
-                <w:vertAlign w:val="baseline"/>
-              </w:rPr>
-            </w:pPr>
-            <w:r>
-              <w:rPr>
-                <w:rtl w:val="0"/>
-              </w:rPr>
-            </w:r>
-          </w:p>
-        </w:tc>
-        <w:tc>
-          <w:tcPr>
-            <w:tcBorders>
-              <w:top w:color="d4e5f4" w:space="0" w:sz="4" w:val="single"/>
-              <w:left w:color="d4e5f4" w:space="0" w:sz="4" w:val="single"/>
-              <w:bottom w:color="d4e5f4" w:space="0" w:sz="4" w:val="single"/>
-              <w:right w:color="d4e5f4" w:space="0" w:sz="4" w:val="single"/>
-            </w:tcBorders>
-            <w:tcMar>
-              <w:top w:w="85.0" w:type="dxa"/>
-              <w:left w:w="85.0" w:type="dxa"/>
-              <w:bottom w:w="85.0" w:type="dxa"/>
-              <w:right w:w="85.0" w:type="dxa"/>
-            </w:tcMar>
-          </w:tcPr>
-          <w:p>
-            <w:pPr>
-              <w:keepNext w:val="0"/>
-              <w:keepLines w:val="0"/>
-              <w:pageBreakBefore w:val="0"/>
-              <w:widowControl w:val="0"/>
-              <w:pBdr>
-                <w:top w:space="0" w:sz="0" w:val="nil"/>
-                <w:left w:space="0" w:sz="0" w:val="nil"/>
-                <w:bottom w:space="0" w:sz="0" w:val="nil"/>
-                <w:right w:space="0" w:sz="0" w:val="nil"/>
-                <w:between w:space="0" w:sz="0" w:val="nil"/>
-              </w:pBdr>
-              <w:shd w:fill="auto" w:val="clear"/>
-              <w:spacing w:after="0" w:before="0" w:line="240" w:lineRule="auto"/>
-              <w:ind w:left="0" w:right="0" w:firstLine="0"/>
-              <w:jc w:val="left"/>
-              <w:rPr>
-                <w:rFonts w:ascii="Arial" w:cs="Arial" w:eastAsia="Arial" w:hAnsi="Arial"/>
-                <w:b w:val="0"/>
-                <w:i w:val="0"/>
-                <w:smallCaps w:val="0"/>
-                <w:strike w:val="0"/>
-                <w:color w:val="000000"/>
-                <w:sz w:val="16"/>
-                <w:szCs w:val="16"/>
-                <w:u w:val="none"/>
-                <w:shd w:fill="auto" w:val="clear"/>
-                <w:vertAlign w:val="baseline"/>
-              </w:rPr>
-            </w:pPr>
-            <w:r>
-              <w:rPr>
-                <w:rFonts w:ascii="Arial" w:cs="Arial" w:eastAsia="Arial" w:hAnsi="Arial"/>
-                <w:b w:val="0"/>
-                <w:i w:val="0"/>
-                <w:smallCaps w:val="0"/>
-                <w:strike w:val="0"/>
-                <w:color w:val="000000"/>
-                <w:sz w:val="16"/>
-                <w:szCs w:val="16"/>
-                <w:u w:val="none"/>
-                <w:shd w:fill="auto" w:val="clear"/>
-                <w:vertAlign w:val="baseline"/>
-                <w:rtl w:val="0"/>
-              </w:rPr>
-              <w:t xml:space="preserve">Zone de protection renforcée Article 6</w:t>
-            </w:r>
-          </w:p>
-        </w:tc>
-      </w:tr>
-      <w:tr>
-        <w:trPr>
-          <w:cantSplit w:val="0"/>
-          <w:tblHeader w:val="0"/>
-        </w:trPr>
-        <w:tc>
-          <w:tcPr>
-            <w:vMerge w:val="continue"/>
-            <w:tcBorders>
-              <w:top w:color="d4e5f4" w:space="0" w:sz="4" w:val="single"/>
-              <w:left w:color="d4e5f4" w:space="0" w:sz="4" w:val="single"/>
-              <w:bottom w:color="d4e5f4" w:space="0" w:sz="4" w:val="single"/>
-              <w:right w:color="d4e5f4" w:space="0" w:sz="4" w:val="single"/>
-            </w:tcBorders>
-            <w:shd w:fill="auto" w:val="clear"/>
-            <w:tcMar>
-              <w:top w:w="85.0" w:type="dxa"/>
-              <w:left w:w="85.0" w:type="dxa"/>
-              <w:bottom w:w="85.0" w:type="dxa"/>
-              <w:right w:w="85.0" w:type="dxa"/>
-            </w:tcMar>
-            <w:vAlign w:val="center"/>
-          </w:tcPr>
-          <w:p>
-            <w:pPr>
-              <w:keepNext w:val="0"/>
-              <w:keepLines w:val="0"/>
-              <w:pageBreakBefore w:val="0"/>
-              <w:widowControl w:val="0"/>
-              <w:pBdr>
-                <w:top w:space="0" w:sz="0" w:val="nil"/>
-                <w:left w:space="0" w:sz="0" w:val="nil"/>
-                <w:bottom w:space="0" w:sz="0" w:val="nil"/>
-                <w:right w:space="0" w:sz="0" w:val="nil"/>
-                <w:between w:space="0" w:sz="0" w:val="nil"/>
-              </w:pBdr>
-              <w:shd w:fill="auto" w:val="clear"/>
-              <w:spacing w:after="0" w:before="0" w:line="276" w:lineRule="auto"/>
-              <w:ind w:left="0" w:right="0" w:firstLine="0"/>
-              <w:jc w:val="left"/>
-              <w:rPr>
-                <w:rFonts w:ascii="Arial" w:cs="Arial" w:eastAsia="Arial" w:hAnsi="Arial"/>
-                <w:b w:val="0"/>
-                <w:i w:val="0"/>
-                <w:smallCaps w:val="0"/>
-                <w:strike w:val="0"/>
-                <w:color w:val="000000"/>
-                <w:sz w:val="16"/>
-                <w:szCs w:val="16"/>
-                <w:u w:val="none"/>
-                <w:shd w:fill="auto" w:val="clear"/>
-                <w:vertAlign w:val="baseline"/>
-              </w:rPr>
-            </w:pPr>
-            <w:r>
-              <w:rPr>
-                <w:rtl w:val="0"/>
-              </w:rPr>
-            </w:r>
-          </w:p>
-        </w:tc>
-        <w:tc>
-          <w:tcPr>
-            <w:tcBorders>
-              <w:left w:color="707785" w:space="0" w:sz="4" w:val="single"/>
-              <w:bottom w:color="707785" w:space="0" w:sz="4" w:val="single"/>
-              <w:right w:color="707785" w:space="0" w:sz="4" w:val="single"/>
-            </w:tcBorders>
-            <w:shd w:fill="8cc3c0" w:val="clear"/>
-            <w:tcMar>
-              <w:top w:w="85.0" w:type="dxa"/>
-              <w:left w:w="85.0" w:type="dxa"/>
-              <w:bottom w:w="85.0" w:type="dxa"/>
-              <w:right w:w="85.0" w:type="dxa"/>
-            </w:tcMar>
-          </w:tcPr>
-          <w:p>
-            <w:pPr>
-              <w:keepNext w:val="0"/>
-              <w:keepLines w:val="0"/>
-              <w:pageBreakBefore w:val="0"/>
-              <w:widowControl w:val="0"/>
-              <w:pBdr>
-                <w:top w:space="0" w:sz="0" w:val="nil"/>
-                <w:left w:space="0" w:sz="0" w:val="nil"/>
-                <w:bottom w:space="0" w:sz="0" w:val="nil"/>
-                <w:right w:space="0" w:sz="0" w:val="nil"/>
-                <w:between w:space="0" w:sz="0" w:val="nil"/>
-              </w:pBdr>
-              <w:shd w:fill="auto" w:val="clear"/>
-              <w:spacing w:after="0" w:before="0" w:line="240" w:lineRule="auto"/>
-              <w:ind w:left="0" w:right="0" w:firstLine="0"/>
-              <w:jc w:val="left"/>
-              <w:rPr>
-                <w:rFonts w:ascii="Arial" w:cs="Arial" w:eastAsia="Arial" w:hAnsi="Arial"/>
-                <w:b w:val="1"/>
-                <w:i w:val="0"/>
-                <w:smallCaps w:val="0"/>
-                <w:strike w:val="0"/>
-                <w:color w:val="000000"/>
-                <w:sz w:val="16"/>
-                <w:szCs w:val="16"/>
-                <w:u w:val="none"/>
-                <w:shd w:fill="auto" w:val="clear"/>
-                <w:vertAlign w:val="baseline"/>
-              </w:rPr>
-            </w:pPr>
-            <w:r>
-              <w:rPr>
-                <w:rtl w:val="0"/>
-              </w:rPr>
-            </w:r>
-          </w:p>
-        </w:tc>
-        <w:tc>
-          <w:tcPr>
-            <w:tcBorders>
-              <w:left w:color="d4e5f4" w:space="0" w:sz="4" w:val="single"/>
-              <w:bottom w:color="d4e5f4" w:space="0" w:sz="4" w:val="single"/>
-              <w:right w:color="d4e5f4" w:space="0" w:sz="4" w:val="single"/>
-            </w:tcBorders>
-            <w:shd w:fill="auto" w:val="clear"/>
-            <w:tcMar>
-              <w:top w:w="85.0" w:type="dxa"/>
-              <w:left w:w="85.0" w:type="dxa"/>
-              <w:bottom w:w="85.0" w:type="dxa"/>
-              <w:right w:w="85.0" w:type="dxa"/>
-            </w:tcMar>
-          </w:tcPr>
-          <w:p>
-            <w:pPr>
-              <w:keepNext w:val="0"/>
-              <w:keepLines w:val="0"/>
-              <w:pageBreakBefore w:val="0"/>
-              <w:widowControl w:val="0"/>
-              <w:pBdr>
-                <w:top w:space="0" w:sz="0" w:val="nil"/>
-                <w:left w:space="0" w:sz="0" w:val="nil"/>
-                <w:bottom w:space="0" w:sz="0" w:val="nil"/>
-                <w:right w:space="0" w:sz="0" w:val="nil"/>
-                <w:between w:space="0" w:sz="0" w:val="nil"/>
-              </w:pBdr>
-              <w:shd w:fill="auto" w:val="clear"/>
-              <w:spacing w:after="0" w:before="0" w:line="240" w:lineRule="auto"/>
-              <w:ind w:left="0" w:right="0" w:firstLine="0"/>
-              <w:jc w:val="left"/>
-              <w:rPr>
-                <w:rFonts w:ascii="Arial" w:cs="Arial" w:eastAsia="Arial" w:hAnsi="Arial"/>
-                <w:b w:val="0"/>
-                <w:i w:val="0"/>
-                <w:smallCaps w:val="0"/>
-                <w:strike w:val="0"/>
-                <w:color w:val="000000"/>
-                <w:sz w:val="16"/>
-                <w:szCs w:val="16"/>
-                <w:u w:val="none"/>
-                <w:shd w:fill="auto" w:val="clear"/>
-                <w:vertAlign w:val="baseline"/>
-              </w:rPr>
-            </w:pPr>
-            <w:r>
-              <w:rPr>
-                <w:rFonts w:ascii="Arial" w:cs="Arial" w:eastAsia="Arial" w:hAnsi="Arial"/>
-                <w:b w:val="0"/>
-                <w:i w:val="0"/>
-                <w:smallCaps w:val="0"/>
-                <w:strike w:val="0"/>
-                <w:color w:val="000000"/>
-                <w:sz w:val="16"/>
-                <w:szCs w:val="16"/>
-                <w:u w:val="none"/>
-                <w:shd w:fill="auto" w:val="clear"/>
-                <w:vertAlign w:val="baseline"/>
-                <w:rtl w:val="0"/>
-              </w:rPr>
-              <w:t xml:space="preserve">Zone de Protection Intégrale</w:t>
-            </w:r>
-          </w:p>
-        </w:tc>
-      </w:tr>
-      <w:tr>
-        <w:trPr>
-          <w:cantSplit w:val="0"/>
-          <w:tblHeader w:val="0"/>
-        </w:trPr>
-        <w:tc>
-          <w:tcPr>
-            <w:vMerge w:val="restart"/>
-            <w:tcBorders>
-              <w:left w:color="d4e5f4" w:space="0" w:sz="4" w:val="single"/>
-              <w:bottom w:color="d4e5f4" w:space="0" w:sz="4" w:val="single"/>
-              <w:right w:color="d4e5f4" w:space="0" w:sz="4" w:val="single"/>
-            </w:tcBorders>
-            <w:tcMar>
-              <w:top w:w="85.0" w:type="dxa"/>
-              <w:left w:w="85.0" w:type="dxa"/>
-              <w:bottom w:w="85.0" w:type="dxa"/>
-              <w:right w:w="85.0" w:type="dxa"/>
-            </w:tcMar>
-            <w:vAlign w:val="center"/>
-          </w:tcPr>
-          <w:p>
-            <w:pPr>
-              <w:keepNext w:val="0"/>
-              <w:keepLines w:val="0"/>
-              <w:pageBreakBefore w:val="0"/>
-              <w:widowControl w:val="0"/>
-              <w:pBdr>
-                <w:top w:space="0" w:sz="0" w:val="nil"/>
-                <w:left w:space="0" w:sz="0" w:val="nil"/>
-                <w:bottom w:space="0" w:sz="0" w:val="nil"/>
-                <w:right w:space="0" w:sz="0" w:val="nil"/>
-                <w:between w:space="0" w:sz="0" w:val="nil"/>
-              </w:pBdr>
-              <w:shd w:fill="auto" w:val="clear"/>
-              <w:spacing w:after="0" w:before="0" w:line="240" w:lineRule="auto"/>
-              <w:ind w:left="0" w:right="0" w:firstLine="0"/>
-              <w:jc w:val="left"/>
-              <w:rPr>
-                <w:rFonts w:ascii="Arial" w:cs="Arial" w:eastAsia="Arial" w:hAnsi="Arial"/>
-                <w:b w:val="1"/>
-                <w:i w:val="0"/>
-                <w:smallCaps w:val="0"/>
-                <w:strike w:val="0"/>
-                <w:color w:val="000000"/>
-                <w:sz w:val="16"/>
-                <w:szCs w:val="16"/>
-                <w:u w:val="none"/>
-                <w:shd w:fill="auto" w:val="clear"/>
-                <w:vertAlign w:val="baseline"/>
-              </w:rPr>
-            </w:pPr>
-            <w:r>
-              <w:rPr>
-                <w:rFonts w:ascii="Arial" w:cs="Arial" w:eastAsia="Arial" w:hAnsi="Arial"/>
-                <w:b w:val="1"/>
-                <w:i w:val="0"/>
-                <w:smallCaps w:val="0"/>
-                <w:strike w:val="0"/>
-                <w:color w:val="000000"/>
-                <w:sz w:val="16"/>
-                <w:szCs w:val="16"/>
-                <w:u w:val="none"/>
-                <w:shd w:fill="auto" w:val="clear"/>
-                <w:vertAlign w:val="baseline"/>
-                <w:rtl w:val="0"/>
-              </w:rPr>
-              <w:t xml:space="preserve">Accès - Entrecastreaux</w:t>
-            </w:r>
-          </w:p>
-        </w:tc>
-        <w:tc>
-          <w:tcPr>
-            <w:tcBorders>
-              <w:left w:color="707785" w:space="0" w:sz="4" w:val="single"/>
-              <w:bottom w:color="707785" w:space="0" w:sz="4" w:val="single"/>
-              <w:right w:color="707785" w:space="0" w:sz="4" w:val="single"/>
-            </w:tcBorders>
-            <w:shd w:fill="8cc3c0" w:val="clear"/>
-            <w:tcMar>
-              <w:top w:w="85.0" w:type="dxa"/>
-              <w:left w:w="85.0" w:type="dxa"/>
-              <w:bottom w:w="85.0" w:type="dxa"/>
-              <w:right w:w="85.0" w:type="dxa"/>
-            </w:tcMar>
-          </w:tcPr>
-          <w:p>
-            <w:pPr>
-              <w:keepNext w:val="0"/>
-              <w:keepLines w:val="0"/>
-              <w:pageBreakBefore w:val="0"/>
-              <w:widowControl w:val="0"/>
-              <w:pBdr>
-                <w:top w:space="0" w:sz="0" w:val="nil"/>
-                <w:left w:space="0" w:sz="0" w:val="nil"/>
-                <w:bottom w:space="0" w:sz="0" w:val="nil"/>
-                <w:right w:space="0" w:sz="0" w:val="nil"/>
-                <w:between w:space="0" w:sz="0" w:val="nil"/>
-              </w:pBdr>
-              <w:shd w:fill="auto" w:val="clear"/>
-              <w:spacing w:after="0" w:before="0" w:line="240" w:lineRule="auto"/>
-              <w:ind w:left="0" w:right="0" w:firstLine="0"/>
-              <w:jc w:val="left"/>
-              <w:rPr>
-                <w:rFonts w:ascii="Arial" w:cs="Arial" w:eastAsia="Arial" w:hAnsi="Arial"/>
-                <w:b w:val="0"/>
-                <w:i w:val="0"/>
-                <w:smallCaps w:val="0"/>
-                <w:strike w:val="0"/>
-                <w:color w:val="000000"/>
-                <w:sz w:val="16"/>
-                <w:szCs w:val="16"/>
-                <w:u w:val="none"/>
-                <w:shd w:fill="auto" w:val="clear"/>
-                <w:vertAlign w:val="baseline"/>
-              </w:rPr>
-            </w:pPr>
-            <w:r>
-              <w:rPr>
-                <w:rtl w:val="0"/>
-              </w:rPr>
-            </w:r>
-          </w:p>
-        </w:tc>
-        <w:tc>
-          <w:tcPr>
-            <w:tcBorders>
-              <w:left w:color="d4e5f4" w:space="0" w:sz="4" w:val="single"/>
-              <w:bottom w:color="d4e5f4" w:space="0" w:sz="4" w:val="single"/>
-              <w:right w:color="d4e5f4" w:space="0" w:sz="4" w:val="single"/>
-            </w:tcBorders>
-            <w:tcMar>
-              <w:top w:w="85.0" w:type="dxa"/>
-              <w:left w:w="85.0" w:type="dxa"/>
-              <w:bottom w:w="85.0" w:type="dxa"/>
-              <w:right w:w="85.0" w:type="dxa"/>
-            </w:tcMar>
-          </w:tcPr>
-          <w:p>
-            <w:pPr>
-              <w:keepNext w:val="0"/>
-              <w:keepLines w:val="0"/>
-              <w:pageBreakBefore w:val="0"/>
-              <w:widowControl w:val="0"/>
-              <w:pBdr>
-                <w:top w:space="0" w:sz="0" w:val="nil"/>
-                <w:left w:space="0" w:sz="0" w:val="nil"/>
-                <w:bottom w:space="0" w:sz="0" w:val="nil"/>
-                <w:right w:space="0" w:sz="0" w:val="nil"/>
-                <w:between w:space="0" w:sz="0" w:val="nil"/>
-              </w:pBdr>
-              <w:shd w:fill="auto" w:val="clear"/>
-              <w:spacing w:after="0" w:before="0" w:line="240" w:lineRule="auto"/>
-              <w:ind w:left="0" w:right="0" w:firstLine="0"/>
-              <w:jc w:val="left"/>
-              <w:rPr>
-                <w:rFonts w:ascii="Arial" w:cs="Arial" w:eastAsia="Arial" w:hAnsi="Arial"/>
-                <w:b w:val="0"/>
-                <w:i w:val="0"/>
-                <w:smallCaps w:val="0"/>
-                <w:strike w:val="0"/>
-                <w:color w:val="000000"/>
-                <w:sz w:val="16"/>
-                <w:szCs w:val="16"/>
-                <w:u w:val="none"/>
-                <w:shd w:fill="auto" w:val="clear"/>
-                <w:vertAlign w:val="baseline"/>
-              </w:rPr>
-            </w:pPr>
-            <w:r>
-              <w:rPr>
-                <w:rFonts w:ascii="Arial" w:cs="Arial" w:eastAsia="Arial" w:hAnsi="Arial"/>
-                <w:b w:val="0"/>
-                <w:i w:val="0"/>
-                <w:smallCaps w:val="0"/>
-                <w:strike w:val="0"/>
-                <w:color w:val="000000"/>
-                <w:sz w:val="16"/>
-                <w:szCs w:val="16"/>
-                <w:u w:val="none"/>
-                <w:shd w:fill="auto" w:val="clear"/>
-                <w:vertAlign w:val="baseline"/>
-                <w:rtl w:val="0"/>
-              </w:rPr>
-              <w:t xml:space="preserve">Accès pédestre autorisé au site d'Entrecasteaux</w:t>
-            </w:r>
-          </w:p>
-        </w:tc>
-      </w:tr>
-      <w:tr>
-        <w:trPr>
-          <w:cantSplit w:val="0"/>
-          <w:tblHeader w:val="0"/>
-        </w:trPr>
-        <w:tc>
-          <w:tcPr>
-            <w:vMerge w:val="continue"/>
-            <w:tcBorders>
-              <w:left w:color="d4e5f4" w:space="0" w:sz="4" w:val="single"/>
-              <w:bottom w:color="d4e5f4" w:space="0" w:sz="4" w:val="single"/>
-              <w:right w:color="d4e5f4" w:space="0" w:sz="4" w:val="single"/>
-            </w:tcBorders>
-            <w:tcMar>
-              <w:top w:w="85.0" w:type="dxa"/>
-              <w:left w:w="85.0" w:type="dxa"/>
-              <w:bottom w:w="85.0" w:type="dxa"/>
-              <w:right w:w="85.0" w:type="dxa"/>
-            </w:tcMar>
-            <w:vAlign w:val="center"/>
-          </w:tcPr>
-          <w:p>
-            <w:pPr>
-              <w:keepNext w:val="0"/>
-              <w:keepLines w:val="0"/>
-              <w:pageBreakBefore w:val="0"/>
-              <w:widowControl w:val="0"/>
-              <w:pBdr>
-                <w:top w:space="0" w:sz="0" w:val="nil"/>
-                <w:left w:space="0" w:sz="0" w:val="nil"/>
-                <w:bottom w:space="0" w:sz="0" w:val="nil"/>
-                <w:right w:space="0" w:sz="0" w:val="nil"/>
-                <w:between w:space="0" w:sz="0" w:val="nil"/>
-              </w:pBdr>
-              <w:shd w:fill="auto" w:val="clear"/>
-              <w:spacing w:after="0" w:before="0" w:line="276" w:lineRule="auto"/>
-              <w:ind w:left="0" w:right="0" w:firstLine="0"/>
-              <w:jc w:val="left"/>
-              <w:rPr>
-                <w:rFonts w:ascii="Arial" w:cs="Arial" w:eastAsia="Arial" w:hAnsi="Arial"/>
-                <w:b w:val="0"/>
-                <w:i w:val="0"/>
-                <w:smallCaps w:val="0"/>
-                <w:strike w:val="0"/>
-                <w:color w:val="000000"/>
-                <w:sz w:val="16"/>
-                <w:szCs w:val="16"/>
-                <w:u w:val="none"/>
-                <w:shd w:fill="auto" w:val="clear"/>
-                <w:vertAlign w:val="baseline"/>
-              </w:rPr>
-            </w:pPr>
-            <w:r>
-              <w:rPr>
-                <w:rtl w:val="0"/>
-              </w:rPr>
-            </w:r>
-          </w:p>
-        </w:tc>
-        <w:tc>
-          <w:tcPr>
-            <w:tcBorders>
-              <w:left w:color="707785" w:space="0" w:sz="4" w:val="single"/>
-              <w:bottom w:color="707785" w:space="0" w:sz="4" w:val="single"/>
-              <w:right w:color="707785" w:space="0" w:sz="4" w:val="single"/>
-            </w:tcBorders>
-            <w:shd w:fill="8cc3c0" w:val="clear"/>
-            <w:tcMar>
-              <w:top w:w="85.0" w:type="dxa"/>
-              <w:left w:w="85.0" w:type="dxa"/>
-              <w:bottom w:w="85.0" w:type="dxa"/>
-              <w:right w:w="85.0" w:type="dxa"/>
-            </w:tcMar>
-          </w:tcPr>
-          <w:p>
-            <w:pPr>
-              <w:keepNext w:val="0"/>
-              <w:keepLines w:val="0"/>
-              <w:pageBreakBefore w:val="0"/>
-              <w:widowControl w:val="0"/>
-              <w:pBdr>
-                <w:top w:space="0" w:sz="0" w:val="nil"/>
-                <w:left w:space="0" w:sz="0" w:val="nil"/>
-                <w:bottom w:space="0" w:sz="0" w:val="nil"/>
-                <w:right w:space="0" w:sz="0" w:val="nil"/>
-                <w:between w:space="0" w:sz="0" w:val="nil"/>
-              </w:pBdr>
-              <w:shd w:fill="auto" w:val="clear"/>
-              <w:spacing w:after="0" w:before="0" w:line="240" w:lineRule="auto"/>
-              <w:ind w:left="0" w:right="0" w:firstLine="0"/>
-              <w:jc w:val="left"/>
-              <w:rPr>
-                <w:rFonts w:ascii="Arial" w:cs="Arial" w:eastAsia="Arial" w:hAnsi="Arial"/>
-                <w:b w:val="0"/>
-                <w:i w:val="0"/>
-                <w:smallCaps w:val="0"/>
-                <w:strike w:val="0"/>
-                <w:color w:val="000000"/>
-                <w:sz w:val="16"/>
-                <w:szCs w:val="16"/>
-                <w:u w:val="none"/>
-                <w:shd w:fill="auto" w:val="clear"/>
-                <w:vertAlign w:val="baseline"/>
-              </w:rPr>
-            </w:pPr>
-            <w:r>
-              <w:rPr>
-                <w:rtl w:val="0"/>
-              </w:rPr>
-            </w:r>
-          </w:p>
-        </w:tc>
-        <w:tc>
-          <w:tcPr>
-            <w:tcBorders>
-              <w:left w:color="d4e5f4" w:space="0" w:sz="4" w:val="single"/>
-              <w:bottom w:color="d4e5f4" w:space="0" w:sz="4" w:val="single"/>
-              <w:right w:color="d4e5f4" w:space="0" w:sz="4" w:val="single"/>
-            </w:tcBorders>
-            <w:tcMar>
-              <w:top w:w="85.0" w:type="dxa"/>
-              <w:left w:w="85.0" w:type="dxa"/>
-              <w:bottom w:w="85.0" w:type="dxa"/>
-              <w:right w:w="85.0" w:type="dxa"/>
-            </w:tcMar>
-          </w:tcPr>
-          <w:p>
-            <w:pPr>
-              <w:keepNext w:val="0"/>
-              <w:keepLines w:val="0"/>
-              <w:pageBreakBefore w:val="0"/>
-              <w:widowControl w:val="0"/>
-              <w:pBdr>
-                <w:top w:space="0" w:sz="0" w:val="nil"/>
-                <w:left w:space="0" w:sz="0" w:val="nil"/>
-                <w:bottom w:space="0" w:sz="0" w:val="nil"/>
-                <w:right w:space="0" w:sz="0" w:val="nil"/>
-                <w:between w:space="0" w:sz="0" w:val="nil"/>
-              </w:pBdr>
-              <w:shd w:fill="auto" w:val="clear"/>
-              <w:spacing w:after="0" w:before="0" w:line="240" w:lineRule="auto"/>
-              <w:ind w:left="0" w:right="0" w:firstLine="0"/>
-              <w:jc w:val="left"/>
-              <w:rPr>
-                <w:rFonts w:ascii="Arial" w:cs="Arial" w:eastAsia="Arial" w:hAnsi="Arial"/>
-                <w:b w:val="0"/>
-                <w:i w:val="0"/>
-                <w:smallCaps w:val="0"/>
-                <w:strike w:val="0"/>
-                <w:color w:val="000000"/>
-                <w:sz w:val="16"/>
-                <w:szCs w:val="16"/>
-                <w:u w:val="none"/>
-                <w:shd w:fill="auto" w:val="clear"/>
-                <w:vertAlign w:val="baseline"/>
-              </w:rPr>
-            </w:pPr>
-            <w:r>
-              <w:rPr>
-                <w:rFonts w:ascii="Arial" w:cs="Arial" w:eastAsia="Arial" w:hAnsi="Arial"/>
-                <w:b w:val="0"/>
-                <w:i w:val="0"/>
-                <w:smallCaps w:val="0"/>
-                <w:strike w:val="0"/>
-                <w:color w:val="000000"/>
-                <w:sz w:val="16"/>
-                <w:szCs w:val="16"/>
-                <w:u w:val="none"/>
-                <w:shd w:fill="auto" w:val="clear"/>
-                <w:vertAlign w:val="baseline"/>
-                <w:rtl w:val="0"/>
-              </w:rPr>
-              <w:t xml:space="preserve">Accès interdit au site d'Entrecasteaux</w:t>
-            </w:r>
-          </w:p>
-        </w:tc>
-      </w:tr>
-      <w:tr>
-        <w:trPr>
-          <w:cantSplit w:val="0"/>
-          <w:tblHeader w:val="0"/>
-        </w:trPr>
-        <w:tc>
-          <w:tcPr>
-            <w:vMerge w:val="restart"/>
-            <w:tcBorders>
-              <w:left w:color="d4e5f4" w:space="0" w:sz="4" w:val="single"/>
-              <w:bottom w:color="d4e5f4" w:space="0" w:sz="4" w:val="single"/>
-              <w:right w:color="d4e5f4" w:space="0" w:sz="4" w:val="single"/>
-            </w:tcBorders>
-            <w:tcMar>
-              <w:top w:w="85.0" w:type="dxa"/>
-              <w:left w:w="85.0" w:type="dxa"/>
-              <w:bottom w:w="85.0" w:type="dxa"/>
-              <w:right w:w="85.0" w:type="dxa"/>
-            </w:tcMar>
-            <w:vAlign w:val="center"/>
-          </w:tcPr>
-          <w:p>
-            <w:pPr>
-              <w:keepNext w:val="0"/>
-              <w:keepLines w:val="0"/>
-              <w:pageBreakBefore w:val="0"/>
-              <w:widowControl w:val="0"/>
-              <w:pBdr>
-                <w:top w:space="0" w:sz="0" w:val="nil"/>
-                <w:left w:space="0" w:sz="0" w:val="nil"/>
-                <w:bottom w:space="0" w:sz="0" w:val="nil"/>
-                <w:right w:space="0" w:sz="0" w:val="nil"/>
-                <w:between w:space="0" w:sz="0" w:val="nil"/>
-              </w:pBdr>
-              <w:shd w:fill="auto" w:val="clear"/>
-              <w:spacing w:after="0" w:before="0" w:line="240" w:lineRule="auto"/>
-              <w:ind w:left="0" w:right="0" w:firstLine="0"/>
-              <w:jc w:val="left"/>
-              <w:rPr>
-                <w:rFonts w:ascii="Arial" w:cs="Arial" w:eastAsia="Arial" w:hAnsi="Arial"/>
-                <w:b w:val="0"/>
-                <w:i w:val="0"/>
-                <w:smallCaps w:val="0"/>
-                <w:strike w:val="0"/>
-                <w:color w:val="000000"/>
-                <w:sz w:val="16"/>
-                <w:szCs w:val="16"/>
-                <w:u w:val="none"/>
-                <w:shd w:fill="auto" w:val="clear"/>
-                <w:vertAlign w:val="baseline"/>
-              </w:rPr>
-            </w:pPr>
-            <w:r>
-              <w:rPr>
-                <w:rFonts w:ascii="Arial" w:cs="Arial" w:eastAsia="Arial" w:hAnsi="Arial"/>
-                <w:b w:val="1"/>
-                <w:i w:val="0"/>
-                <w:smallCaps w:val="0"/>
-                <w:strike w:val="0"/>
-                <w:color w:val="000000"/>
-                <w:sz w:val="16"/>
-                <w:szCs w:val="16"/>
-                <w:u w:val="none"/>
-                <w:shd w:fill="auto" w:val="clear"/>
-                <w:vertAlign w:val="baseline"/>
-                <w:rtl w:val="0"/>
-              </w:rPr>
-              <w:t xml:space="preserve">Pêche de loisir - Ile Saint-Pau et Amsterdam TAAF</w:t>
-            </w:r>
-            <w:r>
-              <w:rPr>
-                <w:rtl w:val="0"/>
-              </w:rPr>
-            </w:r>
-          </w:p>
-        </w:tc>
-        <w:tc>
-          <w:tcPr>
-            <w:tcBorders>
-              <w:left w:color="707785" w:space="0" w:sz="4" w:val="single"/>
-              <w:bottom w:color="707785" w:space="0" w:sz="4" w:val="single"/>
-              <w:right w:color="707785" w:space="0" w:sz="4" w:val="single"/>
-            </w:tcBorders>
-            <w:shd w:fill="8cc3c0" w:val="clear"/>
-            <w:tcMar>
-              <w:top w:w="85.0" w:type="dxa"/>
-              <w:left w:w="85.0" w:type="dxa"/>
-              <w:bottom w:w="85.0" w:type="dxa"/>
-              <w:right w:w="85.0" w:type="dxa"/>
-            </w:tcMar>
-          </w:tcPr>
-          <w:p>
-            <w:pPr>
-              <w:keepNext w:val="0"/>
-              <w:keepLines w:val="0"/>
-              <w:pageBreakBefore w:val="0"/>
-              <w:widowControl w:val="0"/>
-              <w:pBdr>
-                <w:top w:space="0" w:sz="0" w:val="nil"/>
-                <w:left w:space="0" w:sz="0" w:val="nil"/>
-                <w:bottom w:space="0" w:sz="0" w:val="nil"/>
-                <w:right w:space="0" w:sz="0" w:val="nil"/>
-                <w:between w:space="0" w:sz="0" w:val="nil"/>
-              </w:pBdr>
-              <w:shd w:fill="auto" w:val="clear"/>
-              <w:spacing w:after="0" w:before="0" w:line="240" w:lineRule="auto"/>
-              <w:ind w:left="0" w:right="0" w:firstLine="0"/>
-              <w:jc w:val="left"/>
-              <w:rPr>
-                <w:rFonts w:ascii="Arial" w:cs="Arial" w:eastAsia="Arial" w:hAnsi="Arial"/>
-                <w:b w:val="0"/>
-                <w:i w:val="0"/>
-                <w:smallCaps w:val="0"/>
-                <w:strike w:val="0"/>
-                <w:color w:val="000000"/>
-                <w:sz w:val="16"/>
-                <w:szCs w:val="16"/>
-                <w:u w:val="none"/>
-                <w:shd w:fill="auto" w:val="clear"/>
-                <w:vertAlign w:val="baseline"/>
-              </w:rPr>
-            </w:pPr>
-            <w:r>
-              <w:rPr>
-                <w:rtl w:val="0"/>
-              </w:rPr>
-            </w:r>
-          </w:p>
-        </w:tc>
-        <w:tc>
-          <w:tcPr>
-            <w:tcBorders>
-              <w:left w:color="d4e5f4" w:space="0" w:sz="4" w:val="single"/>
-              <w:bottom w:color="d4e5f4" w:space="0" w:sz="4" w:val="single"/>
-              <w:right w:color="d4e5f4" w:space="0" w:sz="4" w:val="single"/>
-            </w:tcBorders>
-            <w:tcMar>
-              <w:top w:w="85.0" w:type="dxa"/>
-              <w:left w:w="85.0" w:type="dxa"/>
-              <w:bottom w:w="85.0" w:type="dxa"/>
-              <w:right w:w="85.0" w:type="dxa"/>
-            </w:tcMar>
-          </w:tcPr>
-          <w:p>
-            <w:pPr>
-              <w:keepNext w:val="0"/>
-              <w:keepLines w:val="0"/>
-              <w:pageBreakBefore w:val="0"/>
-              <w:widowControl w:val="0"/>
-              <w:pBdr>
-                <w:top w:space="0" w:sz="0" w:val="nil"/>
-                <w:left w:space="0" w:sz="0" w:val="nil"/>
-                <w:bottom w:space="0" w:sz="0" w:val="nil"/>
-                <w:right w:space="0" w:sz="0" w:val="nil"/>
-                <w:between w:space="0" w:sz="0" w:val="nil"/>
-              </w:pBdr>
-              <w:shd w:fill="auto" w:val="clear"/>
-              <w:spacing w:after="0" w:before="0" w:line="240" w:lineRule="auto"/>
-              <w:ind w:left="0" w:right="0" w:firstLine="0"/>
-              <w:jc w:val="left"/>
-              <w:rPr>
-                <w:rFonts w:ascii="Arial" w:cs="Arial" w:eastAsia="Arial" w:hAnsi="Arial"/>
-                <w:b w:val="0"/>
-                <w:i w:val="0"/>
-                <w:smallCaps w:val="0"/>
-                <w:strike w:val="0"/>
-                <w:color w:val="000000"/>
-                <w:sz w:val="16"/>
-                <w:szCs w:val="16"/>
-                <w:u w:val="none"/>
-                <w:shd w:fill="auto" w:val="clear"/>
-                <w:vertAlign w:val="baseline"/>
-              </w:rPr>
-            </w:pPr>
-            <w:r>
-              <w:rPr>
-                <w:rFonts w:ascii="Arial" w:cs="Arial" w:eastAsia="Arial" w:hAnsi="Arial"/>
-                <w:b w:val="0"/>
-                <w:i w:val="0"/>
-                <w:smallCaps w:val="0"/>
-                <w:strike w:val="0"/>
-                <w:color w:val="000000"/>
-                <w:sz w:val="16"/>
-                <w:szCs w:val="16"/>
-                <w:u w:val="none"/>
-                <w:shd w:fill="auto" w:val="clear"/>
-                <w:vertAlign w:val="baseline"/>
-                <w:rtl w:val="0"/>
-              </w:rPr>
-              <w:t xml:space="preserve">La pêche maritime de loisir est interdite (autorisée que dans la zone côtière (fonds inférieurs à 70m) de l'île Amsterdam)</w:t>
-            </w:r>
-          </w:p>
-        </w:tc>
-      </w:tr>
-      <w:tr>
-        <w:trPr>
-          <w:cantSplit w:val="0"/>
-          <w:tblHeader w:val="0"/>
-        </w:trPr>
-        <w:tc>
-          <w:tcPr>
-            <w:vMerge w:val="continue"/>
-            <w:tcBorders>
-              <w:left w:color="d4e5f4" w:space="0" w:sz="4" w:val="single"/>
-              <w:bottom w:color="d4e5f4" w:space="0" w:sz="4" w:val="single"/>
-              <w:right w:color="d4e5f4" w:space="0" w:sz="4" w:val="single"/>
-            </w:tcBorders>
-            <w:tcMar>
-              <w:top w:w="85.0" w:type="dxa"/>
-              <w:left w:w="85.0" w:type="dxa"/>
-              <w:bottom w:w="85.0" w:type="dxa"/>
-              <w:right w:w="85.0" w:type="dxa"/>
-            </w:tcMar>
-            <w:vAlign w:val="center"/>
-          </w:tcPr>
-          <w:p>
-            <w:pPr>
-              <w:keepNext w:val="0"/>
-              <w:keepLines w:val="0"/>
-              <w:pageBreakBefore w:val="0"/>
-              <w:widowControl w:val="0"/>
-              <w:pBdr>
-                <w:top w:space="0" w:sz="0" w:val="nil"/>
-                <w:left w:space="0" w:sz="0" w:val="nil"/>
-                <w:bottom w:space="0" w:sz="0" w:val="nil"/>
-                <w:right w:space="0" w:sz="0" w:val="nil"/>
-                <w:between w:space="0" w:sz="0" w:val="nil"/>
-              </w:pBdr>
-              <w:shd w:fill="auto" w:val="clear"/>
-              <w:spacing w:after="0" w:before="0" w:line="276" w:lineRule="auto"/>
-              <w:ind w:left="0" w:right="0" w:firstLine="0"/>
-              <w:jc w:val="left"/>
-              <w:rPr>
-                <w:rFonts w:ascii="Arial" w:cs="Arial" w:eastAsia="Arial" w:hAnsi="Arial"/>
-                <w:b w:val="0"/>
-                <w:i w:val="0"/>
-                <w:smallCaps w:val="0"/>
-                <w:strike w:val="0"/>
-                <w:color w:val="000000"/>
-                <w:sz w:val="16"/>
-                <w:szCs w:val="16"/>
-                <w:u w:val="none"/>
-                <w:shd w:fill="auto" w:val="clear"/>
-                <w:vertAlign w:val="baseline"/>
-              </w:rPr>
-            </w:pPr>
-            <w:r>
-              <w:rPr>
-                <w:rtl w:val="0"/>
-              </w:rPr>
-            </w:r>
-          </w:p>
-        </w:tc>
-        <w:tc>
-          <w:tcPr>
-            <w:tcBorders>
-              <w:left w:color="707785" w:space="0" w:sz="4" w:val="single"/>
-              <w:bottom w:color="707785" w:space="0" w:sz="4" w:val="single"/>
-              <w:right w:color="707785" w:space="0" w:sz="4" w:val="single"/>
-            </w:tcBorders>
-            <w:shd w:fill="8cc3c0" w:val="clear"/>
-            <w:tcMar>
-              <w:top w:w="85.0" w:type="dxa"/>
-              <w:left w:w="85.0" w:type="dxa"/>
-              <w:bottom w:w="85.0" w:type="dxa"/>
-              <w:right w:w="85.0" w:type="dxa"/>
-            </w:tcMar>
-          </w:tcPr>
-          <w:p>
-            <w:pPr>
-              <w:keepNext w:val="0"/>
-              <w:keepLines w:val="0"/>
-              <w:pageBreakBefore w:val="0"/>
-              <w:widowControl w:val="0"/>
-              <w:pBdr>
-                <w:top w:space="0" w:sz="0" w:val="nil"/>
-                <w:left w:space="0" w:sz="0" w:val="nil"/>
-                <w:bottom w:space="0" w:sz="0" w:val="nil"/>
-                <w:right w:space="0" w:sz="0" w:val="nil"/>
-                <w:between w:space="0" w:sz="0" w:val="nil"/>
-              </w:pBdr>
-              <w:shd w:fill="auto" w:val="clear"/>
-              <w:spacing w:after="0" w:before="0" w:line="240" w:lineRule="auto"/>
-              <w:ind w:left="0" w:right="0" w:firstLine="0"/>
-              <w:jc w:val="left"/>
-              <w:rPr>
-                <w:rFonts w:ascii="Arial" w:cs="Arial" w:eastAsia="Arial" w:hAnsi="Arial"/>
-                <w:b w:val="0"/>
-                <w:i w:val="0"/>
-                <w:smallCaps w:val="0"/>
-                <w:strike w:val="0"/>
-                <w:color w:val="000000"/>
-                <w:sz w:val="16"/>
-                <w:szCs w:val="16"/>
-                <w:u w:val="none"/>
-                <w:shd w:fill="auto" w:val="clear"/>
-                <w:vertAlign w:val="baseline"/>
-              </w:rPr>
-            </w:pPr>
-            <w:r>
-              <w:rPr>
-                <w:rtl w:val="0"/>
-              </w:rPr>
-            </w:r>
-          </w:p>
-        </w:tc>
-        <w:tc>
-          <w:tcPr>
-            <w:tcBorders>
-              <w:left w:color="d4e5f4" w:space="0" w:sz="4" w:val="single"/>
-              <w:bottom w:color="d4e5f4" w:space="0" w:sz="4" w:val="single"/>
-              <w:right w:color="d4e5f4" w:space="0" w:sz="4" w:val="single"/>
-            </w:tcBorders>
-            <w:tcMar>
-              <w:top w:w="85.0" w:type="dxa"/>
-              <w:left w:w="85.0" w:type="dxa"/>
-              <w:bottom w:w="85.0" w:type="dxa"/>
-              <w:right w:w="85.0" w:type="dxa"/>
-            </w:tcMar>
-          </w:tcPr>
-          <w:p>
-            <w:pPr>
-              <w:keepNext w:val="0"/>
-              <w:keepLines w:val="0"/>
-              <w:pageBreakBefore w:val="0"/>
-              <w:widowControl w:val="0"/>
-              <w:pBdr>
-                <w:top w:space="0" w:sz="0" w:val="nil"/>
-                <w:left w:space="0" w:sz="0" w:val="nil"/>
-                <w:bottom w:space="0" w:sz="0" w:val="nil"/>
-                <w:right w:space="0" w:sz="0" w:val="nil"/>
-                <w:between w:space="0" w:sz="0" w:val="nil"/>
-              </w:pBdr>
-              <w:shd w:fill="auto" w:val="clear"/>
-              <w:spacing w:after="0" w:before="0" w:line="240" w:lineRule="auto"/>
-              <w:ind w:left="0" w:right="0" w:firstLine="0"/>
-              <w:jc w:val="left"/>
-              <w:rPr>
-                <w:rFonts w:ascii="Arial" w:cs="Arial" w:eastAsia="Arial" w:hAnsi="Arial"/>
-                <w:b w:val="0"/>
-                <w:i w:val="0"/>
-                <w:smallCaps w:val="0"/>
-                <w:strike w:val="0"/>
-                <w:color w:val="000000"/>
-                <w:sz w:val="16"/>
-                <w:szCs w:val="16"/>
-                <w:u w:val="none"/>
-                <w:shd w:fill="auto" w:val="clear"/>
-                <w:vertAlign w:val="baseline"/>
-              </w:rPr>
-            </w:pPr>
-            <w:r>
-              <w:rPr>
-                <w:rFonts w:ascii="Arial" w:cs="Arial" w:eastAsia="Arial" w:hAnsi="Arial"/>
-                <w:b w:val="0"/>
-                <w:i w:val="0"/>
-                <w:smallCaps w:val="0"/>
-                <w:strike w:val="0"/>
-                <w:color w:val="000000"/>
-                <w:sz w:val="16"/>
-                <w:szCs w:val="16"/>
-                <w:u w:val="none"/>
-                <w:shd w:fill="auto" w:val="clear"/>
-                <w:vertAlign w:val="baseline"/>
-                <w:rtl w:val="0"/>
-              </w:rPr>
-              <w:t xml:space="preserve">La pêche maritime de loisir est autorisée (que dans la zone côtière (fonds inférieurs à 70m) de l'île Amsterdam). Pêche maritime de loisir à la langouste est autorisée du 1er décembre au 30 avril, la pêche maritime de loisir aux poissons est autorisée du 15 novembre au 31 juillet. La pêche ciblée du thon rouge du sud, du requin et de raies est interdite</w:t>
-            </w:r>
-          </w:p>
-        </w:tc>
-      </w:tr>
-    </w:tbl>
     <w:p>
       <w:pPr>
         <w:keepNext w:val="0"/>
@@ -4484,8 +3204,8 @@
         <w:ind w:left="0" w:right="0" w:firstLine="0"/>
         <w:jc w:val="left"/>
         <w:rPr>
-          <w:rFonts w:ascii="Liberation Serif" w:cs="Liberation Serif" w:eastAsia="Liberation Serif" w:hAnsi="Liberation Serif"/>
-          <w:b w:val="0"/>
+          <w:rFonts w:ascii="Arial" w:cs="Arial" w:eastAsia="Arial" w:hAnsi="Arial"/>
+          <w:b w:val="1"/>
           <w:i w:val="0"/>
           <w:smallCaps w:val="0"/>
           <w:strike w:val="0"/>
@@ -4503,9 +3223,46 @@
         </w:rPr>
       </w:r>
     </w:p>
+    <w:p>
+      <w:pPr>
+        <w:spacing w:after="240" w:before="240" w:lineRule="auto"/>
+        <w:rPr/>
+      </w:pPr>
+      <w:r>
+        <w:rPr>
+          <w:rtl w:val="0"/>
+        </w:rPr>
+        <w:t xml:space="preserve">${regulatoryAreasTable}</w:t>
+      </w:r>
+    </w:p>
+    <w:p>
+      <w:pPr>
+        <w:keepNext w:val="0"/>
+        <w:keepLines w:val="0"/>
+        <w:pageBreakBefore w:val="0"/>
+        <w:widowControl w:val="1"/>
+        <w:pBdr>
+          <w:top w:space="0" w:sz="0" w:val="nil"/>
+          <w:left w:space="0" w:sz="0" w:val="nil"/>
+          <w:bottom w:space="0" w:sz="0" w:val="nil"/>
+          <w:right w:space="0" w:sz="0" w:val="nil"/>
+          <w:between w:space="0" w:sz="0" w:val="nil"/>
+        </w:pBdr>
+        <w:shd w:fill="auto" w:val="clear"/>
+        <w:spacing w:after="0" w:before="0" w:line="240" w:lineRule="auto"/>
+        <w:ind w:left="0" w:right="0" w:firstLine="0"/>
+        <w:jc w:val="left"/>
+        <w:rPr/>
+      </w:pPr>
+      <w:r>
+        <w:rPr>
+          <w:rtl w:val="0"/>
+        </w:rPr>
+      </w:r>
+    </w:p>
     <w:tbl>
       <w:tblPr>
-        <w:tblStyle w:val="Table5"/>
+        <w:tblStyle w:val="Table4"/>
         <w:tblW w:w="10773.0" w:type="dxa"/>
         <w:jc w:val="left"/>
         <w:tblLayout w:type="fixed"/>
@@ -8452,19 +7209,6 @@
     </w:tblPr>
   </w:style>
   <w:style w:type="table" w:styleId="Table4">
-    <w:basedOn w:val="TableNormal"/>
-    <w:tblPr>
-      <w:tblStyleRowBandSize w:val="1"/>
-      <w:tblStyleColBandSize w:val="1"/>
-      <w:tblCellMar>
-        <w:top w:w="0.0" w:type="dxa"/>
-        <w:left w:w="10.0" w:type="dxa"/>
-        <w:bottom w:w="0.0" w:type="dxa"/>
-        <w:right w:w="10.0" w:type="dxa"/>
-      </w:tblCellMar>
-    </w:tblPr>
-  </w:style>
-  <w:style w:type="table" w:styleId="Table5">
     <w:basedOn w:val="TableNormal"/>
     <w:tblPr>
       <w:tblStyleRowBandSize w:val="1"/>

</xml_diff>

<commit_message>
[Brief] add regulatoryAreas details
</commit_message>
<xml_diff>
--- a/backend/src/main/resources/template_export_brief.docx
+++ b/backend/src/main/resources/template_export_brief.docx
@@ -821,7 +821,7 @@
               <w:jc w:val="left"/>
               <w:rPr>
                 <w:rFonts w:ascii="Arial" w:cs="Arial" w:eastAsia="Arial" w:hAnsi="Arial"/>
-                <w:b w:val="0"/>
+                <w:b w:val="1"/>
                 <w:i w:val="0"/>
                 <w:smallCaps w:val="0"/>
                 <w:strike w:val="0"/>
@@ -836,6 +836,7 @@
             <w:r>
               <w:rPr>
                 <w:rFonts w:ascii="Arial" w:cs="Arial" w:eastAsia="Arial" w:hAnsi="Arial"/>
+                <w:b w:val="1"/>
                 <w:color w:val="282f3e"/>
                 <w:sz w:val="21"/>
                 <w:szCs w:val="21"/>
@@ -917,6 +918,7 @@
               <w:widowControl w:val="0"/>
               <w:rPr>
                 <w:rFonts w:ascii="Arial" w:cs="Arial" w:eastAsia="Arial" w:hAnsi="Arial"/>
+                <w:b w:val="1"/>
                 <w:color w:val="282f3e"/>
                 <w:sz w:val="21"/>
                 <w:szCs w:val="21"/>
@@ -925,6 +927,7 @@
             <w:r>
               <w:rPr>
                 <w:rFonts w:ascii="Arial" w:cs="Arial" w:eastAsia="Arial" w:hAnsi="Arial"/>
+                <w:b w:val="1"/>
                 <w:color w:val="282f3e"/>
                 <w:sz w:val="21"/>
                 <w:szCs w:val="21"/>
@@ -1001,6 +1004,7 @@
               <w:widowControl w:val="0"/>
               <w:rPr>
                 <w:rFonts w:ascii="Arial" w:cs="Arial" w:eastAsia="Arial" w:hAnsi="Arial"/>
+                <w:b w:val="1"/>
                 <w:color w:val="282f3e"/>
                 <w:sz w:val="21"/>
                 <w:szCs w:val="21"/>
@@ -1009,6 +1013,7 @@
             <w:r>
               <w:rPr>
                 <w:rFonts w:ascii="Arial" w:cs="Arial" w:eastAsia="Arial" w:hAnsi="Arial"/>
+                <w:b w:val="1"/>
                 <w:color w:val="282f3e"/>
                 <w:sz w:val="21"/>
                 <w:szCs w:val="21"/>
@@ -1212,6 +1217,7 @@
             <w:r>
               <w:rPr>
                 <w:rFonts w:ascii="Arial" w:cs="Arial" w:eastAsia="Arial" w:hAnsi="Arial"/>
+                <w:b w:val="1"/>
                 <w:color w:val="282f3e"/>
                 <w:sz w:val="21"/>
                 <w:szCs w:val="21"/>
@@ -3226,10 +3232,13 @@
     <w:p>
       <w:pPr>
         <w:spacing w:after="240" w:before="240" w:lineRule="auto"/>
-        <w:rPr/>
+        <w:rPr>
+          <w:rFonts w:ascii="Arial" w:cs="Arial" w:eastAsia="Arial" w:hAnsi="Arial"/>
+        </w:rPr>
       </w:pPr>
       <w:r>
         <w:rPr>
+          <w:rFonts w:ascii="Arial" w:cs="Arial" w:eastAsia="Arial" w:hAnsi="Arial"/>
           <w:rtl w:val="0"/>
         </w:rPr>
         <w:t xml:space="preserve">${regulatoryAreasTable}</w:t>
@@ -5147,11 +5156,9 @@
         <w:jc w:val="left"/>
         <w:rPr>
           <w:rFonts w:ascii="Arial" w:cs="Arial" w:eastAsia="Arial" w:hAnsi="Arial"/>
-          <w:b w:val="1"/>
-          <w:i w:val="0"/>
-          <w:smallCaps w:val="0"/>
-          <w:strike w:val="0"/>
-          <w:color w:val="3b4559"/>
+          <w:i w:val="0"/>
+          <w:smallCaps w:val="0"/>
+          <w:strike w:val="0"/>
           <w:sz w:val="16"/>
           <w:szCs w:val="16"/>
           <w:u w:val="none"/>
@@ -5159,6 +5166,33 @@
           <w:vertAlign w:val="baseline"/>
         </w:rPr>
       </w:pPr>
+      <w:r>
+        <w:rPr>
+          <w:rFonts w:ascii="Arial" w:cs="Arial" w:eastAsia="Arial" w:hAnsi="Arial"/>
+          <w:sz w:val="16"/>
+          <w:szCs w:val="16"/>
+          <w:rtl w:val="0"/>
+        </w:rPr>
+        <w:t xml:space="preserve">${</w:t>
+      </w:r>
+      <w:r>
+        <w:rPr>
+          <w:rFonts w:ascii="Arial" w:cs="Arial" w:eastAsia="Arial" w:hAnsi="Arial"/>
+          <w:sz w:val="16"/>
+          <w:szCs w:val="16"/>
+          <w:rtl w:val="0"/>
+        </w:rPr>
+        <w:t xml:space="preserve">regulatoryAreasDetails</w:t>
+      </w:r>
+      <w:r>
+        <w:rPr>
+          <w:rFonts w:ascii="Arial" w:cs="Arial" w:eastAsia="Arial" w:hAnsi="Arial"/>
+          <w:sz w:val="16"/>
+          <w:szCs w:val="16"/>
+          <w:rtl w:val="0"/>
+        </w:rPr>
+        <w:t xml:space="preserve">}</w:t>
+      </w:r>
       <w:r>
         <w:rPr>
           <w:rtl w:val="0"/>

</xml_diff>

<commit_message>
[Brief] add amps in editable brief
</commit_message>
<xml_diff>
--- a/backend/src/main/resources/template_export_brief.docx
+++ b/backend/src/main/resources/template_export_brief.docx
@@ -2609,7 +2609,7 @@
               <w:shd w:fill="auto" w:val="clear"/>
               <w:spacing w:after="0" w:before="0" w:line="240" w:lineRule="auto"/>
               <w:ind w:left="0" w:right="0" w:firstLine="0"/>
-              <w:jc w:val="left"/>
+              <w:jc w:val="right"/>
               <w:rPr>
                 <w:rFonts w:ascii="Arial" w:cs="Arial" w:eastAsia="Arial" w:hAnsi="Arial"/>
                 <w:b w:val="0"/>
@@ -2624,6 +2624,16 @@
                 <w:vertAlign w:val="baseline"/>
               </w:rPr>
             </w:pPr>
+            <w:r>
+              <w:rPr>
+                <w:rFonts w:ascii="Arial" w:cs="Arial" w:eastAsia="Arial" w:hAnsi="Arial"/>
+                <w:color w:val="282f3e"/>
+                <w:sz w:val="18"/>
+                <w:szCs w:val="18"/>
+                <w:rtl w:val="0"/>
+              </w:rPr>
+              <w:t xml:space="preserve">           </w:t>
+            </w:r>
             <w:r>
               <w:rPr>
                 <w:rFonts w:ascii="Arial" w:cs="Arial" w:eastAsia="Arial" w:hAnsi="Arial"/>
@@ -2835,141 +2845,6 @@
           </w:p>
         </w:tc>
       </w:tr>
-      <w:tr>
-        <w:trPr>
-          <w:cantSplit w:val="0"/>
-          <w:trHeight w:val="399.9609375" w:hRule="atLeast"/>
-          <w:tblHeader w:val="0"/>
-        </w:trPr>
-        <w:tc>
-          <w:tcPr>
-            <w:tcMar>
-              <w:top w:w="55.0" w:type="dxa"/>
-              <w:left w:w="55.0" w:type="dxa"/>
-              <w:bottom w:w="55.0" w:type="dxa"/>
-              <w:right w:w="55.0" w:type="dxa"/>
-            </w:tcMar>
-          </w:tcPr>
-          <w:p>
-            <w:pPr>
-              <w:keepNext w:val="0"/>
-              <w:keepLines w:val="0"/>
-              <w:pageBreakBefore w:val="0"/>
-              <w:widowControl w:val="0"/>
-              <w:pBdr>
-                <w:top w:space="0" w:sz="0" w:val="nil"/>
-                <w:left w:space="0" w:sz="0" w:val="nil"/>
-                <w:bottom w:space="0" w:sz="0" w:val="nil"/>
-                <w:right w:space="0" w:sz="0" w:val="nil"/>
-                <w:between w:space="0" w:sz="0" w:val="nil"/>
-              </w:pBdr>
-              <w:shd w:fill="auto" w:val="clear"/>
-              <w:spacing w:after="0" w:before="0" w:line="240" w:lineRule="auto"/>
-              <w:ind w:left="0" w:right="0" w:firstLine="0"/>
-              <w:jc w:val="left"/>
-              <w:rPr>
-                <w:rFonts w:ascii="Arial" w:cs="Arial" w:eastAsia="Arial" w:hAnsi="Arial"/>
-                <w:b w:val="0"/>
-                <w:i w:val="0"/>
-                <w:smallCaps w:val="0"/>
-                <w:strike w:val="0"/>
-                <w:color w:val="000000"/>
-                <w:sz w:val="40"/>
-                <w:szCs w:val="40"/>
-                <w:u w:val="none"/>
-                <w:shd w:fill="auto" w:val="clear"/>
-                <w:vertAlign w:val="baseline"/>
-              </w:rPr>
-            </w:pPr>
-            <w:r>
-              <w:rPr>
-                <w:rtl w:val="0"/>
-              </w:rPr>
-            </w:r>
-          </w:p>
-        </w:tc>
-        <w:tc>
-          <w:tcPr>
-            <w:tcMar>
-              <w:top w:w="55.0" w:type="dxa"/>
-              <w:left w:w="55.0" w:type="dxa"/>
-              <w:bottom w:w="55.0" w:type="dxa"/>
-              <w:right w:w="55.0" w:type="dxa"/>
-            </w:tcMar>
-            <w:vAlign w:val="center"/>
-          </w:tcPr>
-          <w:p>
-            <w:pPr>
-              <w:keepNext w:val="0"/>
-              <w:keepLines w:val="0"/>
-              <w:pageBreakBefore w:val="0"/>
-              <w:widowControl w:val="0"/>
-              <w:pBdr>
-                <w:top w:space="0" w:sz="0" w:val="nil"/>
-                <w:left w:space="0" w:sz="0" w:val="nil"/>
-                <w:bottom w:space="0" w:sz="0" w:val="nil"/>
-                <w:right w:space="0" w:sz="0" w:val="nil"/>
-                <w:between w:space="0" w:sz="0" w:val="nil"/>
-              </w:pBdr>
-              <w:shd w:fill="auto" w:val="clear"/>
-              <w:spacing w:after="0" w:before="0" w:line="240" w:lineRule="auto"/>
-              <w:ind w:left="0" w:right="0" w:firstLine="0"/>
-              <w:jc w:val="left"/>
-              <w:rPr>
-                <w:rFonts w:ascii="Arial" w:cs="Arial" w:eastAsia="Arial" w:hAnsi="Arial"/>
-                <w:b w:val="0"/>
-                <w:i w:val="0"/>
-                <w:smallCaps w:val="0"/>
-                <w:strike w:val="0"/>
-                <w:color w:val="282f3e"/>
-                <w:sz w:val="18"/>
-                <w:szCs w:val="18"/>
-                <w:u w:val="none"/>
-                <w:shd w:fill="auto" w:val="clear"/>
-                <w:vertAlign w:val="baseline"/>
-              </w:rPr>
-            </w:pPr>
-            <w:r>
-              <w:rPr>
-                <w:rtl w:val="0"/>
-              </w:rPr>
-            </w:r>
-          </w:p>
-        </w:tc>
-        <w:tc>
-          <w:tcPr>
-            <w:tcMar>
-              <w:top w:w="55.0" w:type="dxa"/>
-              <w:left w:w="55.0" w:type="dxa"/>
-              <w:bottom w:w="55.0" w:type="dxa"/>
-              <w:right w:w="55.0" w:type="dxa"/>
-            </w:tcMar>
-            <w:vAlign w:val="center"/>
-          </w:tcPr>
-          <w:p>
-            <w:pPr>
-              <w:widowControl w:val="0"/>
-              <w:jc w:val="right"/>
-              <w:rPr>
-                <w:rFonts w:ascii="Arial" w:cs="Arial" w:eastAsia="Arial" w:hAnsi="Arial"/>
-                <w:color w:val="282f3e"/>
-                <w:sz w:val="18"/>
-                <w:szCs w:val="18"/>
-              </w:rPr>
-            </w:pPr>
-            <w:r>
-              <w:rPr>
-                <w:rFonts w:ascii="Arial" w:cs="Arial" w:eastAsia="Arial" w:hAnsi="Arial"/>
-                <w:color w:val="282f3e"/>
-                <w:sz w:val="18"/>
-                <w:szCs w:val="18"/>
-                <w:rtl w:val="0"/>
-              </w:rPr>
-              <w:t xml:space="preserve">Page 1 / ${totalPages}</w:t>
-            </w:r>
-          </w:p>
-        </w:tc>
-      </w:tr>
     </w:tbl>
     <w:p>
       <w:pPr>
@@ -2991,18 +2866,34 @@
         <w:rPr>
           <w:rFonts w:ascii="Arial" w:cs="Arial" w:eastAsia="Arial" w:hAnsi="Arial"/>
           <w:b w:val="1"/>
-          <w:i w:val="0"/>
-          <w:smallCaps w:val="0"/>
-          <w:strike w:val="0"/>
           <w:color w:val="282f3e"/>
           <w:sz w:val="40"/>
           <w:szCs w:val="40"/>
-          <w:u w:val="none"/>
-          <w:shd w:fill="auto" w:val="clear"/>
-          <w:vertAlign w:val="baseline"/>
-        </w:rPr>
-      </w:pPr>
-      <w:r>
+        </w:rPr>
+      </w:pPr>
+      <w:r>
+        <w:rPr>
+          <w:rtl w:val="0"/>
+        </w:rPr>
+      </w:r>
+    </w:p>
+    <w:p>
+      <w:pPr>
+        <w:keepNext w:val="0"/>
+        <w:keepLines w:val="0"/>
+        <w:pageBreakBefore w:val="0"/>
+        <w:widowControl w:val="1"/>
+        <w:pBdr>
+          <w:top w:space="0" w:sz="0" w:val="nil"/>
+          <w:left w:space="0" w:sz="0" w:val="nil"/>
+          <w:bottom w:space="0" w:sz="0" w:val="nil"/>
+          <w:right w:space="0" w:sz="0" w:val="nil"/>
+          <w:between w:space="0" w:sz="0" w:val="nil"/>
+        </w:pBdr>
+        <w:shd w:fill="auto" w:val="clear"/>
+        <w:spacing w:after="0" w:before="0" w:line="240" w:lineRule="auto"/>
+        <w:ind w:left="0" w:right="0" w:firstLine="0"/>
+        <w:jc w:val="left"/>
         <w:rPr>
           <w:rFonts w:ascii="Arial" w:cs="Arial" w:eastAsia="Arial" w:hAnsi="Arial"/>
           <w:b w:val="1"/>
@@ -3015,6 +2906,21 @@
           <w:u w:val="none"/>
           <w:shd w:fill="auto" w:val="clear"/>
           <w:vertAlign w:val="baseline"/>
+        </w:rPr>
+      </w:pPr>
+      <w:r>
+        <w:rPr>
+          <w:rFonts w:ascii="Arial" w:cs="Arial" w:eastAsia="Arial" w:hAnsi="Arial"/>
+          <w:b w:val="1"/>
+          <w:i w:val="0"/>
+          <w:smallCaps w:val="0"/>
+          <w:strike w:val="0"/>
+          <w:color w:val="282f3e"/>
+          <w:sz w:val="40"/>
+          <w:szCs w:val="40"/>
+          <w:u w:val="none"/>
+          <w:shd w:fill="auto" w:val="clear"/>
+          <w:vertAlign w:val="baseline"/>
           <w:rtl w:val="0"/>
         </w:rPr>
         <w:t xml:space="preserve">Récapitulatif</w:t>
@@ -3246,1739 +3152,94 @@
     </w:p>
     <w:p>
       <w:pPr>
-        <w:keepNext w:val="0"/>
-        <w:keepLines w:val="0"/>
-        <w:pageBreakBefore w:val="0"/>
-        <w:widowControl w:val="1"/>
-        <w:pBdr>
-          <w:top w:space="0" w:sz="0" w:val="nil"/>
-          <w:left w:space="0" w:sz="0" w:val="nil"/>
-          <w:bottom w:space="0" w:sz="0" w:val="nil"/>
-          <w:right w:space="0" w:sz="0" w:val="nil"/>
-          <w:between w:space="0" w:sz="0" w:val="nil"/>
-        </w:pBdr>
-        <w:shd w:fill="auto" w:val="clear"/>
-        <w:spacing w:after="0" w:before="0" w:line="240" w:lineRule="auto"/>
-        <w:ind w:left="0" w:right="0" w:firstLine="0"/>
-        <w:jc w:val="left"/>
-        <w:rPr/>
-      </w:pPr>
-      <w:r>
-        <w:rPr>
-          <w:rtl w:val="0"/>
-        </w:rPr>
-      </w:r>
-    </w:p>
-    <w:tbl>
-      <w:tblPr>
-        <w:tblStyle w:val="Table4"/>
-        <w:tblW w:w="10773.0" w:type="dxa"/>
-        <w:jc w:val="left"/>
-        <w:tblLayout w:type="fixed"/>
-        <w:tblLook w:val="0000"/>
-      </w:tblPr>
-      <w:tblGrid>
-        <w:gridCol w:w="190"/>
-        <w:gridCol w:w="5197"/>
-        <w:gridCol w:w="198"/>
-        <w:gridCol w:w="5188"/>
-        <w:tblGridChange w:id="0">
-          <w:tblGrid>
-            <w:gridCol w:w="190"/>
-            <w:gridCol w:w="5197"/>
-            <w:gridCol w:w="198"/>
-            <w:gridCol w:w="5188"/>
-          </w:tblGrid>
-        </w:tblGridChange>
-      </w:tblGrid>
-      <w:tr>
-        <w:trPr>
-          <w:cantSplit w:val="0"/>
-          <w:trHeight w:val="274" w:hRule="atLeast"/>
-          <w:tblHeader w:val="0"/>
-        </w:trPr>
-        <w:tc>
-          <w:tcPr>
-            <w:gridSpan w:val="2"/>
-            <w:tcBorders>
-              <w:bottom w:color="d4e5f4" w:space="0" w:sz="4" w:val="single"/>
-            </w:tcBorders>
-            <w:shd w:fill="d6df64" w:val="clear"/>
-            <w:tcMar>
-              <w:top w:w="85.0" w:type="dxa"/>
-              <w:left w:w="85.0" w:type="dxa"/>
-              <w:bottom w:w="85.0" w:type="dxa"/>
-              <w:right w:w="85.0" w:type="dxa"/>
-            </w:tcMar>
-            <w:vAlign w:val="center"/>
-          </w:tcPr>
-          <w:p>
-            <w:pPr>
-              <w:keepNext w:val="0"/>
-              <w:keepLines w:val="0"/>
-              <w:pageBreakBefore w:val="0"/>
-              <w:widowControl w:val="0"/>
-              <w:pBdr>
-                <w:top w:space="0" w:sz="0" w:val="nil"/>
-                <w:left w:space="0" w:sz="0" w:val="nil"/>
-                <w:bottom w:space="0" w:sz="0" w:val="nil"/>
-                <w:right w:space="0" w:sz="0" w:val="nil"/>
-                <w:between w:space="0" w:sz="0" w:val="nil"/>
-              </w:pBdr>
-              <w:shd w:fill="auto" w:val="clear"/>
-              <w:spacing w:after="0" w:before="0" w:line="240" w:lineRule="auto"/>
-              <w:ind w:left="0" w:right="0" w:firstLine="0"/>
-              <w:jc w:val="left"/>
-              <w:rPr>
-                <w:rFonts w:ascii="Arial" w:cs="Arial" w:eastAsia="Arial" w:hAnsi="Arial"/>
-                <w:b w:val="1"/>
-                <w:i w:val="0"/>
-                <w:smallCaps w:val="0"/>
-                <w:strike w:val="0"/>
-                <w:color w:val="3b4559"/>
-                <w:sz w:val="16"/>
-                <w:szCs w:val="16"/>
-                <w:u w:val="none"/>
-                <w:shd w:fill="auto" w:val="clear"/>
-                <w:vertAlign w:val="baseline"/>
-              </w:rPr>
-            </w:pPr>
-            <w:r>
-              <w:rPr>
-                <w:rFonts w:ascii="Arial" w:cs="Arial" w:eastAsia="Arial" w:hAnsi="Arial"/>
-                <w:b w:val="1"/>
-                <w:i w:val="0"/>
-                <w:smallCaps w:val="0"/>
-                <w:strike w:val="0"/>
-                <w:color w:val="3b4559"/>
-                <w:sz w:val="16"/>
-                <w:szCs w:val="16"/>
-                <w:u w:val="none"/>
-                <w:shd w:fill="auto" w:val="clear"/>
-                <w:vertAlign w:val="baseline"/>
-                <w:rtl w:val="0"/>
-              </w:rPr>
-              <w:t xml:space="preserve">Aires Marines Protégées                       </w:t>
-            </w:r>
-            <w:r>
-              <w:rPr>
-                <w:rFonts w:ascii="Arial" w:cs="Arial" w:eastAsia="Arial" w:hAnsi="Arial"/>
-                <w:color w:val="3b4559"/>
-                <w:sz w:val="16"/>
-                <w:szCs w:val="16"/>
-                <w:rtl w:val="0"/>
-              </w:rPr>
-              <w:t xml:space="preserve">${totalAMPs}</w:t>
-            </w:r>
-            <w:r>
-              <w:rPr>
-                <w:rFonts w:ascii="Arial" w:cs="Arial" w:eastAsia="Arial" w:hAnsi="Arial"/>
-                <w:b w:val="0"/>
-                <w:i w:val="0"/>
-                <w:smallCaps w:val="0"/>
-                <w:strike w:val="0"/>
-                <w:color w:val="3b4559"/>
-                <w:sz w:val="16"/>
-                <w:szCs w:val="16"/>
-                <w:u w:val="none"/>
-                <w:shd w:fill="auto" w:val="clear"/>
-                <w:vertAlign w:val="baseline"/>
-                <w:rtl w:val="0"/>
-              </w:rPr>
-              <w:t xml:space="preserve"> sélectionnée(s)</w:t>
-            </w:r>
-            <w:r>
-              <w:rPr>
-                <w:rtl w:val="0"/>
-              </w:rPr>
-            </w:r>
-          </w:p>
-        </w:tc>
-        <w:tc>
-          <w:tcPr>
-            <w:gridSpan w:val="2"/>
-            <w:tcBorders>
-              <w:bottom w:color="d4e5f4" w:space="0" w:sz="4" w:val="single"/>
-              <w:right w:color="d4e5f4" w:space="0" w:sz="4" w:val="single"/>
-            </w:tcBorders>
-            <w:shd w:fill="c58f7e" w:val="clear"/>
-            <w:tcMar>
-              <w:top w:w="85.0" w:type="dxa"/>
-              <w:left w:w="85.0" w:type="dxa"/>
-              <w:bottom w:w="85.0" w:type="dxa"/>
-              <w:right w:w="85.0" w:type="dxa"/>
-            </w:tcMar>
-            <w:vAlign w:val="center"/>
-          </w:tcPr>
-          <w:p>
-            <w:pPr>
-              <w:keepNext w:val="0"/>
-              <w:keepLines w:val="0"/>
-              <w:pageBreakBefore w:val="0"/>
-              <w:widowControl w:val="0"/>
-              <w:pBdr>
-                <w:top w:space="0" w:sz="0" w:val="nil"/>
-                <w:left w:space="0" w:sz="0" w:val="nil"/>
-                <w:bottom w:space="0" w:sz="0" w:val="nil"/>
-                <w:right w:space="0" w:sz="0" w:val="nil"/>
-                <w:between w:space="0" w:sz="0" w:val="nil"/>
-              </w:pBdr>
-              <w:shd w:fill="auto" w:val="clear"/>
-              <w:spacing w:after="0" w:before="0" w:line="240" w:lineRule="auto"/>
-              <w:ind w:left="0" w:right="0" w:firstLine="0"/>
-              <w:jc w:val="left"/>
-              <w:rPr>
-                <w:rFonts w:ascii="Arial" w:cs="Arial" w:eastAsia="Arial" w:hAnsi="Arial"/>
-                <w:b w:val="1"/>
-                <w:i w:val="0"/>
-                <w:smallCaps w:val="0"/>
-                <w:strike w:val="0"/>
-                <w:color w:val="ffffff"/>
-                <w:sz w:val="16"/>
-                <w:szCs w:val="16"/>
-                <w:u w:val="none"/>
-                <w:shd w:fill="auto" w:val="clear"/>
-                <w:vertAlign w:val="baseline"/>
-              </w:rPr>
-            </w:pPr>
-            <w:r>
-              <w:rPr>
-                <w:rFonts w:ascii="Arial" w:cs="Arial" w:eastAsia="Arial" w:hAnsi="Arial"/>
-                <w:b w:val="1"/>
-                <w:i w:val="0"/>
-                <w:smallCaps w:val="0"/>
-                <w:strike w:val="0"/>
-                <w:color w:val="ffffff"/>
-                <w:sz w:val="16"/>
-                <w:szCs w:val="16"/>
-                <w:u w:val="none"/>
-                <w:shd w:fill="auto" w:val="clear"/>
-                <w:vertAlign w:val="baseline"/>
-                <w:rtl w:val="0"/>
-              </w:rPr>
-              <w:t xml:space="preserve">Zones de vigilance                  </w:t>
-            </w:r>
-            <w:r>
-              <w:rPr>
-                <w:rFonts w:ascii="Arial" w:cs="Arial" w:eastAsia="Arial" w:hAnsi="Arial"/>
-                <w:color w:val="ffffff"/>
-                <w:sz w:val="16"/>
-                <w:szCs w:val="16"/>
-                <w:rtl w:val="0"/>
-              </w:rPr>
-              <w:t xml:space="preserve">${totalVigilanceAreas}</w:t>
-            </w:r>
-            <w:r>
-              <w:rPr>
-                <w:rFonts w:ascii="Arial" w:cs="Arial" w:eastAsia="Arial" w:hAnsi="Arial"/>
-                <w:b w:val="0"/>
-                <w:i w:val="0"/>
-                <w:smallCaps w:val="0"/>
-                <w:strike w:val="0"/>
-                <w:color w:val="ffffff"/>
-                <w:sz w:val="16"/>
-                <w:szCs w:val="16"/>
-                <w:u w:val="none"/>
-                <w:shd w:fill="auto" w:val="clear"/>
-                <w:vertAlign w:val="baseline"/>
-                <w:rtl w:val="0"/>
-              </w:rPr>
-              <w:t xml:space="preserve"> sélectionnée(s)</w:t>
-            </w:r>
-            <w:r>
-              <w:rPr>
-                <w:rtl w:val="0"/>
-              </w:rPr>
-            </w:r>
-          </w:p>
-        </w:tc>
-      </w:tr>
-      <w:tr>
-        <w:trPr>
-          <w:cantSplit w:val="0"/>
-          <w:trHeight w:val="20" w:hRule="atLeast"/>
-          <w:tblHeader w:val="0"/>
-        </w:trPr>
-        <w:tc>
-          <w:tcPr>
-            <w:tcBorders>
-              <w:top w:color="707785" w:space="0" w:sz="4" w:val="single"/>
-              <w:left w:color="707785" w:space="0" w:sz="4" w:val="single"/>
-              <w:bottom w:color="707785" w:space="0" w:sz="4" w:val="single"/>
-              <w:right w:color="707785" w:space="0" w:sz="4" w:val="single"/>
-            </w:tcBorders>
-            <w:shd w:fill="d6df64" w:val="clear"/>
-            <w:tcMar>
-              <w:top w:w="85.0" w:type="dxa"/>
-              <w:left w:w="85.0" w:type="dxa"/>
-              <w:bottom w:w="85.0" w:type="dxa"/>
-              <w:right w:w="85.0" w:type="dxa"/>
-            </w:tcMar>
-            <w:vAlign w:val="center"/>
-          </w:tcPr>
-          <w:p>
-            <w:pPr>
-              <w:keepNext w:val="0"/>
-              <w:keepLines w:val="0"/>
-              <w:pageBreakBefore w:val="0"/>
-              <w:widowControl w:val="0"/>
-              <w:pBdr>
-                <w:top w:space="0" w:sz="0" w:val="nil"/>
-                <w:left w:space="0" w:sz="0" w:val="nil"/>
-                <w:bottom w:space="0" w:sz="0" w:val="nil"/>
-                <w:right w:space="0" w:sz="0" w:val="nil"/>
-                <w:between w:space="0" w:sz="0" w:val="nil"/>
-              </w:pBdr>
-              <w:shd w:fill="auto" w:val="clear"/>
-              <w:spacing w:after="0" w:before="0" w:line="240" w:lineRule="auto"/>
-              <w:ind w:left="0" w:right="0" w:firstLine="0"/>
-              <w:jc w:val="left"/>
-              <w:rPr>
-                <w:rFonts w:ascii="Arial" w:cs="Arial" w:eastAsia="Arial" w:hAnsi="Arial"/>
-                <w:b w:val="1"/>
-                <w:i w:val="0"/>
-                <w:smallCaps w:val="0"/>
-                <w:strike w:val="0"/>
-                <w:color w:val="000000"/>
-                <w:sz w:val="16"/>
-                <w:szCs w:val="16"/>
-                <w:u w:val="none"/>
-                <w:shd w:fill="auto" w:val="clear"/>
-                <w:vertAlign w:val="baseline"/>
-              </w:rPr>
-            </w:pPr>
-            <w:r>
-              <w:rPr>
-                <w:rtl w:val="0"/>
-              </w:rPr>
-            </w:r>
-          </w:p>
-        </w:tc>
-        <w:tc>
-          <w:tcPr>
-            <w:tcBorders>
-              <w:top w:color="d4e5f4" w:space="0" w:sz="4" w:val="single"/>
-              <w:bottom w:color="d4e5f4" w:space="0" w:sz="4" w:val="single"/>
-            </w:tcBorders>
-            <w:shd w:fill="auto" w:val="clear"/>
-            <w:tcMar>
-              <w:top w:w="85.0" w:type="dxa"/>
-              <w:left w:w="85.0" w:type="dxa"/>
-              <w:bottom w:w="85.0" w:type="dxa"/>
-              <w:right w:w="85.0" w:type="dxa"/>
-            </w:tcMar>
-            <w:vAlign w:val="center"/>
-          </w:tcPr>
-          <w:p>
-            <w:pPr>
-              <w:keepNext w:val="0"/>
-              <w:keepLines w:val="0"/>
-              <w:pageBreakBefore w:val="0"/>
-              <w:widowControl w:val="0"/>
-              <w:pBdr>
-                <w:top w:space="0" w:sz="0" w:val="nil"/>
-                <w:left w:space="0" w:sz="0" w:val="nil"/>
-                <w:bottom w:space="0" w:sz="0" w:val="nil"/>
-                <w:right w:space="0" w:sz="0" w:val="nil"/>
-                <w:between w:space="0" w:sz="0" w:val="nil"/>
-              </w:pBdr>
-              <w:shd w:fill="auto" w:val="clear"/>
-              <w:spacing w:after="0" w:before="0" w:line="240" w:lineRule="auto"/>
-              <w:ind w:left="0" w:right="0" w:firstLine="0"/>
-              <w:jc w:val="left"/>
-              <w:rPr>
-                <w:rFonts w:ascii="Arial" w:cs="Arial" w:eastAsia="Arial" w:hAnsi="Arial"/>
-                <w:b w:val="0"/>
-                <w:i w:val="0"/>
-                <w:smallCaps w:val="0"/>
-                <w:strike w:val="0"/>
-                <w:color w:val="000000"/>
-                <w:sz w:val="16"/>
-                <w:szCs w:val="16"/>
-                <w:u w:val="none"/>
-                <w:shd w:fill="auto" w:val="clear"/>
-                <w:vertAlign w:val="baseline"/>
-              </w:rPr>
-            </w:pPr>
-            <w:r>
-              <w:rPr>
-                <w:rFonts w:ascii="Arial" w:cs="Arial" w:eastAsia="Arial" w:hAnsi="Arial"/>
-                <w:b w:val="1"/>
-                <w:i w:val="0"/>
-                <w:smallCaps w:val="0"/>
-                <w:strike w:val="0"/>
-                <w:color w:val="000000"/>
-                <w:sz w:val="16"/>
-                <w:szCs w:val="16"/>
-                <w:u w:val="none"/>
-                <w:shd w:fill="auto" w:val="clear"/>
-                <w:vertAlign w:val="baseline"/>
-                <w:rtl w:val="0"/>
-              </w:rPr>
-              <w:t xml:space="preserve">Abers - côtes des Légendes </w:t>
-            </w:r>
-            <w:r>
-              <w:rPr>
-                <w:rFonts w:ascii="Arial" w:cs="Arial" w:eastAsia="Arial" w:hAnsi="Arial"/>
-                <w:b w:val="0"/>
-                <w:i w:val="0"/>
-                <w:smallCaps w:val="0"/>
-                <w:strike w:val="0"/>
-                <w:color w:val="000000"/>
-                <w:sz w:val="16"/>
-                <w:szCs w:val="16"/>
-                <w:u w:val="none"/>
-                <w:shd w:fill="auto" w:val="clear"/>
-                <w:vertAlign w:val="baseline"/>
-                <w:rtl w:val="0"/>
-              </w:rPr>
-              <w:t xml:space="preserve">/ Natura 2000</w:t>
-            </w:r>
-          </w:p>
-        </w:tc>
-        <w:tc>
-          <w:tcPr>
-            <w:tcBorders>
-              <w:top w:color="707785" w:space="0" w:sz="4" w:val="single"/>
-              <w:left w:color="707785" w:space="0" w:sz="4" w:val="single"/>
-              <w:bottom w:color="707785" w:space="0" w:sz="4" w:val="single"/>
-              <w:right w:color="707785" w:space="0" w:sz="4" w:val="single"/>
-            </w:tcBorders>
-            <w:shd w:fill="e7b4a6" w:val="clear"/>
-            <w:tcMar>
-              <w:top w:w="85.0" w:type="dxa"/>
-              <w:left w:w="85.0" w:type="dxa"/>
-              <w:bottom w:w="85.0" w:type="dxa"/>
-              <w:right w:w="85.0" w:type="dxa"/>
-            </w:tcMar>
-            <w:vAlign w:val="center"/>
-          </w:tcPr>
-          <w:p>
-            <w:pPr>
-              <w:keepNext w:val="0"/>
-              <w:keepLines w:val="0"/>
-              <w:pageBreakBefore w:val="0"/>
-              <w:widowControl w:val="0"/>
-              <w:pBdr>
-                <w:top w:space="0" w:sz="0" w:val="nil"/>
-                <w:left w:space="0" w:sz="0" w:val="nil"/>
-                <w:bottom w:space="0" w:sz="0" w:val="nil"/>
-                <w:right w:space="0" w:sz="0" w:val="nil"/>
-                <w:between w:space="0" w:sz="0" w:val="nil"/>
-              </w:pBdr>
-              <w:shd w:fill="auto" w:val="clear"/>
-              <w:spacing w:after="0" w:before="0" w:line="240" w:lineRule="auto"/>
-              <w:ind w:left="0" w:right="0" w:firstLine="0"/>
-              <w:jc w:val="left"/>
-              <w:rPr>
-                <w:rFonts w:ascii="Arial" w:cs="Arial" w:eastAsia="Arial" w:hAnsi="Arial"/>
-                <w:b w:val="0"/>
-                <w:i w:val="0"/>
-                <w:smallCaps w:val="0"/>
-                <w:strike w:val="0"/>
-                <w:color w:val="000000"/>
-                <w:sz w:val="16"/>
-                <w:szCs w:val="16"/>
-                <w:u w:val="none"/>
-                <w:shd w:fill="auto" w:val="clear"/>
-                <w:vertAlign w:val="baseline"/>
-              </w:rPr>
-            </w:pPr>
-            <w:r>
-              <w:rPr>
-                <w:rtl w:val="0"/>
-              </w:rPr>
-            </w:r>
-          </w:p>
-        </w:tc>
-        <w:tc>
-          <w:tcPr>
-            <w:tcBorders>
-              <w:top w:color="d4e5f4" w:space="0" w:sz="4" w:val="single"/>
-              <w:bottom w:color="d4e5f4" w:space="0" w:sz="4" w:val="single"/>
-              <w:right w:color="d4e5f4" w:space="0" w:sz="4" w:val="single"/>
-            </w:tcBorders>
-            <w:shd w:fill="auto" w:val="clear"/>
-            <w:tcMar>
-              <w:top w:w="85.0" w:type="dxa"/>
-              <w:left w:w="85.0" w:type="dxa"/>
-              <w:bottom w:w="85.0" w:type="dxa"/>
-              <w:right w:w="85.0" w:type="dxa"/>
-            </w:tcMar>
-            <w:vAlign w:val="center"/>
-          </w:tcPr>
-          <w:p>
-            <w:pPr>
-              <w:keepNext w:val="0"/>
-              <w:keepLines w:val="0"/>
-              <w:pageBreakBefore w:val="0"/>
-              <w:widowControl w:val="0"/>
-              <w:pBdr>
-                <w:top w:space="0" w:sz="0" w:val="nil"/>
-                <w:left w:space="0" w:sz="0" w:val="nil"/>
-                <w:bottom w:space="0" w:sz="0" w:val="nil"/>
-                <w:right w:space="0" w:sz="0" w:val="nil"/>
-                <w:between w:space="0" w:sz="0" w:val="nil"/>
-              </w:pBdr>
-              <w:shd w:fill="auto" w:val="clear"/>
-              <w:spacing w:after="0" w:before="0" w:line="240" w:lineRule="auto"/>
-              <w:ind w:left="0" w:right="0" w:firstLine="0"/>
-              <w:jc w:val="left"/>
-              <w:rPr>
-                <w:rFonts w:ascii="Arial" w:cs="Arial" w:eastAsia="Arial" w:hAnsi="Arial"/>
-                <w:b w:val="0"/>
-                <w:i w:val="0"/>
-                <w:smallCaps w:val="0"/>
-                <w:strike w:val="0"/>
-                <w:color w:val="000000"/>
-                <w:sz w:val="16"/>
-                <w:szCs w:val="16"/>
-                <w:u w:val="none"/>
-                <w:shd w:fill="auto" w:val="clear"/>
-                <w:vertAlign w:val="baseline"/>
-              </w:rPr>
-            </w:pPr>
-            <w:r>
-              <w:rPr>
-                <w:rFonts w:ascii="Arial" w:cs="Arial" w:eastAsia="Arial" w:hAnsi="Arial"/>
-                <w:b w:val="0"/>
-                <w:i w:val="0"/>
-                <w:smallCaps w:val="0"/>
-                <w:strike w:val="0"/>
-                <w:color w:val="000000"/>
-                <w:sz w:val="16"/>
-                <w:szCs w:val="16"/>
-                <w:u w:val="none"/>
-                <w:shd w:fill="auto" w:val="clear"/>
-                <w:vertAlign w:val="baseline"/>
-                <w:rtl w:val="0"/>
-              </w:rPr>
-              <w:t xml:space="preserve">Présence d'orques</w:t>
-            </w:r>
-          </w:p>
-        </w:tc>
-      </w:tr>
-      <w:tr>
-        <w:trPr>
-          <w:cantSplit w:val="0"/>
-          <w:tblHeader w:val="0"/>
-        </w:trPr>
-        <w:tc>
-          <w:tcPr>
-            <w:tcBorders>
-              <w:left w:color="707785" w:space="0" w:sz="4" w:val="single"/>
-              <w:bottom w:color="707785" w:space="0" w:sz="4" w:val="single"/>
-              <w:right w:color="707785" w:space="0" w:sz="4" w:val="single"/>
-            </w:tcBorders>
-            <w:shd w:fill="d6df64" w:val="clear"/>
-            <w:tcMar>
-              <w:top w:w="85.0" w:type="dxa"/>
-              <w:left w:w="85.0" w:type="dxa"/>
-              <w:bottom w:w="85.0" w:type="dxa"/>
-              <w:right w:w="85.0" w:type="dxa"/>
-            </w:tcMar>
-            <w:vAlign w:val="center"/>
-          </w:tcPr>
-          <w:p>
-            <w:pPr>
-              <w:keepNext w:val="0"/>
-              <w:keepLines w:val="0"/>
-              <w:pageBreakBefore w:val="0"/>
-              <w:widowControl w:val="1"/>
-              <w:pBdr>
-                <w:top w:space="0" w:sz="0" w:val="nil"/>
-                <w:left w:space="0" w:sz="0" w:val="nil"/>
-                <w:bottom w:space="0" w:sz="0" w:val="nil"/>
-                <w:right w:space="0" w:sz="0" w:val="nil"/>
-                <w:between w:space="0" w:sz="0" w:val="nil"/>
-              </w:pBdr>
-              <w:shd w:fill="auto" w:val="clear"/>
-              <w:spacing w:after="0" w:before="0" w:line="240" w:lineRule="auto"/>
-              <w:ind w:left="0" w:right="0" w:firstLine="0"/>
-              <w:jc w:val="left"/>
-              <w:rPr>
-                <w:rFonts w:ascii="Arial" w:cs="Arial" w:eastAsia="Arial" w:hAnsi="Arial"/>
-                <w:b w:val="0"/>
-                <w:i w:val="0"/>
-                <w:smallCaps w:val="0"/>
-                <w:strike w:val="0"/>
-                <w:color w:val="282f3e"/>
-                <w:sz w:val="16"/>
-                <w:szCs w:val="16"/>
-                <w:u w:val="none"/>
-                <w:shd w:fill="auto" w:val="clear"/>
-                <w:vertAlign w:val="baseline"/>
-              </w:rPr>
-            </w:pPr>
-            <w:r>
-              <w:rPr>
-                <w:rtl w:val="0"/>
-              </w:rPr>
-            </w:r>
-          </w:p>
-        </w:tc>
-        <w:tc>
-          <w:tcPr>
-            <w:tcBorders>
-              <w:bottom w:color="d4e5f4" w:space="0" w:sz="4" w:val="single"/>
-            </w:tcBorders>
-            <w:tcMar>
-              <w:top w:w="85.0" w:type="dxa"/>
-              <w:left w:w="85.0" w:type="dxa"/>
-              <w:bottom w:w="85.0" w:type="dxa"/>
-              <w:right w:w="85.0" w:type="dxa"/>
-            </w:tcMar>
-            <w:vAlign w:val="center"/>
-          </w:tcPr>
-          <w:p>
-            <w:pPr>
-              <w:keepNext w:val="0"/>
-              <w:keepLines w:val="0"/>
-              <w:pageBreakBefore w:val="0"/>
-              <w:widowControl w:val="0"/>
-              <w:pBdr>
-                <w:top w:space="0" w:sz="0" w:val="nil"/>
-                <w:left w:space="0" w:sz="0" w:val="nil"/>
-                <w:bottom w:space="0" w:sz="0" w:val="nil"/>
-                <w:right w:space="0" w:sz="0" w:val="nil"/>
-                <w:between w:space="0" w:sz="0" w:val="nil"/>
-              </w:pBdr>
-              <w:shd w:fill="auto" w:val="clear"/>
-              <w:spacing w:after="0" w:before="0" w:line="240" w:lineRule="auto"/>
-              <w:ind w:left="0" w:right="0" w:firstLine="0"/>
-              <w:jc w:val="left"/>
-              <w:rPr>
-                <w:rFonts w:ascii="Arial" w:cs="Arial" w:eastAsia="Arial" w:hAnsi="Arial"/>
-                <w:b w:val="0"/>
-                <w:i w:val="0"/>
-                <w:smallCaps w:val="0"/>
-                <w:strike w:val="0"/>
-                <w:color w:val="000000"/>
-                <w:sz w:val="16"/>
-                <w:szCs w:val="16"/>
-                <w:u w:val="none"/>
-                <w:shd w:fill="auto" w:val="clear"/>
-                <w:vertAlign w:val="baseline"/>
-              </w:rPr>
-            </w:pPr>
-            <w:r>
-              <w:rPr>
-                <w:rFonts w:ascii="Arial" w:cs="Arial" w:eastAsia="Arial" w:hAnsi="Arial"/>
-                <w:b w:val="1"/>
-                <w:i w:val="0"/>
-                <w:smallCaps w:val="0"/>
-                <w:strike w:val="0"/>
-                <w:color w:val="000000"/>
-                <w:sz w:val="16"/>
-                <w:szCs w:val="16"/>
-                <w:u w:val="none"/>
-                <w:shd w:fill="auto" w:val="clear"/>
-                <w:vertAlign w:val="baseline"/>
-                <w:rtl w:val="0"/>
-              </w:rPr>
-              <w:t xml:space="preserve">Abers - côtes des Légendes</w:t>
-            </w:r>
-            <w:r>
-              <w:rPr>
-                <w:rFonts w:ascii="Arial" w:cs="Arial" w:eastAsia="Arial" w:hAnsi="Arial"/>
-                <w:b w:val="0"/>
-                <w:i w:val="0"/>
-                <w:smallCaps w:val="0"/>
-                <w:strike w:val="0"/>
-                <w:color w:val="000000"/>
-                <w:sz w:val="16"/>
-                <w:szCs w:val="16"/>
-                <w:u w:val="none"/>
-                <w:shd w:fill="auto" w:val="clear"/>
-                <w:vertAlign w:val="baseline"/>
-                <w:rtl w:val="0"/>
-              </w:rPr>
-              <w:t xml:space="preserve"> / Instruments internationaux</w:t>
-            </w:r>
-          </w:p>
-        </w:tc>
-        <w:tc>
-          <w:tcPr>
-            <w:tcBorders>
-              <w:left w:color="707785" w:space="0" w:sz="4" w:val="single"/>
-              <w:bottom w:color="707785" w:space="0" w:sz="4" w:val="single"/>
-              <w:right w:color="707785" w:space="0" w:sz="4" w:val="single"/>
-            </w:tcBorders>
-            <w:shd w:fill="e7b4a6" w:val="clear"/>
-            <w:tcMar>
-              <w:top w:w="85.0" w:type="dxa"/>
-              <w:left w:w="85.0" w:type="dxa"/>
-              <w:bottom w:w="85.0" w:type="dxa"/>
-              <w:right w:w="85.0" w:type="dxa"/>
-            </w:tcMar>
-            <w:vAlign w:val="center"/>
-          </w:tcPr>
-          <w:p>
-            <w:pPr>
-              <w:keepNext w:val="0"/>
-              <w:keepLines w:val="0"/>
-              <w:pageBreakBefore w:val="0"/>
-              <w:widowControl w:val="0"/>
-              <w:pBdr>
-                <w:top w:space="0" w:sz="0" w:val="nil"/>
-                <w:left w:space="0" w:sz="0" w:val="nil"/>
-                <w:bottom w:space="0" w:sz="0" w:val="nil"/>
-                <w:right w:space="0" w:sz="0" w:val="nil"/>
-                <w:between w:space="0" w:sz="0" w:val="nil"/>
-              </w:pBdr>
-              <w:shd w:fill="auto" w:val="clear"/>
-              <w:spacing w:after="0" w:before="0" w:line="240" w:lineRule="auto"/>
-              <w:ind w:left="0" w:right="0" w:firstLine="0"/>
-              <w:jc w:val="left"/>
-              <w:rPr>
-                <w:rFonts w:ascii="Arial" w:cs="Arial" w:eastAsia="Arial" w:hAnsi="Arial"/>
-                <w:b w:val="0"/>
-                <w:i w:val="0"/>
-                <w:smallCaps w:val="0"/>
-                <w:strike w:val="0"/>
-                <w:color w:val="000000"/>
-                <w:sz w:val="16"/>
-                <w:szCs w:val="16"/>
-                <w:u w:val="none"/>
-                <w:shd w:fill="auto" w:val="clear"/>
-                <w:vertAlign w:val="baseline"/>
-              </w:rPr>
-            </w:pPr>
-            <w:r>
-              <w:rPr>
-                <w:rtl w:val="0"/>
-              </w:rPr>
-            </w:r>
-          </w:p>
-        </w:tc>
-        <w:tc>
-          <w:tcPr>
-            <w:tcBorders>
-              <w:bottom w:color="d4e5f4" w:space="0" w:sz="4" w:val="single"/>
-              <w:right w:color="d4e5f4" w:space="0" w:sz="4" w:val="single"/>
-            </w:tcBorders>
-            <w:tcMar>
-              <w:top w:w="85.0" w:type="dxa"/>
-              <w:left w:w="85.0" w:type="dxa"/>
-              <w:bottom w:w="85.0" w:type="dxa"/>
-              <w:right w:w="85.0" w:type="dxa"/>
-            </w:tcMar>
-            <w:vAlign w:val="center"/>
-          </w:tcPr>
-          <w:p>
-            <w:pPr>
-              <w:keepNext w:val="0"/>
-              <w:keepLines w:val="0"/>
-              <w:pageBreakBefore w:val="0"/>
-              <w:widowControl w:val="0"/>
-              <w:pBdr>
-                <w:top w:space="0" w:sz="0" w:val="nil"/>
-                <w:left w:space="0" w:sz="0" w:val="nil"/>
-                <w:bottom w:space="0" w:sz="0" w:val="nil"/>
-                <w:right w:space="0" w:sz="0" w:val="nil"/>
-                <w:between w:space="0" w:sz="0" w:val="nil"/>
-              </w:pBdr>
-              <w:shd w:fill="auto" w:val="clear"/>
-              <w:spacing w:after="0" w:before="0" w:line="240" w:lineRule="auto"/>
-              <w:ind w:left="0" w:right="0" w:firstLine="0"/>
-              <w:jc w:val="left"/>
-              <w:rPr>
-                <w:rFonts w:ascii="Arial" w:cs="Arial" w:eastAsia="Arial" w:hAnsi="Arial"/>
-                <w:b w:val="0"/>
-                <w:i w:val="0"/>
-                <w:smallCaps w:val="0"/>
-                <w:strike w:val="0"/>
-                <w:color w:val="000000"/>
-                <w:sz w:val="16"/>
-                <w:szCs w:val="16"/>
-                <w:u w:val="none"/>
-                <w:shd w:fill="auto" w:val="clear"/>
-                <w:vertAlign w:val="baseline"/>
-              </w:rPr>
-            </w:pPr>
-            <w:r>
-              <w:rPr>
-                <w:rFonts w:ascii="Arial" w:cs="Arial" w:eastAsia="Arial" w:hAnsi="Arial"/>
-                <w:b w:val="0"/>
-                <w:i w:val="0"/>
-                <w:smallCaps w:val="0"/>
-                <w:strike w:val="0"/>
-                <w:color w:val="000000"/>
-                <w:sz w:val="16"/>
-                <w:szCs w:val="16"/>
-                <w:u w:val="none"/>
-                <w:shd w:fill="auto" w:val="clear"/>
-                <w:vertAlign w:val="baseline"/>
-                <w:rtl w:val="0"/>
-              </w:rPr>
-              <w:t xml:space="preserve">Mouillage interdit zostere Molène</w:t>
-            </w:r>
-          </w:p>
-        </w:tc>
-      </w:tr>
-      <w:tr>
-        <w:trPr>
-          <w:cantSplit w:val="0"/>
-          <w:tblHeader w:val="0"/>
-        </w:trPr>
-        <w:tc>
-          <w:tcPr>
-            <w:tcBorders>
-              <w:left w:color="707785" w:space="0" w:sz="4" w:val="single"/>
-              <w:bottom w:color="707785" w:space="0" w:sz="4" w:val="single"/>
-              <w:right w:color="707785" w:space="0" w:sz="4" w:val="single"/>
-            </w:tcBorders>
-            <w:shd w:fill="d6df64" w:val="clear"/>
-            <w:tcMar>
-              <w:top w:w="85.0" w:type="dxa"/>
-              <w:left w:w="85.0" w:type="dxa"/>
-              <w:bottom w:w="85.0" w:type="dxa"/>
-              <w:right w:w="85.0" w:type="dxa"/>
-            </w:tcMar>
-            <w:vAlign w:val="center"/>
-          </w:tcPr>
-          <w:p>
-            <w:pPr>
-              <w:keepNext w:val="0"/>
-              <w:keepLines w:val="0"/>
-              <w:pageBreakBefore w:val="0"/>
-              <w:widowControl w:val="0"/>
-              <w:pBdr>
-                <w:top w:space="0" w:sz="0" w:val="nil"/>
-                <w:left w:space="0" w:sz="0" w:val="nil"/>
-                <w:bottom w:space="0" w:sz="0" w:val="nil"/>
-                <w:right w:space="0" w:sz="0" w:val="nil"/>
-                <w:between w:space="0" w:sz="0" w:val="nil"/>
-              </w:pBdr>
-              <w:shd w:fill="auto" w:val="clear"/>
-              <w:spacing w:after="0" w:before="0" w:line="240" w:lineRule="auto"/>
-              <w:ind w:left="0" w:right="0" w:firstLine="0"/>
-              <w:jc w:val="left"/>
-              <w:rPr>
-                <w:rFonts w:ascii="Arial" w:cs="Arial" w:eastAsia="Arial" w:hAnsi="Arial"/>
-                <w:b w:val="0"/>
-                <w:i w:val="0"/>
-                <w:smallCaps w:val="0"/>
-                <w:strike w:val="0"/>
-                <w:color w:val="000000"/>
-                <w:sz w:val="16"/>
-                <w:szCs w:val="16"/>
-                <w:u w:val="none"/>
-                <w:shd w:fill="auto" w:val="clear"/>
-                <w:vertAlign w:val="baseline"/>
-              </w:rPr>
-            </w:pPr>
-            <w:r>
-              <w:rPr>
-                <w:rtl w:val="0"/>
-              </w:rPr>
-            </w:r>
-          </w:p>
-        </w:tc>
-        <w:tc>
-          <w:tcPr>
-            <w:tcBorders>
-              <w:bottom w:color="d4e5f4" w:space="0" w:sz="4" w:val="single"/>
-              <w:right w:color="d4e5f4" w:space="0" w:sz="4" w:val="single"/>
-            </w:tcBorders>
-            <w:tcMar>
-              <w:top w:w="85.0" w:type="dxa"/>
-              <w:left w:w="85.0" w:type="dxa"/>
-              <w:bottom w:w="85.0" w:type="dxa"/>
-              <w:right w:w="85.0" w:type="dxa"/>
-            </w:tcMar>
-            <w:vAlign w:val="center"/>
-          </w:tcPr>
-          <w:p>
-            <w:pPr>
-              <w:keepNext w:val="0"/>
-              <w:keepLines w:val="0"/>
-              <w:pageBreakBefore w:val="0"/>
-              <w:widowControl w:val="0"/>
-              <w:pBdr>
-                <w:top w:space="0" w:sz="0" w:val="nil"/>
-                <w:left w:space="0" w:sz="0" w:val="nil"/>
-                <w:bottom w:space="0" w:sz="0" w:val="nil"/>
-                <w:right w:space="0" w:sz="0" w:val="nil"/>
-                <w:between w:space="0" w:sz="0" w:val="nil"/>
-              </w:pBdr>
-              <w:shd w:fill="auto" w:val="clear"/>
-              <w:spacing w:after="0" w:before="0" w:line="240" w:lineRule="auto"/>
-              <w:ind w:left="0" w:right="0" w:firstLine="0"/>
-              <w:jc w:val="left"/>
-              <w:rPr>
-                <w:rFonts w:ascii="Arial" w:cs="Arial" w:eastAsia="Arial" w:hAnsi="Arial"/>
-                <w:b w:val="0"/>
-                <w:i w:val="0"/>
-                <w:smallCaps w:val="0"/>
-                <w:strike w:val="0"/>
-                <w:color w:val="000000"/>
-                <w:sz w:val="16"/>
-                <w:szCs w:val="16"/>
-                <w:u w:val="none"/>
-                <w:shd w:fill="auto" w:val="clear"/>
-                <w:vertAlign w:val="baseline"/>
-              </w:rPr>
-            </w:pPr>
-            <w:r>
-              <w:rPr>
-                <w:rFonts w:ascii="Arial" w:cs="Arial" w:eastAsia="Arial" w:hAnsi="Arial"/>
-                <w:b w:val="1"/>
-                <w:i w:val="0"/>
-                <w:smallCaps w:val="0"/>
-                <w:strike w:val="0"/>
-                <w:color w:val="000000"/>
-                <w:sz w:val="16"/>
-                <w:szCs w:val="16"/>
-                <w:u w:val="none"/>
-                <w:shd w:fill="auto" w:val="clear"/>
-                <w:vertAlign w:val="baseline"/>
-                <w:rtl w:val="0"/>
-              </w:rPr>
-              <w:t xml:space="preserve">chaussée de Sein</w:t>
-            </w:r>
-            <w:r>
-              <w:rPr>
-                <w:rFonts w:ascii="Arial" w:cs="Arial" w:eastAsia="Arial" w:hAnsi="Arial"/>
-                <w:b w:val="0"/>
-                <w:i w:val="0"/>
-                <w:smallCaps w:val="0"/>
-                <w:strike w:val="0"/>
-                <w:color w:val="000000"/>
-                <w:sz w:val="16"/>
-                <w:szCs w:val="16"/>
-                <w:u w:val="none"/>
-                <w:shd w:fill="auto" w:val="clear"/>
-                <w:vertAlign w:val="baseline"/>
-                <w:rtl w:val="0"/>
-              </w:rPr>
-              <w:t xml:space="preserve"> / Natura 2000</w:t>
-            </w:r>
-          </w:p>
-        </w:tc>
-        <w:tc>
-          <w:tcPr>
-            <w:shd w:fill="auto" w:val="clear"/>
-            <w:tcMar>
-              <w:top w:w="85.0" w:type="dxa"/>
-              <w:left w:w="85.0" w:type="dxa"/>
-              <w:bottom w:w="85.0" w:type="dxa"/>
-              <w:right w:w="85.0" w:type="dxa"/>
-            </w:tcMar>
-            <w:vAlign w:val="center"/>
-          </w:tcPr>
-          <w:p>
-            <w:pPr>
-              <w:keepNext w:val="0"/>
-              <w:keepLines w:val="0"/>
-              <w:pageBreakBefore w:val="0"/>
-              <w:widowControl w:val="0"/>
-              <w:pBdr>
-                <w:top w:space="0" w:sz="0" w:val="nil"/>
-                <w:left w:space="0" w:sz="0" w:val="nil"/>
-                <w:bottom w:space="0" w:sz="0" w:val="nil"/>
-                <w:right w:space="0" w:sz="0" w:val="nil"/>
-                <w:between w:space="0" w:sz="0" w:val="nil"/>
-              </w:pBdr>
-              <w:shd w:fill="auto" w:val="clear"/>
-              <w:spacing w:after="0" w:before="0" w:line="240" w:lineRule="auto"/>
-              <w:ind w:left="0" w:right="0" w:firstLine="0"/>
-              <w:jc w:val="left"/>
-              <w:rPr>
-                <w:rFonts w:ascii="Arial" w:cs="Arial" w:eastAsia="Arial" w:hAnsi="Arial"/>
-                <w:b w:val="0"/>
-                <w:i w:val="0"/>
-                <w:smallCaps w:val="0"/>
-                <w:strike w:val="0"/>
-                <w:color w:val="000000"/>
-                <w:sz w:val="16"/>
-                <w:szCs w:val="16"/>
-                <w:u w:val="none"/>
-                <w:shd w:fill="auto" w:val="clear"/>
-                <w:vertAlign w:val="baseline"/>
-              </w:rPr>
-            </w:pPr>
-            <w:r>
-              <w:rPr>
-                <w:rtl w:val="0"/>
-              </w:rPr>
-            </w:r>
-          </w:p>
-        </w:tc>
-        <w:tc>
-          <w:tcPr>
-            <w:tcMar>
-              <w:top w:w="85.0" w:type="dxa"/>
-              <w:left w:w="85.0" w:type="dxa"/>
-              <w:bottom w:w="85.0" w:type="dxa"/>
-              <w:right w:w="85.0" w:type="dxa"/>
-            </w:tcMar>
-            <w:vAlign w:val="center"/>
-          </w:tcPr>
-          <w:p>
-            <w:pPr>
-              <w:keepNext w:val="0"/>
-              <w:keepLines w:val="0"/>
-              <w:pageBreakBefore w:val="0"/>
-              <w:widowControl w:val="0"/>
-              <w:pBdr>
-                <w:top w:space="0" w:sz="0" w:val="nil"/>
-                <w:left w:space="0" w:sz="0" w:val="nil"/>
-                <w:bottom w:space="0" w:sz="0" w:val="nil"/>
-                <w:right w:space="0" w:sz="0" w:val="nil"/>
-                <w:between w:space="0" w:sz="0" w:val="nil"/>
-              </w:pBdr>
-              <w:shd w:fill="auto" w:val="clear"/>
-              <w:spacing w:after="0" w:before="0" w:line="240" w:lineRule="auto"/>
-              <w:ind w:left="0" w:right="0" w:firstLine="0"/>
-              <w:jc w:val="left"/>
-              <w:rPr>
-                <w:rFonts w:ascii="Arial" w:cs="Arial" w:eastAsia="Arial" w:hAnsi="Arial"/>
-                <w:b w:val="0"/>
-                <w:i w:val="0"/>
-                <w:smallCaps w:val="0"/>
-                <w:strike w:val="0"/>
-                <w:color w:val="000000"/>
-                <w:sz w:val="16"/>
-                <w:szCs w:val="16"/>
-                <w:u w:val="none"/>
-                <w:shd w:fill="auto" w:val="clear"/>
-                <w:vertAlign w:val="baseline"/>
-              </w:rPr>
-            </w:pPr>
-            <w:r>
-              <w:rPr>
-                <w:rtl w:val="0"/>
-              </w:rPr>
-            </w:r>
-          </w:p>
-        </w:tc>
-      </w:tr>
-      <w:tr>
-        <w:trPr>
-          <w:cantSplit w:val="0"/>
-          <w:tblHeader w:val="0"/>
-        </w:trPr>
-        <w:tc>
-          <w:tcPr>
-            <w:tcBorders>
-              <w:left w:color="707785" w:space="0" w:sz="4" w:val="single"/>
-              <w:bottom w:color="707785" w:space="0" w:sz="4" w:val="single"/>
-              <w:right w:color="707785" w:space="0" w:sz="4" w:val="single"/>
-            </w:tcBorders>
-            <w:shd w:fill="d6df64" w:val="clear"/>
-            <w:tcMar>
-              <w:top w:w="85.0" w:type="dxa"/>
-              <w:left w:w="85.0" w:type="dxa"/>
-              <w:bottom w:w="85.0" w:type="dxa"/>
-              <w:right w:w="85.0" w:type="dxa"/>
-            </w:tcMar>
-          </w:tcPr>
-          <w:p>
-            <w:pPr>
-              <w:keepNext w:val="0"/>
-              <w:keepLines w:val="0"/>
-              <w:pageBreakBefore w:val="0"/>
-              <w:widowControl w:val="0"/>
-              <w:pBdr>
-                <w:top w:space="0" w:sz="0" w:val="nil"/>
-                <w:left w:space="0" w:sz="0" w:val="nil"/>
-                <w:bottom w:space="0" w:sz="0" w:val="nil"/>
-                <w:right w:space="0" w:sz="0" w:val="nil"/>
-                <w:between w:space="0" w:sz="0" w:val="nil"/>
-              </w:pBdr>
-              <w:shd w:fill="auto" w:val="clear"/>
-              <w:spacing w:after="0" w:before="0" w:line="240" w:lineRule="auto"/>
-              <w:ind w:left="0" w:right="0" w:firstLine="0"/>
-              <w:jc w:val="left"/>
-              <w:rPr>
-                <w:rFonts w:ascii="Arial" w:cs="Arial" w:eastAsia="Arial" w:hAnsi="Arial"/>
-                <w:b w:val="1"/>
-                <w:i w:val="0"/>
-                <w:smallCaps w:val="0"/>
-                <w:strike w:val="0"/>
-                <w:color w:val="000000"/>
-                <w:sz w:val="16"/>
-                <w:szCs w:val="16"/>
-                <w:u w:val="none"/>
-                <w:shd w:fill="auto" w:val="clear"/>
-                <w:vertAlign w:val="baseline"/>
-              </w:rPr>
-            </w:pPr>
-            <w:r>
-              <w:rPr>
-                <w:rtl w:val="0"/>
-              </w:rPr>
-            </w:r>
-          </w:p>
-        </w:tc>
-        <w:tc>
-          <w:tcPr>
-            <w:tcBorders>
-              <w:bottom w:color="d4e5f4" w:space="0" w:sz="4" w:val="single"/>
-              <w:right w:color="d4e5f4" w:space="0" w:sz="4" w:val="single"/>
-            </w:tcBorders>
-            <w:tcMar>
-              <w:top w:w="85.0" w:type="dxa"/>
-              <w:left w:w="85.0" w:type="dxa"/>
-              <w:bottom w:w="85.0" w:type="dxa"/>
-              <w:right w:w="85.0" w:type="dxa"/>
-            </w:tcMar>
-          </w:tcPr>
-          <w:p>
-            <w:pPr>
-              <w:keepNext w:val="0"/>
-              <w:keepLines w:val="0"/>
-              <w:pageBreakBefore w:val="0"/>
-              <w:widowControl w:val="0"/>
-              <w:pBdr>
-                <w:top w:space="0" w:sz="0" w:val="nil"/>
-                <w:left w:space="0" w:sz="0" w:val="nil"/>
-                <w:bottom w:space="0" w:sz="0" w:val="nil"/>
-                <w:right w:space="0" w:sz="0" w:val="nil"/>
-                <w:between w:space="0" w:sz="0" w:val="nil"/>
-              </w:pBdr>
-              <w:shd w:fill="auto" w:val="clear"/>
-              <w:spacing w:after="0" w:before="0" w:line="240" w:lineRule="auto"/>
-              <w:ind w:left="0" w:right="0" w:firstLine="0"/>
-              <w:jc w:val="left"/>
-              <w:rPr>
-                <w:rFonts w:ascii="Arial" w:cs="Arial" w:eastAsia="Arial" w:hAnsi="Arial"/>
-                <w:b w:val="1"/>
-                <w:i w:val="0"/>
-                <w:smallCaps w:val="0"/>
-                <w:strike w:val="0"/>
-                <w:color w:val="000000"/>
-                <w:sz w:val="16"/>
-                <w:szCs w:val="16"/>
-                <w:u w:val="none"/>
-                <w:shd w:fill="auto" w:val="clear"/>
-                <w:vertAlign w:val="baseline"/>
-              </w:rPr>
-            </w:pPr>
-            <w:r>
-              <w:rPr>
-                <w:rFonts w:ascii="Arial" w:cs="Arial" w:eastAsia="Arial" w:hAnsi="Arial"/>
-                <w:b w:val="1"/>
-                <w:i w:val="0"/>
-                <w:smallCaps w:val="0"/>
-                <w:strike w:val="0"/>
-                <w:color w:val="000000"/>
-                <w:sz w:val="16"/>
-                <w:szCs w:val="16"/>
-                <w:u w:val="none"/>
-                <w:shd w:fill="auto" w:val="clear"/>
-                <w:vertAlign w:val="baseline"/>
-                <w:rtl w:val="0"/>
-              </w:rPr>
-              <w:t xml:space="preserve">Iroise </w:t>
-            </w:r>
-            <w:r>
-              <w:rPr>
-                <w:rFonts w:ascii="Arial" w:cs="Arial" w:eastAsia="Arial" w:hAnsi="Arial"/>
-                <w:b w:val="0"/>
-                <w:i w:val="0"/>
-                <w:smallCaps w:val="0"/>
-                <w:strike w:val="0"/>
-                <w:color w:val="000000"/>
-                <w:sz w:val="16"/>
-                <w:szCs w:val="16"/>
-                <w:u w:val="none"/>
-                <w:shd w:fill="auto" w:val="clear"/>
-                <w:vertAlign w:val="baseline"/>
-                <w:rtl w:val="0"/>
-              </w:rPr>
-              <w:t xml:space="preserve">/ Réserve naturelle</w:t>
-            </w:r>
-            <w:r>
-              <w:rPr>
-                <w:rtl w:val="0"/>
-              </w:rPr>
-            </w:r>
-          </w:p>
-        </w:tc>
-        <w:tc>
-          <w:tcPr>
-            <w:shd w:fill="auto" w:val="clear"/>
-            <w:tcMar>
-              <w:top w:w="85.0" w:type="dxa"/>
-              <w:left w:w="85.0" w:type="dxa"/>
-              <w:bottom w:w="85.0" w:type="dxa"/>
-              <w:right w:w="85.0" w:type="dxa"/>
-            </w:tcMar>
-          </w:tcPr>
-          <w:p>
-            <w:pPr>
-              <w:keepNext w:val="0"/>
-              <w:keepLines w:val="0"/>
-              <w:pageBreakBefore w:val="0"/>
-              <w:widowControl w:val="0"/>
-              <w:pBdr>
-                <w:top w:space="0" w:sz="0" w:val="nil"/>
-                <w:left w:space="0" w:sz="0" w:val="nil"/>
-                <w:bottom w:space="0" w:sz="0" w:val="nil"/>
-                <w:right w:space="0" w:sz="0" w:val="nil"/>
-                <w:between w:space="0" w:sz="0" w:val="nil"/>
-              </w:pBdr>
-              <w:shd w:fill="auto" w:val="clear"/>
-              <w:spacing w:after="0" w:before="0" w:line="240" w:lineRule="auto"/>
-              <w:ind w:left="0" w:right="0" w:firstLine="0"/>
-              <w:jc w:val="left"/>
-              <w:rPr>
-                <w:rFonts w:ascii="Arial" w:cs="Arial" w:eastAsia="Arial" w:hAnsi="Arial"/>
-                <w:b w:val="1"/>
-                <w:i w:val="0"/>
-                <w:smallCaps w:val="0"/>
-                <w:strike w:val="0"/>
-                <w:color w:val="000000"/>
-                <w:sz w:val="16"/>
-                <w:szCs w:val="16"/>
-                <w:u w:val="none"/>
-                <w:shd w:fill="auto" w:val="clear"/>
-                <w:vertAlign w:val="baseline"/>
-              </w:rPr>
-            </w:pPr>
-            <w:r>
-              <w:rPr>
-                <w:rtl w:val="0"/>
-              </w:rPr>
-            </w:r>
-          </w:p>
-        </w:tc>
-        <w:tc>
-          <w:tcPr>
-            <w:tcMar>
-              <w:top w:w="85.0" w:type="dxa"/>
-              <w:left w:w="85.0" w:type="dxa"/>
-              <w:bottom w:w="85.0" w:type="dxa"/>
-              <w:right w:w="85.0" w:type="dxa"/>
-            </w:tcMar>
-          </w:tcPr>
-          <w:p>
-            <w:pPr>
-              <w:keepNext w:val="0"/>
-              <w:keepLines w:val="0"/>
-              <w:pageBreakBefore w:val="0"/>
-              <w:widowControl w:val="0"/>
-              <w:pBdr>
-                <w:top w:space="0" w:sz="0" w:val="nil"/>
-                <w:left w:space="0" w:sz="0" w:val="nil"/>
-                <w:bottom w:space="0" w:sz="0" w:val="nil"/>
-                <w:right w:space="0" w:sz="0" w:val="nil"/>
-                <w:between w:space="0" w:sz="0" w:val="nil"/>
-              </w:pBdr>
-              <w:shd w:fill="auto" w:val="clear"/>
-              <w:spacing w:after="0" w:before="0" w:line="240" w:lineRule="auto"/>
-              <w:ind w:left="0" w:right="0" w:firstLine="0"/>
-              <w:jc w:val="left"/>
-              <w:rPr>
-                <w:rFonts w:ascii="Arial" w:cs="Arial" w:eastAsia="Arial" w:hAnsi="Arial"/>
-                <w:b w:val="1"/>
-                <w:i w:val="0"/>
-                <w:smallCaps w:val="0"/>
-                <w:strike w:val="0"/>
-                <w:color w:val="000000"/>
-                <w:sz w:val="16"/>
-                <w:szCs w:val="16"/>
-                <w:u w:val="none"/>
-                <w:shd w:fill="auto" w:val="clear"/>
-                <w:vertAlign w:val="baseline"/>
-              </w:rPr>
-            </w:pPr>
-            <w:r>
-              <w:rPr>
-                <w:rtl w:val="0"/>
-              </w:rPr>
-            </w:r>
-          </w:p>
-        </w:tc>
-      </w:tr>
-      <w:tr>
-        <w:trPr>
-          <w:cantSplit w:val="0"/>
-          <w:tblHeader w:val="0"/>
-        </w:trPr>
-        <w:tc>
-          <w:tcPr>
-            <w:tcBorders>
-              <w:left w:color="707785" w:space="0" w:sz="4" w:val="single"/>
-              <w:bottom w:color="707785" w:space="0" w:sz="4" w:val="single"/>
-              <w:right w:color="707785" w:space="0" w:sz="4" w:val="single"/>
-            </w:tcBorders>
-            <w:shd w:fill="d6df64" w:val="clear"/>
-            <w:tcMar>
-              <w:top w:w="85.0" w:type="dxa"/>
-              <w:left w:w="85.0" w:type="dxa"/>
-              <w:bottom w:w="85.0" w:type="dxa"/>
-              <w:right w:w="85.0" w:type="dxa"/>
-            </w:tcMar>
-          </w:tcPr>
-          <w:p>
-            <w:pPr>
-              <w:keepNext w:val="0"/>
-              <w:keepLines w:val="0"/>
-              <w:pageBreakBefore w:val="0"/>
-              <w:widowControl w:val="0"/>
-              <w:pBdr>
-                <w:top w:space="0" w:sz="0" w:val="nil"/>
-                <w:left w:space="0" w:sz="0" w:val="nil"/>
-                <w:bottom w:space="0" w:sz="0" w:val="nil"/>
-                <w:right w:space="0" w:sz="0" w:val="nil"/>
-                <w:between w:space="0" w:sz="0" w:val="nil"/>
-              </w:pBdr>
-              <w:shd w:fill="auto" w:val="clear"/>
-              <w:spacing w:after="0" w:before="0" w:line="240" w:lineRule="auto"/>
-              <w:ind w:left="0" w:right="0" w:firstLine="0"/>
-              <w:jc w:val="left"/>
-              <w:rPr>
-                <w:rFonts w:ascii="Arial" w:cs="Arial" w:eastAsia="Arial" w:hAnsi="Arial"/>
-                <w:b w:val="0"/>
-                <w:i w:val="0"/>
-                <w:smallCaps w:val="0"/>
-                <w:strike w:val="0"/>
-                <w:color w:val="000000"/>
-                <w:sz w:val="16"/>
-                <w:szCs w:val="16"/>
-                <w:u w:val="none"/>
-                <w:shd w:fill="auto" w:val="clear"/>
-                <w:vertAlign w:val="baseline"/>
-              </w:rPr>
-            </w:pPr>
-            <w:r>
-              <w:rPr>
-                <w:rtl w:val="0"/>
-              </w:rPr>
-            </w:r>
-          </w:p>
-        </w:tc>
-        <w:tc>
-          <w:tcPr>
-            <w:tcBorders>
-              <w:bottom w:color="d4e5f4" w:space="0" w:sz="4" w:val="single"/>
-              <w:right w:color="d4e5f4" w:space="0" w:sz="4" w:val="single"/>
-            </w:tcBorders>
-            <w:tcMar>
-              <w:top w:w="85.0" w:type="dxa"/>
-              <w:left w:w="85.0" w:type="dxa"/>
-              <w:bottom w:w="85.0" w:type="dxa"/>
-              <w:right w:w="85.0" w:type="dxa"/>
-            </w:tcMar>
-          </w:tcPr>
-          <w:p>
-            <w:pPr>
-              <w:keepNext w:val="0"/>
-              <w:keepLines w:val="0"/>
-              <w:pageBreakBefore w:val="0"/>
-              <w:widowControl w:val="0"/>
-              <w:pBdr>
-                <w:top w:space="0" w:sz="0" w:val="nil"/>
-                <w:left w:space="0" w:sz="0" w:val="nil"/>
-                <w:bottom w:space="0" w:sz="0" w:val="nil"/>
-                <w:right w:space="0" w:sz="0" w:val="nil"/>
-                <w:between w:space="0" w:sz="0" w:val="nil"/>
-              </w:pBdr>
-              <w:shd w:fill="auto" w:val="clear"/>
-              <w:spacing w:after="0" w:before="0" w:line="240" w:lineRule="auto"/>
-              <w:ind w:left="0" w:right="0" w:firstLine="0"/>
-              <w:jc w:val="left"/>
-              <w:rPr>
-                <w:rFonts w:ascii="Arial" w:cs="Arial" w:eastAsia="Arial" w:hAnsi="Arial"/>
-                <w:b w:val="0"/>
-                <w:i w:val="0"/>
-                <w:smallCaps w:val="0"/>
-                <w:strike w:val="0"/>
-                <w:color w:val="000000"/>
-                <w:sz w:val="16"/>
-                <w:szCs w:val="16"/>
-                <w:u w:val="none"/>
-                <w:shd w:fill="auto" w:val="clear"/>
-                <w:vertAlign w:val="baseline"/>
-              </w:rPr>
-            </w:pPr>
-            <w:r>
-              <w:rPr>
-                <w:rFonts w:ascii="Arial" w:cs="Arial" w:eastAsia="Arial" w:hAnsi="Arial"/>
-                <w:b w:val="1"/>
-                <w:i w:val="0"/>
-                <w:smallCaps w:val="0"/>
-                <w:strike w:val="0"/>
-                <w:color w:val="000000"/>
-                <w:sz w:val="16"/>
-                <w:szCs w:val="16"/>
-                <w:u w:val="none"/>
-                <w:shd w:fill="auto" w:val="clear"/>
-                <w:vertAlign w:val="baseline"/>
-                <w:rtl w:val="0"/>
-              </w:rPr>
-              <w:t xml:space="preserve">presqu'île de Crozon </w:t>
-            </w:r>
-            <w:r>
-              <w:rPr>
-                <w:rFonts w:ascii="Arial" w:cs="Arial" w:eastAsia="Arial" w:hAnsi="Arial"/>
-                <w:b w:val="0"/>
-                <w:i w:val="0"/>
-                <w:smallCaps w:val="0"/>
-                <w:strike w:val="0"/>
-                <w:color w:val="000000"/>
-                <w:sz w:val="16"/>
-                <w:szCs w:val="16"/>
-                <w:u w:val="none"/>
-                <w:shd w:fill="auto" w:val="clear"/>
-                <w:vertAlign w:val="baseline"/>
-                <w:rtl w:val="0"/>
-              </w:rPr>
-              <w:t xml:space="preserve">/ Natura 2000</w:t>
-            </w:r>
-          </w:p>
-        </w:tc>
-        <w:tc>
-          <w:tcPr>
-            <w:shd w:fill="auto" w:val="clear"/>
-            <w:tcMar>
-              <w:top w:w="85.0" w:type="dxa"/>
-              <w:left w:w="85.0" w:type="dxa"/>
-              <w:bottom w:w="85.0" w:type="dxa"/>
-              <w:right w:w="85.0" w:type="dxa"/>
-            </w:tcMar>
-          </w:tcPr>
-          <w:p>
-            <w:pPr>
-              <w:keepNext w:val="0"/>
-              <w:keepLines w:val="0"/>
-              <w:pageBreakBefore w:val="0"/>
-              <w:widowControl w:val="0"/>
-              <w:pBdr>
-                <w:top w:space="0" w:sz="0" w:val="nil"/>
-                <w:left w:space="0" w:sz="0" w:val="nil"/>
-                <w:bottom w:space="0" w:sz="0" w:val="nil"/>
-                <w:right w:space="0" w:sz="0" w:val="nil"/>
-                <w:between w:space="0" w:sz="0" w:val="nil"/>
-              </w:pBdr>
-              <w:shd w:fill="auto" w:val="clear"/>
-              <w:spacing w:after="0" w:before="0" w:line="240" w:lineRule="auto"/>
-              <w:ind w:left="0" w:right="0" w:firstLine="0"/>
-              <w:jc w:val="left"/>
-              <w:rPr>
-                <w:rFonts w:ascii="Arial" w:cs="Arial" w:eastAsia="Arial" w:hAnsi="Arial"/>
-                <w:b w:val="0"/>
-                <w:i w:val="0"/>
-                <w:smallCaps w:val="0"/>
-                <w:strike w:val="0"/>
-                <w:color w:val="000000"/>
-                <w:sz w:val="16"/>
-                <w:szCs w:val="16"/>
-                <w:u w:val="none"/>
-                <w:shd w:fill="auto" w:val="clear"/>
-                <w:vertAlign w:val="baseline"/>
-              </w:rPr>
-            </w:pPr>
-            <w:r>
-              <w:rPr>
-                <w:rtl w:val="0"/>
-              </w:rPr>
-            </w:r>
-          </w:p>
-        </w:tc>
-        <w:tc>
-          <w:tcPr>
-            <w:tcMar>
-              <w:top w:w="85.0" w:type="dxa"/>
-              <w:left w:w="85.0" w:type="dxa"/>
-              <w:bottom w:w="85.0" w:type="dxa"/>
-              <w:right w:w="85.0" w:type="dxa"/>
-            </w:tcMar>
-          </w:tcPr>
-          <w:p>
-            <w:pPr>
-              <w:keepNext w:val="0"/>
-              <w:keepLines w:val="0"/>
-              <w:pageBreakBefore w:val="0"/>
-              <w:widowControl w:val="0"/>
-              <w:pBdr>
-                <w:top w:space="0" w:sz="0" w:val="nil"/>
-                <w:left w:space="0" w:sz="0" w:val="nil"/>
-                <w:bottom w:space="0" w:sz="0" w:val="nil"/>
-                <w:right w:space="0" w:sz="0" w:val="nil"/>
-                <w:between w:space="0" w:sz="0" w:val="nil"/>
-              </w:pBdr>
-              <w:shd w:fill="auto" w:val="clear"/>
-              <w:spacing w:after="0" w:before="0" w:line="240" w:lineRule="auto"/>
-              <w:ind w:left="0" w:right="0" w:firstLine="0"/>
-              <w:jc w:val="left"/>
-              <w:rPr>
-                <w:rFonts w:ascii="Arial" w:cs="Arial" w:eastAsia="Arial" w:hAnsi="Arial"/>
-                <w:b w:val="0"/>
-                <w:i w:val="0"/>
-                <w:smallCaps w:val="0"/>
-                <w:strike w:val="0"/>
-                <w:color w:val="000000"/>
-                <w:sz w:val="16"/>
-                <w:szCs w:val="16"/>
-                <w:u w:val="none"/>
-                <w:shd w:fill="auto" w:val="clear"/>
-                <w:vertAlign w:val="baseline"/>
-              </w:rPr>
-            </w:pPr>
-            <w:r>
-              <w:rPr>
-                <w:rtl w:val="0"/>
-              </w:rPr>
-            </w:r>
-          </w:p>
-        </w:tc>
-      </w:tr>
-      <w:tr>
-        <w:trPr>
-          <w:cantSplit w:val="0"/>
-          <w:tblHeader w:val="0"/>
-        </w:trPr>
-        <w:tc>
-          <w:tcPr>
-            <w:tcBorders>
-              <w:left w:color="707785" w:space="0" w:sz="4" w:val="single"/>
-              <w:bottom w:color="707785" w:space="0" w:sz="4" w:val="single"/>
-              <w:right w:color="707785" w:space="0" w:sz="4" w:val="single"/>
-            </w:tcBorders>
-            <w:shd w:fill="d6df64" w:val="clear"/>
-            <w:tcMar>
-              <w:top w:w="85.0" w:type="dxa"/>
-              <w:left w:w="85.0" w:type="dxa"/>
-              <w:bottom w:w="85.0" w:type="dxa"/>
-              <w:right w:w="85.0" w:type="dxa"/>
-            </w:tcMar>
-          </w:tcPr>
-          <w:p>
-            <w:pPr>
-              <w:keepNext w:val="0"/>
-              <w:keepLines w:val="0"/>
-              <w:pageBreakBefore w:val="0"/>
-              <w:widowControl w:val="0"/>
-              <w:pBdr>
-                <w:top w:space="0" w:sz="0" w:val="nil"/>
-                <w:left w:space="0" w:sz="0" w:val="nil"/>
-                <w:bottom w:space="0" w:sz="0" w:val="nil"/>
-                <w:right w:space="0" w:sz="0" w:val="nil"/>
-                <w:between w:space="0" w:sz="0" w:val="nil"/>
-              </w:pBdr>
-              <w:shd w:fill="auto" w:val="clear"/>
-              <w:spacing w:after="0" w:before="0" w:line="240" w:lineRule="auto"/>
-              <w:ind w:left="0" w:right="0" w:firstLine="0"/>
-              <w:jc w:val="left"/>
-              <w:rPr>
-                <w:rFonts w:ascii="Arial" w:cs="Arial" w:eastAsia="Arial" w:hAnsi="Arial"/>
-                <w:b w:val="0"/>
-                <w:i w:val="0"/>
-                <w:smallCaps w:val="0"/>
-                <w:strike w:val="0"/>
-                <w:color w:val="000000"/>
-                <w:sz w:val="16"/>
-                <w:szCs w:val="16"/>
-                <w:u w:val="none"/>
-                <w:shd w:fill="auto" w:val="clear"/>
-                <w:vertAlign w:val="baseline"/>
-              </w:rPr>
-            </w:pPr>
-            <w:r>
-              <w:rPr>
-                <w:rtl w:val="0"/>
-              </w:rPr>
-            </w:r>
-          </w:p>
-        </w:tc>
-        <w:tc>
-          <w:tcPr>
-            <w:tcBorders>
-              <w:bottom w:color="d4e5f4" w:space="0" w:sz="4" w:val="single"/>
-              <w:right w:color="d4e5f4" w:space="0" w:sz="4" w:val="single"/>
-            </w:tcBorders>
-            <w:tcMar>
-              <w:top w:w="85.0" w:type="dxa"/>
-              <w:left w:w="85.0" w:type="dxa"/>
-              <w:bottom w:w="85.0" w:type="dxa"/>
-              <w:right w:w="85.0" w:type="dxa"/>
-            </w:tcMar>
-          </w:tcPr>
-          <w:p>
-            <w:pPr>
-              <w:keepNext w:val="0"/>
-              <w:keepLines w:val="0"/>
-              <w:pageBreakBefore w:val="0"/>
-              <w:widowControl w:val="0"/>
-              <w:pBdr>
-                <w:top w:space="0" w:sz="0" w:val="nil"/>
-                <w:left w:space="0" w:sz="0" w:val="nil"/>
-                <w:bottom w:space="0" w:sz="0" w:val="nil"/>
-                <w:right w:space="0" w:sz="0" w:val="nil"/>
-                <w:between w:space="0" w:sz="0" w:val="nil"/>
-              </w:pBdr>
-              <w:shd w:fill="auto" w:val="clear"/>
-              <w:spacing w:after="0" w:before="0" w:line="240" w:lineRule="auto"/>
-              <w:ind w:left="0" w:right="0" w:firstLine="0"/>
-              <w:jc w:val="left"/>
-              <w:rPr>
-                <w:rFonts w:ascii="Arial" w:cs="Arial" w:eastAsia="Arial" w:hAnsi="Arial"/>
-                <w:b w:val="0"/>
-                <w:i w:val="0"/>
-                <w:smallCaps w:val="0"/>
-                <w:strike w:val="0"/>
-                <w:color w:val="000000"/>
-                <w:sz w:val="16"/>
-                <w:szCs w:val="16"/>
-                <w:u w:val="none"/>
-                <w:shd w:fill="auto" w:val="clear"/>
-                <w:vertAlign w:val="baseline"/>
-              </w:rPr>
-            </w:pPr>
-            <w:r>
-              <w:rPr>
-                <w:rFonts w:ascii="Arial" w:cs="Arial" w:eastAsia="Arial" w:hAnsi="Arial"/>
-                <w:b w:val="1"/>
-                <w:i w:val="0"/>
-                <w:smallCaps w:val="0"/>
-                <w:strike w:val="0"/>
-                <w:color w:val="000000"/>
-                <w:sz w:val="16"/>
-                <w:szCs w:val="16"/>
-                <w:u w:val="none"/>
-                <w:shd w:fill="auto" w:val="clear"/>
-                <w:vertAlign w:val="baseline"/>
-                <w:rtl w:val="0"/>
-              </w:rPr>
-              <w:t xml:space="preserve">Baie d'Audierne</w:t>
-            </w:r>
-            <w:r>
-              <w:rPr>
-                <w:rFonts w:ascii="Arial" w:cs="Arial" w:eastAsia="Arial" w:hAnsi="Arial"/>
-                <w:b w:val="0"/>
-                <w:i w:val="0"/>
-                <w:smallCaps w:val="0"/>
-                <w:strike w:val="0"/>
-                <w:color w:val="000000"/>
-                <w:sz w:val="16"/>
-                <w:szCs w:val="16"/>
-                <w:u w:val="none"/>
-                <w:shd w:fill="auto" w:val="clear"/>
-                <w:vertAlign w:val="baseline"/>
-                <w:rtl w:val="0"/>
-              </w:rPr>
-              <w:t xml:space="preserve"> / Instruments internationaux</w:t>
-            </w:r>
-          </w:p>
-        </w:tc>
-        <w:tc>
-          <w:tcPr>
-            <w:shd w:fill="auto" w:val="clear"/>
-            <w:tcMar>
-              <w:top w:w="85.0" w:type="dxa"/>
-              <w:left w:w="85.0" w:type="dxa"/>
-              <w:bottom w:w="85.0" w:type="dxa"/>
-              <w:right w:w="85.0" w:type="dxa"/>
-            </w:tcMar>
-          </w:tcPr>
-          <w:p>
-            <w:pPr>
-              <w:keepNext w:val="0"/>
-              <w:keepLines w:val="0"/>
-              <w:pageBreakBefore w:val="0"/>
-              <w:widowControl w:val="0"/>
-              <w:pBdr>
-                <w:top w:space="0" w:sz="0" w:val="nil"/>
-                <w:left w:space="0" w:sz="0" w:val="nil"/>
-                <w:bottom w:space="0" w:sz="0" w:val="nil"/>
-                <w:right w:space="0" w:sz="0" w:val="nil"/>
-                <w:between w:space="0" w:sz="0" w:val="nil"/>
-              </w:pBdr>
-              <w:shd w:fill="auto" w:val="clear"/>
-              <w:spacing w:after="0" w:before="0" w:line="240" w:lineRule="auto"/>
-              <w:ind w:left="0" w:right="0" w:firstLine="0"/>
-              <w:jc w:val="left"/>
-              <w:rPr>
-                <w:rFonts w:ascii="Arial" w:cs="Arial" w:eastAsia="Arial" w:hAnsi="Arial"/>
-                <w:b w:val="0"/>
-                <w:i w:val="0"/>
-                <w:smallCaps w:val="0"/>
-                <w:strike w:val="0"/>
-                <w:color w:val="000000"/>
-                <w:sz w:val="16"/>
-                <w:szCs w:val="16"/>
-                <w:u w:val="none"/>
-                <w:shd w:fill="auto" w:val="clear"/>
-                <w:vertAlign w:val="baseline"/>
-              </w:rPr>
-            </w:pPr>
-            <w:r>
-              <w:rPr>
-                <w:rtl w:val="0"/>
-              </w:rPr>
-            </w:r>
-          </w:p>
-        </w:tc>
-        <w:tc>
-          <w:tcPr>
-            <w:tcMar>
-              <w:top w:w="85.0" w:type="dxa"/>
-              <w:left w:w="85.0" w:type="dxa"/>
-              <w:bottom w:w="85.0" w:type="dxa"/>
-              <w:right w:w="85.0" w:type="dxa"/>
-            </w:tcMar>
-          </w:tcPr>
-          <w:p>
-            <w:pPr>
-              <w:keepNext w:val="0"/>
-              <w:keepLines w:val="0"/>
-              <w:pageBreakBefore w:val="0"/>
-              <w:widowControl w:val="0"/>
-              <w:pBdr>
-                <w:top w:space="0" w:sz="0" w:val="nil"/>
-                <w:left w:space="0" w:sz="0" w:val="nil"/>
-                <w:bottom w:space="0" w:sz="0" w:val="nil"/>
-                <w:right w:space="0" w:sz="0" w:val="nil"/>
-                <w:between w:space="0" w:sz="0" w:val="nil"/>
-              </w:pBdr>
-              <w:shd w:fill="auto" w:val="clear"/>
-              <w:spacing w:after="0" w:before="0" w:line="240" w:lineRule="auto"/>
-              <w:ind w:left="0" w:right="0" w:firstLine="0"/>
-              <w:jc w:val="left"/>
-              <w:rPr>
-                <w:rFonts w:ascii="Arial" w:cs="Arial" w:eastAsia="Arial" w:hAnsi="Arial"/>
-                <w:b w:val="0"/>
-                <w:i w:val="0"/>
-                <w:smallCaps w:val="0"/>
-                <w:strike w:val="0"/>
-                <w:color w:val="000000"/>
-                <w:sz w:val="16"/>
-                <w:szCs w:val="16"/>
-                <w:u w:val="none"/>
-                <w:shd w:fill="auto" w:val="clear"/>
-                <w:vertAlign w:val="baseline"/>
-              </w:rPr>
-            </w:pPr>
-            <w:r>
-              <w:rPr>
-                <w:rtl w:val="0"/>
-              </w:rPr>
-            </w:r>
-          </w:p>
-        </w:tc>
-      </w:tr>
-    </w:tbl>
-    <w:p>
-      <w:pPr>
-        <w:keepNext w:val="0"/>
-        <w:keepLines w:val="0"/>
-        <w:pageBreakBefore w:val="0"/>
-        <w:widowControl w:val="1"/>
-        <w:pBdr>
-          <w:top w:space="0" w:sz="0" w:val="nil"/>
-          <w:left w:space="0" w:sz="0" w:val="nil"/>
-          <w:bottom w:space="0" w:sz="0" w:val="nil"/>
-          <w:right w:space="0" w:sz="0" w:val="nil"/>
-          <w:between w:space="0" w:sz="0" w:val="nil"/>
-        </w:pBdr>
-        <w:shd w:fill="auto" w:val="clear"/>
-        <w:spacing w:after="0" w:before="0" w:line="240" w:lineRule="auto"/>
-        <w:ind w:left="0" w:right="0" w:firstLine="0"/>
-        <w:jc w:val="left"/>
+        <w:spacing w:after="240" w:before="240" w:lineRule="auto"/>
+        <w:rPr>
+          <w:rFonts w:ascii="Arial" w:cs="Arial" w:eastAsia="Arial" w:hAnsi="Arial"/>
+        </w:rPr>
+      </w:pPr>
+      <w:r>
+        <w:rPr>
+          <w:rtl w:val="0"/>
+        </w:rPr>
+      </w:r>
+    </w:p>
+    <w:p>
+      <w:pPr>
+        <w:spacing w:after="240" w:before="240" w:lineRule="auto"/>
+        <w:rPr>
+          <w:rFonts w:ascii="Arial" w:cs="Arial" w:eastAsia="Arial" w:hAnsi="Arial"/>
+        </w:rPr>
+      </w:pPr>
+      <w:r>
+        <w:rPr>
+          <w:rFonts w:ascii="Arial" w:cs="Arial" w:eastAsia="Arial" w:hAnsi="Arial"/>
+          <w:rtl w:val="0"/>
+        </w:rPr>
+        <w:t xml:space="preserve">${AMPsTable}</w:t>
+      </w:r>
+    </w:p>
+    <w:p>
+      <w:pPr>
+        <w:spacing w:after="240" w:before="240" w:lineRule="auto"/>
+        <w:rPr>
+          <w:rFonts w:ascii="Arial" w:cs="Arial" w:eastAsia="Arial" w:hAnsi="Arial"/>
+        </w:rPr>
+      </w:pPr>
+      <w:r>
+        <w:rPr>
+          <w:rtl w:val="0"/>
+        </w:rPr>
+      </w:r>
+    </w:p>
+    <w:p>
+      <w:pPr>
+        <w:spacing w:after="240" w:before="240" w:lineRule="auto"/>
+        <w:rPr>
+          <w:rFonts w:ascii="Arial" w:cs="Arial" w:eastAsia="Arial" w:hAnsi="Arial"/>
+        </w:rPr>
+      </w:pPr>
+      <w:r>
+        <w:rPr>
+          <w:rFonts w:ascii="Arial" w:cs="Arial" w:eastAsia="Arial" w:hAnsi="Arial"/>
+          <w:rtl w:val="0"/>
+        </w:rPr>
+        <w:t xml:space="preserve">${vigilanceAreasTable}</w:t>
+      </w:r>
+    </w:p>
+    <w:p>
+      <w:pPr>
+        <w:spacing w:after="240" w:before="240" w:lineRule="auto"/>
+        <w:rPr>
+          <w:rFonts w:ascii="Arial" w:cs="Arial" w:eastAsia="Arial" w:hAnsi="Arial"/>
+        </w:rPr>
+      </w:pPr>
+      <w:r>
+        <w:br w:type="page"/>
+      </w:r>
+      <w:r>
+        <w:rPr>
+          <w:rtl w:val="0"/>
+        </w:rPr>
+      </w:r>
+    </w:p>
+    <w:p>
+      <w:pPr>
+        <w:spacing w:after="240" w:before="240" w:lineRule="auto"/>
+        <w:rPr>
+          <w:rFonts w:ascii="Arial" w:cs="Arial" w:eastAsia="Arial" w:hAnsi="Arial"/>
+          <w:b w:val="0"/>
+          <w:i w:val="0"/>
+          <w:smallCaps w:val="0"/>
+          <w:strike w:val="0"/>
+          <w:color w:val="515151"/>
+          <w:sz w:val="28"/>
+          <w:szCs w:val="28"/>
+          <w:u w:val="none"/>
+          <w:shd w:fill="auto" w:val="clear"/>
+          <w:vertAlign w:val="baseline"/>
+        </w:rPr>
+      </w:pPr>
+      <w:r>
         <w:rPr>
           <w:rFonts w:ascii="Arial" w:cs="Arial" w:eastAsia="Arial" w:hAnsi="Arial"/>
           <w:b w:val="0"/>
@@ -4991,31 +3252,11 @@
           <w:u w:val="none"/>
           <w:shd w:fill="auto" w:val="clear"/>
           <w:vertAlign w:val="baseline"/>
-        </w:rPr>
-      </w:pPr>
-      <w:r>
-        <w:rPr>
-          <w:rtl w:val="0"/>
-        </w:rPr>
-      </w:r>
-    </w:p>
-    <w:p>
-      <w:pPr>
-        <w:keepNext w:val="0"/>
-        <w:keepLines w:val="0"/>
-        <w:pageBreakBefore w:val="1"/>
-        <w:widowControl w:val="1"/>
-        <w:pBdr>
-          <w:top w:space="0" w:sz="0" w:val="nil"/>
-          <w:left w:space="0" w:sz="0" w:val="nil"/>
-          <w:bottom w:space="0" w:sz="0" w:val="nil"/>
-          <w:right w:space="0" w:sz="0" w:val="nil"/>
-          <w:between w:space="0" w:sz="0" w:val="nil"/>
-        </w:pBdr>
-        <w:shd w:fill="auto" w:val="clear"/>
-        <w:spacing w:after="0" w:before="0" w:line="240" w:lineRule="auto"/>
-        <w:ind w:left="0" w:right="0" w:firstLine="0"/>
-        <w:jc w:val="left"/>
+          <w:rtl w:val="0"/>
+        </w:rPr>
+        <w:t xml:space="preserve">Zones réglementaires</w:t>
+      </w:r>
+      <w:r>
         <w:rPr>
           <w:rFonts w:ascii="Arial" w:cs="Arial" w:eastAsia="Arial" w:hAnsi="Arial"/>
           <w:b w:val="0"/>
@@ -5028,6 +3269,158 @@
           <w:u w:val="none"/>
           <w:shd w:fill="auto" w:val="clear"/>
           <w:vertAlign w:val="baseline"/>
+          <w:rtl w:val="0"/>
+        </w:rPr>
+        <w:t xml:space="preserve">   </w:t>
+      </w:r>
+      <w:r>
+        <w:rPr>
+          <w:rFonts w:ascii="Arial" w:cs="Arial" w:eastAsia="Arial" w:hAnsi="Arial"/>
+          <w:b w:val="1"/>
+          <w:color w:val="3b4559"/>
+          <w:sz w:val="16"/>
+          <w:szCs w:val="16"/>
+          <w:rtl w:val="0"/>
+        </w:rPr>
+        <w:t xml:space="preserve">${totalRegulatoryAreas}</w:t>
+      </w:r>
+      <w:r>
+        <w:rPr>
+          <w:rFonts w:ascii="Arial" w:cs="Arial" w:eastAsia="Arial" w:hAnsi="Arial"/>
+          <w:b w:val="1"/>
+          <w:i w:val="0"/>
+          <w:smallCaps w:val="0"/>
+          <w:strike w:val="0"/>
+          <w:color w:val="3b4559"/>
+          <w:sz w:val="16"/>
+          <w:szCs w:val="16"/>
+          <w:u w:val="none"/>
+          <w:shd w:fill="auto" w:val="clear"/>
+          <w:vertAlign w:val="baseline"/>
+          <w:rtl w:val="0"/>
+        </w:rPr>
+        <w:t xml:space="preserve"> sélectionnées</w:t>
+      </w:r>
+      <w:r>
+        <w:rPr>
+          <w:rtl w:val="0"/>
+        </w:rPr>
+      </w:r>
+    </w:p>
+    <w:p>
+      <w:pPr>
+        <w:keepNext w:val="0"/>
+        <w:keepLines w:val="0"/>
+        <w:pageBreakBefore w:val="0"/>
+        <w:widowControl w:val="1"/>
+        <w:pBdr>
+          <w:top w:space="0" w:sz="0" w:val="nil"/>
+          <w:left w:space="0" w:sz="0" w:val="nil"/>
+          <w:bottom w:space="0" w:sz="0" w:val="nil"/>
+          <w:right w:space="0" w:sz="0" w:val="nil"/>
+          <w:between w:space="0" w:sz="0" w:val="nil"/>
+        </w:pBdr>
+        <w:shd w:fill="auto" w:val="clear"/>
+        <w:spacing w:after="0" w:before="0" w:line="240" w:lineRule="auto"/>
+        <w:ind w:left="0" w:right="0" w:firstLine="0"/>
+        <w:jc w:val="left"/>
+        <w:rPr>
+          <w:rFonts w:ascii="Arial" w:cs="Arial" w:eastAsia="Arial" w:hAnsi="Arial"/>
+          <w:b w:val="1"/>
+          <w:i w:val="0"/>
+          <w:smallCaps w:val="0"/>
+          <w:strike w:val="0"/>
+          <w:color w:val="3b4559"/>
+          <w:sz w:val="16"/>
+          <w:szCs w:val="16"/>
+          <w:u w:val="none"/>
+          <w:shd w:fill="auto" w:val="clear"/>
+          <w:vertAlign w:val="baseline"/>
+        </w:rPr>
+      </w:pPr>
+      <w:r>
+        <w:rPr>
+          <w:rtl w:val="0"/>
+        </w:rPr>
+      </w:r>
+    </w:p>
+    <w:p>
+      <w:pPr>
+        <w:keepNext w:val="0"/>
+        <w:keepLines w:val="0"/>
+        <w:pageBreakBefore w:val="0"/>
+        <w:widowControl w:val="1"/>
+        <w:pBdr>
+          <w:top w:space="0" w:sz="0" w:val="nil"/>
+          <w:left w:space="0" w:sz="0" w:val="nil"/>
+          <w:bottom w:space="0" w:sz="0" w:val="nil"/>
+          <w:right w:space="0" w:sz="0" w:val="nil"/>
+          <w:between w:space="0" w:sz="0" w:val="nil"/>
+        </w:pBdr>
+        <w:shd w:fill="auto" w:val="clear"/>
+        <w:spacing w:after="0" w:before="0" w:line="240" w:lineRule="auto"/>
+        <w:ind w:left="0" w:right="0" w:firstLine="0"/>
+        <w:jc w:val="left"/>
+        <w:rPr>
+          <w:rFonts w:ascii="Arial" w:cs="Arial" w:eastAsia="Arial" w:hAnsi="Arial"/>
+          <w:i w:val="0"/>
+          <w:smallCaps w:val="0"/>
+          <w:strike w:val="0"/>
+          <w:sz w:val="16"/>
+          <w:szCs w:val="16"/>
+          <w:u w:val="none"/>
+          <w:shd w:fill="auto" w:val="clear"/>
+          <w:vertAlign w:val="baseline"/>
+        </w:rPr>
+      </w:pPr>
+      <w:r>
+        <w:rPr>
+          <w:rFonts w:ascii="Arial" w:cs="Arial" w:eastAsia="Arial" w:hAnsi="Arial"/>
+          <w:sz w:val="16"/>
+          <w:szCs w:val="16"/>
+          <w:rtl w:val="0"/>
+        </w:rPr>
+        <w:t xml:space="preserve">${</w:t>
+      </w:r>
+      <w:r>
+        <w:rPr>
+          <w:rFonts w:ascii="Arial" w:cs="Arial" w:eastAsia="Arial" w:hAnsi="Arial"/>
+          <w:sz w:val="16"/>
+          <w:szCs w:val="16"/>
+          <w:rtl w:val="0"/>
+        </w:rPr>
+        <w:t xml:space="preserve">regulatoryAreasDetails</w:t>
+      </w:r>
+      <w:r>
+        <w:rPr>
+          <w:rFonts w:ascii="Arial" w:cs="Arial" w:eastAsia="Arial" w:hAnsi="Arial"/>
+          <w:sz w:val="16"/>
+          <w:szCs w:val="16"/>
+          <w:rtl w:val="0"/>
+        </w:rPr>
+        <w:t xml:space="preserve">}</w:t>
+      </w:r>
+      <w:r>
+        <w:rPr>
+          <w:rtl w:val="0"/>
+        </w:rPr>
+      </w:r>
+    </w:p>
+    <w:p>
+      <w:pPr>
+        <w:pageBreakBefore w:val="1"/>
+        <w:rPr>
+          <w:rFonts w:ascii="Arial" w:cs="Arial" w:eastAsia="Arial" w:hAnsi="Arial"/>
+          <w:b w:val="1"/>
+          <w:i w:val="0"/>
+          <w:smallCaps w:val="0"/>
+          <w:strike w:val="0"/>
+          <w:color w:val="3b4559"/>
+          <w:sz w:val="16"/>
+          <w:szCs w:val="16"/>
+          <w:u w:val="none"/>
+          <w:shd w:fill="auto" w:val="clear"/>
+          <w:vertAlign w:val="baseline"/>
         </w:rPr>
       </w:pPr>
       <w:bookmarkStart w:colFirst="0" w:colLast="0" w:name="_bqob7wjjjgwn" w:id="0"/>
@@ -5035,33 +3428,19 @@
       <w:r>
         <w:rPr>
           <w:rFonts w:ascii="Arial" w:cs="Arial" w:eastAsia="Arial" w:hAnsi="Arial"/>
-          <w:b w:val="0"/>
-          <w:i w:val="0"/>
-          <w:smallCaps w:val="0"/>
-          <w:strike w:val="0"/>
           <w:color w:val="282f3e"/>
           <w:sz w:val="32"/>
           <w:szCs w:val="32"/>
-          <w:u w:val="none"/>
-          <w:shd w:fill="auto" w:val="clear"/>
-          <w:vertAlign w:val="baseline"/>
-          <w:rtl w:val="0"/>
-        </w:rPr>
-        <w:t xml:space="preserve">Zones réglementaires</w:t>
-      </w:r>
-      <w:r>
-        <w:rPr>
-          <w:rFonts w:ascii="Arial" w:cs="Arial" w:eastAsia="Arial" w:hAnsi="Arial"/>
-          <w:b w:val="0"/>
-          <w:i w:val="0"/>
-          <w:smallCaps w:val="0"/>
-          <w:strike w:val="0"/>
+          <w:rtl w:val="0"/>
+        </w:rPr>
+        <w:t xml:space="preserve">Aires marines protégées</w:t>
+      </w:r>
+      <w:r>
+        <w:rPr>
+          <w:rFonts w:ascii="Arial" w:cs="Arial" w:eastAsia="Arial" w:hAnsi="Arial"/>
           <w:color w:val="515151"/>
           <w:sz w:val="28"/>
           <w:szCs w:val="28"/>
-          <w:u w:val="none"/>
-          <w:shd w:fill="auto" w:val="clear"/>
-          <w:vertAlign w:val="baseline"/>
           <w:rtl w:val="0"/>
         </w:rPr>
         <w:t xml:space="preserve">   </w:t>
@@ -5075,9 +3454,31 @@
           <w:szCs w:val="16"/>
           <w:rtl w:val="0"/>
         </w:rPr>
-        <w:t xml:space="preserve">${totalRegulatoryAreas}</w:t>
-      </w:r>
-      <w:r>
+        <w:t xml:space="preserve">${totalAMPs} sélectionnées</w:t>
+      </w:r>
+      <w:r>
+        <w:rPr>
+          <w:rtl w:val="0"/>
+        </w:rPr>
+      </w:r>
+    </w:p>
+    <w:p>
+      <w:pPr>
+        <w:keepNext w:val="0"/>
+        <w:keepLines w:val="0"/>
+        <w:pageBreakBefore w:val="0"/>
+        <w:widowControl w:val="1"/>
+        <w:pBdr>
+          <w:top w:space="0" w:sz="0" w:val="nil"/>
+          <w:left w:space="0" w:sz="0" w:val="nil"/>
+          <w:bottom w:space="0" w:sz="0" w:val="nil"/>
+          <w:right w:space="0" w:sz="0" w:val="nil"/>
+          <w:between w:space="0" w:sz="0" w:val="nil"/>
+        </w:pBdr>
+        <w:shd w:fill="auto" w:val="clear"/>
+        <w:spacing w:after="0" w:before="0" w:line="240" w:lineRule="auto"/>
+        <w:ind w:left="0" w:right="0" w:firstLine="0"/>
+        <w:jc w:val="left"/>
         <w:rPr>
           <w:rFonts w:ascii="Arial" w:cs="Arial" w:eastAsia="Arial" w:hAnsi="Arial"/>
           <w:b w:val="1"/>
@@ -5090,33 +3491,16 @@
           <w:u w:val="none"/>
           <w:shd w:fill="auto" w:val="clear"/>
           <w:vertAlign w:val="baseline"/>
-          <w:rtl w:val="0"/>
-        </w:rPr>
-        <w:t xml:space="preserve"> sélectionnées</w:t>
-      </w:r>
-      <w:r>
-        <w:rPr>
-          <w:rtl w:val="0"/>
-        </w:rPr>
-      </w:r>
-    </w:p>
-    <w:p>
-      <w:pPr>
-        <w:keepNext w:val="0"/>
-        <w:keepLines w:val="0"/>
-        <w:pageBreakBefore w:val="0"/>
-        <w:widowControl w:val="1"/>
-        <w:pBdr>
-          <w:top w:space="0" w:sz="0" w:val="nil"/>
-          <w:left w:space="0" w:sz="0" w:val="nil"/>
-          <w:bottom w:space="0" w:sz="0" w:val="nil"/>
-          <w:right w:space="0" w:sz="0" w:val="nil"/>
-          <w:between w:space="0" w:sz="0" w:val="nil"/>
-        </w:pBdr>
-        <w:shd w:fill="auto" w:val="clear"/>
-        <w:spacing w:after="0" w:before="0" w:line="240" w:lineRule="auto"/>
-        <w:ind w:left="0" w:right="0" w:firstLine="0"/>
-        <w:jc w:val="left"/>
+        </w:rPr>
+      </w:pPr>
+      <w:r>
+        <w:rPr>
+          <w:rtl w:val="0"/>
+        </w:rPr>
+      </w:r>
+    </w:p>
+    <w:p>
+      <w:pPr>
         <w:rPr>
           <w:rFonts w:ascii="Arial" w:cs="Arial" w:eastAsia="Arial" w:hAnsi="Arial"/>
           <w:b w:val="1"/>
@@ -5133,75 +3517,36 @@
       </w:pPr>
       <w:r>
         <w:rPr>
-          <w:rtl w:val="0"/>
-        </w:rPr>
-      </w:r>
-    </w:p>
-    <w:p>
-      <w:pPr>
-        <w:keepNext w:val="0"/>
-        <w:keepLines w:val="0"/>
-        <w:pageBreakBefore w:val="0"/>
-        <w:widowControl w:val="1"/>
-        <w:pBdr>
-          <w:top w:space="0" w:sz="0" w:val="nil"/>
-          <w:left w:space="0" w:sz="0" w:val="nil"/>
-          <w:bottom w:space="0" w:sz="0" w:val="nil"/>
-          <w:right w:space="0" w:sz="0" w:val="nil"/>
-          <w:between w:space="0" w:sz="0" w:val="nil"/>
-        </w:pBdr>
-        <w:shd w:fill="auto" w:val="clear"/>
-        <w:spacing w:after="0" w:before="0" w:line="240" w:lineRule="auto"/>
-        <w:ind w:left="0" w:right="0" w:firstLine="0"/>
-        <w:jc w:val="left"/>
-        <w:rPr>
-          <w:rFonts w:ascii="Arial" w:cs="Arial" w:eastAsia="Arial" w:hAnsi="Arial"/>
-          <w:i w:val="0"/>
-          <w:smallCaps w:val="0"/>
-          <w:strike w:val="0"/>
+          <w:rFonts w:ascii="Arial" w:cs="Arial" w:eastAsia="Arial" w:hAnsi="Arial"/>
           <w:sz w:val="16"/>
           <w:szCs w:val="16"/>
-          <w:u w:val="none"/>
-          <w:shd w:fill="auto" w:val="clear"/>
-          <w:vertAlign w:val="baseline"/>
-        </w:rPr>
-      </w:pPr>
-      <w:r>
-        <w:rPr>
-          <w:rFonts w:ascii="Arial" w:cs="Arial" w:eastAsia="Arial" w:hAnsi="Arial"/>
-          <w:sz w:val="16"/>
-          <w:szCs w:val="16"/>
-          <w:rtl w:val="0"/>
-        </w:rPr>
-        <w:t xml:space="preserve">${</w:t>
-      </w:r>
-      <w:r>
-        <w:rPr>
-          <w:rFonts w:ascii="Arial" w:cs="Arial" w:eastAsia="Arial" w:hAnsi="Arial"/>
-          <w:sz w:val="16"/>
-          <w:szCs w:val="16"/>
-          <w:rtl w:val="0"/>
-        </w:rPr>
-        <w:t xml:space="preserve">regulatoryAreasDetails</w:t>
-      </w:r>
-      <w:r>
-        <w:rPr>
-          <w:rFonts w:ascii="Arial" w:cs="Arial" w:eastAsia="Arial" w:hAnsi="Arial"/>
-          <w:sz w:val="16"/>
-          <w:szCs w:val="16"/>
-          <w:rtl w:val="0"/>
-        </w:rPr>
-        <w:t xml:space="preserve">}</w:t>
-      </w:r>
-      <w:r>
-        <w:rPr>
-          <w:rtl w:val="0"/>
-        </w:rPr>
-      </w:r>
-    </w:p>
-    <w:p>
-      <w:pPr>
-        <w:pageBreakBefore w:val="1"/>
+          <w:rtl w:val="0"/>
+        </w:rPr>
+        <w:t xml:space="preserve">${AMPsDetails}</w:t>
+      </w:r>
+      <w:r>
+        <w:rPr>
+          <w:rtl w:val="0"/>
+        </w:rPr>
+      </w:r>
+    </w:p>
+    <w:p>
+      <w:pPr>
+        <w:keepNext w:val="0"/>
+        <w:keepLines w:val="0"/>
+        <w:pageBreakBefore w:val="0"/>
+        <w:widowControl w:val="1"/>
+        <w:pBdr>
+          <w:top w:space="0" w:sz="0" w:val="nil"/>
+          <w:left w:space="0" w:sz="0" w:val="nil"/>
+          <w:bottom w:space="0" w:sz="0" w:val="nil"/>
+          <w:right w:space="0" w:sz="0" w:val="nil"/>
+          <w:between w:space="0" w:sz="0" w:val="nil"/>
+        </w:pBdr>
+        <w:shd w:fill="auto" w:val="clear"/>
+        <w:spacing w:after="0" w:before="0" w:line="240" w:lineRule="auto"/>
+        <w:ind w:left="0" w:right="0" w:firstLine="0"/>
+        <w:jc w:val="left"/>
         <w:rPr>
           <w:rFonts w:ascii="Arial" w:cs="Arial" w:eastAsia="Arial" w:hAnsi="Arial"/>
           <w:b w:val="1"/>
@@ -5216,24 +3561,887 @@
           <w:vertAlign w:val="baseline"/>
         </w:rPr>
       </w:pPr>
-      <w:bookmarkStart w:colFirst="0" w:colLast="0" w:name="_bqob7wjjjgwn" w:id="0"/>
-      <w:bookmarkEnd w:id="0"/>
-      <w:r>
-        <w:rPr>
-          <w:rFonts w:ascii="Arial" w:cs="Arial" w:eastAsia="Arial" w:hAnsi="Arial"/>
+      <w:r>
+        <w:rPr>
+          <w:rtl w:val="0"/>
+        </w:rPr>
+      </w:r>
+    </w:p>
+    <w:p>
+      <w:pPr>
+        <w:keepNext w:val="0"/>
+        <w:keepLines w:val="0"/>
+        <w:pageBreakBefore w:val="0"/>
+        <w:widowControl w:val="1"/>
+        <w:pBdr>
+          <w:top w:space="0" w:sz="0" w:val="nil"/>
+          <w:left w:space="0" w:sz="0" w:val="nil"/>
+          <w:bottom w:space="0" w:sz="0" w:val="nil"/>
+          <w:right w:space="0" w:sz="0" w:val="nil"/>
+          <w:between w:space="0" w:sz="0" w:val="nil"/>
+        </w:pBdr>
+        <w:shd w:fill="auto" w:val="clear"/>
+        <w:spacing w:after="0" w:before="0" w:line="240" w:lineRule="auto"/>
+        <w:ind w:left="0" w:right="0" w:firstLine="0"/>
+        <w:jc w:val="left"/>
+        <w:rPr>
+          <w:rFonts w:ascii="Arial" w:cs="Arial" w:eastAsia="Arial" w:hAnsi="Arial"/>
+          <w:b w:val="1"/>
+          <w:i w:val="0"/>
+          <w:smallCaps w:val="0"/>
+          <w:strike w:val="0"/>
+          <w:color w:val="3b4559"/>
+          <w:sz w:val="16"/>
+          <w:szCs w:val="16"/>
+          <w:u w:val="none"/>
+          <w:shd w:fill="auto" w:val="clear"/>
+          <w:vertAlign w:val="baseline"/>
+        </w:rPr>
+      </w:pPr>
+      <w:r>
+        <w:rPr>
+          <w:rtl w:val="0"/>
+        </w:rPr>
+      </w:r>
+    </w:p>
+    <w:p>
+      <w:pPr>
+        <w:keepNext w:val="0"/>
+        <w:keepLines w:val="0"/>
+        <w:pageBreakBefore w:val="0"/>
+        <w:widowControl w:val="1"/>
+        <w:pBdr>
+          <w:top w:space="0" w:sz="0" w:val="nil"/>
+          <w:left w:space="0" w:sz="0" w:val="nil"/>
+          <w:bottom w:space="0" w:sz="0" w:val="nil"/>
+          <w:right w:space="0" w:sz="0" w:val="nil"/>
+          <w:between w:space="0" w:sz="0" w:val="nil"/>
+        </w:pBdr>
+        <w:shd w:fill="auto" w:val="clear"/>
+        <w:spacing w:after="0" w:before="0" w:line="240" w:lineRule="auto"/>
+        <w:ind w:left="0" w:right="0" w:firstLine="0"/>
+        <w:jc w:val="left"/>
+        <w:rPr>
+          <w:rFonts w:ascii="Arial" w:cs="Arial" w:eastAsia="Arial" w:hAnsi="Arial"/>
+          <w:b w:val="1"/>
+          <w:i w:val="0"/>
+          <w:smallCaps w:val="0"/>
+          <w:strike w:val="0"/>
+          <w:color w:val="3b4559"/>
+          <w:sz w:val="16"/>
+          <w:szCs w:val="16"/>
+          <w:u w:val="none"/>
+          <w:shd w:fill="auto" w:val="clear"/>
+          <w:vertAlign w:val="baseline"/>
+        </w:rPr>
+      </w:pPr>
+      <w:r>
+        <w:rPr>
+          <w:rtl w:val="0"/>
+        </w:rPr>
+      </w:r>
+    </w:p>
+    <w:p>
+      <w:pPr>
+        <w:keepNext w:val="0"/>
+        <w:keepLines w:val="0"/>
+        <w:pageBreakBefore w:val="0"/>
+        <w:widowControl w:val="1"/>
+        <w:pBdr>
+          <w:top w:space="0" w:sz="0" w:val="nil"/>
+          <w:left w:space="0" w:sz="0" w:val="nil"/>
+          <w:bottom w:space="0" w:sz="0" w:val="nil"/>
+          <w:right w:space="0" w:sz="0" w:val="nil"/>
+          <w:between w:space="0" w:sz="0" w:val="nil"/>
+        </w:pBdr>
+        <w:shd w:fill="auto" w:val="clear"/>
+        <w:spacing w:after="0" w:before="0" w:line="240" w:lineRule="auto"/>
+        <w:ind w:left="0" w:right="0" w:firstLine="0"/>
+        <w:jc w:val="left"/>
+        <w:rPr>
+          <w:rFonts w:ascii="Arial" w:cs="Arial" w:eastAsia="Arial" w:hAnsi="Arial"/>
+          <w:b w:val="1"/>
+          <w:i w:val="0"/>
+          <w:smallCaps w:val="0"/>
+          <w:strike w:val="0"/>
+          <w:color w:val="3b4559"/>
+          <w:sz w:val="16"/>
+          <w:szCs w:val="16"/>
+          <w:u w:val="none"/>
+          <w:shd w:fill="auto" w:val="clear"/>
+          <w:vertAlign w:val="baseline"/>
+        </w:rPr>
+      </w:pPr>
+      <w:r>
+        <w:rPr>
+          <w:rtl w:val="0"/>
+        </w:rPr>
+      </w:r>
+    </w:p>
+    <w:p>
+      <w:pPr>
+        <w:keepNext w:val="0"/>
+        <w:keepLines w:val="0"/>
+        <w:pageBreakBefore w:val="0"/>
+        <w:widowControl w:val="1"/>
+        <w:pBdr>
+          <w:top w:space="0" w:sz="0" w:val="nil"/>
+          <w:left w:space="0" w:sz="0" w:val="nil"/>
+          <w:bottom w:space="0" w:sz="0" w:val="nil"/>
+          <w:right w:space="0" w:sz="0" w:val="nil"/>
+          <w:between w:space="0" w:sz="0" w:val="nil"/>
+        </w:pBdr>
+        <w:shd w:fill="auto" w:val="clear"/>
+        <w:spacing w:after="0" w:before="0" w:line="240" w:lineRule="auto"/>
+        <w:ind w:left="0" w:right="0" w:firstLine="0"/>
+        <w:jc w:val="left"/>
+        <w:rPr>
+          <w:rFonts w:ascii="Arial" w:cs="Arial" w:eastAsia="Arial" w:hAnsi="Arial"/>
+          <w:b w:val="1"/>
+          <w:i w:val="0"/>
+          <w:smallCaps w:val="0"/>
+          <w:strike w:val="0"/>
+          <w:color w:val="3b4559"/>
+          <w:sz w:val="16"/>
+          <w:szCs w:val="16"/>
+          <w:u w:val="none"/>
+          <w:shd w:fill="auto" w:val="clear"/>
+          <w:vertAlign w:val="baseline"/>
+        </w:rPr>
+      </w:pPr>
+      <w:r>
+        <w:rPr>
+          <w:rtl w:val="0"/>
+        </w:rPr>
+      </w:r>
+    </w:p>
+    <w:p>
+      <w:pPr>
+        <w:keepNext w:val="0"/>
+        <w:keepLines w:val="0"/>
+        <w:pageBreakBefore w:val="0"/>
+        <w:widowControl w:val="1"/>
+        <w:pBdr>
+          <w:top w:space="0" w:sz="0" w:val="nil"/>
+          <w:left w:space="0" w:sz="0" w:val="nil"/>
+          <w:bottom w:space="0" w:sz="0" w:val="nil"/>
+          <w:right w:space="0" w:sz="0" w:val="nil"/>
+          <w:between w:space="0" w:sz="0" w:val="nil"/>
+        </w:pBdr>
+        <w:shd w:fill="auto" w:val="clear"/>
+        <w:spacing w:after="0" w:before="0" w:line="240" w:lineRule="auto"/>
+        <w:ind w:left="0" w:right="0" w:firstLine="0"/>
+        <w:jc w:val="left"/>
+        <w:rPr>
+          <w:rFonts w:ascii="Arial" w:cs="Arial" w:eastAsia="Arial" w:hAnsi="Arial"/>
+          <w:b w:val="1"/>
+          <w:i w:val="0"/>
+          <w:smallCaps w:val="0"/>
+          <w:strike w:val="0"/>
+          <w:color w:val="3b4559"/>
+          <w:sz w:val="16"/>
+          <w:szCs w:val="16"/>
+          <w:u w:val="none"/>
+          <w:shd w:fill="auto" w:val="clear"/>
+          <w:vertAlign w:val="baseline"/>
+        </w:rPr>
+      </w:pPr>
+      <w:r>
+        <w:rPr>
+          <w:rtl w:val="0"/>
+        </w:rPr>
+      </w:r>
+    </w:p>
+    <w:p>
+      <w:pPr>
+        <w:keepNext w:val="0"/>
+        <w:keepLines w:val="0"/>
+        <w:pageBreakBefore w:val="0"/>
+        <w:widowControl w:val="1"/>
+        <w:pBdr>
+          <w:top w:space="0" w:sz="0" w:val="nil"/>
+          <w:left w:space="0" w:sz="0" w:val="nil"/>
+          <w:bottom w:space="0" w:sz="0" w:val="nil"/>
+          <w:right w:space="0" w:sz="0" w:val="nil"/>
+          <w:between w:space="0" w:sz="0" w:val="nil"/>
+        </w:pBdr>
+        <w:shd w:fill="auto" w:val="clear"/>
+        <w:spacing w:after="0" w:before="0" w:line="240" w:lineRule="auto"/>
+        <w:ind w:left="0" w:right="0" w:firstLine="0"/>
+        <w:jc w:val="left"/>
+        <w:rPr>
+          <w:rFonts w:ascii="Arial" w:cs="Arial" w:eastAsia="Arial" w:hAnsi="Arial"/>
+          <w:b w:val="1"/>
+          <w:i w:val="0"/>
+          <w:smallCaps w:val="0"/>
+          <w:strike w:val="0"/>
+          <w:color w:val="3b4559"/>
+          <w:sz w:val="16"/>
+          <w:szCs w:val="16"/>
+          <w:u w:val="none"/>
+          <w:shd w:fill="auto" w:val="clear"/>
+          <w:vertAlign w:val="baseline"/>
+        </w:rPr>
+      </w:pPr>
+      <w:r>
+        <w:rPr>
+          <w:rtl w:val="0"/>
+        </w:rPr>
+      </w:r>
+    </w:p>
+    <w:p>
+      <w:pPr>
+        <w:keepNext w:val="0"/>
+        <w:keepLines w:val="0"/>
+        <w:pageBreakBefore w:val="0"/>
+        <w:widowControl w:val="1"/>
+        <w:pBdr>
+          <w:top w:space="0" w:sz="0" w:val="nil"/>
+          <w:left w:space="0" w:sz="0" w:val="nil"/>
+          <w:bottom w:space="0" w:sz="0" w:val="nil"/>
+          <w:right w:space="0" w:sz="0" w:val="nil"/>
+          <w:between w:space="0" w:sz="0" w:val="nil"/>
+        </w:pBdr>
+        <w:shd w:fill="auto" w:val="clear"/>
+        <w:spacing w:after="0" w:before="0" w:line="240" w:lineRule="auto"/>
+        <w:ind w:left="0" w:right="0" w:firstLine="0"/>
+        <w:jc w:val="left"/>
+        <w:rPr>
+          <w:rFonts w:ascii="Arial" w:cs="Arial" w:eastAsia="Arial" w:hAnsi="Arial"/>
+          <w:b w:val="1"/>
+          <w:i w:val="0"/>
+          <w:smallCaps w:val="0"/>
+          <w:strike w:val="0"/>
+          <w:color w:val="3b4559"/>
+          <w:sz w:val="16"/>
+          <w:szCs w:val="16"/>
+          <w:u w:val="none"/>
+          <w:shd w:fill="auto" w:val="clear"/>
+          <w:vertAlign w:val="baseline"/>
+        </w:rPr>
+      </w:pPr>
+      <w:r>
+        <w:rPr>
+          <w:rtl w:val="0"/>
+        </w:rPr>
+      </w:r>
+    </w:p>
+    <w:p>
+      <w:pPr>
+        <w:keepNext w:val="0"/>
+        <w:keepLines w:val="0"/>
+        <w:pageBreakBefore w:val="0"/>
+        <w:widowControl w:val="1"/>
+        <w:pBdr>
+          <w:top w:space="0" w:sz="0" w:val="nil"/>
+          <w:left w:space="0" w:sz="0" w:val="nil"/>
+          <w:bottom w:space="0" w:sz="0" w:val="nil"/>
+          <w:right w:space="0" w:sz="0" w:val="nil"/>
+          <w:between w:space="0" w:sz="0" w:val="nil"/>
+        </w:pBdr>
+        <w:shd w:fill="auto" w:val="clear"/>
+        <w:spacing w:after="0" w:before="0" w:line="240" w:lineRule="auto"/>
+        <w:ind w:left="0" w:right="0" w:firstLine="0"/>
+        <w:jc w:val="left"/>
+        <w:rPr>
+          <w:rFonts w:ascii="Arial" w:cs="Arial" w:eastAsia="Arial" w:hAnsi="Arial"/>
+          <w:b w:val="1"/>
+          <w:i w:val="0"/>
+          <w:smallCaps w:val="0"/>
+          <w:strike w:val="0"/>
+          <w:color w:val="3b4559"/>
+          <w:sz w:val="16"/>
+          <w:szCs w:val="16"/>
+          <w:u w:val="none"/>
+          <w:shd w:fill="auto" w:val="clear"/>
+          <w:vertAlign w:val="baseline"/>
+        </w:rPr>
+      </w:pPr>
+      <w:r>
+        <w:rPr>
+          <w:rtl w:val="0"/>
+        </w:rPr>
+      </w:r>
+    </w:p>
+    <w:p>
+      <w:pPr>
+        <w:keepNext w:val="0"/>
+        <w:keepLines w:val="0"/>
+        <w:pageBreakBefore w:val="0"/>
+        <w:widowControl w:val="1"/>
+        <w:pBdr>
+          <w:top w:space="0" w:sz="0" w:val="nil"/>
+          <w:left w:space="0" w:sz="0" w:val="nil"/>
+          <w:bottom w:space="0" w:sz="0" w:val="nil"/>
+          <w:right w:space="0" w:sz="0" w:val="nil"/>
+          <w:between w:space="0" w:sz="0" w:val="nil"/>
+        </w:pBdr>
+        <w:shd w:fill="auto" w:val="clear"/>
+        <w:spacing w:after="0" w:before="0" w:line="240" w:lineRule="auto"/>
+        <w:ind w:left="0" w:right="0" w:firstLine="0"/>
+        <w:jc w:val="left"/>
+        <w:rPr>
+          <w:rFonts w:ascii="Arial" w:cs="Arial" w:eastAsia="Arial" w:hAnsi="Arial"/>
+          <w:b w:val="1"/>
+          <w:i w:val="0"/>
+          <w:smallCaps w:val="0"/>
+          <w:strike w:val="0"/>
+          <w:color w:val="3b4559"/>
+          <w:sz w:val="16"/>
+          <w:szCs w:val="16"/>
+          <w:u w:val="none"/>
+          <w:shd w:fill="auto" w:val="clear"/>
+          <w:vertAlign w:val="baseline"/>
+        </w:rPr>
+      </w:pPr>
+      <w:r>
+        <w:rPr>
+          <w:rtl w:val="0"/>
+        </w:rPr>
+      </w:r>
+    </w:p>
+    <w:p>
+      <w:pPr>
+        <w:keepNext w:val="0"/>
+        <w:keepLines w:val="0"/>
+        <w:pageBreakBefore w:val="0"/>
+        <w:widowControl w:val="1"/>
+        <w:pBdr>
+          <w:top w:space="0" w:sz="0" w:val="nil"/>
+          <w:left w:space="0" w:sz="0" w:val="nil"/>
+          <w:bottom w:space="0" w:sz="0" w:val="nil"/>
+          <w:right w:space="0" w:sz="0" w:val="nil"/>
+          <w:between w:space="0" w:sz="0" w:val="nil"/>
+        </w:pBdr>
+        <w:shd w:fill="auto" w:val="clear"/>
+        <w:spacing w:after="0" w:before="0" w:line="240" w:lineRule="auto"/>
+        <w:ind w:left="0" w:right="0" w:firstLine="0"/>
+        <w:jc w:val="left"/>
+        <w:rPr>
+          <w:rFonts w:ascii="Arial" w:cs="Arial" w:eastAsia="Arial" w:hAnsi="Arial"/>
+          <w:b w:val="1"/>
+          <w:i w:val="0"/>
+          <w:smallCaps w:val="0"/>
+          <w:strike w:val="0"/>
+          <w:color w:val="3b4559"/>
+          <w:sz w:val="16"/>
+          <w:szCs w:val="16"/>
+          <w:u w:val="none"/>
+          <w:shd w:fill="auto" w:val="clear"/>
+          <w:vertAlign w:val="baseline"/>
+        </w:rPr>
+      </w:pPr>
+      <w:r>
+        <w:rPr>
+          <w:rtl w:val="0"/>
+        </w:rPr>
+      </w:r>
+    </w:p>
+    <w:p>
+      <w:pPr>
+        <w:keepNext w:val="0"/>
+        <w:keepLines w:val="0"/>
+        <w:pageBreakBefore w:val="0"/>
+        <w:widowControl w:val="1"/>
+        <w:pBdr>
+          <w:top w:space="0" w:sz="0" w:val="nil"/>
+          <w:left w:space="0" w:sz="0" w:val="nil"/>
+          <w:bottom w:space="0" w:sz="0" w:val="nil"/>
+          <w:right w:space="0" w:sz="0" w:val="nil"/>
+          <w:between w:space="0" w:sz="0" w:val="nil"/>
+        </w:pBdr>
+        <w:shd w:fill="auto" w:val="clear"/>
+        <w:spacing w:after="0" w:before="0" w:line="240" w:lineRule="auto"/>
+        <w:ind w:left="0" w:right="0" w:firstLine="0"/>
+        <w:jc w:val="left"/>
+        <w:rPr>
+          <w:rFonts w:ascii="Arial" w:cs="Arial" w:eastAsia="Arial" w:hAnsi="Arial"/>
+          <w:b w:val="1"/>
+          <w:i w:val="0"/>
+          <w:smallCaps w:val="0"/>
+          <w:strike w:val="0"/>
+          <w:color w:val="3b4559"/>
+          <w:sz w:val="16"/>
+          <w:szCs w:val="16"/>
+          <w:u w:val="none"/>
+          <w:shd w:fill="auto" w:val="clear"/>
+          <w:vertAlign w:val="baseline"/>
+        </w:rPr>
+      </w:pPr>
+      <w:r>
+        <w:rPr>
+          <w:rtl w:val="0"/>
+        </w:rPr>
+      </w:r>
+    </w:p>
+    <w:p>
+      <w:pPr>
+        <w:keepNext w:val="0"/>
+        <w:keepLines w:val="0"/>
+        <w:pageBreakBefore w:val="0"/>
+        <w:widowControl w:val="1"/>
+        <w:pBdr>
+          <w:top w:space="0" w:sz="0" w:val="nil"/>
+          <w:left w:space="0" w:sz="0" w:val="nil"/>
+          <w:bottom w:space="0" w:sz="0" w:val="nil"/>
+          <w:right w:space="0" w:sz="0" w:val="nil"/>
+          <w:between w:space="0" w:sz="0" w:val="nil"/>
+        </w:pBdr>
+        <w:shd w:fill="auto" w:val="clear"/>
+        <w:spacing w:after="0" w:before="0" w:line="240" w:lineRule="auto"/>
+        <w:ind w:left="0" w:right="0" w:firstLine="0"/>
+        <w:jc w:val="left"/>
+        <w:rPr>
+          <w:rFonts w:ascii="Arial" w:cs="Arial" w:eastAsia="Arial" w:hAnsi="Arial"/>
+          <w:b w:val="1"/>
+          <w:i w:val="0"/>
+          <w:smallCaps w:val="0"/>
+          <w:strike w:val="0"/>
+          <w:color w:val="3b4559"/>
+          <w:sz w:val="16"/>
+          <w:szCs w:val="16"/>
+          <w:u w:val="none"/>
+          <w:shd w:fill="auto" w:val="clear"/>
+          <w:vertAlign w:val="baseline"/>
+        </w:rPr>
+      </w:pPr>
+      <w:r>
+        <w:rPr>
+          <w:rtl w:val="0"/>
+        </w:rPr>
+      </w:r>
+    </w:p>
+    <w:p>
+      <w:pPr>
+        <w:keepNext w:val="0"/>
+        <w:keepLines w:val="0"/>
+        <w:pageBreakBefore w:val="0"/>
+        <w:widowControl w:val="1"/>
+        <w:pBdr>
+          <w:top w:space="0" w:sz="0" w:val="nil"/>
+          <w:left w:space="0" w:sz="0" w:val="nil"/>
+          <w:bottom w:space="0" w:sz="0" w:val="nil"/>
+          <w:right w:space="0" w:sz="0" w:val="nil"/>
+          <w:between w:space="0" w:sz="0" w:val="nil"/>
+        </w:pBdr>
+        <w:shd w:fill="auto" w:val="clear"/>
+        <w:spacing w:after="0" w:before="0" w:line="240" w:lineRule="auto"/>
+        <w:ind w:left="0" w:right="0" w:firstLine="0"/>
+        <w:jc w:val="left"/>
+        <w:rPr>
+          <w:rFonts w:ascii="Arial" w:cs="Arial" w:eastAsia="Arial" w:hAnsi="Arial"/>
+          <w:b w:val="1"/>
+          <w:i w:val="0"/>
+          <w:smallCaps w:val="0"/>
+          <w:strike w:val="0"/>
+          <w:color w:val="3b4559"/>
+          <w:sz w:val="16"/>
+          <w:szCs w:val="16"/>
+          <w:u w:val="none"/>
+          <w:shd w:fill="auto" w:val="clear"/>
+          <w:vertAlign w:val="baseline"/>
+        </w:rPr>
+      </w:pPr>
+      <w:r>
+        <w:rPr>
+          <w:rtl w:val="0"/>
+        </w:rPr>
+      </w:r>
+    </w:p>
+    <w:p>
+      <w:pPr>
+        <w:keepNext w:val="0"/>
+        <w:keepLines w:val="0"/>
+        <w:pageBreakBefore w:val="0"/>
+        <w:widowControl w:val="1"/>
+        <w:pBdr>
+          <w:top w:space="0" w:sz="0" w:val="nil"/>
+          <w:left w:space="0" w:sz="0" w:val="nil"/>
+          <w:bottom w:space="0" w:sz="0" w:val="nil"/>
+          <w:right w:space="0" w:sz="0" w:val="nil"/>
+          <w:between w:space="0" w:sz="0" w:val="nil"/>
+        </w:pBdr>
+        <w:shd w:fill="auto" w:val="clear"/>
+        <w:spacing w:after="0" w:before="0" w:line="240" w:lineRule="auto"/>
+        <w:ind w:left="0" w:right="0" w:firstLine="0"/>
+        <w:jc w:val="left"/>
+        <w:rPr>
+          <w:rFonts w:ascii="Arial" w:cs="Arial" w:eastAsia="Arial" w:hAnsi="Arial"/>
+          <w:b w:val="1"/>
+          <w:i w:val="0"/>
+          <w:smallCaps w:val="0"/>
+          <w:strike w:val="0"/>
+          <w:color w:val="3b4559"/>
+          <w:sz w:val="16"/>
+          <w:szCs w:val="16"/>
+          <w:u w:val="none"/>
+          <w:shd w:fill="auto" w:val="clear"/>
+          <w:vertAlign w:val="baseline"/>
+        </w:rPr>
+      </w:pPr>
+      <w:r>
+        <w:rPr>
+          <w:rtl w:val="0"/>
+        </w:rPr>
+      </w:r>
+    </w:p>
+    <w:p>
+      <w:pPr>
+        <w:keepNext w:val="0"/>
+        <w:keepLines w:val="0"/>
+        <w:pageBreakBefore w:val="0"/>
+        <w:widowControl w:val="1"/>
+        <w:pBdr>
+          <w:top w:space="0" w:sz="0" w:val="nil"/>
+          <w:left w:space="0" w:sz="0" w:val="nil"/>
+          <w:bottom w:space="0" w:sz="0" w:val="nil"/>
+          <w:right w:space="0" w:sz="0" w:val="nil"/>
+          <w:between w:space="0" w:sz="0" w:val="nil"/>
+        </w:pBdr>
+        <w:shd w:fill="auto" w:val="clear"/>
+        <w:spacing w:after="0" w:before="0" w:line="240" w:lineRule="auto"/>
+        <w:ind w:left="0" w:right="0" w:firstLine="0"/>
+        <w:jc w:val="left"/>
+        <w:rPr>
+          <w:rFonts w:ascii="Arial" w:cs="Arial" w:eastAsia="Arial" w:hAnsi="Arial"/>
+          <w:b w:val="1"/>
+          <w:i w:val="0"/>
+          <w:smallCaps w:val="0"/>
+          <w:strike w:val="0"/>
+          <w:color w:val="3b4559"/>
+          <w:sz w:val="16"/>
+          <w:szCs w:val="16"/>
+          <w:u w:val="none"/>
+          <w:shd w:fill="auto" w:val="clear"/>
+          <w:vertAlign w:val="baseline"/>
+        </w:rPr>
+      </w:pPr>
+      <w:r>
+        <w:rPr>
+          <w:rtl w:val="0"/>
+        </w:rPr>
+      </w:r>
+    </w:p>
+    <w:p>
+      <w:pPr>
+        <w:keepNext w:val="0"/>
+        <w:keepLines w:val="0"/>
+        <w:pageBreakBefore w:val="0"/>
+        <w:widowControl w:val="1"/>
+        <w:pBdr>
+          <w:top w:space="0" w:sz="0" w:val="nil"/>
+          <w:left w:space="0" w:sz="0" w:val="nil"/>
+          <w:bottom w:space="0" w:sz="0" w:val="nil"/>
+          <w:right w:space="0" w:sz="0" w:val="nil"/>
+          <w:between w:space="0" w:sz="0" w:val="nil"/>
+        </w:pBdr>
+        <w:shd w:fill="auto" w:val="clear"/>
+        <w:spacing w:after="0" w:before="0" w:line="240" w:lineRule="auto"/>
+        <w:ind w:left="0" w:right="0" w:firstLine="0"/>
+        <w:jc w:val="left"/>
+        <w:rPr>
+          <w:rFonts w:ascii="Arial" w:cs="Arial" w:eastAsia="Arial" w:hAnsi="Arial"/>
+          <w:b w:val="1"/>
+          <w:i w:val="0"/>
+          <w:smallCaps w:val="0"/>
+          <w:strike w:val="0"/>
+          <w:color w:val="3b4559"/>
+          <w:sz w:val="16"/>
+          <w:szCs w:val="16"/>
+          <w:u w:val="none"/>
+          <w:shd w:fill="auto" w:val="clear"/>
+          <w:vertAlign w:val="baseline"/>
+        </w:rPr>
+      </w:pPr>
+      <w:r>
+        <w:rPr>
+          <w:rtl w:val="0"/>
+        </w:rPr>
+      </w:r>
+    </w:p>
+    <w:p>
+      <w:pPr>
+        <w:keepNext w:val="0"/>
+        <w:keepLines w:val="0"/>
+        <w:pageBreakBefore w:val="0"/>
+        <w:widowControl w:val="1"/>
+        <w:pBdr>
+          <w:top w:space="0" w:sz="0" w:val="nil"/>
+          <w:left w:space="0" w:sz="0" w:val="nil"/>
+          <w:bottom w:space="0" w:sz="0" w:val="nil"/>
+          <w:right w:space="0" w:sz="0" w:val="nil"/>
+          <w:between w:space="0" w:sz="0" w:val="nil"/>
+        </w:pBdr>
+        <w:shd w:fill="auto" w:val="clear"/>
+        <w:spacing w:after="0" w:before="0" w:line="240" w:lineRule="auto"/>
+        <w:ind w:left="0" w:right="0" w:firstLine="0"/>
+        <w:jc w:val="left"/>
+        <w:rPr>
+          <w:rFonts w:ascii="Arial" w:cs="Arial" w:eastAsia="Arial" w:hAnsi="Arial"/>
+          <w:b w:val="1"/>
+          <w:i w:val="0"/>
+          <w:smallCaps w:val="0"/>
+          <w:strike w:val="0"/>
+          <w:color w:val="3b4559"/>
+          <w:sz w:val="16"/>
+          <w:szCs w:val="16"/>
+          <w:u w:val="none"/>
+          <w:shd w:fill="auto" w:val="clear"/>
+          <w:vertAlign w:val="baseline"/>
+        </w:rPr>
+      </w:pPr>
+      <w:r>
+        <w:rPr>
+          <w:rtl w:val="0"/>
+        </w:rPr>
+      </w:r>
+    </w:p>
+    <w:p>
+      <w:pPr>
+        <w:keepNext w:val="0"/>
+        <w:keepLines w:val="0"/>
+        <w:pageBreakBefore w:val="0"/>
+        <w:widowControl w:val="1"/>
+        <w:pBdr>
+          <w:top w:space="0" w:sz="0" w:val="nil"/>
+          <w:left w:space="0" w:sz="0" w:val="nil"/>
+          <w:bottom w:space="0" w:sz="0" w:val="nil"/>
+          <w:right w:space="0" w:sz="0" w:val="nil"/>
+          <w:between w:space="0" w:sz="0" w:val="nil"/>
+        </w:pBdr>
+        <w:shd w:fill="auto" w:val="clear"/>
+        <w:spacing w:after="0" w:before="0" w:line="240" w:lineRule="auto"/>
+        <w:ind w:left="0" w:right="0" w:firstLine="0"/>
+        <w:jc w:val="left"/>
+        <w:rPr>
+          <w:rFonts w:ascii="Arial" w:cs="Arial" w:eastAsia="Arial" w:hAnsi="Arial"/>
+          <w:b w:val="1"/>
+          <w:i w:val="0"/>
+          <w:smallCaps w:val="0"/>
+          <w:strike w:val="0"/>
+          <w:color w:val="3b4559"/>
+          <w:sz w:val="16"/>
+          <w:szCs w:val="16"/>
+          <w:u w:val="none"/>
+          <w:shd w:fill="auto" w:val="clear"/>
+          <w:vertAlign w:val="baseline"/>
+        </w:rPr>
+      </w:pPr>
+      <w:r>
+        <w:rPr>
+          <w:rtl w:val="0"/>
+        </w:rPr>
+      </w:r>
+    </w:p>
+    <w:p>
+      <w:pPr>
+        <w:keepNext w:val="0"/>
+        <w:keepLines w:val="0"/>
+        <w:pageBreakBefore w:val="0"/>
+        <w:widowControl w:val="1"/>
+        <w:pBdr>
+          <w:top w:space="0" w:sz="0" w:val="nil"/>
+          <w:left w:space="0" w:sz="0" w:val="nil"/>
+          <w:bottom w:space="0" w:sz="0" w:val="nil"/>
+          <w:right w:space="0" w:sz="0" w:val="nil"/>
+          <w:between w:space="0" w:sz="0" w:val="nil"/>
+        </w:pBdr>
+        <w:shd w:fill="auto" w:val="clear"/>
+        <w:spacing w:after="0" w:before="0" w:line="240" w:lineRule="auto"/>
+        <w:ind w:left="0" w:right="0" w:firstLine="0"/>
+        <w:jc w:val="left"/>
+        <w:rPr>
+          <w:rFonts w:ascii="Arial" w:cs="Arial" w:eastAsia="Arial" w:hAnsi="Arial"/>
+          <w:b w:val="1"/>
+          <w:i w:val="0"/>
+          <w:smallCaps w:val="0"/>
+          <w:strike w:val="0"/>
+          <w:color w:val="3b4559"/>
+          <w:sz w:val="16"/>
+          <w:szCs w:val="16"/>
+          <w:u w:val="none"/>
+          <w:shd w:fill="auto" w:val="clear"/>
+          <w:vertAlign w:val="baseline"/>
+        </w:rPr>
+      </w:pPr>
+      <w:r>
+        <w:rPr>
+          <w:rtl w:val="0"/>
+        </w:rPr>
+      </w:r>
+    </w:p>
+    <w:p>
+      <w:pPr>
+        <w:keepNext w:val="0"/>
+        <w:keepLines w:val="0"/>
+        <w:pageBreakBefore w:val="0"/>
+        <w:widowControl w:val="1"/>
+        <w:pBdr>
+          <w:top w:space="0" w:sz="0" w:val="nil"/>
+          <w:left w:space="0" w:sz="0" w:val="nil"/>
+          <w:bottom w:space="0" w:sz="0" w:val="nil"/>
+          <w:right w:space="0" w:sz="0" w:val="nil"/>
+          <w:between w:space="0" w:sz="0" w:val="nil"/>
+        </w:pBdr>
+        <w:shd w:fill="auto" w:val="clear"/>
+        <w:spacing w:after="0" w:before="0" w:line="240" w:lineRule="auto"/>
+        <w:ind w:left="0" w:right="0" w:firstLine="0"/>
+        <w:jc w:val="left"/>
+        <w:rPr>
+          <w:rFonts w:ascii="Arial" w:cs="Arial" w:eastAsia="Arial" w:hAnsi="Arial"/>
+          <w:b w:val="1"/>
+          <w:i w:val="0"/>
+          <w:smallCaps w:val="0"/>
+          <w:strike w:val="0"/>
+          <w:color w:val="3b4559"/>
+          <w:sz w:val="16"/>
+          <w:szCs w:val="16"/>
+          <w:u w:val="none"/>
+          <w:shd w:fill="auto" w:val="clear"/>
+          <w:vertAlign w:val="baseline"/>
+        </w:rPr>
+      </w:pPr>
+      <w:r>
+        <w:rPr>
+          <w:rtl w:val="0"/>
+        </w:rPr>
+      </w:r>
+    </w:p>
+    <w:p>
+      <w:pPr>
+        <w:keepNext w:val="0"/>
+        <w:keepLines w:val="0"/>
+        <w:pageBreakBefore w:val="0"/>
+        <w:widowControl w:val="1"/>
+        <w:pBdr>
+          <w:top w:space="0" w:sz="0" w:val="nil"/>
+          <w:left w:space="0" w:sz="0" w:val="nil"/>
+          <w:bottom w:space="0" w:sz="0" w:val="nil"/>
+          <w:right w:space="0" w:sz="0" w:val="nil"/>
+          <w:between w:space="0" w:sz="0" w:val="nil"/>
+        </w:pBdr>
+        <w:shd w:fill="auto" w:val="clear"/>
+        <w:spacing w:after="0" w:before="0" w:line="240" w:lineRule="auto"/>
+        <w:ind w:left="0" w:right="0" w:firstLine="0"/>
+        <w:jc w:val="left"/>
+        <w:rPr>
+          <w:rFonts w:ascii="Arial" w:cs="Arial" w:eastAsia="Arial" w:hAnsi="Arial"/>
+          <w:b w:val="1"/>
+          <w:i w:val="0"/>
+          <w:smallCaps w:val="0"/>
+          <w:strike w:val="0"/>
+          <w:color w:val="3b4559"/>
+          <w:sz w:val="16"/>
+          <w:szCs w:val="16"/>
+          <w:u w:val="none"/>
+          <w:shd w:fill="auto" w:val="clear"/>
+          <w:vertAlign w:val="baseline"/>
+        </w:rPr>
+      </w:pPr>
+      <w:r>
+        <w:rPr>
+          <w:rtl w:val="0"/>
+        </w:rPr>
+      </w:r>
+    </w:p>
+    <w:p>
+      <w:pPr>
+        <w:keepNext w:val="0"/>
+        <w:keepLines w:val="0"/>
+        <w:pageBreakBefore w:val="0"/>
+        <w:widowControl w:val="1"/>
+        <w:pBdr>
+          <w:top w:space="0" w:sz="0" w:val="nil"/>
+          <w:left w:space="0" w:sz="0" w:val="nil"/>
+          <w:bottom w:space="0" w:sz="0" w:val="nil"/>
+          <w:right w:space="0" w:sz="0" w:val="nil"/>
+          <w:between w:space="0" w:sz="0" w:val="nil"/>
+        </w:pBdr>
+        <w:shd w:fill="auto" w:val="clear"/>
+        <w:spacing w:after="0" w:before="0" w:line="240" w:lineRule="auto"/>
+        <w:ind w:left="0" w:right="0" w:firstLine="0"/>
+        <w:jc w:val="left"/>
+        <w:rPr>
+          <w:rFonts w:ascii="Arial" w:cs="Arial" w:eastAsia="Arial" w:hAnsi="Arial"/>
+          <w:b w:val="1"/>
+          <w:i w:val="0"/>
+          <w:smallCaps w:val="0"/>
+          <w:strike w:val="0"/>
+          <w:color w:val="3b4559"/>
+          <w:sz w:val="20"/>
+          <w:szCs w:val="20"/>
+          <w:u w:val="none"/>
+          <w:shd w:fill="auto" w:val="clear"/>
+          <w:vertAlign w:val="baseline"/>
+        </w:rPr>
+      </w:pPr>
+      <w:r>
+        <w:rPr>
+          <w:rtl w:val="0"/>
+        </w:rPr>
+      </w:r>
+    </w:p>
+    <w:p>
+      <w:pPr>
+        <w:keepNext w:val="0"/>
+        <w:keepLines w:val="0"/>
+        <w:pageBreakBefore w:val="1"/>
+        <w:widowControl w:val="1"/>
+        <w:pBdr>
+          <w:top w:space="0" w:sz="0" w:val="nil"/>
+          <w:left w:space="0" w:sz="0" w:val="nil"/>
+          <w:bottom w:space="0" w:sz="0" w:val="nil"/>
+          <w:right w:space="0" w:sz="0" w:val="nil"/>
+          <w:between w:space="0" w:sz="0" w:val="nil"/>
+        </w:pBdr>
+        <w:shd w:fill="auto" w:val="clear"/>
+        <w:spacing w:after="0" w:before="0" w:line="240" w:lineRule="auto"/>
+        <w:ind w:left="0" w:right="0" w:firstLine="0"/>
+        <w:jc w:val="left"/>
+        <w:rPr>
+          <w:rFonts w:ascii="Arial" w:cs="Arial" w:eastAsia="Arial" w:hAnsi="Arial"/>
+          <w:b w:val="0"/>
+          <w:i w:val="0"/>
+          <w:smallCaps w:val="0"/>
+          <w:strike w:val="0"/>
+          <w:color w:val="515151"/>
+          <w:sz w:val="28"/>
+          <w:szCs w:val="28"/>
+          <w:u w:val="none"/>
+          <w:shd w:fill="auto" w:val="clear"/>
+          <w:vertAlign w:val="baseline"/>
+        </w:rPr>
+      </w:pPr>
+      <w:r>
+        <w:rPr>
+          <w:rFonts w:ascii="Arial" w:cs="Arial" w:eastAsia="Arial" w:hAnsi="Arial"/>
+          <w:b w:val="0"/>
+          <w:i w:val="0"/>
+          <w:smallCaps w:val="0"/>
+          <w:strike w:val="0"/>
           <w:color w:val="282f3e"/>
           <w:sz w:val="32"/>
           <w:szCs w:val="32"/>
-          <w:rtl w:val="0"/>
-        </w:rPr>
-        <w:t xml:space="preserve">Aires marines protégées</w:t>
-      </w:r>
-      <w:r>
-        <w:rPr>
-          <w:rFonts w:ascii="Arial" w:cs="Arial" w:eastAsia="Arial" w:hAnsi="Arial"/>
+          <w:u w:val="none"/>
+          <w:shd w:fill="auto" w:val="clear"/>
+          <w:vertAlign w:val="baseline"/>
+          <w:rtl w:val="0"/>
+        </w:rPr>
+        <w:t xml:space="preserve">Zones de vigilance</w:t>
+      </w:r>
+      <w:r>
+        <w:rPr>
+          <w:rFonts w:ascii="Arial" w:cs="Arial" w:eastAsia="Arial" w:hAnsi="Arial"/>
+          <w:b w:val="0"/>
+          <w:i w:val="0"/>
+          <w:smallCaps w:val="0"/>
+          <w:strike w:val="0"/>
           <w:color w:val="515151"/>
           <w:sz w:val="28"/>
           <w:szCs w:val="28"/>
+          <w:u w:val="none"/>
+          <w:shd w:fill="auto" w:val="clear"/>
+          <w:vertAlign w:val="baseline"/>
           <w:rtl w:val="0"/>
         </w:rPr>
         <w:t xml:space="preserve">   </w:t>
@@ -5247,31 +4455,9 @@
           <w:szCs w:val="16"/>
           <w:rtl w:val="0"/>
         </w:rPr>
-        <w:t xml:space="preserve">${totalAMPs} sélectionnées</w:t>
-      </w:r>
-      <w:r>
-        <w:rPr>
-          <w:rtl w:val="0"/>
-        </w:rPr>
-      </w:r>
-    </w:p>
-    <w:p>
-      <w:pPr>
-        <w:keepNext w:val="0"/>
-        <w:keepLines w:val="0"/>
-        <w:pageBreakBefore w:val="0"/>
-        <w:widowControl w:val="1"/>
-        <w:pBdr>
-          <w:top w:space="0" w:sz="0" w:val="nil"/>
-          <w:left w:space="0" w:sz="0" w:val="nil"/>
-          <w:bottom w:space="0" w:sz="0" w:val="nil"/>
-          <w:right w:space="0" w:sz="0" w:val="nil"/>
-          <w:between w:space="0" w:sz="0" w:val="nil"/>
-        </w:pBdr>
-        <w:shd w:fill="auto" w:val="clear"/>
-        <w:spacing w:after="0" w:before="0" w:line="240" w:lineRule="auto"/>
-        <w:ind w:left="0" w:right="0" w:firstLine="0"/>
-        <w:jc w:val="left"/>
+        <w:t xml:space="preserve">${totalVigilanceAreas}</w:t>
+      </w:r>
+      <w:r>
         <w:rPr>
           <w:rFonts w:ascii="Arial" w:cs="Arial" w:eastAsia="Arial" w:hAnsi="Arial"/>
           <w:b w:val="1"/>
@@ -5284,8 +4470,10 @@
           <w:u w:val="none"/>
           <w:shd w:fill="auto" w:val="clear"/>
           <w:vertAlign w:val="baseline"/>
-        </w:rPr>
-      </w:pPr>
+          <w:rtl w:val="0"/>
+        </w:rPr>
+        <w:t xml:space="preserve"> sélectionnées</w:t>
+      </w:r>
       <w:r>
         <w:rPr>
           <w:rtl w:val="0"/>
@@ -5348,6 +4536,114 @@
         <w:jc w:val="left"/>
         <w:rPr>
           <w:rFonts w:ascii="Arial" w:cs="Arial" w:eastAsia="Arial" w:hAnsi="Arial"/>
+          <w:b w:val="0"/>
+          <w:i w:val="0"/>
+          <w:smallCaps w:val="0"/>
+          <w:strike w:val="0"/>
+          <w:color w:val="282f3e"/>
+          <w:sz w:val="18"/>
+          <w:szCs w:val="18"/>
+          <w:u w:val="none"/>
+          <w:shd w:fill="auto" w:val="clear"/>
+          <w:vertAlign w:val="baseline"/>
+        </w:rPr>
+      </w:pPr>
+      <w:r>
+        <w:rPr>
+          <w:rFonts w:ascii="Arial" w:cs="Arial" w:eastAsia="Arial" w:hAnsi="Arial"/>
+          <w:b w:val="0"/>
+          <w:i w:val="1"/>
+          <w:smallCaps w:val="0"/>
+          <w:strike w:val="0"/>
+          <w:color w:val="282f3e"/>
+          <w:sz w:val="18"/>
+          <w:szCs w:val="18"/>
+          <w:u w:val="none"/>
+          <w:shd w:fill="auto" w:val="clear"/>
+          <w:vertAlign w:val="baseline"/>
+          <w:rtl w:val="0"/>
+        </w:rPr>
+        <w:t xml:space="preserve">Une zone de vigilance permet d'orienter les contrôles en attirant l'attention et rappelant des informations utiles sur un endroit / une période donnés.</w:t>
+      </w:r>
+      <w:r>
+        <w:rPr>
+          <w:rtl w:val="0"/>
+        </w:rPr>
+      </w:r>
+    </w:p>
+    <w:p>
+      <w:pPr>
+        <w:keepNext w:val="0"/>
+        <w:keepLines w:val="0"/>
+        <w:pageBreakBefore w:val="0"/>
+        <w:widowControl w:val="1"/>
+        <w:pBdr>
+          <w:top w:space="0" w:sz="0" w:val="nil"/>
+          <w:left w:space="0" w:sz="0" w:val="nil"/>
+          <w:bottom w:space="0" w:sz="0" w:val="nil"/>
+          <w:right w:space="0" w:sz="0" w:val="nil"/>
+          <w:between w:space="0" w:sz="0" w:val="nil"/>
+        </w:pBdr>
+        <w:shd w:fill="auto" w:val="clear"/>
+        <w:spacing w:after="0" w:before="0" w:line="240" w:lineRule="auto"/>
+        <w:ind w:left="0" w:right="0" w:firstLine="0"/>
+        <w:jc w:val="left"/>
+        <w:rPr>
+          <w:rFonts w:ascii="Arial" w:cs="Arial" w:eastAsia="Arial" w:hAnsi="Arial"/>
+          <w:b w:val="0"/>
+          <w:i w:val="0"/>
+          <w:smallCaps w:val="0"/>
+          <w:strike w:val="0"/>
+          <w:color w:val="282f3e"/>
+          <w:sz w:val="18"/>
+          <w:szCs w:val="18"/>
+          <w:u w:val="none"/>
+          <w:shd w:fill="auto" w:val="clear"/>
+          <w:vertAlign w:val="baseline"/>
+        </w:rPr>
+      </w:pPr>
+      <w:r>
+        <w:rPr>
+          <w:rFonts w:ascii="Arial" w:cs="Arial" w:eastAsia="Arial" w:hAnsi="Arial"/>
+          <w:b w:val="0"/>
+          <w:i w:val="1"/>
+          <w:smallCaps w:val="0"/>
+          <w:strike w:val="0"/>
+          <w:color w:val="282f3e"/>
+          <w:sz w:val="18"/>
+          <w:szCs w:val="18"/>
+          <w:u w:val="none"/>
+          <w:shd w:fill="auto" w:val="clear"/>
+          <w:vertAlign w:val="baseline"/>
+          <w:rtl w:val="0"/>
+        </w:rPr>
+        <w:t xml:space="preserve">Les informations consignées dans les ZV ont – contrairement aux signalements – une validité dans le temps plus longue ou récurrente.</w:t>
+      </w:r>
+      <w:r>
+        <w:rPr>
+          <w:rtl w:val="0"/>
+        </w:rPr>
+      </w:r>
+    </w:p>
+    <w:p>
+      <w:pPr>
+        <w:keepNext w:val="0"/>
+        <w:keepLines w:val="0"/>
+        <w:pageBreakBefore w:val="0"/>
+        <w:widowControl w:val="1"/>
+        <w:pBdr>
+          <w:top w:space="0" w:sz="0" w:val="nil"/>
+          <w:left w:space="0" w:sz="0" w:val="nil"/>
+          <w:bottom w:space="0" w:sz="0" w:val="nil"/>
+          <w:right w:space="0" w:sz="0" w:val="nil"/>
+          <w:between w:space="0" w:sz="0" w:val="nil"/>
+        </w:pBdr>
+        <w:shd w:fill="auto" w:val="clear"/>
+        <w:spacing w:after="0" w:before="0" w:line="240" w:lineRule="auto"/>
+        <w:ind w:left="0" w:right="0" w:firstLine="0"/>
+        <w:jc w:val="left"/>
+        <w:rPr>
+          <w:rFonts w:ascii="Arial" w:cs="Arial" w:eastAsia="Arial" w:hAnsi="Arial"/>
           <w:b w:val="1"/>
           <w:i w:val="0"/>
           <w:smallCaps w:val="0"/>
@@ -5368,21 +4664,6 @@
     </w:p>
     <w:p>
       <w:pPr>
-        <w:keepNext w:val="0"/>
-        <w:keepLines w:val="0"/>
-        <w:pageBreakBefore w:val="0"/>
-        <w:widowControl w:val="1"/>
-        <w:pBdr>
-          <w:top w:space="0" w:sz="0" w:val="nil"/>
-          <w:left w:space="0" w:sz="0" w:val="nil"/>
-          <w:bottom w:space="0" w:sz="0" w:val="nil"/>
-          <w:right w:space="0" w:sz="0" w:val="nil"/>
-          <w:between w:space="0" w:sz="0" w:val="nil"/>
-        </w:pBdr>
-        <w:shd w:fill="auto" w:val="clear"/>
-        <w:spacing w:after="0" w:before="0" w:line="240" w:lineRule="auto"/>
-        <w:ind w:left="0" w:right="0" w:firstLine="0"/>
-        <w:jc w:val="left"/>
         <w:rPr>
           <w:rFonts w:ascii="Arial" w:cs="Arial" w:eastAsia="Arial" w:hAnsi="Arial"/>
           <w:b w:val="1"/>
@@ -5399,1099 +4680,13 @@
       </w:pPr>
       <w:r>
         <w:rPr>
-          <w:rtl w:val="0"/>
-        </w:rPr>
-      </w:r>
-    </w:p>
-    <w:p>
-      <w:pPr>
-        <w:keepNext w:val="0"/>
-        <w:keepLines w:val="0"/>
-        <w:pageBreakBefore w:val="0"/>
-        <w:widowControl w:val="1"/>
-        <w:pBdr>
-          <w:top w:space="0" w:sz="0" w:val="nil"/>
-          <w:left w:space="0" w:sz="0" w:val="nil"/>
-          <w:bottom w:space="0" w:sz="0" w:val="nil"/>
-          <w:right w:space="0" w:sz="0" w:val="nil"/>
-          <w:between w:space="0" w:sz="0" w:val="nil"/>
-        </w:pBdr>
-        <w:shd w:fill="auto" w:val="clear"/>
-        <w:spacing w:after="0" w:before="0" w:line="240" w:lineRule="auto"/>
-        <w:ind w:left="0" w:right="0" w:firstLine="0"/>
-        <w:jc w:val="left"/>
-        <w:rPr>
-          <w:rFonts w:ascii="Arial" w:cs="Arial" w:eastAsia="Arial" w:hAnsi="Arial"/>
-          <w:b w:val="1"/>
-          <w:i w:val="0"/>
-          <w:smallCaps w:val="0"/>
-          <w:strike w:val="0"/>
-          <w:color w:val="3b4559"/>
+          <w:rFonts w:ascii="Arial" w:cs="Arial" w:eastAsia="Arial" w:hAnsi="Arial"/>
           <w:sz w:val="16"/>
           <w:szCs w:val="16"/>
-          <w:u w:val="none"/>
-          <w:shd w:fill="auto" w:val="clear"/>
-          <w:vertAlign w:val="baseline"/>
-        </w:rPr>
-      </w:pPr>
-      <w:r>
-        <w:rPr>
-          <w:rtl w:val="0"/>
-        </w:rPr>
-      </w:r>
-    </w:p>
-    <w:p>
-      <w:pPr>
-        <w:keepNext w:val="0"/>
-        <w:keepLines w:val="0"/>
-        <w:pageBreakBefore w:val="0"/>
-        <w:widowControl w:val="1"/>
-        <w:pBdr>
-          <w:top w:space="0" w:sz="0" w:val="nil"/>
-          <w:left w:space="0" w:sz="0" w:val="nil"/>
-          <w:bottom w:space="0" w:sz="0" w:val="nil"/>
-          <w:right w:space="0" w:sz="0" w:val="nil"/>
-          <w:between w:space="0" w:sz="0" w:val="nil"/>
-        </w:pBdr>
-        <w:shd w:fill="auto" w:val="clear"/>
-        <w:spacing w:after="0" w:before="0" w:line="240" w:lineRule="auto"/>
-        <w:ind w:left="0" w:right="0" w:firstLine="0"/>
-        <w:jc w:val="left"/>
-        <w:rPr>
-          <w:rFonts w:ascii="Arial" w:cs="Arial" w:eastAsia="Arial" w:hAnsi="Arial"/>
-          <w:b w:val="1"/>
-          <w:i w:val="0"/>
-          <w:smallCaps w:val="0"/>
-          <w:strike w:val="0"/>
-          <w:color w:val="3b4559"/>
-          <w:sz w:val="16"/>
-          <w:szCs w:val="16"/>
-          <w:u w:val="none"/>
-          <w:shd w:fill="auto" w:val="clear"/>
-          <w:vertAlign w:val="baseline"/>
-        </w:rPr>
-      </w:pPr>
-      <w:r>
-        <w:rPr>
-          <w:rtl w:val="0"/>
-        </w:rPr>
-      </w:r>
-    </w:p>
-    <w:p>
-      <w:pPr>
-        <w:keepNext w:val="0"/>
-        <w:keepLines w:val="0"/>
-        <w:pageBreakBefore w:val="0"/>
-        <w:widowControl w:val="1"/>
-        <w:pBdr>
-          <w:top w:space="0" w:sz="0" w:val="nil"/>
-          <w:left w:space="0" w:sz="0" w:val="nil"/>
-          <w:bottom w:space="0" w:sz="0" w:val="nil"/>
-          <w:right w:space="0" w:sz="0" w:val="nil"/>
-          <w:between w:space="0" w:sz="0" w:val="nil"/>
-        </w:pBdr>
-        <w:shd w:fill="auto" w:val="clear"/>
-        <w:spacing w:after="0" w:before="0" w:line="240" w:lineRule="auto"/>
-        <w:ind w:left="0" w:right="0" w:firstLine="0"/>
-        <w:jc w:val="left"/>
-        <w:rPr>
-          <w:rFonts w:ascii="Arial" w:cs="Arial" w:eastAsia="Arial" w:hAnsi="Arial"/>
-          <w:b w:val="1"/>
-          <w:i w:val="0"/>
-          <w:smallCaps w:val="0"/>
-          <w:strike w:val="0"/>
-          <w:color w:val="3b4559"/>
-          <w:sz w:val="16"/>
-          <w:szCs w:val="16"/>
-          <w:u w:val="none"/>
-          <w:shd w:fill="auto" w:val="clear"/>
-          <w:vertAlign w:val="baseline"/>
-        </w:rPr>
-      </w:pPr>
-      <w:r>
-        <w:rPr>
-          <w:rtl w:val="0"/>
-        </w:rPr>
-      </w:r>
-    </w:p>
-    <w:p>
-      <w:pPr>
-        <w:keepNext w:val="0"/>
-        <w:keepLines w:val="0"/>
-        <w:pageBreakBefore w:val="0"/>
-        <w:widowControl w:val="1"/>
-        <w:pBdr>
-          <w:top w:space="0" w:sz="0" w:val="nil"/>
-          <w:left w:space="0" w:sz="0" w:val="nil"/>
-          <w:bottom w:space="0" w:sz="0" w:val="nil"/>
-          <w:right w:space="0" w:sz="0" w:val="nil"/>
-          <w:between w:space="0" w:sz="0" w:val="nil"/>
-        </w:pBdr>
-        <w:shd w:fill="auto" w:val="clear"/>
-        <w:spacing w:after="0" w:before="0" w:line="240" w:lineRule="auto"/>
-        <w:ind w:left="0" w:right="0" w:firstLine="0"/>
-        <w:jc w:val="left"/>
-        <w:rPr>
-          <w:rFonts w:ascii="Arial" w:cs="Arial" w:eastAsia="Arial" w:hAnsi="Arial"/>
-          <w:b w:val="1"/>
-          <w:i w:val="0"/>
-          <w:smallCaps w:val="0"/>
-          <w:strike w:val="0"/>
-          <w:color w:val="3b4559"/>
-          <w:sz w:val="16"/>
-          <w:szCs w:val="16"/>
-          <w:u w:val="none"/>
-          <w:shd w:fill="auto" w:val="clear"/>
-          <w:vertAlign w:val="baseline"/>
-        </w:rPr>
-      </w:pPr>
-      <w:r>
-        <w:rPr>
-          <w:rtl w:val="0"/>
-        </w:rPr>
-      </w:r>
-    </w:p>
-    <w:p>
-      <w:pPr>
-        <w:keepNext w:val="0"/>
-        <w:keepLines w:val="0"/>
-        <w:pageBreakBefore w:val="0"/>
-        <w:widowControl w:val="1"/>
-        <w:pBdr>
-          <w:top w:space="0" w:sz="0" w:val="nil"/>
-          <w:left w:space="0" w:sz="0" w:val="nil"/>
-          <w:bottom w:space="0" w:sz="0" w:val="nil"/>
-          <w:right w:space="0" w:sz="0" w:val="nil"/>
-          <w:between w:space="0" w:sz="0" w:val="nil"/>
-        </w:pBdr>
-        <w:shd w:fill="auto" w:val="clear"/>
-        <w:spacing w:after="0" w:before="0" w:line="240" w:lineRule="auto"/>
-        <w:ind w:left="0" w:right="0" w:firstLine="0"/>
-        <w:jc w:val="left"/>
-        <w:rPr>
-          <w:rFonts w:ascii="Arial" w:cs="Arial" w:eastAsia="Arial" w:hAnsi="Arial"/>
-          <w:b w:val="1"/>
-          <w:i w:val="0"/>
-          <w:smallCaps w:val="0"/>
-          <w:strike w:val="0"/>
-          <w:color w:val="3b4559"/>
-          <w:sz w:val="16"/>
-          <w:szCs w:val="16"/>
-          <w:u w:val="none"/>
-          <w:shd w:fill="auto" w:val="clear"/>
-          <w:vertAlign w:val="baseline"/>
-        </w:rPr>
-      </w:pPr>
-      <w:r>
-        <w:rPr>
-          <w:rtl w:val="0"/>
-        </w:rPr>
-      </w:r>
-    </w:p>
-    <w:p>
-      <w:pPr>
-        <w:keepNext w:val="0"/>
-        <w:keepLines w:val="0"/>
-        <w:pageBreakBefore w:val="0"/>
-        <w:widowControl w:val="1"/>
-        <w:pBdr>
-          <w:top w:space="0" w:sz="0" w:val="nil"/>
-          <w:left w:space="0" w:sz="0" w:val="nil"/>
-          <w:bottom w:space="0" w:sz="0" w:val="nil"/>
-          <w:right w:space="0" w:sz="0" w:val="nil"/>
-          <w:between w:space="0" w:sz="0" w:val="nil"/>
-        </w:pBdr>
-        <w:shd w:fill="auto" w:val="clear"/>
-        <w:spacing w:after="0" w:before="0" w:line="240" w:lineRule="auto"/>
-        <w:ind w:left="0" w:right="0" w:firstLine="0"/>
-        <w:jc w:val="left"/>
-        <w:rPr>
-          <w:rFonts w:ascii="Arial" w:cs="Arial" w:eastAsia="Arial" w:hAnsi="Arial"/>
-          <w:b w:val="1"/>
-          <w:i w:val="0"/>
-          <w:smallCaps w:val="0"/>
-          <w:strike w:val="0"/>
-          <w:color w:val="3b4559"/>
-          <w:sz w:val="16"/>
-          <w:szCs w:val="16"/>
-          <w:u w:val="none"/>
-          <w:shd w:fill="auto" w:val="clear"/>
-          <w:vertAlign w:val="baseline"/>
-        </w:rPr>
-      </w:pPr>
-      <w:r>
-        <w:rPr>
-          <w:rtl w:val="0"/>
-        </w:rPr>
-      </w:r>
-    </w:p>
-    <w:p>
-      <w:pPr>
-        <w:keepNext w:val="0"/>
-        <w:keepLines w:val="0"/>
-        <w:pageBreakBefore w:val="0"/>
-        <w:widowControl w:val="1"/>
-        <w:pBdr>
-          <w:top w:space="0" w:sz="0" w:val="nil"/>
-          <w:left w:space="0" w:sz="0" w:val="nil"/>
-          <w:bottom w:space="0" w:sz="0" w:val="nil"/>
-          <w:right w:space="0" w:sz="0" w:val="nil"/>
-          <w:between w:space="0" w:sz="0" w:val="nil"/>
-        </w:pBdr>
-        <w:shd w:fill="auto" w:val="clear"/>
-        <w:spacing w:after="0" w:before="0" w:line="240" w:lineRule="auto"/>
-        <w:ind w:left="0" w:right="0" w:firstLine="0"/>
-        <w:jc w:val="left"/>
-        <w:rPr>
-          <w:rFonts w:ascii="Arial" w:cs="Arial" w:eastAsia="Arial" w:hAnsi="Arial"/>
-          <w:b w:val="1"/>
-          <w:i w:val="0"/>
-          <w:smallCaps w:val="0"/>
-          <w:strike w:val="0"/>
-          <w:color w:val="3b4559"/>
-          <w:sz w:val="16"/>
-          <w:szCs w:val="16"/>
-          <w:u w:val="none"/>
-          <w:shd w:fill="auto" w:val="clear"/>
-          <w:vertAlign w:val="baseline"/>
-        </w:rPr>
-      </w:pPr>
-      <w:r>
-        <w:rPr>
-          <w:rtl w:val="0"/>
-        </w:rPr>
-      </w:r>
-    </w:p>
-    <w:p>
-      <w:pPr>
-        <w:keepNext w:val="0"/>
-        <w:keepLines w:val="0"/>
-        <w:pageBreakBefore w:val="0"/>
-        <w:widowControl w:val="1"/>
-        <w:pBdr>
-          <w:top w:space="0" w:sz="0" w:val="nil"/>
-          <w:left w:space="0" w:sz="0" w:val="nil"/>
-          <w:bottom w:space="0" w:sz="0" w:val="nil"/>
-          <w:right w:space="0" w:sz="0" w:val="nil"/>
-          <w:between w:space="0" w:sz="0" w:val="nil"/>
-        </w:pBdr>
-        <w:shd w:fill="auto" w:val="clear"/>
-        <w:spacing w:after="0" w:before="0" w:line="240" w:lineRule="auto"/>
-        <w:ind w:left="0" w:right="0" w:firstLine="0"/>
-        <w:jc w:val="left"/>
-        <w:rPr>
-          <w:rFonts w:ascii="Arial" w:cs="Arial" w:eastAsia="Arial" w:hAnsi="Arial"/>
-          <w:b w:val="1"/>
-          <w:i w:val="0"/>
-          <w:smallCaps w:val="0"/>
-          <w:strike w:val="0"/>
-          <w:color w:val="3b4559"/>
-          <w:sz w:val="16"/>
-          <w:szCs w:val="16"/>
-          <w:u w:val="none"/>
-          <w:shd w:fill="auto" w:val="clear"/>
-          <w:vertAlign w:val="baseline"/>
-        </w:rPr>
-      </w:pPr>
-      <w:r>
-        <w:rPr>
-          <w:rtl w:val="0"/>
-        </w:rPr>
-      </w:r>
-    </w:p>
-    <w:p>
-      <w:pPr>
-        <w:keepNext w:val="0"/>
-        <w:keepLines w:val="0"/>
-        <w:pageBreakBefore w:val="0"/>
-        <w:widowControl w:val="1"/>
-        <w:pBdr>
-          <w:top w:space="0" w:sz="0" w:val="nil"/>
-          <w:left w:space="0" w:sz="0" w:val="nil"/>
-          <w:bottom w:space="0" w:sz="0" w:val="nil"/>
-          <w:right w:space="0" w:sz="0" w:val="nil"/>
-          <w:between w:space="0" w:sz="0" w:val="nil"/>
-        </w:pBdr>
-        <w:shd w:fill="auto" w:val="clear"/>
-        <w:spacing w:after="0" w:before="0" w:line="240" w:lineRule="auto"/>
-        <w:ind w:left="0" w:right="0" w:firstLine="0"/>
-        <w:jc w:val="left"/>
-        <w:rPr>
-          <w:rFonts w:ascii="Arial" w:cs="Arial" w:eastAsia="Arial" w:hAnsi="Arial"/>
-          <w:b w:val="1"/>
-          <w:i w:val="0"/>
-          <w:smallCaps w:val="0"/>
-          <w:strike w:val="0"/>
-          <w:color w:val="3b4559"/>
-          <w:sz w:val="16"/>
-          <w:szCs w:val="16"/>
-          <w:u w:val="none"/>
-          <w:shd w:fill="auto" w:val="clear"/>
-          <w:vertAlign w:val="baseline"/>
-        </w:rPr>
-      </w:pPr>
-      <w:r>
-        <w:rPr>
-          <w:rtl w:val="0"/>
-        </w:rPr>
-      </w:r>
-    </w:p>
-    <w:p>
-      <w:pPr>
-        <w:keepNext w:val="0"/>
-        <w:keepLines w:val="0"/>
-        <w:pageBreakBefore w:val="0"/>
-        <w:widowControl w:val="1"/>
-        <w:pBdr>
-          <w:top w:space="0" w:sz="0" w:val="nil"/>
-          <w:left w:space="0" w:sz="0" w:val="nil"/>
-          <w:bottom w:space="0" w:sz="0" w:val="nil"/>
-          <w:right w:space="0" w:sz="0" w:val="nil"/>
-          <w:between w:space="0" w:sz="0" w:val="nil"/>
-        </w:pBdr>
-        <w:shd w:fill="auto" w:val="clear"/>
-        <w:spacing w:after="0" w:before="0" w:line="240" w:lineRule="auto"/>
-        <w:ind w:left="0" w:right="0" w:firstLine="0"/>
-        <w:jc w:val="left"/>
-        <w:rPr>
-          <w:rFonts w:ascii="Arial" w:cs="Arial" w:eastAsia="Arial" w:hAnsi="Arial"/>
-          <w:b w:val="1"/>
-          <w:i w:val="0"/>
-          <w:smallCaps w:val="0"/>
-          <w:strike w:val="0"/>
-          <w:color w:val="3b4559"/>
-          <w:sz w:val="16"/>
-          <w:szCs w:val="16"/>
-          <w:u w:val="none"/>
-          <w:shd w:fill="auto" w:val="clear"/>
-          <w:vertAlign w:val="baseline"/>
-        </w:rPr>
-      </w:pPr>
-      <w:r>
-        <w:rPr>
-          <w:rtl w:val="0"/>
-        </w:rPr>
-      </w:r>
-    </w:p>
-    <w:p>
-      <w:pPr>
-        <w:keepNext w:val="0"/>
-        <w:keepLines w:val="0"/>
-        <w:pageBreakBefore w:val="0"/>
-        <w:widowControl w:val="1"/>
-        <w:pBdr>
-          <w:top w:space="0" w:sz="0" w:val="nil"/>
-          <w:left w:space="0" w:sz="0" w:val="nil"/>
-          <w:bottom w:space="0" w:sz="0" w:val="nil"/>
-          <w:right w:space="0" w:sz="0" w:val="nil"/>
-          <w:between w:space="0" w:sz="0" w:val="nil"/>
-        </w:pBdr>
-        <w:shd w:fill="auto" w:val="clear"/>
-        <w:spacing w:after="0" w:before="0" w:line="240" w:lineRule="auto"/>
-        <w:ind w:left="0" w:right="0" w:firstLine="0"/>
-        <w:jc w:val="left"/>
-        <w:rPr>
-          <w:rFonts w:ascii="Arial" w:cs="Arial" w:eastAsia="Arial" w:hAnsi="Arial"/>
-          <w:b w:val="1"/>
-          <w:i w:val="0"/>
-          <w:smallCaps w:val="0"/>
-          <w:strike w:val="0"/>
-          <w:color w:val="3b4559"/>
-          <w:sz w:val="16"/>
-          <w:szCs w:val="16"/>
-          <w:u w:val="none"/>
-          <w:shd w:fill="auto" w:val="clear"/>
-          <w:vertAlign w:val="baseline"/>
-        </w:rPr>
-      </w:pPr>
-      <w:r>
-        <w:rPr>
-          <w:rtl w:val="0"/>
-        </w:rPr>
-      </w:r>
-    </w:p>
-    <w:p>
-      <w:pPr>
-        <w:keepNext w:val="0"/>
-        <w:keepLines w:val="0"/>
-        <w:pageBreakBefore w:val="0"/>
-        <w:widowControl w:val="1"/>
-        <w:pBdr>
-          <w:top w:space="0" w:sz="0" w:val="nil"/>
-          <w:left w:space="0" w:sz="0" w:val="nil"/>
-          <w:bottom w:space="0" w:sz="0" w:val="nil"/>
-          <w:right w:space="0" w:sz="0" w:val="nil"/>
-          <w:between w:space="0" w:sz="0" w:val="nil"/>
-        </w:pBdr>
-        <w:shd w:fill="auto" w:val="clear"/>
-        <w:spacing w:after="0" w:before="0" w:line="240" w:lineRule="auto"/>
-        <w:ind w:left="0" w:right="0" w:firstLine="0"/>
-        <w:jc w:val="left"/>
-        <w:rPr>
-          <w:rFonts w:ascii="Arial" w:cs="Arial" w:eastAsia="Arial" w:hAnsi="Arial"/>
-          <w:b w:val="1"/>
-          <w:i w:val="0"/>
-          <w:smallCaps w:val="0"/>
-          <w:strike w:val="0"/>
-          <w:color w:val="3b4559"/>
-          <w:sz w:val="16"/>
-          <w:szCs w:val="16"/>
-          <w:u w:val="none"/>
-          <w:shd w:fill="auto" w:val="clear"/>
-          <w:vertAlign w:val="baseline"/>
-        </w:rPr>
-      </w:pPr>
-      <w:r>
-        <w:rPr>
-          <w:rtl w:val="0"/>
-        </w:rPr>
-      </w:r>
-    </w:p>
-    <w:p>
-      <w:pPr>
-        <w:keepNext w:val="0"/>
-        <w:keepLines w:val="0"/>
-        <w:pageBreakBefore w:val="0"/>
-        <w:widowControl w:val="1"/>
-        <w:pBdr>
-          <w:top w:space="0" w:sz="0" w:val="nil"/>
-          <w:left w:space="0" w:sz="0" w:val="nil"/>
-          <w:bottom w:space="0" w:sz="0" w:val="nil"/>
-          <w:right w:space="0" w:sz="0" w:val="nil"/>
-          <w:between w:space="0" w:sz="0" w:val="nil"/>
-        </w:pBdr>
-        <w:shd w:fill="auto" w:val="clear"/>
-        <w:spacing w:after="0" w:before="0" w:line="240" w:lineRule="auto"/>
-        <w:ind w:left="0" w:right="0" w:firstLine="0"/>
-        <w:jc w:val="left"/>
-        <w:rPr>
-          <w:rFonts w:ascii="Arial" w:cs="Arial" w:eastAsia="Arial" w:hAnsi="Arial"/>
-          <w:b w:val="1"/>
-          <w:i w:val="0"/>
-          <w:smallCaps w:val="0"/>
-          <w:strike w:val="0"/>
-          <w:color w:val="3b4559"/>
-          <w:sz w:val="16"/>
-          <w:szCs w:val="16"/>
-          <w:u w:val="none"/>
-          <w:shd w:fill="auto" w:val="clear"/>
-          <w:vertAlign w:val="baseline"/>
-        </w:rPr>
-      </w:pPr>
-      <w:r>
-        <w:rPr>
-          <w:rtl w:val="0"/>
-        </w:rPr>
-      </w:r>
-    </w:p>
-    <w:p>
-      <w:pPr>
-        <w:keepNext w:val="0"/>
-        <w:keepLines w:val="0"/>
-        <w:pageBreakBefore w:val="0"/>
-        <w:widowControl w:val="1"/>
-        <w:pBdr>
-          <w:top w:space="0" w:sz="0" w:val="nil"/>
-          <w:left w:space="0" w:sz="0" w:val="nil"/>
-          <w:bottom w:space="0" w:sz="0" w:val="nil"/>
-          <w:right w:space="0" w:sz="0" w:val="nil"/>
-          <w:between w:space="0" w:sz="0" w:val="nil"/>
-        </w:pBdr>
-        <w:shd w:fill="auto" w:val="clear"/>
-        <w:spacing w:after="0" w:before="0" w:line="240" w:lineRule="auto"/>
-        <w:ind w:left="0" w:right="0" w:firstLine="0"/>
-        <w:jc w:val="left"/>
-        <w:rPr>
-          <w:rFonts w:ascii="Arial" w:cs="Arial" w:eastAsia="Arial" w:hAnsi="Arial"/>
-          <w:b w:val="1"/>
-          <w:i w:val="0"/>
-          <w:smallCaps w:val="0"/>
-          <w:strike w:val="0"/>
-          <w:color w:val="3b4559"/>
-          <w:sz w:val="16"/>
-          <w:szCs w:val="16"/>
-          <w:u w:val="none"/>
-          <w:shd w:fill="auto" w:val="clear"/>
-          <w:vertAlign w:val="baseline"/>
-        </w:rPr>
-      </w:pPr>
-      <w:r>
-        <w:rPr>
-          <w:rtl w:val="0"/>
-        </w:rPr>
-      </w:r>
-    </w:p>
-    <w:p>
-      <w:pPr>
-        <w:keepNext w:val="0"/>
-        <w:keepLines w:val="0"/>
-        <w:pageBreakBefore w:val="0"/>
-        <w:widowControl w:val="1"/>
-        <w:pBdr>
-          <w:top w:space="0" w:sz="0" w:val="nil"/>
-          <w:left w:space="0" w:sz="0" w:val="nil"/>
-          <w:bottom w:space="0" w:sz="0" w:val="nil"/>
-          <w:right w:space="0" w:sz="0" w:val="nil"/>
-          <w:between w:space="0" w:sz="0" w:val="nil"/>
-        </w:pBdr>
-        <w:shd w:fill="auto" w:val="clear"/>
-        <w:spacing w:after="0" w:before="0" w:line="240" w:lineRule="auto"/>
-        <w:ind w:left="0" w:right="0" w:firstLine="0"/>
-        <w:jc w:val="left"/>
-        <w:rPr>
-          <w:rFonts w:ascii="Arial" w:cs="Arial" w:eastAsia="Arial" w:hAnsi="Arial"/>
-          <w:b w:val="1"/>
-          <w:i w:val="0"/>
-          <w:smallCaps w:val="0"/>
-          <w:strike w:val="0"/>
-          <w:color w:val="3b4559"/>
-          <w:sz w:val="16"/>
-          <w:szCs w:val="16"/>
-          <w:u w:val="none"/>
-          <w:shd w:fill="auto" w:val="clear"/>
-          <w:vertAlign w:val="baseline"/>
-        </w:rPr>
-      </w:pPr>
-      <w:r>
-        <w:rPr>
-          <w:rtl w:val="0"/>
-        </w:rPr>
-      </w:r>
-    </w:p>
-    <w:p>
-      <w:pPr>
-        <w:keepNext w:val="0"/>
-        <w:keepLines w:val="0"/>
-        <w:pageBreakBefore w:val="0"/>
-        <w:widowControl w:val="1"/>
-        <w:pBdr>
-          <w:top w:space="0" w:sz="0" w:val="nil"/>
-          <w:left w:space="0" w:sz="0" w:val="nil"/>
-          <w:bottom w:space="0" w:sz="0" w:val="nil"/>
-          <w:right w:space="0" w:sz="0" w:val="nil"/>
-          <w:between w:space="0" w:sz="0" w:val="nil"/>
-        </w:pBdr>
-        <w:shd w:fill="auto" w:val="clear"/>
-        <w:spacing w:after="0" w:before="0" w:line="240" w:lineRule="auto"/>
-        <w:ind w:left="0" w:right="0" w:firstLine="0"/>
-        <w:jc w:val="left"/>
-        <w:rPr>
-          <w:rFonts w:ascii="Arial" w:cs="Arial" w:eastAsia="Arial" w:hAnsi="Arial"/>
-          <w:b w:val="1"/>
-          <w:i w:val="0"/>
-          <w:smallCaps w:val="0"/>
-          <w:strike w:val="0"/>
-          <w:color w:val="3b4559"/>
-          <w:sz w:val="16"/>
-          <w:szCs w:val="16"/>
-          <w:u w:val="none"/>
-          <w:shd w:fill="auto" w:val="clear"/>
-          <w:vertAlign w:val="baseline"/>
-        </w:rPr>
-      </w:pPr>
-      <w:r>
-        <w:rPr>
-          <w:rtl w:val="0"/>
-        </w:rPr>
-      </w:r>
-    </w:p>
-    <w:p>
-      <w:pPr>
-        <w:keepNext w:val="0"/>
-        <w:keepLines w:val="0"/>
-        <w:pageBreakBefore w:val="0"/>
-        <w:widowControl w:val="1"/>
-        <w:pBdr>
-          <w:top w:space="0" w:sz="0" w:val="nil"/>
-          <w:left w:space="0" w:sz="0" w:val="nil"/>
-          <w:bottom w:space="0" w:sz="0" w:val="nil"/>
-          <w:right w:space="0" w:sz="0" w:val="nil"/>
-          <w:between w:space="0" w:sz="0" w:val="nil"/>
-        </w:pBdr>
-        <w:shd w:fill="auto" w:val="clear"/>
-        <w:spacing w:after="0" w:before="0" w:line="240" w:lineRule="auto"/>
-        <w:ind w:left="0" w:right="0" w:firstLine="0"/>
-        <w:jc w:val="left"/>
-        <w:rPr>
-          <w:rFonts w:ascii="Arial" w:cs="Arial" w:eastAsia="Arial" w:hAnsi="Arial"/>
-          <w:b w:val="1"/>
-          <w:i w:val="0"/>
-          <w:smallCaps w:val="0"/>
-          <w:strike w:val="0"/>
-          <w:color w:val="3b4559"/>
-          <w:sz w:val="16"/>
-          <w:szCs w:val="16"/>
-          <w:u w:val="none"/>
-          <w:shd w:fill="auto" w:val="clear"/>
-          <w:vertAlign w:val="baseline"/>
-        </w:rPr>
-      </w:pPr>
-      <w:r>
-        <w:rPr>
-          <w:rtl w:val="0"/>
-        </w:rPr>
-      </w:r>
-    </w:p>
-    <w:p>
-      <w:pPr>
-        <w:keepNext w:val="0"/>
-        <w:keepLines w:val="0"/>
-        <w:pageBreakBefore w:val="0"/>
-        <w:widowControl w:val="1"/>
-        <w:pBdr>
-          <w:top w:space="0" w:sz="0" w:val="nil"/>
-          <w:left w:space="0" w:sz="0" w:val="nil"/>
-          <w:bottom w:space="0" w:sz="0" w:val="nil"/>
-          <w:right w:space="0" w:sz="0" w:val="nil"/>
-          <w:between w:space="0" w:sz="0" w:val="nil"/>
-        </w:pBdr>
-        <w:shd w:fill="auto" w:val="clear"/>
-        <w:spacing w:after="0" w:before="0" w:line="240" w:lineRule="auto"/>
-        <w:ind w:left="0" w:right="0" w:firstLine="0"/>
-        <w:jc w:val="left"/>
-        <w:rPr>
-          <w:rFonts w:ascii="Arial" w:cs="Arial" w:eastAsia="Arial" w:hAnsi="Arial"/>
-          <w:b w:val="1"/>
-          <w:i w:val="0"/>
-          <w:smallCaps w:val="0"/>
-          <w:strike w:val="0"/>
-          <w:color w:val="3b4559"/>
-          <w:sz w:val="16"/>
-          <w:szCs w:val="16"/>
-          <w:u w:val="none"/>
-          <w:shd w:fill="auto" w:val="clear"/>
-          <w:vertAlign w:val="baseline"/>
-        </w:rPr>
-      </w:pPr>
-      <w:r>
-        <w:rPr>
-          <w:rtl w:val="0"/>
-        </w:rPr>
-      </w:r>
-    </w:p>
-    <w:p>
-      <w:pPr>
-        <w:keepNext w:val="0"/>
-        <w:keepLines w:val="0"/>
-        <w:pageBreakBefore w:val="0"/>
-        <w:widowControl w:val="1"/>
-        <w:pBdr>
-          <w:top w:space="0" w:sz="0" w:val="nil"/>
-          <w:left w:space="0" w:sz="0" w:val="nil"/>
-          <w:bottom w:space="0" w:sz="0" w:val="nil"/>
-          <w:right w:space="0" w:sz="0" w:val="nil"/>
-          <w:between w:space="0" w:sz="0" w:val="nil"/>
-        </w:pBdr>
-        <w:shd w:fill="auto" w:val="clear"/>
-        <w:spacing w:after="0" w:before="0" w:line="240" w:lineRule="auto"/>
-        <w:ind w:left="0" w:right="0" w:firstLine="0"/>
-        <w:jc w:val="left"/>
-        <w:rPr>
-          <w:rFonts w:ascii="Arial" w:cs="Arial" w:eastAsia="Arial" w:hAnsi="Arial"/>
-          <w:b w:val="1"/>
-          <w:i w:val="0"/>
-          <w:smallCaps w:val="0"/>
-          <w:strike w:val="0"/>
-          <w:color w:val="3b4559"/>
-          <w:sz w:val="16"/>
-          <w:szCs w:val="16"/>
-          <w:u w:val="none"/>
-          <w:shd w:fill="auto" w:val="clear"/>
-          <w:vertAlign w:val="baseline"/>
-        </w:rPr>
-      </w:pPr>
-      <w:r>
-        <w:rPr>
-          <w:rtl w:val="0"/>
-        </w:rPr>
-      </w:r>
-    </w:p>
-    <w:p>
-      <w:pPr>
-        <w:keepNext w:val="0"/>
-        <w:keepLines w:val="0"/>
-        <w:pageBreakBefore w:val="0"/>
-        <w:widowControl w:val="1"/>
-        <w:pBdr>
-          <w:top w:space="0" w:sz="0" w:val="nil"/>
-          <w:left w:space="0" w:sz="0" w:val="nil"/>
-          <w:bottom w:space="0" w:sz="0" w:val="nil"/>
-          <w:right w:space="0" w:sz="0" w:val="nil"/>
-          <w:between w:space="0" w:sz="0" w:val="nil"/>
-        </w:pBdr>
-        <w:shd w:fill="auto" w:val="clear"/>
-        <w:spacing w:after="0" w:before="0" w:line="240" w:lineRule="auto"/>
-        <w:ind w:left="0" w:right="0" w:firstLine="0"/>
-        <w:jc w:val="left"/>
-        <w:rPr>
-          <w:rFonts w:ascii="Arial" w:cs="Arial" w:eastAsia="Arial" w:hAnsi="Arial"/>
-          <w:b w:val="1"/>
-          <w:i w:val="0"/>
-          <w:smallCaps w:val="0"/>
-          <w:strike w:val="0"/>
-          <w:color w:val="3b4559"/>
-          <w:sz w:val="16"/>
-          <w:szCs w:val="16"/>
-          <w:u w:val="none"/>
-          <w:shd w:fill="auto" w:val="clear"/>
-          <w:vertAlign w:val="baseline"/>
-        </w:rPr>
-      </w:pPr>
-      <w:r>
-        <w:rPr>
-          <w:rtl w:val="0"/>
-        </w:rPr>
-      </w:r>
-    </w:p>
-    <w:p>
-      <w:pPr>
-        <w:keepNext w:val="0"/>
-        <w:keepLines w:val="0"/>
-        <w:pageBreakBefore w:val="0"/>
-        <w:widowControl w:val="1"/>
-        <w:pBdr>
-          <w:top w:space="0" w:sz="0" w:val="nil"/>
-          <w:left w:space="0" w:sz="0" w:val="nil"/>
-          <w:bottom w:space="0" w:sz="0" w:val="nil"/>
-          <w:right w:space="0" w:sz="0" w:val="nil"/>
-          <w:between w:space="0" w:sz="0" w:val="nil"/>
-        </w:pBdr>
-        <w:shd w:fill="auto" w:val="clear"/>
-        <w:spacing w:after="0" w:before="0" w:line="240" w:lineRule="auto"/>
-        <w:ind w:left="0" w:right="0" w:firstLine="0"/>
-        <w:jc w:val="left"/>
-        <w:rPr>
-          <w:rFonts w:ascii="Arial" w:cs="Arial" w:eastAsia="Arial" w:hAnsi="Arial"/>
-          <w:b w:val="1"/>
-          <w:i w:val="0"/>
-          <w:smallCaps w:val="0"/>
-          <w:strike w:val="0"/>
-          <w:color w:val="3b4559"/>
-          <w:sz w:val="20"/>
-          <w:szCs w:val="20"/>
-          <w:u w:val="none"/>
-          <w:shd w:fill="auto" w:val="clear"/>
-          <w:vertAlign w:val="baseline"/>
-        </w:rPr>
-      </w:pPr>
-      <w:r>
-        <w:rPr>
-          <w:rtl w:val="0"/>
-        </w:rPr>
-      </w:r>
-    </w:p>
-    <w:p>
-      <w:pPr>
-        <w:keepNext w:val="0"/>
-        <w:keepLines w:val="0"/>
-        <w:pageBreakBefore w:val="1"/>
-        <w:widowControl w:val="1"/>
-        <w:pBdr>
-          <w:top w:space="0" w:sz="0" w:val="nil"/>
-          <w:left w:space="0" w:sz="0" w:val="nil"/>
-          <w:bottom w:space="0" w:sz="0" w:val="nil"/>
-          <w:right w:space="0" w:sz="0" w:val="nil"/>
-          <w:between w:space="0" w:sz="0" w:val="nil"/>
-        </w:pBdr>
-        <w:shd w:fill="auto" w:val="clear"/>
-        <w:spacing w:after="0" w:before="0" w:line="240" w:lineRule="auto"/>
-        <w:ind w:left="0" w:right="0" w:firstLine="0"/>
-        <w:jc w:val="left"/>
-        <w:rPr>
-          <w:rFonts w:ascii="Arial" w:cs="Arial" w:eastAsia="Arial" w:hAnsi="Arial"/>
-          <w:b w:val="0"/>
-          <w:i w:val="0"/>
-          <w:smallCaps w:val="0"/>
-          <w:strike w:val="0"/>
-          <w:color w:val="515151"/>
-          <w:sz w:val="28"/>
-          <w:szCs w:val="28"/>
-          <w:u w:val="none"/>
-          <w:shd w:fill="auto" w:val="clear"/>
-          <w:vertAlign w:val="baseline"/>
-        </w:rPr>
-      </w:pPr>
-      <w:r>
-        <w:rPr>
-          <w:rFonts w:ascii="Arial" w:cs="Arial" w:eastAsia="Arial" w:hAnsi="Arial"/>
-          <w:b w:val="0"/>
-          <w:i w:val="0"/>
-          <w:smallCaps w:val="0"/>
-          <w:strike w:val="0"/>
-          <w:color w:val="282f3e"/>
-          <w:sz w:val="32"/>
-          <w:szCs w:val="32"/>
-          <w:u w:val="none"/>
-          <w:shd w:fill="auto" w:val="clear"/>
-          <w:vertAlign w:val="baseline"/>
-          <w:rtl w:val="0"/>
-        </w:rPr>
-        <w:t xml:space="preserve">Zones de vigilance</w:t>
-      </w:r>
-      <w:r>
-        <w:rPr>
-          <w:rFonts w:ascii="Arial" w:cs="Arial" w:eastAsia="Arial" w:hAnsi="Arial"/>
-          <w:b w:val="0"/>
-          <w:i w:val="0"/>
-          <w:smallCaps w:val="0"/>
-          <w:strike w:val="0"/>
-          <w:color w:val="515151"/>
-          <w:sz w:val="28"/>
-          <w:szCs w:val="28"/>
-          <w:u w:val="none"/>
-          <w:shd w:fill="auto" w:val="clear"/>
-          <w:vertAlign w:val="baseline"/>
-          <w:rtl w:val="0"/>
-        </w:rPr>
-        <w:t xml:space="preserve">   </w:t>
-      </w:r>
-      <w:r>
-        <w:rPr>
-          <w:rFonts w:ascii="Arial" w:cs="Arial" w:eastAsia="Arial" w:hAnsi="Arial"/>
-          <w:b w:val="1"/>
-          <w:color w:val="3b4559"/>
-          <w:sz w:val="16"/>
-          <w:szCs w:val="16"/>
-          <w:rtl w:val="0"/>
-        </w:rPr>
-        <w:t xml:space="preserve">${totalVigilanceAreas}</w:t>
-      </w:r>
-      <w:r>
-        <w:rPr>
-          <w:rFonts w:ascii="Arial" w:cs="Arial" w:eastAsia="Arial" w:hAnsi="Arial"/>
-          <w:b w:val="1"/>
-          <w:i w:val="0"/>
-          <w:smallCaps w:val="0"/>
-          <w:strike w:val="0"/>
-          <w:color w:val="3b4559"/>
-          <w:sz w:val="16"/>
-          <w:szCs w:val="16"/>
-          <w:u w:val="none"/>
-          <w:shd w:fill="auto" w:val="clear"/>
-          <w:vertAlign w:val="baseline"/>
-          <w:rtl w:val="0"/>
-        </w:rPr>
-        <w:t xml:space="preserve"> sélectionnées</w:t>
-      </w:r>
-      <w:r>
-        <w:rPr>
-          <w:rtl w:val="0"/>
-        </w:rPr>
-      </w:r>
-    </w:p>
-    <w:p>
-      <w:pPr>
-        <w:keepNext w:val="0"/>
-        <w:keepLines w:val="0"/>
-        <w:pageBreakBefore w:val="0"/>
-        <w:widowControl w:val="1"/>
-        <w:pBdr>
-          <w:top w:space="0" w:sz="0" w:val="nil"/>
-          <w:left w:space="0" w:sz="0" w:val="nil"/>
-          <w:bottom w:space="0" w:sz="0" w:val="nil"/>
-          <w:right w:space="0" w:sz="0" w:val="nil"/>
-          <w:between w:space="0" w:sz="0" w:val="nil"/>
-        </w:pBdr>
-        <w:shd w:fill="auto" w:val="clear"/>
-        <w:spacing w:after="0" w:before="0" w:line="240" w:lineRule="auto"/>
-        <w:ind w:left="0" w:right="0" w:firstLine="0"/>
-        <w:jc w:val="left"/>
-        <w:rPr>
-          <w:rFonts w:ascii="Arial" w:cs="Arial" w:eastAsia="Arial" w:hAnsi="Arial"/>
-          <w:b w:val="1"/>
-          <w:i w:val="0"/>
-          <w:smallCaps w:val="0"/>
-          <w:strike w:val="0"/>
-          <w:color w:val="3b4559"/>
-          <w:sz w:val="16"/>
-          <w:szCs w:val="16"/>
-          <w:u w:val="none"/>
-          <w:shd w:fill="auto" w:val="clear"/>
-          <w:vertAlign w:val="baseline"/>
-        </w:rPr>
-      </w:pPr>
-      <w:r>
-        <w:rPr>
-          <w:rtl w:val="0"/>
-        </w:rPr>
-      </w:r>
-    </w:p>
-    <w:p>
-      <w:pPr>
-        <w:keepNext w:val="0"/>
-        <w:keepLines w:val="0"/>
-        <w:pageBreakBefore w:val="0"/>
-        <w:widowControl w:val="1"/>
-        <w:pBdr>
-          <w:top w:space="0" w:sz="0" w:val="nil"/>
-          <w:left w:space="0" w:sz="0" w:val="nil"/>
-          <w:bottom w:space="0" w:sz="0" w:val="nil"/>
-          <w:right w:space="0" w:sz="0" w:val="nil"/>
-          <w:between w:space="0" w:sz="0" w:val="nil"/>
-        </w:pBdr>
-        <w:shd w:fill="auto" w:val="clear"/>
-        <w:spacing w:after="0" w:before="0" w:line="240" w:lineRule="auto"/>
-        <w:ind w:left="0" w:right="0" w:firstLine="0"/>
-        <w:jc w:val="left"/>
-        <w:rPr>
-          <w:rFonts w:ascii="Arial" w:cs="Arial" w:eastAsia="Arial" w:hAnsi="Arial"/>
-          <w:b w:val="0"/>
-          <w:i w:val="0"/>
-          <w:smallCaps w:val="0"/>
-          <w:strike w:val="0"/>
-          <w:color w:val="282f3e"/>
-          <w:sz w:val="18"/>
-          <w:szCs w:val="18"/>
-          <w:u w:val="none"/>
-          <w:shd w:fill="auto" w:val="clear"/>
-          <w:vertAlign w:val="baseline"/>
-        </w:rPr>
-      </w:pPr>
-      <w:r>
-        <w:rPr>
-          <w:rFonts w:ascii="Arial" w:cs="Arial" w:eastAsia="Arial" w:hAnsi="Arial"/>
-          <w:b w:val="0"/>
-          <w:i w:val="1"/>
-          <w:smallCaps w:val="0"/>
-          <w:strike w:val="0"/>
-          <w:color w:val="282f3e"/>
-          <w:sz w:val="18"/>
-          <w:szCs w:val="18"/>
-          <w:u w:val="none"/>
-          <w:shd w:fill="auto" w:val="clear"/>
-          <w:vertAlign w:val="baseline"/>
-          <w:rtl w:val="0"/>
-        </w:rPr>
-        <w:t xml:space="preserve">Une zone de vigilance permet d'orienter les contrôles en attirant l'attention et rappelant des informations utiles sur un endroit / une période donnés.</w:t>
-      </w:r>
-      <w:r>
-        <w:rPr>
-          <w:rtl w:val="0"/>
-        </w:rPr>
-      </w:r>
-    </w:p>
-    <w:p>
-      <w:pPr>
-        <w:keepNext w:val="0"/>
-        <w:keepLines w:val="0"/>
-        <w:pageBreakBefore w:val="0"/>
-        <w:widowControl w:val="1"/>
-        <w:pBdr>
-          <w:top w:space="0" w:sz="0" w:val="nil"/>
-          <w:left w:space="0" w:sz="0" w:val="nil"/>
-          <w:bottom w:space="0" w:sz="0" w:val="nil"/>
-          <w:right w:space="0" w:sz="0" w:val="nil"/>
-          <w:between w:space="0" w:sz="0" w:val="nil"/>
-        </w:pBdr>
-        <w:shd w:fill="auto" w:val="clear"/>
-        <w:spacing w:after="0" w:before="0" w:line="240" w:lineRule="auto"/>
-        <w:ind w:left="0" w:right="0" w:firstLine="0"/>
-        <w:jc w:val="left"/>
-        <w:rPr>
-          <w:rFonts w:ascii="Arial" w:cs="Arial" w:eastAsia="Arial" w:hAnsi="Arial"/>
-          <w:b w:val="0"/>
-          <w:i w:val="0"/>
-          <w:smallCaps w:val="0"/>
-          <w:strike w:val="0"/>
-          <w:color w:val="282f3e"/>
-          <w:sz w:val="18"/>
-          <w:szCs w:val="18"/>
-          <w:u w:val="none"/>
-          <w:shd w:fill="auto" w:val="clear"/>
-          <w:vertAlign w:val="baseline"/>
-        </w:rPr>
-      </w:pPr>
-      <w:r>
-        <w:rPr>
-          <w:rFonts w:ascii="Arial" w:cs="Arial" w:eastAsia="Arial" w:hAnsi="Arial"/>
-          <w:b w:val="0"/>
-          <w:i w:val="1"/>
-          <w:smallCaps w:val="0"/>
-          <w:strike w:val="0"/>
-          <w:color w:val="282f3e"/>
-          <w:sz w:val="18"/>
-          <w:szCs w:val="18"/>
-          <w:u w:val="none"/>
-          <w:shd w:fill="auto" w:val="clear"/>
-          <w:vertAlign w:val="baseline"/>
-          <w:rtl w:val="0"/>
-        </w:rPr>
-        <w:t xml:space="preserve">Les informations consignées dans les ZV ont – contrairement aux signalements – une validité dans le temps plus longue ou récurrente.</w:t>
-      </w:r>
-      <w:r>
-        <w:rPr>
-          <w:rtl w:val="0"/>
-        </w:rPr>
-      </w:r>
-    </w:p>
-    <w:p>
-      <w:pPr>
-        <w:keepNext w:val="0"/>
-        <w:keepLines w:val="0"/>
-        <w:pageBreakBefore w:val="0"/>
-        <w:widowControl w:val="1"/>
-        <w:pBdr>
-          <w:top w:space="0" w:sz="0" w:val="nil"/>
-          <w:left w:space="0" w:sz="0" w:val="nil"/>
-          <w:bottom w:space="0" w:sz="0" w:val="nil"/>
-          <w:right w:space="0" w:sz="0" w:val="nil"/>
-          <w:between w:space="0" w:sz="0" w:val="nil"/>
-        </w:pBdr>
-        <w:shd w:fill="auto" w:val="clear"/>
-        <w:spacing w:after="0" w:before="0" w:line="240" w:lineRule="auto"/>
-        <w:ind w:left="0" w:right="0" w:firstLine="0"/>
-        <w:jc w:val="left"/>
-        <w:rPr>
-          <w:rFonts w:ascii="Arial" w:cs="Arial" w:eastAsia="Arial" w:hAnsi="Arial"/>
-          <w:b w:val="1"/>
-          <w:i w:val="0"/>
-          <w:smallCaps w:val="0"/>
-          <w:strike w:val="0"/>
-          <w:color w:val="3b4559"/>
-          <w:sz w:val="16"/>
-          <w:szCs w:val="16"/>
-          <w:u w:val="none"/>
-          <w:shd w:fill="auto" w:val="clear"/>
-          <w:vertAlign w:val="baseline"/>
-        </w:rPr>
-      </w:pPr>
-      <w:r>
-        <w:rPr>
-          <w:rtl w:val="0"/>
-        </w:rPr>
-      </w:r>
-    </w:p>
-    <w:p>
-      <w:pPr>
-        <w:keepNext w:val="0"/>
-        <w:keepLines w:val="0"/>
-        <w:pageBreakBefore w:val="0"/>
-        <w:widowControl w:val="1"/>
-        <w:pBdr>
-          <w:top w:space="0" w:sz="0" w:val="nil"/>
-          <w:left w:space="0" w:sz="0" w:val="nil"/>
-          <w:bottom w:space="0" w:sz="0" w:val="nil"/>
-          <w:right w:space="0" w:sz="0" w:val="nil"/>
-          <w:between w:space="0" w:sz="0" w:val="nil"/>
-        </w:pBdr>
-        <w:shd w:fill="auto" w:val="clear"/>
-        <w:spacing w:after="0" w:before="0" w:line="240" w:lineRule="auto"/>
-        <w:ind w:left="0" w:right="0" w:firstLine="0"/>
-        <w:jc w:val="left"/>
-        <w:rPr>
-          <w:rFonts w:ascii="Arial" w:cs="Arial" w:eastAsia="Arial" w:hAnsi="Arial"/>
-          <w:b w:val="1"/>
-          <w:i w:val="0"/>
-          <w:smallCaps w:val="0"/>
-          <w:strike w:val="0"/>
-          <w:color w:val="3b4559"/>
-          <w:sz w:val="16"/>
-          <w:szCs w:val="16"/>
-          <w:u w:val="none"/>
-          <w:shd w:fill="auto" w:val="clear"/>
-          <w:vertAlign w:val="baseline"/>
-        </w:rPr>
-      </w:pPr>
+          <w:rtl w:val="0"/>
+        </w:rPr>
+        <w:t xml:space="preserve">${vigilanceAreasDetails}</w:t>
+      </w:r>
       <w:r>
         <w:rPr>
           <w:rtl w:val="0"/>
@@ -6631,6 +4826,71 @@
           <w:rtl w:val="0"/>
         </w:rPr>
         <w:t xml:space="preserve">Liens utiles</w:t>
+      </w:r>
+    </w:p>
+    <w:p>
+      <w:pPr>
+        <w:keepNext w:val="0"/>
+        <w:keepLines w:val="0"/>
+        <w:pageBreakBefore w:val="0"/>
+        <w:widowControl w:val="0"/>
+        <w:pBdr>
+          <w:top w:space="0" w:sz="0" w:val="nil"/>
+          <w:left w:space="0" w:sz="0" w:val="nil"/>
+          <w:bottom w:space="0" w:sz="0" w:val="nil"/>
+          <w:right w:space="0" w:sz="0" w:val="nil"/>
+          <w:between w:space="0" w:sz="0" w:val="nil"/>
+        </w:pBdr>
+        <w:shd w:fill="auto" w:val="clear"/>
+        <w:spacing w:after="0" w:before="0" w:line="240" w:lineRule="auto"/>
+        <w:ind w:left="0" w:right="0" w:firstLine="0"/>
+        <w:jc w:val="left"/>
+        <w:rPr>
+          <w:rFonts w:ascii="Arial" w:cs="Arial" w:eastAsia="Arial" w:hAnsi="Arial"/>
+          <w:color w:val="282f3e"/>
+          <w:sz w:val="26"/>
+          <w:szCs w:val="26"/>
+        </w:rPr>
+      </w:pPr>
+      <w:r>
+        <w:rPr>
+          <w:rtl w:val="0"/>
+        </w:rPr>
+      </w:r>
+    </w:p>
+    <w:p>
+      <w:pPr>
+        <w:keepNext w:val="0"/>
+        <w:keepLines w:val="0"/>
+        <w:pageBreakBefore w:val="0"/>
+        <w:widowControl w:val="0"/>
+        <w:pBdr>
+          <w:top w:space="0" w:sz="0" w:val="nil"/>
+          <w:left w:space="0" w:sz="0" w:val="nil"/>
+          <w:bottom w:space="0" w:sz="0" w:val="nil"/>
+          <w:right w:space="0" w:sz="0" w:val="nil"/>
+          <w:between w:space="0" w:sz="0" w:val="nil"/>
+        </w:pBdr>
+        <w:shd w:fill="auto" w:val="clear"/>
+        <w:spacing w:after="0" w:before="0" w:line="240" w:lineRule="auto"/>
+        <w:ind w:left="0" w:right="0" w:firstLine="0"/>
+        <w:jc w:val="left"/>
+        <w:rPr>
+          <w:rFonts w:ascii="Arial" w:cs="Arial" w:eastAsia="Arial" w:hAnsi="Arial"/>
+          <w:color w:val="282f3e"/>
+          <w:sz w:val="26"/>
+          <w:szCs w:val="26"/>
+        </w:rPr>
+      </w:pPr>
+      <w:r>
+        <w:rPr>
+          <w:rFonts w:ascii="Arial" w:cs="Arial" w:eastAsia="Arial" w:hAnsi="Arial"/>
+          <w:color w:val="282f3e"/>
+          <w:sz w:val="26"/>
+          <w:szCs w:val="26"/>
+          <w:rtl w:val="0"/>
+        </w:rPr>
+        <w:t xml:space="preserve">${links}</w:t>
       </w:r>
     </w:p>
     <w:p>
@@ -6918,21 +5178,7 @@
     </w:p>
     <w:p>
       <w:pPr>
-        <w:keepNext w:val="0"/>
-        <w:keepLines w:val="0"/>
-        <w:pageBreakBefore w:val="0"/>
-        <w:widowControl w:val="1"/>
-        <w:pBdr>
-          <w:top w:space="0" w:sz="0" w:val="nil"/>
-          <w:left w:space="0" w:sz="0" w:val="nil"/>
-          <w:bottom w:space="0" w:sz="0" w:val="nil"/>
-          <w:right w:space="0" w:sz="0" w:val="nil"/>
-          <w:between w:space="0" w:sz="0" w:val="nil"/>
-        </w:pBdr>
-        <w:shd w:fill="auto" w:val="clear"/>
-        <w:spacing w:after="0" w:before="0" w:line="240" w:lineRule="auto"/>
-        <w:ind w:left="0" w:right="0" w:firstLine="0"/>
-        <w:jc w:val="left"/>
+        <w:widowControl w:val="0"/>
         <w:rPr>
           <w:rFonts w:ascii="Arial" w:cs="Arial" w:eastAsia="Arial" w:hAnsi="Arial"/>
           <w:b w:val="1"/>
@@ -6947,6 +5193,16 @@
           <w:vertAlign w:val="baseline"/>
         </w:rPr>
       </w:pPr>
+      <w:r>
+        <w:rPr>
+          <w:rFonts w:ascii="Arial" w:cs="Arial" w:eastAsia="Arial" w:hAnsi="Arial"/>
+          <w:color w:val="282f3e"/>
+          <w:sz w:val="26"/>
+          <w:szCs w:val="26"/>
+          <w:rtl w:val="0"/>
+        </w:rPr>
+        <w:t xml:space="preserve">${images}</w:t>
+      </w:r>
       <w:r>
         <w:rPr>
           <w:rtl w:val="0"/>
@@ -7230,19 +5486,6 @@
     </w:tblPr>
   </w:style>
   <w:style w:type="table" w:styleId="Table3">
-    <w:basedOn w:val="TableNormal"/>
-    <w:tblPr>
-      <w:tblStyleRowBandSize w:val="1"/>
-      <w:tblStyleColBandSize w:val="1"/>
-      <w:tblCellMar>
-        <w:top w:w="0.0" w:type="dxa"/>
-        <w:left w:w="10.0" w:type="dxa"/>
-        <w:bottom w:w="0.0" w:type="dxa"/>
-        <w:right w:w="10.0" w:type="dxa"/>
-      </w:tblCellMar>
-    </w:tblPr>
-  </w:style>
-  <w:style w:type="table" w:styleId="Table4">
     <w:basedOn w:val="TableNormal"/>
     <w:tblPr>
       <w:tblStyleRowBandSize w:val="1"/>

</xml_diff>

<commit_message>
[Brief] add vigilanceAreas in editable brief
</commit_message>
<xml_diff>
--- a/backend/src/main/resources/template_export_brief.docx
+++ b/backend/src/main/resources/template_export_brief.docx
@@ -933,7 +933,7 @@
                 <w:szCs w:val="21"/>
                 <w:rtl w:val="0"/>
               </w:rPr>
-              <w:t xml:space="preserve">${totalAMPsText}</w:t>
+              <w:t xml:space="preserve">${totalAmpsText}</w:t>
             </w:r>
           </w:p>
         </w:tc>
@@ -2749,6 +2749,27 @@
               <w:widowControl w:val="0"/>
               <w:rPr>
                 <w:rFonts w:ascii="Arial" w:cs="Arial" w:eastAsia="Arial" w:hAnsi="Arial"/>
+                <w:color w:val="282f3e"/>
+                <w:sz w:val="18"/>
+                <w:szCs w:val="18"/>
+              </w:rPr>
+            </w:pPr>
+            <w:r>
+              <w:rPr>
+                <w:rFonts w:ascii="Arial" w:cs="Arial" w:eastAsia="Arial" w:hAnsi="Arial"/>
+                <w:color w:val="282f3e"/>
+                <w:sz w:val="18"/>
+                <w:szCs w:val="18"/>
+                <w:rtl w:val="0"/>
+              </w:rPr>
+              <w:t xml:space="preserve">   02 90 74 32 55</w:t>
+            </w:r>
+          </w:p>
+          <w:p>
+            <w:pPr>
+              <w:widowControl w:val="0"/>
+              <w:rPr>
+                <w:rFonts w:ascii="Arial" w:cs="Arial" w:eastAsia="Arial" w:hAnsi="Arial"/>
                 <w:b w:val="0"/>
                 <w:i w:val="0"/>
                 <w:smallCaps w:val="0"/>
@@ -2761,26 +2782,6 @@
                 <w:vertAlign w:val="baseline"/>
               </w:rPr>
             </w:pPr>
-            <w:r>
-              <w:rPr>
-                <w:rFonts w:ascii="Arial" w:cs="Arial" w:eastAsia="Arial" w:hAnsi="Arial"/>
-                <w:color w:val="282f3e"/>
-                <w:sz w:val="18"/>
-                <w:szCs w:val="18"/>
-                <w:rtl w:val="0"/>
-              </w:rPr>
-              <w:t xml:space="preserve">   02 90 74 32 55 </w:t>
-            </w:r>
-            <w:r>
-              <w:rPr>
-                <w:rFonts w:ascii="Arial" w:cs="Arial" w:eastAsia="Arial" w:hAnsi="Arial"/>
-                <w:sz w:val="18"/>
-                <w:szCs w:val="18"/>
-                <w:rtl w:val="0"/>
-              </w:rPr>
-              <w:br w:type="textWrapping"/>
-              <w:t xml:space="preserve">   </w:t>
-            </w:r>
             <w:r>
               <w:rPr>
                 <w:rFonts w:ascii="Arial" w:cs="Arial" w:eastAsia="Arial" w:hAnsi="Arial"/>
@@ -3159,36 +3160,10 @@
       </w:pPr>
       <w:r>
         <w:rPr>
-          <w:rtl w:val="0"/>
-        </w:rPr>
-      </w:r>
-    </w:p>
-    <w:p>
-      <w:pPr>
-        <w:spacing w:after="240" w:before="240" w:lineRule="auto"/>
-        <w:rPr>
-          <w:rFonts w:ascii="Arial" w:cs="Arial" w:eastAsia="Arial" w:hAnsi="Arial"/>
-        </w:rPr>
-      </w:pPr>
-      <w:r>
-        <w:rPr>
-          <w:rFonts w:ascii="Arial" w:cs="Arial" w:eastAsia="Arial" w:hAnsi="Arial"/>
-          <w:rtl w:val="0"/>
-        </w:rPr>
-        <w:t xml:space="preserve">${AMPsTable}</w:t>
-      </w:r>
-    </w:p>
-    <w:p>
-      <w:pPr>
-        <w:spacing w:after="240" w:before="240" w:lineRule="auto"/>
-        <w:rPr>
-          <w:rFonts w:ascii="Arial" w:cs="Arial" w:eastAsia="Arial" w:hAnsi="Arial"/>
-        </w:rPr>
-      </w:pPr>
-      <w:r>
-        <w:rPr>
-          <w:rtl w:val="0"/>
-        </w:rPr>
+          <w:rFonts w:ascii="Arial" w:cs="Arial" w:eastAsia="Arial" w:hAnsi="Arial"/>
+          <w:rtl w:val="0"/>
+        </w:rPr>
+        <w:t xml:space="preserve">${ampsTable} </w:t>
       </w:r>
     </w:p>
     <w:p>
@@ -3454,7 +3429,7 @@
           <w:szCs w:val="16"/>
           <w:rtl w:val="0"/>
         </w:rPr>
-        <w:t xml:space="preserve">${totalAMPs} sélectionnées</w:t>
+        <w:t xml:space="preserve">${totalAmps} sélectionnées</w:t>
       </w:r>
       <w:r>
         <w:rPr>
@@ -3522,7 +3497,7 @@
           <w:szCs w:val="16"/>
           <w:rtl w:val="0"/>
         </w:rPr>
-        <w:t xml:space="preserve">${AMPsDetails}</w:t>
+        <w:t xml:space="preserve">${ampsDetails}</w:t>
       </w:r>
       <w:r>
         <w:rPr>

</xml_diff>

<commit_message>
[Brief] clean amps and vigilance areas table and add reportings (WIP)
</commit_message>
<xml_diff>
--- a/backend/src/main/resources/template_export_brief.docx
+++ b/backend/src/main/resources/template_export_brief.docx
@@ -1104,7 +1104,6 @@
               <w:jc w:val="left"/>
               <w:rPr>
                 <w:rFonts w:ascii="Arial" w:cs="Arial" w:eastAsia="Arial" w:hAnsi="Arial"/>
-                <w:b w:val="0"/>
                 <w:i w:val="0"/>
                 <w:smallCaps w:val="0"/>
                 <w:strike w:val="0"/>
@@ -3160,10 +3159,8 @@
       </w:pPr>
       <w:r>
         <w:rPr>
-          <w:rFonts w:ascii="Arial" w:cs="Arial" w:eastAsia="Arial" w:hAnsi="Arial"/>
-          <w:rtl w:val="0"/>
-        </w:rPr>
-        <w:t xml:space="preserve">${ampsTable} </w:t>
+          <w:rtl w:val="0"/>
+        </w:rPr>
       </w:r>
     </w:p>
     <w:p>
@@ -3178,7 +3175,21 @@
           <w:rFonts w:ascii="Arial" w:cs="Arial" w:eastAsia="Arial" w:hAnsi="Arial"/>
           <w:rtl w:val="0"/>
         </w:rPr>
-        <w:t xml:space="preserve">${vigilanceAreasTable}</w:t>
+        <w:t xml:space="preserve">${ampsAndVigilanceAreas</w:t>
+      </w:r>
+      <w:r>
+        <w:rPr>
+          <w:rFonts w:ascii="Arial" w:cs="Arial" w:eastAsia="Arial" w:hAnsi="Arial"/>
+          <w:rtl w:val="0"/>
+        </w:rPr>
+        <w:t xml:space="preserve">Tables</w:t>
+      </w:r>
+      <w:r>
+        <w:rPr>
+          <w:rFonts w:ascii="Arial" w:cs="Arial" w:eastAsia="Arial" w:hAnsi="Arial"/>
+          <w:rtl w:val="0"/>
+        </w:rPr>
+        <w:t xml:space="preserve">}</w:t>
       </w:r>
     </w:p>
     <w:p>
@@ -3186,6 +3197,176 @@
         <w:spacing w:after="240" w:before="240" w:lineRule="auto"/>
         <w:rPr>
           <w:rFonts w:ascii="Arial" w:cs="Arial" w:eastAsia="Arial" w:hAnsi="Arial"/>
+        </w:rPr>
+      </w:pPr>
+      <w:r>
+        <w:rPr>
+          <w:rtl w:val="0"/>
+        </w:rPr>
+      </w:r>
+    </w:p>
+    <w:p>
+      <w:pPr>
+        <w:spacing w:after="240" w:before="240" w:lineRule="auto"/>
+        <w:rPr>
+          <w:rFonts w:ascii="Arial" w:cs="Arial" w:eastAsia="Arial" w:hAnsi="Arial"/>
+          <w:color w:val="282f3e"/>
+          <w:sz w:val="32"/>
+          <w:szCs w:val="32"/>
+        </w:rPr>
+      </w:pPr>
+      <w:r>
+        <w:br w:type="page"/>
+      </w:r>
+      <w:r>
+        <w:rPr>
+          <w:rtl w:val="0"/>
+        </w:rPr>
+      </w:r>
+    </w:p>
+    <w:p>
+      <w:pPr>
+        <w:pageBreakBefore w:val="1"/>
+        <w:rPr>
+          <w:rFonts w:ascii="Arial" w:cs="Arial" w:eastAsia="Arial" w:hAnsi="Arial"/>
+          <w:b w:val="1"/>
+          <w:color w:val="3b4559"/>
+          <w:sz w:val="16"/>
+          <w:szCs w:val="16"/>
+        </w:rPr>
+      </w:pPr>
+      <w:r>
+        <w:rPr>
+          <w:rFonts w:ascii="Arial" w:cs="Arial" w:eastAsia="Arial" w:hAnsi="Arial"/>
+          <w:color w:val="282f3e"/>
+          <w:sz w:val="32"/>
+          <w:szCs w:val="32"/>
+          <w:rtl w:val="0"/>
+        </w:rPr>
+        <w:t xml:space="preserve">Signalements (détails)  </w:t>
+      </w:r>
+      <w:r>
+        <w:rPr>
+          <w:rFonts w:ascii="Arial" w:cs="Arial" w:eastAsia="Arial" w:hAnsi="Arial"/>
+          <w:b w:val="1"/>
+          <w:color w:val="3b4559"/>
+          <w:sz w:val="16"/>
+          <w:szCs w:val="16"/>
+          <w:rtl w:val="0"/>
+        </w:rPr>
+        <w:t xml:space="preserve">${totalReportings} sélectionnés</w:t>
+      </w:r>
+    </w:p>
+    <w:p>
+      <w:pPr>
+        <w:rPr>
+          <w:rFonts w:ascii="Arial" w:cs="Arial" w:eastAsia="Arial" w:hAnsi="Arial"/>
+          <w:b w:val="1"/>
+          <w:color w:val="3b4559"/>
+          <w:sz w:val="16"/>
+          <w:szCs w:val="16"/>
+        </w:rPr>
+      </w:pPr>
+      <w:r>
+        <w:rPr>
+          <w:rtl w:val="0"/>
+        </w:rPr>
+      </w:r>
+    </w:p>
+    <w:p>
+      <w:pPr>
+        <w:spacing w:line="276" w:lineRule="auto"/>
+        <w:rPr>
+          <w:rFonts w:ascii="Arial" w:cs="Arial" w:eastAsia="Arial" w:hAnsi="Arial"/>
+          <w:i w:val="1"/>
+          <w:color w:val="282f3e"/>
+          <w:sz w:val="18"/>
+          <w:szCs w:val="18"/>
+        </w:rPr>
+      </w:pPr>
+      <w:r>
+        <w:rPr>
+          <w:rFonts w:ascii="Arial" w:cs="Arial" w:eastAsia="Arial" w:hAnsi="Arial"/>
+          <w:i w:val="1"/>
+          <w:color w:val="282f3e"/>
+          <w:sz w:val="18"/>
+          <w:szCs w:val="18"/>
+          <w:rtl w:val="0"/>
+        </w:rPr>
+        <w:t xml:space="preserve">Les signalements sont des remontées d'informations ponctuelles faites par le terrain (unités, sémaphores...).</w:t>
+      </w:r>
+    </w:p>
+    <w:p>
+      <w:pPr>
+        <w:spacing w:line="276" w:lineRule="auto"/>
+        <w:rPr>
+          <w:rFonts w:ascii="Arial" w:cs="Arial" w:eastAsia="Arial" w:hAnsi="Arial"/>
+          <w:i w:val="1"/>
+          <w:color w:val="282f3e"/>
+          <w:sz w:val="18"/>
+          <w:szCs w:val="18"/>
+        </w:rPr>
+      </w:pPr>
+      <w:r>
+        <w:rPr>
+          <w:rFonts w:ascii="Arial" w:cs="Arial" w:eastAsia="Arial" w:hAnsi="Arial"/>
+          <w:i w:val="1"/>
+          <w:color w:val="282f3e"/>
+          <w:sz w:val="18"/>
+          <w:szCs w:val="18"/>
+          <w:rtl w:val="0"/>
+        </w:rPr>
+        <w:t xml:space="preserve">Ils peuvent concerner des suspicions d'infractions ou des observations et appellent à une prise en compte rapide.</w:t>
+      </w:r>
+    </w:p>
+    <w:p>
+      <w:pPr>
+        <w:rPr>
+          <w:rFonts w:ascii="Arial" w:cs="Arial" w:eastAsia="Arial" w:hAnsi="Arial"/>
+          <w:color w:val="282f3e"/>
+          <w:sz w:val="16"/>
+          <w:szCs w:val="16"/>
+        </w:rPr>
+      </w:pPr>
+      <w:r>
+        <w:rPr>
+          <w:rtl w:val="0"/>
+        </w:rPr>
+      </w:r>
+    </w:p>
+    <w:p>
+      <w:pPr>
+        <w:rPr>
+          <w:rFonts w:ascii="Arial" w:cs="Arial" w:eastAsia="Arial" w:hAnsi="Arial"/>
+          <w:color w:val="282f3e"/>
+          <w:sz w:val="32"/>
+          <w:szCs w:val="32"/>
+        </w:rPr>
+      </w:pPr>
+      <w:r>
+        <w:rPr>
+          <w:rFonts w:ascii="Arial" w:cs="Arial" w:eastAsia="Arial" w:hAnsi="Arial"/>
+          <w:color w:val="282f3e"/>
+          <w:sz w:val="16"/>
+          <w:szCs w:val="16"/>
+          <w:rtl w:val="0"/>
+        </w:rPr>
+        <w:t xml:space="preserve">${reportingsDetails}</w:t>
+      </w:r>
+      <w:r>
+        <w:rPr>
+          <w:rtl w:val="0"/>
+        </w:rPr>
+      </w:r>
+    </w:p>
+    <w:p>
+      <w:pPr>
+        <w:spacing w:after="240" w:before="240" w:lineRule="auto"/>
+        <w:rPr>
+          <w:rFonts w:ascii="Arial" w:cs="Arial" w:eastAsia="Arial" w:hAnsi="Arial"/>
+          <w:color w:val="282f3e"/>
+          <w:sz w:val="32"/>
+          <w:szCs w:val="32"/>
         </w:rPr>
       </w:pPr>
       <w:r>
@@ -4672,7 +4853,39 @@
       <w:pPr>
         <w:keepNext w:val="0"/>
         <w:keepLines w:val="0"/>
-        <w:pageBreakBefore w:val="1"/>
+        <w:widowControl w:val="1"/>
+        <w:pBdr>
+          <w:top w:space="0" w:sz="0" w:val="nil"/>
+          <w:left w:space="0" w:sz="0" w:val="nil"/>
+          <w:bottom w:space="0" w:sz="0" w:val="nil"/>
+          <w:right w:space="0" w:sz="0" w:val="nil"/>
+          <w:between w:space="0" w:sz="0" w:val="nil"/>
+        </w:pBdr>
+        <w:shd w:fill="auto" w:val="clear"/>
+        <w:spacing w:after="0" w:before="0" w:line="240" w:lineRule="auto"/>
+        <w:ind w:left="0" w:right="0" w:firstLine="0"/>
+        <w:jc w:val="left"/>
+        <w:rPr>
+          <w:rFonts w:ascii="Arial" w:cs="Arial" w:eastAsia="Arial" w:hAnsi="Arial"/>
+          <w:b w:val="1"/>
+          <w:color w:val="282f3e"/>
+          <w:sz w:val="40"/>
+          <w:szCs w:val="40"/>
+        </w:rPr>
+      </w:pPr>
+      <w:r>
+        <w:br w:type="page"/>
+      </w:r>
+      <w:r>
+        <w:rPr>
+          <w:rtl w:val="0"/>
+        </w:rPr>
+      </w:r>
+    </w:p>
+    <w:p>
+      <w:pPr>
+        <w:keepNext w:val="0"/>
+        <w:keepLines w:val="0"/>
         <w:widowControl w:val="1"/>
         <w:pBdr>
           <w:top w:space="0" w:sz="0" w:val="nil"/>

</xml_diff>

<commit_message>
[EditableBrief] fix bug when no value and has placeholder to delete
</commit_message>
<xml_diff>
--- a/backend/src/main/resources/template_export_brief.docx
+++ b/backend/src/main/resources/template_export_brief.docx
@@ -2426,12 +2426,12 @@
             <wp:extent cx="923726" cy="923726"/>
             <wp:effectExtent b="0" l="0" r="0" t="0"/>
             <wp:wrapNone/>
-            <wp:docPr id="9" name="image1.jpg"/>
+            <wp:docPr id="9" name="image6.jpg"/>
             <a:graphic>
               <a:graphicData uri="http://schemas.openxmlformats.org/drawingml/2006/picture">
                 <pic:pic>
                   <pic:nvPicPr>
-                    <pic:cNvPr id="0" name="image1.jpg"/>
+                    <pic:cNvPr id="0" name="image6.jpg"/>
                     <pic:cNvPicPr preferRelativeResize="0"/>
                   </pic:nvPicPr>
                   <pic:blipFill>
@@ -3380,14 +3380,8 @@
         <w:jc w:val="left"/>
         <w:rPr>
           <w:rFonts w:ascii="Arial" w:cs="Arial" w:eastAsia="Arial" w:hAnsi="Arial"/>
-          <w:i w:val="0"/>
-          <w:smallCaps w:val="0"/>
-          <w:strike w:val="0"/>
           <w:sz w:val="16"/>
           <w:szCs w:val="16"/>
-          <w:u w:val="none"/>
-          <w:shd w:fill="auto" w:val="clear"/>
-          <w:vertAlign w:val="baseline"/>
         </w:rPr>
       </w:pPr>
       <w:r>
@@ -3416,67 +3410,6 @@
           <w:rtl w:val="0"/>
         </w:rPr>
         <w:t xml:space="preserve">}</w:t>
-      </w:r>
-      <w:r>
-        <w:rPr>
-          <w:rtl w:val="0"/>
-        </w:rPr>
-      </w:r>
-    </w:p>
-    <w:p>
-      <w:pPr>
-        <w:pageBreakBefore w:val="1"/>
-        <w:rPr>
-          <w:rFonts w:ascii="Arial" w:cs="Arial" w:eastAsia="Arial" w:hAnsi="Arial"/>
-          <w:b w:val="1"/>
-          <w:i w:val="0"/>
-          <w:smallCaps w:val="0"/>
-          <w:strike w:val="0"/>
-          <w:color w:val="3b4559"/>
-          <w:sz w:val="16"/>
-          <w:szCs w:val="16"/>
-          <w:u w:val="none"/>
-          <w:shd w:fill="auto" w:val="clear"/>
-          <w:vertAlign w:val="baseline"/>
-        </w:rPr>
-      </w:pPr>
-      <w:bookmarkStart w:colFirst="0" w:colLast="0" w:name="_bqob7wjjjgwn" w:id="0"/>
-      <w:bookmarkEnd w:id="0"/>
-      <w:r>
-        <w:rPr>
-          <w:rFonts w:ascii="Arial" w:cs="Arial" w:eastAsia="Arial" w:hAnsi="Arial"/>
-          <w:color w:val="282f3e"/>
-          <w:sz w:val="32"/>
-          <w:szCs w:val="32"/>
-          <w:rtl w:val="0"/>
-        </w:rPr>
-        <w:t xml:space="preserve">Aires marines protégées</w:t>
-      </w:r>
-      <w:r>
-        <w:rPr>
-          <w:rFonts w:ascii="Arial" w:cs="Arial" w:eastAsia="Arial" w:hAnsi="Arial"/>
-          <w:color w:val="515151"/>
-          <w:sz w:val="28"/>
-          <w:szCs w:val="28"/>
-          <w:rtl w:val="0"/>
-        </w:rPr>
-        <w:t xml:space="preserve">   </w:t>
-      </w:r>
-      <w:r>
-        <w:rPr>
-          <w:rFonts w:ascii="Arial" w:cs="Arial" w:eastAsia="Arial" w:hAnsi="Arial"/>
-          <w:b w:val="1"/>
-          <w:color w:val="3b4559"/>
-          <w:sz w:val="16"/>
-          <w:szCs w:val="16"/>
-          <w:rtl w:val="0"/>
-        </w:rPr>
-        <w:t xml:space="preserve">${totalAmps} sélectionnées</w:t>
-      </w:r>
-      <w:r>
-        <w:rPr>
-          <w:rtl w:val="0"/>
-        </w:rPr>
       </w:r>
     </w:p>
     <w:p>
@@ -3498,49 +3431,10 @@
         <w:jc w:val="left"/>
         <w:rPr>
           <w:rFonts w:ascii="Arial" w:cs="Arial" w:eastAsia="Arial" w:hAnsi="Arial"/>
-          <w:b w:val="1"/>
-          <w:i w:val="0"/>
-          <w:smallCaps w:val="0"/>
-          <w:strike w:val="0"/>
-          <w:color w:val="3b4559"/>
           <w:sz w:val="16"/>
           <w:szCs w:val="16"/>
-          <w:u w:val="none"/>
-          <w:shd w:fill="auto" w:val="clear"/>
-          <w:vertAlign w:val="baseline"/>
-        </w:rPr>
-      </w:pPr>
-      <w:r>
-        <w:rPr>
-          <w:rtl w:val="0"/>
-        </w:rPr>
-      </w:r>
-    </w:p>
-    <w:p>
-      <w:pPr>
-        <w:rPr>
-          <w:rFonts w:ascii="Arial" w:cs="Arial" w:eastAsia="Arial" w:hAnsi="Arial"/>
-          <w:b w:val="1"/>
-          <w:i w:val="0"/>
-          <w:smallCaps w:val="0"/>
-          <w:strike w:val="0"/>
-          <w:color w:val="3b4559"/>
-          <w:sz w:val="16"/>
-          <w:szCs w:val="16"/>
-          <w:u w:val="none"/>
-          <w:shd w:fill="auto" w:val="clear"/>
-          <w:vertAlign w:val="baseline"/>
-        </w:rPr>
-      </w:pPr>
-      <w:r>
-        <w:rPr>
-          <w:rFonts w:ascii="Arial" w:cs="Arial" w:eastAsia="Arial" w:hAnsi="Arial"/>
-          <w:sz w:val="16"/>
-          <w:szCs w:val="16"/>
-          <w:rtl w:val="0"/>
-        </w:rPr>
-        <w:t xml:space="preserve">${ampsDetails}</w:t>
-      </w:r>
+        </w:rPr>
+      </w:pPr>
       <w:r>
         <w:rPr>
           <w:rtl w:val="0"/>
@@ -3580,6 +3474,37 @@
       </w:pPr>
       <w:r>
         <w:rPr>
+          <w:rFonts w:ascii="Arial" w:cs="Arial" w:eastAsia="Arial" w:hAnsi="Arial"/>
+          <w:color w:val="282f3e"/>
+          <w:sz w:val="32"/>
+          <w:szCs w:val="32"/>
+          <w:rtl w:val="0"/>
+        </w:rPr>
+        <w:t xml:space="preserve">Aires marines protégées</w:t>
+      </w:r>
+      <w:r>
+        <w:rPr>
+          <w:rFonts w:ascii="Arial" w:cs="Arial" w:eastAsia="Arial" w:hAnsi="Arial"/>
+          <w:color w:val="515151"/>
+          <w:sz w:val="28"/>
+          <w:szCs w:val="28"/>
+          <w:rtl w:val="0"/>
+        </w:rPr>
+        <w:t xml:space="preserve">   </w:t>
+      </w:r>
+      <w:r>
+        <w:rPr>
+          <w:rFonts w:ascii="Arial" w:cs="Arial" w:eastAsia="Arial" w:hAnsi="Arial"/>
+          <w:b w:val="1"/>
+          <w:color w:val="3b4559"/>
+          <w:sz w:val="16"/>
+          <w:szCs w:val="16"/>
+          <w:rtl w:val="0"/>
+        </w:rPr>
+        <w:t xml:space="preserve">${totalAmps} sélectionnées</w:t>
+      </w:r>
+      <w:r>
+        <w:rPr>
           <w:rtl w:val="0"/>
         </w:rPr>
       </w:r>
@@ -3623,6 +3548,131 @@
     </w:p>
     <w:p>
       <w:pPr>
+        <w:rPr>
+          <w:rFonts w:ascii="Arial" w:cs="Arial" w:eastAsia="Arial" w:hAnsi="Arial"/>
+          <w:b w:val="1"/>
+          <w:color w:val="3b4559"/>
+          <w:sz w:val="16"/>
+          <w:szCs w:val="16"/>
+        </w:rPr>
+      </w:pPr>
+      <w:r>
+        <w:rPr>
+          <w:rFonts w:ascii="Arial" w:cs="Arial" w:eastAsia="Arial" w:hAnsi="Arial"/>
+          <w:sz w:val="16"/>
+          <w:szCs w:val="16"/>
+          <w:rtl w:val="0"/>
+        </w:rPr>
+        <w:t xml:space="preserve">${ampsDetails}</w:t>
+      </w:r>
+      <w:r>
+        <w:rPr>
+          <w:rtl w:val="0"/>
+        </w:rPr>
+      </w:r>
+    </w:p>
+    <w:p>
+      <w:pPr>
+        <w:rPr>
+          <w:rFonts w:ascii="Arial" w:cs="Arial" w:eastAsia="Arial" w:hAnsi="Arial"/>
+          <w:b w:val="1"/>
+          <w:color w:val="3b4559"/>
+          <w:sz w:val="16"/>
+          <w:szCs w:val="16"/>
+        </w:rPr>
+      </w:pPr>
+      <w:r>
+        <w:rPr>
+          <w:rtl w:val="0"/>
+        </w:rPr>
+      </w:r>
+    </w:p>
+    <w:p>
+      <w:pPr>
+        <w:rPr>
+          <w:rFonts w:ascii="Arial" w:cs="Arial" w:eastAsia="Arial" w:hAnsi="Arial"/>
+          <w:b w:val="0"/>
+          <w:i w:val="0"/>
+          <w:smallCaps w:val="0"/>
+          <w:strike w:val="0"/>
+          <w:color w:val="515151"/>
+          <w:sz w:val="28"/>
+          <w:szCs w:val="28"/>
+          <w:u w:val="none"/>
+          <w:shd w:fill="auto" w:val="clear"/>
+          <w:vertAlign w:val="baseline"/>
+        </w:rPr>
+      </w:pPr>
+      <w:r>
+        <w:rPr>
+          <w:rFonts w:ascii="Arial" w:cs="Arial" w:eastAsia="Arial" w:hAnsi="Arial"/>
+          <w:b w:val="0"/>
+          <w:i w:val="0"/>
+          <w:smallCaps w:val="0"/>
+          <w:strike w:val="0"/>
+          <w:color w:val="282f3e"/>
+          <w:sz w:val="32"/>
+          <w:szCs w:val="32"/>
+          <w:u w:val="none"/>
+          <w:shd w:fill="auto" w:val="clear"/>
+          <w:vertAlign w:val="baseline"/>
+          <w:rtl w:val="0"/>
+        </w:rPr>
+        <w:t xml:space="preserve">Zones de vigilance</w:t>
+      </w:r>
+      <w:r>
+        <w:rPr>
+          <w:rFonts w:ascii="Arial" w:cs="Arial" w:eastAsia="Arial" w:hAnsi="Arial"/>
+          <w:b w:val="0"/>
+          <w:i w:val="0"/>
+          <w:smallCaps w:val="0"/>
+          <w:strike w:val="0"/>
+          <w:color w:val="515151"/>
+          <w:sz w:val="28"/>
+          <w:szCs w:val="28"/>
+          <w:u w:val="none"/>
+          <w:shd w:fill="auto" w:val="clear"/>
+          <w:vertAlign w:val="baseline"/>
+          <w:rtl w:val="0"/>
+        </w:rPr>
+        <w:t xml:space="preserve">   </w:t>
+      </w:r>
+      <w:r>
+        <w:rPr>
+          <w:rFonts w:ascii="Arial" w:cs="Arial" w:eastAsia="Arial" w:hAnsi="Arial"/>
+          <w:b w:val="1"/>
+          <w:color w:val="3b4559"/>
+          <w:sz w:val="16"/>
+          <w:szCs w:val="16"/>
+          <w:rtl w:val="0"/>
+        </w:rPr>
+        <w:t xml:space="preserve">${totalVigilanceAreas}</w:t>
+      </w:r>
+      <w:r>
+        <w:rPr>
+          <w:rFonts w:ascii="Arial" w:cs="Arial" w:eastAsia="Arial" w:hAnsi="Arial"/>
+          <w:b w:val="1"/>
+          <w:i w:val="0"/>
+          <w:smallCaps w:val="0"/>
+          <w:strike w:val="0"/>
+          <w:color w:val="3b4559"/>
+          <w:sz w:val="16"/>
+          <w:szCs w:val="16"/>
+          <w:u w:val="none"/>
+          <w:shd w:fill="auto" w:val="clear"/>
+          <w:vertAlign w:val="baseline"/>
+          <w:rtl w:val="0"/>
+        </w:rPr>
+        <w:t xml:space="preserve"> sélectionnées</w:t>
+      </w:r>
+      <w:r>
+        <w:rPr>
+          <w:rtl w:val="0"/>
+        </w:rPr>
+      </w:r>
+    </w:p>
+    <w:p>
+      <w:pPr>
         <w:keepNext w:val="0"/>
         <w:keepLines w:val="0"/>
         <w:pageBreakBefore w:val="0"/>
@@ -3677,18 +3727,35 @@
         <w:jc w:val="left"/>
         <w:rPr>
           <w:rFonts w:ascii="Arial" w:cs="Arial" w:eastAsia="Arial" w:hAnsi="Arial"/>
-          <w:b w:val="1"/>
+          <w:b w:val="0"/>
           <w:i w:val="0"/>
           <w:smallCaps w:val="0"/>
           <w:strike w:val="0"/>
-          <w:color w:val="3b4559"/>
-          <w:sz w:val="16"/>
-          <w:szCs w:val="16"/>
+          <w:color w:val="282f3e"/>
+          <w:sz w:val="18"/>
+          <w:szCs w:val="18"/>
           <w:u w:val="none"/>
           <w:shd w:fill="auto" w:val="clear"/>
           <w:vertAlign w:val="baseline"/>
         </w:rPr>
       </w:pPr>
+      <w:r>
+        <w:rPr>
+          <w:rFonts w:ascii="Arial" w:cs="Arial" w:eastAsia="Arial" w:hAnsi="Arial"/>
+          <w:b w:val="0"/>
+          <w:i w:val="1"/>
+          <w:smallCaps w:val="0"/>
+          <w:strike w:val="0"/>
+          <w:color w:val="282f3e"/>
+          <w:sz w:val="18"/>
+          <w:szCs w:val="18"/>
+          <w:u w:val="none"/>
+          <w:shd w:fill="auto" w:val="clear"/>
+          <w:vertAlign w:val="baseline"/>
+          <w:rtl w:val="0"/>
+        </w:rPr>
+        <w:t xml:space="preserve">Une zone de vigilance permet d'orienter les contrôles en attirant l'attention et rappelant des informations utiles sur un endroit / une période donnés.</w:t>
+      </w:r>
       <w:r>
         <w:rPr>
           <w:rtl w:val="0"/>
@@ -3714,18 +3781,35 @@
         <w:jc w:val="left"/>
         <w:rPr>
           <w:rFonts w:ascii="Arial" w:cs="Arial" w:eastAsia="Arial" w:hAnsi="Arial"/>
-          <w:b w:val="1"/>
+          <w:b w:val="0"/>
           <w:i w:val="0"/>
           <w:smallCaps w:val="0"/>
           <w:strike w:val="0"/>
-          <w:color w:val="3b4559"/>
-          <w:sz w:val="16"/>
-          <w:szCs w:val="16"/>
+          <w:color w:val="282f3e"/>
+          <w:sz w:val="18"/>
+          <w:szCs w:val="18"/>
           <w:u w:val="none"/>
           <w:shd w:fill="auto" w:val="clear"/>
           <w:vertAlign w:val="baseline"/>
         </w:rPr>
       </w:pPr>
+      <w:r>
+        <w:rPr>
+          <w:rFonts w:ascii="Arial" w:cs="Arial" w:eastAsia="Arial" w:hAnsi="Arial"/>
+          <w:b w:val="0"/>
+          <w:i w:val="1"/>
+          <w:smallCaps w:val="0"/>
+          <w:strike w:val="0"/>
+          <w:color w:val="282f3e"/>
+          <w:sz w:val="18"/>
+          <w:szCs w:val="18"/>
+          <w:u w:val="none"/>
+          <w:shd w:fill="auto" w:val="clear"/>
+          <w:vertAlign w:val="baseline"/>
+          <w:rtl w:val="0"/>
+        </w:rPr>
+        <w:t xml:space="preserve">Les informations consignées dans les ZV ont – contrairement aux signalements – une validité dans le temps plus longue ou récurrente.</w:t>
+      </w:r>
       <w:r>
         <w:rPr>
           <w:rtl w:val="0"/>
@@ -3771,1019 +3855,85 @@
     </w:p>
     <w:p>
       <w:pPr>
-        <w:keepNext w:val="0"/>
-        <w:keepLines w:val="0"/>
-        <w:pageBreakBefore w:val="0"/>
-        <w:widowControl w:val="1"/>
-        <w:pBdr>
-          <w:top w:space="0" w:sz="0" w:val="nil"/>
-          <w:left w:space="0" w:sz="0" w:val="nil"/>
-          <w:bottom w:space="0" w:sz="0" w:val="nil"/>
-          <w:right w:space="0" w:sz="0" w:val="nil"/>
-          <w:between w:space="0" w:sz="0" w:val="nil"/>
-        </w:pBdr>
-        <w:shd w:fill="auto" w:val="clear"/>
-        <w:spacing w:after="0" w:before="0" w:line="240" w:lineRule="auto"/>
-        <w:ind w:left="0" w:right="0" w:firstLine="0"/>
-        <w:jc w:val="left"/>
         <w:rPr>
           <w:rFonts w:ascii="Arial" w:cs="Arial" w:eastAsia="Arial" w:hAnsi="Arial"/>
           <w:b w:val="1"/>
-          <w:i w:val="0"/>
-          <w:smallCaps w:val="0"/>
-          <w:strike w:val="0"/>
-          <w:color w:val="3b4559"/>
+          <w:color w:val="282f3e"/>
+          <w:sz w:val="40"/>
+          <w:szCs w:val="40"/>
+        </w:rPr>
+      </w:pPr>
+      <w:r>
+        <w:rPr>
+          <w:rFonts w:ascii="Arial" w:cs="Arial" w:eastAsia="Arial" w:hAnsi="Arial"/>
           <w:sz w:val="16"/>
           <w:szCs w:val="16"/>
-          <w:u w:val="none"/>
-          <w:shd w:fill="auto" w:val="clear"/>
-          <w:vertAlign w:val="baseline"/>
-        </w:rPr>
-      </w:pPr>
-      <w:r>
-        <w:rPr>
-          <w:rtl w:val="0"/>
-        </w:rPr>
-      </w:r>
-    </w:p>
-    <w:p>
-      <w:pPr>
-        <w:keepNext w:val="0"/>
-        <w:keepLines w:val="0"/>
-        <w:pageBreakBefore w:val="0"/>
-        <w:widowControl w:val="1"/>
-        <w:pBdr>
-          <w:top w:space="0" w:sz="0" w:val="nil"/>
-          <w:left w:space="0" w:sz="0" w:val="nil"/>
-          <w:bottom w:space="0" w:sz="0" w:val="nil"/>
-          <w:right w:space="0" w:sz="0" w:val="nil"/>
-          <w:between w:space="0" w:sz="0" w:val="nil"/>
-        </w:pBdr>
-        <w:shd w:fill="auto" w:val="clear"/>
-        <w:spacing w:after="0" w:before="0" w:line="240" w:lineRule="auto"/>
-        <w:ind w:left="0" w:right="0" w:firstLine="0"/>
-        <w:jc w:val="left"/>
+          <w:rtl w:val="0"/>
+        </w:rPr>
+        <w:t xml:space="preserve">${vigilanceAreasDetails}</w:t>
+      </w:r>
+      <w:r>
+        <w:rPr>
+          <w:rtl w:val="0"/>
+        </w:rPr>
+      </w:r>
+    </w:p>
+    <w:p>
+      <w:pPr>
         <w:rPr>
           <w:rFonts w:ascii="Arial" w:cs="Arial" w:eastAsia="Arial" w:hAnsi="Arial"/>
           <w:b w:val="1"/>
-          <w:i w:val="0"/>
-          <w:smallCaps w:val="0"/>
-          <w:strike w:val="0"/>
-          <w:color w:val="3b4559"/>
-          <w:sz w:val="16"/>
-          <w:szCs w:val="16"/>
-          <w:u w:val="none"/>
-          <w:shd w:fill="auto" w:val="clear"/>
-          <w:vertAlign w:val="baseline"/>
-        </w:rPr>
-      </w:pPr>
-      <w:r>
-        <w:rPr>
-          <w:rtl w:val="0"/>
-        </w:rPr>
-      </w:r>
-    </w:p>
-    <w:p>
-      <w:pPr>
-        <w:keepNext w:val="0"/>
-        <w:keepLines w:val="0"/>
-        <w:pageBreakBefore w:val="0"/>
-        <w:widowControl w:val="1"/>
-        <w:pBdr>
-          <w:top w:space="0" w:sz="0" w:val="nil"/>
-          <w:left w:space="0" w:sz="0" w:val="nil"/>
-          <w:bottom w:space="0" w:sz="0" w:val="nil"/>
-          <w:right w:space="0" w:sz="0" w:val="nil"/>
-          <w:between w:space="0" w:sz="0" w:val="nil"/>
-        </w:pBdr>
-        <w:shd w:fill="auto" w:val="clear"/>
-        <w:spacing w:after="0" w:before="0" w:line="240" w:lineRule="auto"/>
-        <w:ind w:left="0" w:right="0" w:firstLine="0"/>
-        <w:jc w:val="left"/>
-        <w:rPr>
-          <w:rFonts w:ascii="Arial" w:cs="Arial" w:eastAsia="Arial" w:hAnsi="Arial"/>
-          <w:b w:val="1"/>
-          <w:i w:val="0"/>
-          <w:smallCaps w:val="0"/>
-          <w:strike w:val="0"/>
-          <w:color w:val="3b4559"/>
-          <w:sz w:val="16"/>
-          <w:szCs w:val="16"/>
-          <w:u w:val="none"/>
-          <w:shd w:fill="auto" w:val="clear"/>
-          <w:vertAlign w:val="baseline"/>
-        </w:rPr>
-      </w:pPr>
-      <w:r>
-        <w:rPr>
-          <w:rtl w:val="0"/>
-        </w:rPr>
-      </w:r>
-    </w:p>
-    <w:p>
-      <w:pPr>
-        <w:keepNext w:val="0"/>
-        <w:keepLines w:val="0"/>
-        <w:pageBreakBefore w:val="0"/>
-        <w:widowControl w:val="1"/>
-        <w:pBdr>
-          <w:top w:space="0" w:sz="0" w:val="nil"/>
-          <w:left w:space="0" w:sz="0" w:val="nil"/>
-          <w:bottom w:space="0" w:sz="0" w:val="nil"/>
-          <w:right w:space="0" w:sz="0" w:val="nil"/>
-          <w:between w:space="0" w:sz="0" w:val="nil"/>
-        </w:pBdr>
-        <w:shd w:fill="auto" w:val="clear"/>
-        <w:spacing w:after="0" w:before="0" w:line="240" w:lineRule="auto"/>
-        <w:ind w:left="0" w:right="0" w:firstLine="0"/>
-        <w:jc w:val="left"/>
-        <w:rPr>
-          <w:rFonts w:ascii="Arial" w:cs="Arial" w:eastAsia="Arial" w:hAnsi="Arial"/>
-          <w:b w:val="1"/>
-          <w:i w:val="0"/>
-          <w:smallCaps w:val="0"/>
-          <w:strike w:val="0"/>
-          <w:color w:val="3b4559"/>
-          <w:sz w:val="16"/>
-          <w:szCs w:val="16"/>
-          <w:u w:val="none"/>
-          <w:shd w:fill="auto" w:val="clear"/>
-          <w:vertAlign w:val="baseline"/>
-        </w:rPr>
-      </w:pPr>
-      <w:r>
-        <w:rPr>
-          <w:rtl w:val="0"/>
-        </w:rPr>
-      </w:r>
-    </w:p>
-    <w:p>
-      <w:pPr>
-        <w:keepNext w:val="0"/>
-        <w:keepLines w:val="0"/>
-        <w:pageBreakBefore w:val="0"/>
-        <w:widowControl w:val="1"/>
-        <w:pBdr>
-          <w:top w:space="0" w:sz="0" w:val="nil"/>
-          <w:left w:space="0" w:sz="0" w:val="nil"/>
-          <w:bottom w:space="0" w:sz="0" w:val="nil"/>
-          <w:right w:space="0" w:sz="0" w:val="nil"/>
-          <w:between w:space="0" w:sz="0" w:val="nil"/>
-        </w:pBdr>
-        <w:shd w:fill="auto" w:val="clear"/>
-        <w:spacing w:after="0" w:before="0" w:line="240" w:lineRule="auto"/>
-        <w:ind w:left="0" w:right="0" w:firstLine="0"/>
-        <w:jc w:val="left"/>
-        <w:rPr>
-          <w:rFonts w:ascii="Arial" w:cs="Arial" w:eastAsia="Arial" w:hAnsi="Arial"/>
-          <w:b w:val="1"/>
-          <w:i w:val="0"/>
-          <w:smallCaps w:val="0"/>
-          <w:strike w:val="0"/>
-          <w:color w:val="3b4559"/>
-          <w:sz w:val="16"/>
-          <w:szCs w:val="16"/>
-          <w:u w:val="none"/>
-          <w:shd w:fill="auto" w:val="clear"/>
-          <w:vertAlign w:val="baseline"/>
-        </w:rPr>
-      </w:pPr>
-      <w:r>
-        <w:rPr>
-          <w:rtl w:val="0"/>
-        </w:rPr>
-      </w:r>
-    </w:p>
-    <w:p>
-      <w:pPr>
-        <w:keepNext w:val="0"/>
-        <w:keepLines w:val="0"/>
-        <w:pageBreakBefore w:val="0"/>
-        <w:widowControl w:val="1"/>
-        <w:pBdr>
-          <w:top w:space="0" w:sz="0" w:val="nil"/>
-          <w:left w:space="0" w:sz="0" w:val="nil"/>
-          <w:bottom w:space="0" w:sz="0" w:val="nil"/>
-          <w:right w:space="0" w:sz="0" w:val="nil"/>
-          <w:between w:space="0" w:sz="0" w:val="nil"/>
-        </w:pBdr>
-        <w:shd w:fill="auto" w:val="clear"/>
-        <w:spacing w:after="0" w:before="0" w:line="240" w:lineRule="auto"/>
-        <w:ind w:left="0" w:right="0" w:firstLine="0"/>
-        <w:jc w:val="left"/>
-        <w:rPr>
-          <w:rFonts w:ascii="Arial" w:cs="Arial" w:eastAsia="Arial" w:hAnsi="Arial"/>
-          <w:b w:val="1"/>
-          <w:i w:val="0"/>
-          <w:smallCaps w:val="0"/>
-          <w:strike w:val="0"/>
-          <w:color w:val="3b4559"/>
-          <w:sz w:val="16"/>
-          <w:szCs w:val="16"/>
-          <w:u w:val="none"/>
-          <w:shd w:fill="auto" w:val="clear"/>
-          <w:vertAlign w:val="baseline"/>
-        </w:rPr>
-      </w:pPr>
-      <w:r>
-        <w:rPr>
-          <w:rtl w:val="0"/>
-        </w:rPr>
-      </w:r>
-    </w:p>
-    <w:p>
-      <w:pPr>
-        <w:keepNext w:val="0"/>
-        <w:keepLines w:val="0"/>
-        <w:pageBreakBefore w:val="0"/>
-        <w:widowControl w:val="1"/>
-        <w:pBdr>
-          <w:top w:space="0" w:sz="0" w:val="nil"/>
-          <w:left w:space="0" w:sz="0" w:val="nil"/>
-          <w:bottom w:space="0" w:sz="0" w:val="nil"/>
-          <w:right w:space="0" w:sz="0" w:val="nil"/>
-          <w:between w:space="0" w:sz="0" w:val="nil"/>
-        </w:pBdr>
-        <w:shd w:fill="auto" w:val="clear"/>
-        <w:spacing w:after="0" w:before="0" w:line="240" w:lineRule="auto"/>
-        <w:ind w:left="0" w:right="0" w:firstLine="0"/>
-        <w:jc w:val="left"/>
-        <w:rPr>
-          <w:rFonts w:ascii="Arial" w:cs="Arial" w:eastAsia="Arial" w:hAnsi="Arial"/>
-          <w:b w:val="1"/>
-          <w:i w:val="0"/>
-          <w:smallCaps w:val="0"/>
-          <w:strike w:val="0"/>
-          <w:color w:val="3b4559"/>
-          <w:sz w:val="16"/>
-          <w:szCs w:val="16"/>
-          <w:u w:val="none"/>
-          <w:shd w:fill="auto" w:val="clear"/>
-          <w:vertAlign w:val="baseline"/>
-        </w:rPr>
-      </w:pPr>
-      <w:r>
-        <w:rPr>
-          <w:rtl w:val="0"/>
-        </w:rPr>
-      </w:r>
-    </w:p>
-    <w:p>
-      <w:pPr>
-        <w:keepNext w:val="0"/>
-        <w:keepLines w:val="0"/>
-        <w:pageBreakBefore w:val="0"/>
-        <w:widowControl w:val="1"/>
-        <w:pBdr>
-          <w:top w:space="0" w:sz="0" w:val="nil"/>
-          <w:left w:space="0" w:sz="0" w:val="nil"/>
-          <w:bottom w:space="0" w:sz="0" w:val="nil"/>
-          <w:right w:space="0" w:sz="0" w:val="nil"/>
-          <w:between w:space="0" w:sz="0" w:val="nil"/>
-        </w:pBdr>
-        <w:shd w:fill="auto" w:val="clear"/>
-        <w:spacing w:after="0" w:before="0" w:line="240" w:lineRule="auto"/>
-        <w:ind w:left="0" w:right="0" w:firstLine="0"/>
-        <w:jc w:val="left"/>
-        <w:rPr>
-          <w:rFonts w:ascii="Arial" w:cs="Arial" w:eastAsia="Arial" w:hAnsi="Arial"/>
-          <w:b w:val="1"/>
-          <w:i w:val="0"/>
-          <w:smallCaps w:val="0"/>
-          <w:strike w:val="0"/>
-          <w:color w:val="3b4559"/>
-          <w:sz w:val="16"/>
-          <w:szCs w:val="16"/>
-          <w:u w:val="none"/>
-          <w:shd w:fill="auto" w:val="clear"/>
-          <w:vertAlign w:val="baseline"/>
-        </w:rPr>
-      </w:pPr>
-      <w:r>
-        <w:rPr>
-          <w:rtl w:val="0"/>
-        </w:rPr>
-      </w:r>
-    </w:p>
-    <w:p>
-      <w:pPr>
-        <w:keepNext w:val="0"/>
-        <w:keepLines w:val="0"/>
-        <w:pageBreakBefore w:val="0"/>
-        <w:widowControl w:val="1"/>
-        <w:pBdr>
-          <w:top w:space="0" w:sz="0" w:val="nil"/>
-          <w:left w:space="0" w:sz="0" w:val="nil"/>
-          <w:bottom w:space="0" w:sz="0" w:val="nil"/>
-          <w:right w:space="0" w:sz="0" w:val="nil"/>
-          <w:between w:space="0" w:sz="0" w:val="nil"/>
-        </w:pBdr>
-        <w:shd w:fill="auto" w:val="clear"/>
-        <w:spacing w:after="0" w:before="0" w:line="240" w:lineRule="auto"/>
-        <w:ind w:left="0" w:right="0" w:firstLine="0"/>
-        <w:jc w:val="left"/>
-        <w:rPr>
-          <w:rFonts w:ascii="Arial" w:cs="Arial" w:eastAsia="Arial" w:hAnsi="Arial"/>
-          <w:b w:val="1"/>
-          <w:i w:val="0"/>
-          <w:smallCaps w:val="0"/>
-          <w:strike w:val="0"/>
-          <w:color w:val="3b4559"/>
-          <w:sz w:val="16"/>
-          <w:szCs w:val="16"/>
-          <w:u w:val="none"/>
-          <w:shd w:fill="auto" w:val="clear"/>
-          <w:vertAlign w:val="baseline"/>
-        </w:rPr>
-      </w:pPr>
-      <w:r>
-        <w:rPr>
-          <w:rtl w:val="0"/>
-        </w:rPr>
-      </w:r>
-    </w:p>
-    <w:p>
-      <w:pPr>
-        <w:keepNext w:val="0"/>
-        <w:keepLines w:val="0"/>
-        <w:pageBreakBefore w:val="0"/>
-        <w:widowControl w:val="1"/>
-        <w:pBdr>
-          <w:top w:space="0" w:sz="0" w:val="nil"/>
-          <w:left w:space="0" w:sz="0" w:val="nil"/>
-          <w:bottom w:space="0" w:sz="0" w:val="nil"/>
-          <w:right w:space="0" w:sz="0" w:val="nil"/>
-          <w:between w:space="0" w:sz="0" w:val="nil"/>
-        </w:pBdr>
-        <w:shd w:fill="auto" w:val="clear"/>
-        <w:spacing w:after="0" w:before="0" w:line="240" w:lineRule="auto"/>
-        <w:ind w:left="0" w:right="0" w:firstLine="0"/>
-        <w:jc w:val="left"/>
-        <w:rPr>
-          <w:rFonts w:ascii="Arial" w:cs="Arial" w:eastAsia="Arial" w:hAnsi="Arial"/>
-          <w:b w:val="1"/>
-          <w:i w:val="0"/>
-          <w:smallCaps w:val="0"/>
-          <w:strike w:val="0"/>
-          <w:color w:val="3b4559"/>
-          <w:sz w:val="16"/>
-          <w:szCs w:val="16"/>
-          <w:u w:val="none"/>
-          <w:shd w:fill="auto" w:val="clear"/>
-          <w:vertAlign w:val="baseline"/>
-        </w:rPr>
-      </w:pPr>
-      <w:r>
-        <w:rPr>
-          <w:rtl w:val="0"/>
-        </w:rPr>
-      </w:r>
-    </w:p>
-    <w:p>
-      <w:pPr>
-        <w:keepNext w:val="0"/>
-        <w:keepLines w:val="0"/>
-        <w:pageBreakBefore w:val="0"/>
-        <w:widowControl w:val="1"/>
-        <w:pBdr>
-          <w:top w:space="0" w:sz="0" w:val="nil"/>
-          <w:left w:space="0" w:sz="0" w:val="nil"/>
-          <w:bottom w:space="0" w:sz="0" w:val="nil"/>
-          <w:right w:space="0" w:sz="0" w:val="nil"/>
-          <w:between w:space="0" w:sz="0" w:val="nil"/>
-        </w:pBdr>
-        <w:shd w:fill="auto" w:val="clear"/>
-        <w:spacing w:after="0" w:before="0" w:line="240" w:lineRule="auto"/>
-        <w:ind w:left="0" w:right="0" w:firstLine="0"/>
-        <w:jc w:val="left"/>
-        <w:rPr>
-          <w:rFonts w:ascii="Arial" w:cs="Arial" w:eastAsia="Arial" w:hAnsi="Arial"/>
-          <w:b w:val="1"/>
-          <w:i w:val="0"/>
-          <w:smallCaps w:val="0"/>
-          <w:strike w:val="0"/>
-          <w:color w:val="3b4559"/>
-          <w:sz w:val="16"/>
-          <w:szCs w:val="16"/>
-          <w:u w:val="none"/>
-          <w:shd w:fill="auto" w:val="clear"/>
-          <w:vertAlign w:val="baseline"/>
-        </w:rPr>
-      </w:pPr>
-      <w:r>
-        <w:rPr>
-          <w:rtl w:val="0"/>
-        </w:rPr>
-      </w:r>
-    </w:p>
-    <w:p>
-      <w:pPr>
-        <w:keepNext w:val="0"/>
-        <w:keepLines w:val="0"/>
-        <w:pageBreakBefore w:val="0"/>
-        <w:widowControl w:val="1"/>
-        <w:pBdr>
-          <w:top w:space="0" w:sz="0" w:val="nil"/>
-          <w:left w:space="0" w:sz="0" w:val="nil"/>
-          <w:bottom w:space="0" w:sz="0" w:val="nil"/>
-          <w:right w:space="0" w:sz="0" w:val="nil"/>
-          <w:between w:space="0" w:sz="0" w:val="nil"/>
-        </w:pBdr>
-        <w:shd w:fill="auto" w:val="clear"/>
-        <w:spacing w:after="0" w:before="0" w:line="240" w:lineRule="auto"/>
-        <w:ind w:left="0" w:right="0" w:firstLine="0"/>
-        <w:jc w:val="left"/>
-        <w:rPr>
-          <w:rFonts w:ascii="Arial" w:cs="Arial" w:eastAsia="Arial" w:hAnsi="Arial"/>
-          <w:b w:val="1"/>
-          <w:i w:val="0"/>
-          <w:smallCaps w:val="0"/>
-          <w:strike w:val="0"/>
-          <w:color w:val="3b4559"/>
-          <w:sz w:val="16"/>
-          <w:szCs w:val="16"/>
-          <w:u w:val="none"/>
-          <w:shd w:fill="auto" w:val="clear"/>
-          <w:vertAlign w:val="baseline"/>
-        </w:rPr>
-      </w:pPr>
-      <w:r>
-        <w:rPr>
-          <w:rtl w:val="0"/>
-        </w:rPr>
-      </w:r>
-    </w:p>
-    <w:p>
-      <w:pPr>
-        <w:keepNext w:val="0"/>
-        <w:keepLines w:val="0"/>
-        <w:pageBreakBefore w:val="0"/>
-        <w:widowControl w:val="1"/>
-        <w:pBdr>
-          <w:top w:space="0" w:sz="0" w:val="nil"/>
-          <w:left w:space="0" w:sz="0" w:val="nil"/>
-          <w:bottom w:space="0" w:sz="0" w:val="nil"/>
-          <w:right w:space="0" w:sz="0" w:val="nil"/>
-          <w:between w:space="0" w:sz="0" w:val="nil"/>
-        </w:pBdr>
-        <w:shd w:fill="auto" w:val="clear"/>
-        <w:spacing w:after="0" w:before="0" w:line="240" w:lineRule="auto"/>
-        <w:ind w:left="0" w:right="0" w:firstLine="0"/>
-        <w:jc w:val="left"/>
-        <w:rPr>
-          <w:rFonts w:ascii="Arial" w:cs="Arial" w:eastAsia="Arial" w:hAnsi="Arial"/>
-          <w:b w:val="1"/>
-          <w:i w:val="0"/>
-          <w:smallCaps w:val="0"/>
-          <w:strike w:val="0"/>
-          <w:color w:val="3b4559"/>
-          <w:sz w:val="16"/>
-          <w:szCs w:val="16"/>
-          <w:u w:val="none"/>
-          <w:shd w:fill="auto" w:val="clear"/>
-          <w:vertAlign w:val="baseline"/>
-        </w:rPr>
-      </w:pPr>
-      <w:r>
-        <w:rPr>
-          <w:rtl w:val="0"/>
-        </w:rPr>
-      </w:r>
-    </w:p>
-    <w:p>
-      <w:pPr>
-        <w:keepNext w:val="0"/>
-        <w:keepLines w:val="0"/>
-        <w:pageBreakBefore w:val="0"/>
-        <w:widowControl w:val="1"/>
-        <w:pBdr>
-          <w:top w:space="0" w:sz="0" w:val="nil"/>
-          <w:left w:space="0" w:sz="0" w:val="nil"/>
-          <w:bottom w:space="0" w:sz="0" w:val="nil"/>
-          <w:right w:space="0" w:sz="0" w:val="nil"/>
-          <w:between w:space="0" w:sz="0" w:val="nil"/>
-        </w:pBdr>
-        <w:shd w:fill="auto" w:val="clear"/>
-        <w:spacing w:after="0" w:before="0" w:line="240" w:lineRule="auto"/>
-        <w:ind w:left="0" w:right="0" w:firstLine="0"/>
-        <w:jc w:val="left"/>
-        <w:rPr>
-          <w:rFonts w:ascii="Arial" w:cs="Arial" w:eastAsia="Arial" w:hAnsi="Arial"/>
-          <w:b w:val="1"/>
-          <w:i w:val="0"/>
-          <w:smallCaps w:val="0"/>
-          <w:strike w:val="0"/>
-          <w:color w:val="3b4559"/>
-          <w:sz w:val="16"/>
-          <w:szCs w:val="16"/>
-          <w:u w:val="none"/>
-          <w:shd w:fill="auto" w:val="clear"/>
-          <w:vertAlign w:val="baseline"/>
-        </w:rPr>
-      </w:pPr>
-      <w:r>
-        <w:rPr>
-          <w:rtl w:val="0"/>
-        </w:rPr>
-      </w:r>
-    </w:p>
-    <w:p>
-      <w:pPr>
-        <w:keepNext w:val="0"/>
-        <w:keepLines w:val="0"/>
-        <w:pageBreakBefore w:val="0"/>
-        <w:widowControl w:val="1"/>
-        <w:pBdr>
-          <w:top w:space="0" w:sz="0" w:val="nil"/>
-          <w:left w:space="0" w:sz="0" w:val="nil"/>
-          <w:bottom w:space="0" w:sz="0" w:val="nil"/>
-          <w:right w:space="0" w:sz="0" w:val="nil"/>
-          <w:between w:space="0" w:sz="0" w:val="nil"/>
-        </w:pBdr>
-        <w:shd w:fill="auto" w:val="clear"/>
-        <w:spacing w:after="0" w:before="0" w:line="240" w:lineRule="auto"/>
-        <w:ind w:left="0" w:right="0" w:firstLine="0"/>
-        <w:jc w:val="left"/>
-        <w:rPr>
-          <w:rFonts w:ascii="Arial" w:cs="Arial" w:eastAsia="Arial" w:hAnsi="Arial"/>
-          <w:b w:val="1"/>
-          <w:i w:val="0"/>
-          <w:smallCaps w:val="0"/>
-          <w:strike w:val="0"/>
-          <w:color w:val="3b4559"/>
-          <w:sz w:val="16"/>
-          <w:szCs w:val="16"/>
-          <w:u w:val="none"/>
-          <w:shd w:fill="auto" w:val="clear"/>
-          <w:vertAlign w:val="baseline"/>
-        </w:rPr>
-      </w:pPr>
-      <w:r>
-        <w:rPr>
-          <w:rtl w:val="0"/>
-        </w:rPr>
-      </w:r>
-    </w:p>
-    <w:p>
-      <w:pPr>
-        <w:keepNext w:val="0"/>
-        <w:keepLines w:val="0"/>
-        <w:pageBreakBefore w:val="0"/>
-        <w:widowControl w:val="1"/>
-        <w:pBdr>
-          <w:top w:space="0" w:sz="0" w:val="nil"/>
-          <w:left w:space="0" w:sz="0" w:val="nil"/>
-          <w:bottom w:space="0" w:sz="0" w:val="nil"/>
-          <w:right w:space="0" w:sz="0" w:val="nil"/>
-          <w:between w:space="0" w:sz="0" w:val="nil"/>
-        </w:pBdr>
-        <w:shd w:fill="auto" w:val="clear"/>
-        <w:spacing w:after="0" w:before="0" w:line="240" w:lineRule="auto"/>
-        <w:ind w:left="0" w:right="0" w:firstLine="0"/>
-        <w:jc w:val="left"/>
-        <w:rPr>
-          <w:rFonts w:ascii="Arial" w:cs="Arial" w:eastAsia="Arial" w:hAnsi="Arial"/>
-          <w:b w:val="1"/>
-          <w:i w:val="0"/>
-          <w:smallCaps w:val="0"/>
-          <w:strike w:val="0"/>
-          <w:color w:val="3b4559"/>
-          <w:sz w:val="16"/>
-          <w:szCs w:val="16"/>
-          <w:u w:val="none"/>
-          <w:shd w:fill="auto" w:val="clear"/>
-          <w:vertAlign w:val="baseline"/>
-        </w:rPr>
-      </w:pPr>
-      <w:r>
-        <w:rPr>
-          <w:rtl w:val="0"/>
-        </w:rPr>
-      </w:r>
-    </w:p>
-    <w:p>
-      <w:pPr>
-        <w:keepNext w:val="0"/>
-        <w:keepLines w:val="0"/>
-        <w:pageBreakBefore w:val="0"/>
-        <w:widowControl w:val="1"/>
-        <w:pBdr>
-          <w:top w:space="0" w:sz="0" w:val="nil"/>
-          <w:left w:space="0" w:sz="0" w:val="nil"/>
-          <w:bottom w:space="0" w:sz="0" w:val="nil"/>
-          <w:right w:space="0" w:sz="0" w:val="nil"/>
-          <w:between w:space="0" w:sz="0" w:val="nil"/>
-        </w:pBdr>
-        <w:shd w:fill="auto" w:val="clear"/>
-        <w:spacing w:after="0" w:before="0" w:line="240" w:lineRule="auto"/>
-        <w:ind w:left="0" w:right="0" w:firstLine="0"/>
-        <w:jc w:val="left"/>
-        <w:rPr>
-          <w:rFonts w:ascii="Arial" w:cs="Arial" w:eastAsia="Arial" w:hAnsi="Arial"/>
-          <w:b w:val="1"/>
-          <w:i w:val="0"/>
-          <w:smallCaps w:val="0"/>
-          <w:strike w:val="0"/>
-          <w:color w:val="3b4559"/>
-          <w:sz w:val="20"/>
-          <w:szCs w:val="20"/>
-          <w:u w:val="none"/>
-          <w:shd w:fill="auto" w:val="clear"/>
-          <w:vertAlign w:val="baseline"/>
-        </w:rPr>
-      </w:pPr>
-      <w:r>
-        <w:rPr>
-          <w:rtl w:val="0"/>
-        </w:rPr>
-      </w:r>
-    </w:p>
-    <w:p>
-      <w:pPr>
-        <w:keepNext w:val="0"/>
-        <w:keepLines w:val="0"/>
-        <w:pageBreakBefore w:val="1"/>
-        <w:widowControl w:val="1"/>
-        <w:pBdr>
-          <w:top w:space="0" w:sz="0" w:val="nil"/>
-          <w:left w:space="0" w:sz="0" w:val="nil"/>
-          <w:bottom w:space="0" w:sz="0" w:val="nil"/>
-          <w:right w:space="0" w:sz="0" w:val="nil"/>
-          <w:between w:space="0" w:sz="0" w:val="nil"/>
-        </w:pBdr>
-        <w:shd w:fill="auto" w:val="clear"/>
-        <w:spacing w:after="0" w:before="0" w:line="240" w:lineRule="auto"/>
-        <w:ind w:left="0" w:right="0" w:firstLine="0"/>
-        <w:jc w:val="left"/>
-        <w:rPr>
-          <w:rFonts w:ascii="Arial" w:cs="Arial" w:eastAsia="Arial" w:hAnsi="Arial"/>
-          <w:b w:val="0"/>
-          <w:i w:val="0"/>
-          <w:smallCaps w:val="0"/>
-          <w:strike w:val="0"/>
-          <w:color w:val="515151"/>
-          <w:sz w:val="28"/>
-          <w:szCs w:val="28"/>
-          <w:u w:val="none"/>
-          <w:shd w:fill="auto" w:val="clear"/>
-          <w:vertAlign w:val="baseline"/>
-        </w:rPr>
-      </w:pPr>
-      <w:r>
-        <w:rPr>
-          <w:rFonts w:ascii="Arial" w:cs="Arial" w:eastAsia="Arial" w:hAnsi="Arial"/>
-          <w:b w:val="0"/>
-          <w:i w:val="0"/>
-          <w:smallCaps w:val="0"/>
-          <w:strike w:val="0"/>
           <w:color w:val="282f3e"/>
-          <w:sz w:val="32"/>
-          <w:szCs w:val="32"/>
-          <w:u w:val="none"/>
-          <w:shd w:fill="auto" w:val="clear"/>
-          <w:vertAlign w:val="baseline"/>
-          <w:rtl w:val="0"/>
-        </w:rPr>
-        <w:t xml:space="preserve">Zones de vigilance</w:t>
-      </w:r>
-      <w:r>
-        <w:rPr>
-          <w:rFonts w:ascii="Arial" w:cs="Arial" w:eastAsia="Arial" w:hAnsi="Arial"/>
-          <w:b w:val="0"/>
-          <w:i w:val="0"/>
-          <w:smallCaps w:val="0"/>
-          <w:strike w:val="0"/>
-          <w:color w:val="515151"/>
-          <w:sz w:val="28"/>
-          <w:szCs w:val="28"/>
-          <w:u w:val="none"/>
-          <w:shd w:fill="auto" w:val="clear"/>
-          <w:vertAlign w:val="baseline"/>
-          <w:rtl w:val="0"/>
-        </w:rPr>
-        <w:t xml:space="preserve">   </w:t>
-      </w:r>
-      <w:r>
+          <w:sz w:val="40"/>
+          <w:szCs w:val="40"/>
+        </w:rPr>
+      </w:pPr>
+      <w:r>
+        <w:rPr>
+          <w:rtl w:val="0"/>
+        </w:rPr>
+      </w:r>
+    </w:p>
+    <w:p>
+      <w:pPr>
         <w:rPr>
           <w:rFonts w:ascii="Arial" w:cs="Arial" w:eastAsia="Arial" w:hAnsi="Arial"/>
           <w:b w:val="1"/>
           <w:color w:val="3b4559"/>
           <w:sz w:val="16"/>
           <w:szCs w:val="16"/>
-          <w:rtl w:val="0"/>
-        </w:rPr>
-        <w:t xml:space="preserve">${totalVigilanceAreas}</w:t>
-      </w:r>
-      <w:r>
-        <w:rPr>
-          <w:rFonts w:ascii="Arial" w:cs="Arial" w:eastAsia="Arial" w:hAnsi="Arial"/>
-          <w:b w:val="1"/>
-          <w:i w:val="0"/>
-          <w:smallCaps w:val="0"/>
-          <w:strike w:val="0"/>
-          <w:color w:val="3b4559"/>
-          <w:sz w:val="16"/>
-          <w:szCs w:val="16"/>
-          <w:u w:val="none"/>
-          <w:shd w:fill="auto" w:val="clear"/>
-          <w:vertAlign w:val="baseline"/>
-          <w:rtl w:val="0"/>
-        </w:rPr>
-        <w:t xml:space="preserve"> sélectionnées</w:t>
-      </w:r>
-      <w:r>
-        <w:rPr>
-          <w:rtl w:val="0"/>
-        </w:rPr>
-      </w:r>
-    </w:p>
-    <w:p>
-      <w:pPr>
-        <w:keepNext w:val="0"/>
-        <w:keepLines w:val="0"/>
-        <w:pageBreakBefore w:val="0"/>
-        <w:widowControl w:val="1"/>
-        <w:pBdr>
-          <w:top w:space="0" w:sz="0" w:val="nil"/>
-          <w:left w:space="0" w:sz="0" w:val="nil"/>
-          <w:bottom w:space="0" w:sz="0" w:val="nil"/>
-          <w:right w:space="0" w:sz="0" w:val="nil"/>
-          <w:between w:space="0" w:sz="0" w:val="nil"/>
-        </w:pBdr>
-        <w:shd w:fill="auto" w:val="clear"/>
-        <w:spacing w:after="0" w:before="0" w:line="240" w:lineRule="auto"/>
-        <w:ind w:left="0" w:right="0" w:firstLine="0"/>
-        <w:jc w:val="left"/>
-        <w:rPr>
-          <w:rFonts w:ascii="Arial" w:cs="Arial" w:eastAsia="Arial" w:hAnsi="Arial"/>
-          <w:b w:val="1"/>
-          <w:i w:val="0"/>
-          <w:smallCaps w:val="0"/>
-          <w:strike w:val="0"/>
-          <w:color w:val="3b4559"/>
-          <w:sz w:val="16"/>
-          <w:szCs w:val="16"/>
-          <w:u w:val="none"/>
-          <w:shd w:fill="auto" w:val="clear"/>
-          <w:vertAlign w:val="baseline"/>
-        </w:rPr>
-      </w:pPr>
-      <w:r>
-        <w:rPr>
-          <w:rtl w:val="0"/>
-        </w:rPr>
-      </w:r>
-    </w:p>
-    <w:p>
-      <w:pPr>
-        <w:keepNext w:val="0"/>
-        <w:keepLines w:val="0"/>
-        <w:pageBreakBefore w:val="0"/>
-        <w:widowControl w:val="1"/>
-        <w:pBdr>
-          <w:top w:space="0" w:sz="0" w:val="nil"/>
-          <w:left w:space="0" w:sz="0" w:val="nil"/>
-          <w:bottom w:space="0" w:sz="0" w:val="nil"/>
-          <w:right w:space="0" w:sz="0" w:val="nil"/>
-          <w:between w:space="0" w:sz="0" w:val="nil"/>
-        </w:pBdr>
-        <w:shd w:fill="auto" w:val="clear"/>
-        <w:spacing w:after="0" w:before="0" w:line="240" w:lineRule="auto"/>
-        <w:ind w:left="0" w:right="0" w:firstLine="0"/>
-        <w:jc w:val="left"/>
-        <w:rPr>
-          <w:rFonts w:ascii="Arial" w:cs="Arial" w:eastAsia="Arial" w:hAnsi="Arial"/>
-          <w:b w:val="0"/>
-          <w:i w:val="0"/>
-          <w:smallCaps w:val="0"/>
-          <w:strike w:val="0"/>
+        </w:rPr>
+      </w:pPr>
+      <w:r>
+        <w:rPr>
+          <w:rFonts w:ascii="Arial" w:cs="Arial" w:eastAsia="Arial" w:hAnsi="Arial"/>
           <w:color w:val="282f3e"/>
-          <w:sz w:val="18"/>
-          <w:szCs w:val="18"/>
-          <w:u w:val="none"/>
-          <w:shd w:fill="auto" w:val="clear"/>
-          <w:vertAlign w:val="baseline"/>
-        </w:rPr>
-      </w:pPr>
-      <w:r>
-        <w:rPr>
-          <w:rFonts w:ascii="Arial" w:cs="Arial" w:eastAsia="Arial" w:hAnsi="Arial"/>
-          <w:b w:val="0"/>
-          <w:i w:val="1"/>
-          <w:smallCaps w:val="0"/>
-          <w:strike w:val="0"/>
-          <w:color w:val="282f3e"/>
-          <w:sz w:val="18"/>
-          <w:szCs w:val="18"/>
-          <w:u w:val="none"/>
-          <w:shd w:fill="auto" w:val="clear"/>
-          <w:vertAlign w:val="baseline"/>
-          <w:rtl w:val="0"/>
-        </w:rPr>
-        <w:t xml:space="preserve">Une zone de vigilance permet d'orienter les contrôles en attirant l'attention et rappelant des informations utiles sur un endroit / une période donnés.</w:t>
-      </w:r>
-      <w:r>
-        <w:rPr>
-          <w:rtl w:val="0"/>
-        </w:rPr>
-      </w:r>
-    </w:p>
-    <w:p>
-      <w:pPr>
-        <w:keepNext w:val="0"/>
-        <w:keepLines w:val="0"/>
-        <w:pageBreakBefore w:val="0"/>
-        <w:widowControl w:val="1"/>
-        <w:pBdr>
-          <w:top w:space="0" w:sz="0" w:val="nil"/>
-          <w:left w:space="0" w:sz="0" w:val="nil"/>
-          <w:bottom w:space="0" w:sz="0" w:val="nil"/>
-          <w:right w:space="0" w:sz="0" w:val="nil"/>
-          <w:between w:space="0" w:sz="0" w:val="nil"/>
-        </w:pBdr>
-        <w:shd w:fill="auto" w:val="clear"/>
-        <w:spacing w:after="0" w:before="0" w:line="240" w:lineRule="auto"/>
-        <w:ind w:left="0" w:right="0" w:firstLine="0"/>
-        <w:jc w:val="left"/>
-        <w:rPr>
-          <w:rFonts w:ascii="Arial" w:cs="Arial" w:eastAsia="Arial" w:hAnsi="Arial"/>
-          <w:b w:val="0"/>
-          <w:i w:val="0"/>
-          <w:smallCaps w:val="0"/>
-          <w:strike w:val="0"/>
-          <w:color w:val="282f3e"/>
-          <w:sz w:val="18"/>
-          <w:szCs w:val="18"/>
-          <w:u w:val="none"/>
-          <w:shd w:fill="auto" w:val="clear"/>
-          <w:vertAlign w:val="baseline"/>
-        </w:rPr>
-      </w:pPr>
-      <w:r>
-        <w:rPr>
-          <w:rFonts w:ascii="Arial" w:cs="Arial" w:eastAsia="Arial" w:hAnsi="Arial"/>
-          <w:b w:val="0"/>
-          <w:i w:val="1"/>
-          <w:smallCaps w:val="0"/>
-          <w:strike w:val="0"/>
-          <w:color w:val="282f3e"/>
-          <w:sz w:val="18"/>
-          <w:szCs w:val="18"/>
-          <w:u w:val="none"/>
-          <w:shd w:fill="auto" w:val="clear"/>
-          <w:vertAlign w:val="baseline"/>
-          <w:rtl w:val="0"/>
-        </w:rPr>
-        <w:t xml:space="preserve">Les informations consignées dans les ZV ont – contrairement aux signalements – une validité dans le temps plus longue ou récurrente.</w:t>
-      </w:r>
-      <w:r>
-        <w:rPr>
-          <w:rtl w:val="0"/>
-        </w:rPr>
-      </w:r>
-    </w:p>
-    <w:p>
-      <w:pPr>
-        <w:keepNext w:val="0"/>
-        <w:keepLines w:val="0"/>
-        <w:pageBreakBefore w:val="0"/>
-        <w:widowControl w:val="1"/>
-        <w:pBdr>
-          <w:top w:space="0" w:sz="0" w:val="nil"/>
-          <w:left w:space="0" w:sz="0" w:val="nil"/>
-          <w:bottom w:space="0" w:sz="0" w:val="nil"/>
-          <w:right w:space="0" w:sz="0" w:val="nil"/>
-          <w:between w:space="0" w:sz="0" w:val="nil"/>
-        </w:pBdr>
-        <w:shd w:fill="auto" w:val="clear"/>
-        <w:spacing w:after="0" w:before="0" w:line="240" w:lineRule="auto"/>
-        <w:ind w:left="0" w:right="0" w:firstLine="0"/>
-        <w:jc w:val="left"/>
-        <w:rPr>
-          <w:rFonts w:ascii="Arial" w:cs="Arial" w:eastAsia="Arial" w:hAnsi="Arial"/>
-          <w:b w:val="1"/>
-          <w:i w:val="0"/>
-          <w:smallCaps w:val="0"/>
-          <w:strike w:val="0"/>
-          <w:color w:val="3b4559"/>
-          <w:sz w:val="16"/>
-          <w:szCs w:val="16"/>
-          <w:u w:val="none"/>
-          <w:shd w:fill="auto" w:val="clear"/>
-          <w:vertAlign w:val="baseline"/>
-        </w:rPr>
-      </w:pPr>
-      <w:r>
-        <w:rPr>
-          <w:rtl w:val="0"/>
-        </w:rPr>
-      </w:r>
-    </w:p>
-    <w:p>
-      <w:pPr>
-        <w:rPr>
-          <w:rFonts w:ascii="Arial" w:cs="Arial" w:eastAsia="Arial" w:hAnsi="Arial"/>
-          <w:b w:val="1"/>
-          <w:i w:val="0"/>
-          <w:smallCaps w:val="0"/>
-          <w:strike w:val="0"/>
-          <w:color w:val="3b4559"/>
-          <w:sz w:val="16"/>
-          <w:szCs w:val="16"/>
-          <w:u w:val="none"/>
-          <w:shd w:fill="auto" w:val="clear"/>
-          <w:vertAlign w:val="baseline"/>
-        </w:rPr>
-      </w:pPr>
-      <w:r>
-        <w:rPr>
-          <w:rFonts w:ascii="Arial" w:cs="Arial" w:eastAsia="Arial" w:hAnsi="Arial"/>
-          <w:sz w:val="16"/>
-          <w:szCs w:val="16"/>
-          <w:rtl w:val="0"/>
-        </w:rPr>
-        <w:t xml:space="preserve">${vigilanceAreasDetails}</w:t>
-      </w:r>
-      <w:r>
-        <w:rPr>
-          <w:rtl w:val="0"/>
-        </w:rPr>
-      </w:r>
-    </w:p>
-    <w:p>
-      <w:pPr>
-        <w:keepNext w:val="0"/>
-        <w:keepLines w:val="0"/>
-        <w:widowControl w:val="1"/>
-        <w:pBdr>
-          <w:top w:space="0" w:sz="0" w:val="nil"/>
-          <w:left w:space="0" w:sz="0" w:val="nil"/>
-          <w:bottom w:space="0" w:sz="0" w:val="nil"/>
-          <w:right w:space="0" w:sz="0" w:val="nil"/>
-          <w:between w:space="0" w:sz="0" w:val="nil"/>
-        </w:pBdr>
-        <w:shd w:fill="auto" w:val="clear"/>
-        <w:spacing w:after="0" w:before="0" w:line="240" w:lineRule="auto"/>
-        <w:ind w:left="0" w:right="0" w:firstLine="0"/>
-        <w:jc w:val="left"/>
-        <w:rPr>
-          <w:rFonts w:ascii="Arial" w:cs="Arial" w:eastAsia="Arial" w:hAnsi="Arial"/>
-          <w:b w:val="1"/>
-          <w:color w:val="282f3e"/>
-          <w:sz w:val="40"/>
-          <w:szCs w:val="40"/>
-        </w:rPr>
-      </w:pPr>
-      <w:r>
-        <w:br w:type="page"/>
-      </w:r>
-      <w:r>
-        <w:rPr>
-          <w:rtl w:val="0"/>
-        </w:rPr>
-      </w:r>
-    </w:p>
-    <w:p>
-      <w:pPr>
-        <w:pageBreakBefore w:val="1"/>
+          <w:sz w:val="32"/>
+          <w:szCs w:val="32"/>
+          <w:rtl w:val="0"/>
+        </w:rPr>
+        <w:t xml:space="preserve">Signalements (détails)  </w:t>
+      </w:r>
+      <w:r>
         <w:rPr>
           <w:rFonts w:ascii="Arial" w:cs="Arial" w:eastAsia="Arial" w:hAnsi="Arial"/>
           <w:b w:val="1"/>
           <w:color w:val="3b4559"/>
           <w:sz w:val="16"/>
           <w:szCs w:val="16"/>
-        </w:rPr>
-      </w:pPr>
-      <w:r>
-        <w:rPr>
-          <w:rFonts w:ascii="Arial" w:cs="Arial" w:eastAsia="Arial" w:hAnsi="Arial"/>
-          <w:color w:val="282f3e"/>
-          <w:sz w:val="32"/>
-          <w:szCs w:val="32"/>
-          <w:rtl w:val="0"/>
-        </w:rPr>
-        <w:t xml:space="preserve">Signalements (détails)  </w:t>
-      </w:r>
-      <w:r>
+          <w:rtl w:val="0"/>
+        </w:rPr>
+        <w:t xml:space="preserve">${totalReportings} sélectionnés</w:t>
+      </w:r>
+    </w:p>
+    <w:p>
+      <w:pPr>
         <w:rPr>
           <w:rFonts w:ascii="Arial" w:cs="Arial" w:eastAsia="Arial" w:hAnsi="Arial"/>
           <w:b w:val="1"/>
           <w:color w:val="3b4559"/>
           <w:sz w:val="16"/>
           <w:szCs w:val="16"/>
-          <w:rtl w:val="0"/>
-        </w:rPr>
-        <w:t xml:space="preserve">${totalReportings} sélectionnés</w:t>
-      </w:r>
-    </w:p>
-    <w:p>
-      <w:pPr>
-        <w:rPr>
-          <w:rFonts w:ascii="Arial" w:cs="Arial" w:eastAsia="Arial" w:hAnsi="Arial"/>
-          <w:b w:val="1"/>
-          <w:color w:val="3b4559"/>
-          <w:sz w:val="16"/>
-          <w:szCs w:val="16"/>
         </w:rPr>
       </w:pPr>
       <w:r>
@@ -4864,294 +4014,6 @@
           <w:szCs w:val="18"/>
         </w:rPr>
       </w:pPr>
-      <w:r>
-        <w:rPr>
-          <w:rFonts w:ascii="Arial" w:cs="Arial" w:eastAsia="Arial" w:hAnsi="Arial"/>
-          <w:color w:val="282f3e"/>
-          <w:sz w:val="18"/>
-          <w:szCs w:val="18"/>
-        </w:rPr>
-        <w:drawing>
-          <wp:anchor allowOverlap="1" behindDoc="0" distB="114300" distT="114300" distL="114300" distR="114300" hidden="0" layoutInCell="1" locked="0" relativeHeight="0" simplePos="0">
-            <wp:simplePos x="0" y="0"/>
-            <wp:positionH relativeFrom="page">
-              <wp:posOffset>436245</wp:posOffset>
-            </wp:positionH>
-            <wp:positionV relativeFrom="page">
-              <wp:posOffset>2333036</wp:posOffset>
-            </wp:positionV>
-            <wp:extent cx="133833" cy="188940"/>
-            <wp:effectExtent b="0" l="0" r="0" t="0"/>
-            <wp:wrapNone/>
-            <wp:docPr id="8" name="image2.png"/>
-            <a:graphic>
-              <a:graphicData uri="http://schemas.openxmlformats.org/drawingml/2006/picture">
-                <pic:pic>
-                  <pic:nvPicPr>
-                    <pic:cNvPr id="0" name="image2.png"/>
-                    <pic:cNvPicPr preferRelativeResize="0"/>
-                  </pic:nvPicPr>
-                  <pic:blipFill>
-                    <a:blip r:embed="rId8"/>
-                    <a:srcRect b="0" l="0" r="0" t="0"/>
-                    <a:stretch>
-                      <a:fillRect/>
-                    </a:stretch>
-                  </pic:blipFill>
-                  <pic:spPr>
-                    <a:xfrm>
-                      <a:off x="0" y="0"/>
-                      <a:ext cx="133833" cy="188940"/>
-                    </a:xfrm>
-                    <a:prstGeom prst="rect"/>
-                    <a:ln/>
-                  </pic:spPr>
-                </pic:pic>
-              </a:graphicData>
-            </a:graphic>
-          </wp:anchor>
-        </w:drawing>
-      </w:r>
-      <w:r>
-        <w:rPr>
-          <w:rFonts w:ascii="Arial" w:cs="Arial" w:eastAsia="Arial" w:hAnsi="Arial"/>
-          <w:color w:val="282f3e"/>
-          <w:sz w:val="18"/>
-          <w:szCs w:val="18"/>
-        </w:rPr>
-        <w:drawing>
-          <wp:anchor allowOverlap="1" behindDoc="0" distB="114300" distT="114300" distL="114300" distR="114300" hidden="0" layoutInCell="1" locked="0" relativeHeight="0" simplePos="0">
-            <wp:simplePos x="0" y="0"/>
-            <wp:positionH relativeFrom="page">
-              <wp:posOffset>429895</wp:posOffset>
-            </wp:positionH>
-            <wp:positionV relativeFrom="page">
-              <wp:posOffset>2066336</wp:posOffset>
-            </wp:positionV>
-            <wp:extent cx="127000" cy="185615"/>
-            <wp:effectExtent b="0" l="0" r="0" t="0"/>
-            <wp:wrapNone/>
-            <wp:docPr id="6" name="image5.png"/>
-            <a:graphic>
-              <a:graphicData uri="http://schemas.openxmlformats.org/drawingml/2006/picture">
-                <pic:pic>
-                  <pic:nvPicPr>
-                    <pic:cNvPr id="0" name="image5.png"/>
-                    <pic:cNvPicPr preferRelativeResize="0"/>
-                  </pic:nvPicPr>
-                  <pic:blipFill>
-                    <a:blip r:embed="rId9"/>
-                    <a:srcRect b="0" l="0" r="0" t="0"/>
-                    <a:stretch>
-                      <a:fillRect/>
-                    </a:stretch>
-                  </pic:blipFill>
-                  <pic:spPr>
-                    <a:xfrm>
-                      <a:off x="0" y="0"/>
-                      <a:ext cx="127000" cy="185615"/>
-                    </a:xfrm>
-                    <a:prstGeom prst="rect"/>
-                    <a:ln/>
-                  </pic:spPr>
-                </pic:pic>
-              </a:graphicData>
-            </a:graphic>
-          </wp:anchor>
-        </w:drawing>
-      </w:r>
-      <w:r>
-        <w:rPr>
-          <w:rFonts w:ascii="Arial" w:cs="Arial" w:eastAsia="Arial" w:hAnsi="Arial"/>
-          <w:color w:val="282f3e"/>
-          <w:sz w:val="18"/>
-          <w:szCs w:val="18"/>
-        </w:rPr>
-        <w:drawing>
-          <wp:anchor allowOverlap="1" behindDoc="0" distB="114300" distT="114300" distL="114300" distR="114300" hidden="0" layoutInCell="1" locked="0" relativeHeight="0" simplePos="0">
-            <wp:simplePos x="0" y="0"/>
-            <wp:positionH relativeFrom="page">
-              <wp:posOffset>429895</wp:posOffset>
-            </wp:positionH>
-            <wp:positionV relativeFrom="page">
-              <wp:posOffset>1790111</wp:posOffset>
-            </wp:positionV>
-            <wp:extent cx="133106" cy="187914"/>
-            <wp:effectExtent b="0" l="0" r="0" t="0"/>
-            <wp:wrapNone/>
-            <wp:docPr id="4" name="image4.png"/>
-            <a:graphic>
-              <a:graphicData uri="http://schemas.openxmlformats.org/drawingml/2006/picture">
-                <pic:pic>
-                  <pic:nvPicPr>
-                    <pic:cNvPr id="0" name="image4.png"/>
-                    <pic:cNvPicPr preferRelativeResize="0"/>
-                  </pic:nvPicPr>
-                  <pic:blipFill>
-                    <a:blip r:embed="rId10"/>
-                    <a:srcRect b="0" l="0" r="0" t="0"/>
-                    <a:stretch>
-                      <a:fillRect/>
-                    </a:stretch>
-                  </pic:blipFill>
-                  <pic:spPr>
-                    <a:xfrm>
-                      <a:off x="0" y="0"/>
-                      <a:ext cx="133106" cy="187914"/>
-                    </a:xfrm>
-                    <a:prstGeom prst="rect"/>
-                    <a:ln/>
-                  </pic:spPr>
-                </pic:pic>
-              </a:graphicData>
-            </a:graphic>
-          </wp:anchor>
-        </w:drawing>
-      </w:r>
-      <w:r>
-        <w:rPr>
-          <w:rFonts w:ascii="Arial" w:cs="Arial" w:eastAsia="Arial" w:hAnsi="Arial"/>
-          <w:color w:val="282f3e"/>
-          <w:sz w:val="18"/>
-          <w:szCs w:val="18"/>
-        </w:rPr>
-        <w:drawing>
-          <wp:anchor allowOverlap="1" behindDoc="0" distB="114300" distT="114300" distL="114300" distR="114300" hidden="0" layoutInCell="1" locked="0" relativeHeight="0" simplePos="0">
-            <wp:simplePos x="0" y="0"/>
-            <wp:positionH relativeFrom="page">
-              <wp:posOffset>3814445</wp:posOffset>
-            </wp:positionH>
-            <wp:positionV relativeFrom="page">
-              <wp:posOffset>2339386</wp:posOffset>
-            </wp:positionV>
-            <wp:extent cx="141320" cy="188427"/>
-            <wp:effectExtent b="0" l="0" r="0" t="0"/>
-            <wp:wrapNone/>
-            <wp:docPr id="5" name="image7.png"/>
-            <a:graphic>
-              <a:graphicData uri="http://schemas.openxmlformats.org/drawingml/2006/picture">
-                <pic:pic>
-                  <pic:nvPicPr>
-                    <pic:cNvPr id="0" name="image7.png"/>
-                    <pic:cNvPicPr preferRelativeResize="0"/>
-                  </pic:nvPicPr>
-                  <pic:blipFill>
-                    <a:blip r:embed="rId11"/>
-                    <a:srcRect b="0" l="0" r="0" t="0"/>
-                    <a:stretch>
-                      <a:fillRect/>
-                    </a:stretch>
-                  </pic:blipFill>
-                  <pic:spPr>
-                    <a:xfrm>
-                      <a:off x="0" y="0"/>
-                      <a:ext cx="141320" cy="188427"/>
-                    </a:xfrm>
-                    <a:prstGeom prst="rect"/>
-                    <a:ln/>
-                  </pic:spPr>
-                </pic:pic>
-              </a:graphicData>
-            </a:graphic>
-          </wp:anchor>
-        </w:drawing>
-      </w:r>
-      <w:r>
-        <w:rPr>
-          <w:rFonts w:ascii="Arial" w:cs="Arial" w:eastAsia="Arial" w:hAnsi="Arial"/>
-          <w:color w:val="282f3e"/>
-          <w:sz w:val="18"/>
-          <w:szCs w:val="18"/>
-        </w:rPr>
-        <w:drawing>
-          <wp:anchor allowOverlap="1" behindDoc="0" distB="114300" distT="114300" distL="114300" distR="114300" hidden="0" layoutInCell="1" locked="0" relativeHeight="0" simplePos="0">
-            <wp:simplePos x="0" y="0"/>
-            <wp:positionH relativeFrom="page">
-              <wp:posOffset>3808095</wp:posOffset>
-            </wp:positionH>
-            <wp:positionV relativeFrom="page">
-              <wp:posOffset>2079625</wp:posOffset>
-            </wp:positionV>
-            <wp:extent cx="142275" cy="186736"/>
-            <wp:effectExtent b="0" l="0" r="0" t="0"/>
-            <wp:wrapNone/>
-            <wp:docPr id="7" name="image6.png"/>
-            <a:graphic>
-              <a:graphicData uri="http://schemas.openxmlformats.org/drawingml/2006/picture">
-                <pic:pic>
-                  <pic:nvPicPr>
-                    <pic:cNvPr id="0" name="image6.png"/>
-                    <pic:cNvPicPr preferRelativeResize="0"/>
-                  </pic:nvPicPr>
-                  <pic:blipFill>
-                    <a:blip r:embed="rId12"/>
-                    <a:srcRect b="0" l="0" r="0" t="0"/>
-                    <a:stretch>
-                      <a:fillRect/>
-                    </a:stretch>
-                  </pic:blipFill>
-                  <pic:spPr>
-                    <a:xfrm>
-                      <a:off x="0" y="0"/>
-                      <a:ext cx="142275" cy="186736"/>
-                    </a:xfrm>
-                    <a:prstGeom prst="rect"/>
-                    <a:ln/>
-                  </pic:spPr>
-                </pic:pic>
-              </a:graphicData>
-            </a:graphic>
-          </wp:anchor>
-        </w:drawing>
-      </w:r>
-      <w:r>
-        <w:rPr>
-          <w:rFonts w:ascii="Arial" w:cs="Arial" w:eastAsia="Arial" w:hAnsi="Arial"/>
-          <w:color w:val="282f3e"/>
-          <w:sz w:val="18"/>
-          <w:szCs w:val="18"/>
-        </w:rPr>
-        <w:drawing>
-          <wp:anchor allowOverlap="1" behindDoc="0" distB="114300" distT="114300" distL="114300" distR="114300" hidden="0" layoutInCell="1" locked="0" relativeHeight="0" simplePos="0">
-            <wp:simplePos x="0" y="0"/>
-            <wp:positionH relativeFrom="page">
-              <wp:posOffset>3808095</wp:posOffset>
-            </wp:positionH>
-            <wp:positionV relativeFrom="page">
-              <wp:posOffset>1815511</wp:posOffset>
-            </wp:positionV>
-            <wp:extent cx="140936" cy="187914"/>
-            <wp:effectExtent b="0" l="0" r="0" t="0"/>
-            <wp:wrapNone/>
-            <wp:docPr id="3" name="image3.png"/>
-            <a:graphic>
-              <a:graphicData uri="http://schemas.openxmlformats.org/drawingml/2006/picture">
-                <pic:pic>
-                  <pic:nvPicPr>
-                    <pic:cNvPr id="0" name="image3.png"/>
-                    <pic:cNvPicPr preferRelativeResize="0"/>
-                  </pic:nvPicPr>
-                  <pic:blipFill>
-                    <a:blip r:embed="rId13"/>
-                    <a:srcRect b="0" l="0" r="0" t="0"/>
-                    <a:stretch>
-                      <a:fillRect/>
-                    </a:stretch>
-                  </pic:blipFill>
-                  <pic:spPr>
-                    <a:xfrm>
-                      <a:off x="0" y="0"/>
-                      <a:ext cx="140936" cy="187914"/>
-                    </a:xfrm>
-                    <a:prstGeom prst="rect"/>
-                    <a:ln/>
-                  </pic:spPr>
-                </pic:pic>
-              </a:graphicData>
-            </a:graphic>
-          </wp:anchor>
-        </w:drawing>
-      </w:r>
       <w:r>
         <w:rPr>
           <w:rtl w:val="0"/>
@@ -5314,6 +4176,46 @@
             </w:pPr>
             <w:r>
               <w:rPr>
+                <w:rFonts w:ascii="Arial" w:cs="Arial" w:eastAsia="Arial" w:hAnsi="Arial"/>
+                <w:color w:val="282f3e"/>
+                <w:sz w:val="18"/>
+                <w:szCs w:val="18"/>
+              </w:rPr>
+              <w:drawing>
+                <wp:inline distB="114300" distT="114300" distL="114300" distR="114300">
+                  <wp:extent cx="133106" cy="187914"/>
+                  <wp:effectExtent b="0" l="0" r="0" t="0"/>
+                  <wp:docPr id="6" name="image3.png"/>
+                  <a:graphic>
+                    <a:graphicData uri="http://schemas.openxmlformats.org/drawingml/2006/picture">
+                      <pic:pic>
+                        <pic:nvPicPr>
+                          <pic:cNvPr id="0" name="image3.png"/>
+                          <pic:cNvPicPr preferRelativeResize="0"/>
+                        </pic:nvPicPr>
+                        <pic:blipFill>
+                          <a:blip r:embed="rId8"/>
+                          <a:srcRect b="0" l="0" r="0" t="0"/>
+                          <a:stretch>
+                            <a:fillRect/>
+                          </a:stretch>
+                        </pic:blipFill>
+                        <pic:spPr>
+                          <a:xfrm>
+                            <a:off x="0" y="0"/>
+                            <a:ext cx="133106" cy="187914"/>
+                          </a:xfrm>
+                          <a:prstGeom prst="rect"/>
+                          <a:ln/>
+                        </pic:spPr>
+                      </pic:pic>
+                    </a:graphicData>
+                  </a:graphic>
+                </wp:inline>
+              </w:drawing>
+            </w:r>
+            <w:r>
+              <w:rPr>
                 <w:rtl w:val="0"/>
               </w:rPr>
             </w:r>
@@ -5354,7 +4256,7 @@
                 <w:szCs w:val="18"/>
                 <w:rtl w:val="0"/>
               </w:rPr>
-              <w:t xml:space="preserve">   Observation</w:t>
+              <w:t xml:space="preserve"> Observation</w:t>
             </w:r>
           </w:p>
         </w:tc>
@@ -5387,6 +4289,46 @@
             </w:pPr>
             <w:r>
               <w:rPr>
+                <w:rFonts w:ascii="Arial" w:cs="Arial" w:eastAsia="Arial" w:hAnsi="Arial"/>
+                <w:color w:val="282f3e"/>
+                <w:sz w:val="18"/>
+                <w:szCs w:val="18"/>
+              </w:rPr>
+              <w:drawing>
+                <wp:inline distB="114300" distT="114300" distL="114300" distR="114300">
+                  <wp:extent cx="140936" cy="187914"/>
+                  <wp:effectExtent b="0" l="0" r="0" t="0"/>
+                  <wp:docPr id="4" name="image1.png"/>
+                  <a:graphic>
+                    <a:graphicData uri="http://schemas.openxmlformats.org/drawingml/2006/picture">
+                      <pic:pic>
+                        <pic:nvPicPr>
+                          <pic:cNvPr id="0" name="image1.png"/>
+                          <pic:cNvPicPr preferRelativeResize="0"/>
+                        </pic:nvPicPr>
+                        <pic:blipFill>
+                          <a:blip r:embed="rId9"/>
+                          <a:srcRect b="0" l="0" r="0" t="0"/>
+                          <a:stretch>
+                            <a:fillRect/>
+                          </a:stretch>
+                        </pic:blipFill>
+                        <pic:spPr>
+                          <a:xfrm>
+                            <a:off x="0" y="0"/>
+                            <a:ext cx="140936" cy="187914"/>
+                          </a:xfrm>
+                          <a:prstGeom prst="rect"/>
+                          <a:ln/>
+                        </pic:spPr>
+                      </pic:pic>
+                    </a:graphicData>
+                  </a:graphic>
+                </wp:inline>
+              </w:drawing>
+            </w:r>
+            <w:r>
+              <w:rPr>
                 <w:rtl w:val="0"/>
               </w:rPr>
             </w:r>
@@ -5427,7 +4369,7 @@
                 <w:szCs w:val="18"/>
                 <w:rtl w:val="0"/>
               </w:rPr>
-              <w:t xml:space="preserve">   Observation</w:t>
+              <w:t xml:space="preserve"> Observation</w:t>
             </w:r>
           </w:p>
         </w:tc>
@@ -5467,6 +4409,46 @@
             </w:pPr>
             <w:r>
               <w:rPr>
+                <w:rFonts w:ascii="Arial" w:cs="Arial" w:eastAsia="Arial" w:hAnsi="Arial"/>
+                <w:color w:val="282f3e"/>
+                <w:sz w:val="18"/>
+                <w:szCs w:val="18"/>
+              </w:rPr>
+              <w:drawing>
+                <wp:inline distB="114300" distT="114300" distL="114300" distR="114300">
+                  <wp:extent cx="127000" cy="185615"/>
+                  <wp:effectExtent b="0" l="0" r="0" t="0"/>
+                  <wp:docPr id="5" name="image5.png"/>
+                  <a:graphic>
+                    <a:graphicData uri="http://schemas.openxmlformats.org/drawingml/2006/picture">
+                      <pic:pic>
+                        <pic:nvPicPr>
+                          <pic:cNvPr id="0" name="image5.png"/>
+                          <pic:cNvPicPr preferRelativeResize="0"/>
+                        </pic:nvPicPr>
+                        <pic:blipFill>
+                          <a:blip r:embed="rId10"/>
+                          <a:srcRect b="0" l="0" r="0" t="0"/>
+                          <a:stretch>
+                            <a:fillRect/>
+                          </a:stretch>
+                        </pic:blipFill>
+                        <pic:spPr>
+                          <a:xfrm>
+                            <a:off x="0" y="0"/>
+                            <a:ext cx="127000" cy="185615"/>
+                          </a:xfrm>
+                          <a:prstGeom prst="rect"/>
+                          <a:ln/>
+                        </pic:spPr>
+                      </pic:pic>
+                    </a:graphicData>
+                  </a:graphic>
+                </wp:inline>
+              </w:drawing>
+            </w:r>
+            <w:r>
+              <w:rPr>
                 <w:rtl w:val="0"/>
               </w:rPr>
             </w:r>
@@ -5507,7 +4489,7 @@
                 <w:szCs w:val="18"/>
                 <w:rtl w:val="0"/>
               </w:rPr>
-              <w:t xml:space="preserve">   Suspicion d’infraction</w:t>
+              <w:t xml:space="preserve"> Suspicion d’infraction</w:t>
             </w:r>
           </w:p>
         </w:tc>
@@ -5540,6 +4522,46 @@
             </w:pPr>
             <w:r>
               <w:rPr>
+                <w:rFonts w:ascii="Arial" w:cs="Arial" w:eastAsia="Arial" w:hAnsi="Arial"/>
+                <w:color w:val="282f3e"/>
+                <w:sz w:val="18"/>
+                <w:szCs w:val="18"/>
+              </w:rPr>
+              <w:drawing>
+                <wp:inline distB="114300" distT="114300" distL="114300" distR="114300">
+                  <wp:extent cx="142275" cy="186736"/>
+                  <wp:effectExtent b="0" l="0" r="0" t="0"/>
+                  <wp:docPr id="7" name="image7.png"/>
+                  <a:graphic>
+                    <a:graphicData uri="http://schemas.openxmlformats.org/drawingml/2006/picture">
+                      <pic:pic>
+                        <pic:nvPicPr>
+                          <pic:cNvPr id="0" name="image7.png"/>
+                          <pic:cNvPicPr preferRelativeResize="0"/>
+                        </pic:nvPicPr>
+                        <pic:blipFill>
+                          <a:blip r:embed="rId11"/>
+                          <a:srcRect b="0" l="0" r="0" t="0"/>
+                          <a:stretch>
+                            <a:fillRect/>
+                          </a:stretch>
+                        </pic:blipFill>
+                        <pic:spPr>
+                          <a:xfrm>
+                            <a:off x="0" y="0"/>
+                            <a:ext cx="142275" cy="186736"/>
+                          </a:xfrm>
+                          <a:prstGeom prst="rect"/>
+                          <a:ln/>
+                        </pic:spPr>
+                      </pic:pic>
+                    </a:graphicData>
+                  </a:graphic>
+                </wp:inline>
+              </w:drawing>
+            </w:r>
+            <w:r>
+              <w:rPr>
                 <w:rtl w:val="0"/>
               </w:rPr>
             </w:r>
@@ -5579,7 +4601,7 @@
                 <w:szCs w:val="18"/>
                 <w:rtl w:val="0"/>
               </w:rPr>
-              <w:t xml:space="preserve">   Suspicion d’infraction</w:t>
+              <w:t xml:space="preserve"> Suspicion d’infraction</w:t>
             </w:r>
           </w:p>
         </w:tc>
@@ -5619,6 +4641,46 @@
             </w:pPr>
             <w:r>
               <w:rPr>
+                <w:rFonts w:ascii="Arial" w:cs="Arial" w:eastAsia="Arial" w:hAnsi="Arial"/>
+                <w:color w:val="282f3e"/>
+                <w:sz w:val="18"/>
+                <w:szCs w:val="18"/>
+              </w:rPr>
+              <w:drawing>
+                <wp:inline distB="114300" distT="114300" distL="114300" distR="114300">
+                  <wp:extent cx="133833" cy="188940"/>
+                  <wp:effectExtent b="0" l="0" r="0" t="0"/>
+                  <wp:docPr id="8" name="image4.png"/>
+                  <a:graphic>
+                    <a:graphicData uri="http://schemas.openxmlformats.org/drawingml/2006/picture">
+                      <pic:pic>
+                        <pic:nvPicPr>
+                          <pic:cNvPr id="0" name="image4.png"/>
+                          <pic:cNvPicPr preferRelativeResize="0"/>
+                        </pic:nvPicPr>
+                        <pic:blipFill>
+                          <a:blip r:embed="rId12"/>
+                          <a:srcRect b="0" l="0" r="0" t="0"/>
+                          <a:stretch>
+                            <a:fillRect/>
+                          </a:stretch>
+                        </pic:blipFill>
+                        <pic:spPr>
+                          <a:xfrm>
+                            <a:off x="0" y="0"/>
+                            <a:ext cx="133833" cy="188940"/>
+                          </a:xfrm>
+                          <a:prstGeom prst="rect"/>
+                          <a:ln/>
+                        </pic:spPr>
+                      </pic:pic>
+                    </a:graphicData>
+                  </a:graphic>
+                </wp:inline>
+              </w:drawing>
+            </w:r>
+            <w:r>
+              <w:rPr>
                 <w:rtl w:val="0"/>
               </w:rPr>
             </w:r>
@@ -5659,7 +4721,7 @@
                 <w:szCs w:val="18"/>
                 <w:rtl w:val="0"/>
               </w:rPr>
-              <w:t xml:space="preserve">   Rattaché à une mission</w:t>
+              <w:t xml:space="preserve">  Rattaché à une mission</w:t>
             </w:r>
           </w:p>
         </w:tc>
@@ -5692,6 +4754,46 @@
             </w:pPr>
             <w:r>
               <w:rPr>
+                <w:rFonts w:ascii="Arial" w:cs="Arial" w:eastAsia="Arial" w:hAnsi="Arial"/>
+                <w:color w:val="282f3e"/>
+                <w:sz w:val="18"/>
+                <w:szCs w:val="18"/>
+              </w:rPr>
+              <w:drawing>
+                <wp:inline distB="114300" distT="114300" distL="114300" distR="114300">
+                  <wp:extent cx="141320" cy="188427"/>
+                  <wp:effectExtent b="0" l="0" r="0" t="0"/>
+                  <wp:docPr id="3" name="image2.png"/>
+                  <a:graphic>
+                    <a:graphicData uri="http://schemas.openxmlformats.org/drawingml/2006/picture">
+                      <pic:pic>
+                        <pic:nvPicPr>
+                          <pic:cNvPr id="0" name="image2.png"/>
+                          <pic:cNvPicPr preferRelativeResize="0"/>
+                        </pic:nvPicPr>
+                        <pic:blipFill>
+                          <a:blip r:embed="rId13"/>
+                          <a:srcRect b="0" l="0" r="0" t="0"/>
+                          <a:stretch>
+                            <a:fillRect/>
+                          </a:stretch>
+                        </pic:blipFill>
+                        <pic:spPr>
+                          <a:xfrm>
+                            <a:off x="0" y="0"/>
+                            <a:ext cx="141320" cy="188427"/>
+                          </a:xfrm>
+                          <a:prstGeom prst="rect"/>
+                          <a:ln/>
+                        </pic:spPr>
+                      </pic:pic>
+                    </a:graphicData>
+                  </a:graphic>
+                </wp:inline>
+              </w:drawing>
+            </w:r>
+            <w:r>
+              <w:rPr>
                 <w:rtl w:val="0"/>
               </w:rPr>
             </w:r>
@@ -5731,7 +4833,7 @@
                 <w:szCs w:val="18"/>
                 <w:rtl w:val="0"/>
               </w:rPr>
-              <w:t xml:space="preserve">   Rattaché à une mission</w:t>
+              <w:t xml:space="preserve"> Rattaché à une mission</w:t>
             </w:r>
           </w:p>
         </w:tc>
@@ -5802,9 +4904,6 @@
           <w:szCs w:val="40"/>
         </w:rPr>
       </w:pPr>
-      <w:r>
-        <w:br w:type="page"/>
-      </w:r>
       <w:r>
         <w:rPr>
           <w:rtl w:val="0"/>
@@ -6008,80 +5107,6 @@
           <w:rtl w:val="0"/>
         </w:rPr>
         <w:t xml:space="preserve">${links}</w:t>
-      </w:r>
-    </w:p>
-    <w:p>
-      <w:pPr>
-        <w:keepNext w:val="0"/>
-        <w:keepLines w:val="0"/>
-        <w:pageBreakBefore w:val="0"/>
-        <w:widowControl w:val="0"/>
-        <w:pBdr>
-          <w:top w:space="0" w:sz="0" w:val="nil"/>
-          <w:left w:space="0" w:sz="0" w:val="nil"/>
-          <w:bottom w:space="0" w:sz="0" w:val="nil"/>
-          <w:right w:space="0" w:sz="0" w:val="nil"/>
-          <w:between w:space="0" w:sz="0" w:val="nil"/>
-        </w:pBdr>
-        <w:shd w:fill="auto" w:val="clear"/>
-        <w:spacing w:after="0" w:before="0" w:line="240" w:lineRule="auto"/>
-        <w:ind w:left="0" w:right="0" w:firstLine="0"/>
-        <w:jc w:val="left"/>
-        <w:rPr>
-          <w:rFonts w:ascii="Arial" w:cs="Arial" w:eastAsia="Arial" w:hAnsi="Arial"/>
-          <w:b w:val="0"/>
-          <w:i w:val="0"/>
-          <w:smallCaps w:val="0"/>
-          <w:strike w:val="0"/>
-          <w:color w:val="282f3e"/>
-          <w:sz w:val="26"/>
-          <w:szCs w:val="26"/>
-          <w:u w:val="none"/>
-          <w:shd w:fill="auto" w:val="clear"/>
-          <w:vertAlign w:val="baseline"/>
-        </w:rPr>
-      </w:pPr>
-      <w:r>
-        <w:rPr>
-          <w:rtl w:val="0"/>
-        </w:rPr>
-      </w:r>
-    </w:p>
-    <w:p>
-      <w:pPr>
-        <w:keepNext w:val="0"/>
-        <w:keepLines w:val="0"/>
-        <w:pageBreakBefore w:val="0"/>
-        <w:widowControl w:val="1"/>
-        <w:pBdr>
-          <w:top w:space="0" w:sz="0" w:val="nil"/>
-          <w:left w:space="0" w:sz="0" w:val="nil"/>
-          <w:bottom w:space="0" w:sz="0" w:val="nil"/>
-          <w:right w:space="0" w:sz="0" w:val="nil"/>
-          <w:between w:space="0" w:sz="0" w:val="nil"/>
-        </w:pBdr>
-        <w:shd w:fill="auto" w:val="clear"/>
-        <w:spacing w:after="0" w:before="0" w:line="240" w:lineRule="auto"/>
-        <w:ind w:left="0" w:right="0" w:firstLine="0"/>
-        <w:jc w:val="left"/>
-        <w:rPr>
-          <w:rFonts w:ascii="Arial" w:cs="Arial" w:eastAsia="Arial" w:hAnsi="Arial"/>
-          <w:b w:val="0"/>
-          <w:i w:val="0"/>
-          <w:smallCaps w:val="0"/>
-          <w:strike w:val="0"/>
-          <w:color w:val="295edb"/>
-          <w:sz w:val="21"/>
-          <w:szCs w:val="21"/>
-          <w:u w:val="single"/>
-          <w:shd w:fill="auto" w:val="clear"/>
-          <w:vertAlign w:val="baseline"/>
-        </w:rPr>
-      </w:pPr>
-      <w:r>
-        <w:rPr>
-          <w:rtl w:val="0"/>
-        </w:rPr>
       </w:r>
     </w:p>
     <w:p>

</xml_diff>

<commit_message>
[EditableBrief] fix blank page at the end of the document
</commit_message>
<xml_diff>
--- a/backend/src/main/resources/template_export_brief.docx
+++ b/backend/src/main/resources/template_export_brief.docx
@@ -251,12 +251,12 @@
               <wp:inline distB="0" distT="0" distL="0" distR="0">
                 <wp:extent cx="6738122" cy="36750"/>
                 <wp:effectExtent b="0" l="0" r="0" t="0"/>
-                <wp:docPr id="2" name="image9.png"/>
+                <wp:docPr id="2" name="image8.png"/>
                 <a:graphic>
                   <a:graphicData uri="http://schemas.openxmlformats.org/drawingml/2006/picture">
                     <pic:pic>
                       <pic:nvPicPr>
-                        <pic:cNvPr id="0" name="image9.png"/>
+                        <pic:cNvPr id="0" name="image8.png"/>
                         <pic:cNvPicPr preferRelativeResize="0"/>
                       </pic:nvPicPr>
                       <pic:blipFill>
@@ -2376,12 +2376,12 @@
                 <wp:extent cx="6738122" cy="18375"/>
                 <wp:effectExtent b="0" l="0" r="0" t="0"/>
                 <wp:wrapNone/>
-                <wp:docPr id="1" name="image8.png"/>
+                <wp:docPr id="1" name="image6.png"/>
                 <a:graphic>
                   <a:graphicData uri="http://schemas.openxmlformats.org/drawingml/2006/picture">
                     <pic:pic>
                       <pic:nvPicPr>
-                        <pic:cNvPr id="0" name="image8.png"/>
+                        <pic:cNvPr id="0" name="image6.png"/>
                         <pic:cNvPicPr preferRelativeResize="0"/>
                       </pic:nvPicPr>
                       <pic:blipFill>
@@ -2426,12 +2426,12 @@
             <wp:extent cx="923726" cy="923726"/>
             <wp:effectExtent b="0" l="0" r="0" t="0"/>
             <wp:wrapNone/>
-            <wp:docPr id="9" name="image1.jpg"/>
+            <wp:docPr id="9" name="image9.jpg"/>
             <a:graphic>
               <a:graphicData uri="http://schemas.openxmlformats.org/drawingml/2006/picture">
                 <pic:pic>
                   <pic:nvPicPr>
-                    <pic:cNvPr id="0" name="image1.jpg"/>
+                    <pic:cNvPr id="0" name="image9.jpg"/>
                     <pic:cNvPicPr preferRelativeResize="0"/>
                   </pic:nvPicPr>
                   <pic:blipFill>
@@ -3193,68 +3193,78 @@
       <w:pPr>
         <w:rPr>
           <w:rFonts w:ascii="Arial" w:cs="Arial" w:eastAsia="Arial" w:hAnsi="Arial"/>
-          <w:color w:val="515151"/>
-          <w:sz w:val="28"/>
-          <w:szCs w:val="28"/>
-        </w:rPr>
-      </w:pPr>
-      <w:r>
-        <w:rPr>
-          <w:rFonts w:ascii="Arial" w:cs="Arial" w:eastAsia="Arial" w:hAnsi="Arial"/>
           <w:color w:val="282f3e"/>
           <w:sz w:val="32"/>
           <w:szCs w:val="32"/>
-          <w:rtl w:val="0"/>
-        </w:rPr>
-        <w:t xml:space="preserve">Zones de vigilance</w:t>
-      </w:r>
-      <w:r>
-        <w:rPr>
-          <w:rFonts w:ascii="Arial" w:cs="Arial" w:eastAsia="Arial" w:hAnsi="Arial"/>
-          <w:color w:val="515151"/>
-          <w:sz w:val="28"/>
-          <w:szCs w:val="28"/>
-          <w:rtl w:val="0"/>
-        </w:rPr>
-        <w:t xml:space="preserve">   </w:t>
-      </w:r>
-      <w:r>
-        <w:rPr>
-          <w:rFonts w:ascii="Arial" w:cs="Arial" w:eastAsia="Arial" w:hAnsi="Arial"/>
-          <w:b w:val="1"/>
-          <w:color w:val="3b4559"/>
+        </w:rPr>
+      </w:pPr>
+      <w:r>
+        <w:rPr>
+          <w:rFonts w:ascii="Arial" w:cs="Arial" w:eastAsia="Arial" w:hAnsi="Arial"/>
+          <w:color w:val="282f3e"/>
+          <w:sz w:val="32"/>
+          <w:szCs w:val="32"/>
+          <w:rtl w:val="0"/>
+        </w:rPr>
+        <w:t xml:space="preserve">Activité récente</w:t>
+      </w:r>
+    </w:p>
+    <w:p>
+      <w:pPr>
+        <w:rPr>
+          <w:rFonts w:ascii="Arial" w:cs="Arial" w:eastAsia="Arial" w:hAnsi="Arial"/>
+          <w:color w:val="282f3e"/>
+          <w:sz w:val="32"/>
+          <w:szCs w:val="32"/>
+        </w:rPr>
+      </w:pPr>
+      <w:r>
+        <w:rPr>
+          <w:rtl w:val="0"/>
+        </w:rPr>
+      </w:r>
+    </w:p>
+    <w:p>
+      <w:pPr>
+        <w:rPr>
+          <w:rFonts w:ascii="Arial" w:cs="Arial" w:eastAsia="Arial" w:hAnsi="Arial"/>
+          <w:color w:val="282f3e"/>
           <w:sz w:val="16"/>
           <w:szCs w:val="16"/>
-          <w:rtl w:val="0"/>
-        </w:rPr>
-        <w:t xml:space="preserve">${totalVigilanceAreas} sélectionnées</w:t>
-      </w:r>
-      <w:r>
-        <w:rPr>
-          <w:rtl w:val="0"/>
-        </w:rPr>
-      </w:r>
-    </w:p>
-    <w:p>
-      <w:pPr>
-        <w:rPr>
-          <w:rFonts w:ascii="Arial" w:cs="Arial" w:eastAsia="Arial" w:hAnsi="Arial"/>
-          <w:b w:val="1"/>
-          <w:color w:val="3b4559"/>
+        </w:rPr>
+      </w:pPr>
+      <w:r>
+        <w:rPr>
+          <w:rFonts w:ascii="Arial" w:cs="Arial" w:eastAsia="Arial" w:hAnsi="Arial"/>
+          <w:color w:val="282f3e"/>
           <w:sz w:val="16"/>
           <w:szCs w:val="16"/>
-        </w:rPr>
-      </w:pPr>
-      <w:r>
-        <w:rPr>
-          <w:rtl w:val="0"/>
-        </w:rPr>
-      </w:r>
-    </w:p>
-    <w:p>
-      <w:pPr>
-        <w:rPr>
-          <w:rFonts w:ascii="Arial" w:cs="Arial" w:eastAsia="Arial" w:hAnsi="Arial"/>
+          <w:rtl w:val="0"/>
+        </w:rPr>
+        <w:t xml:space="preserve">${recentActivityPeriod}</w:t>
+      </w:r>
+    </w:p>
+    <w:p>
+      <w:pPr>
+        <w:rPr>
+          <w:rFonts w:ascii="Arial" w:cs="Arial" w:eastAsia="Arial" w:hAnsi="Arial"/>
+          <w:color w:val="282f3e"/>
+          <w:sz w:val="32"/>
+          <w:szCs w:val="32"/>
+        </w:rPr>
+      </w:pPr>
+      <w:r>
+        <w:rPr>
+          <w:rtl w:val="0"/>
+        </w:rPr>
+      </w:r>
+    </w:p>
+    <w:p>
+      <w:pPr>
+        <w:spacing w:line="276" w:lineRule="auto"/>
+        <w:rPr>
+          <w:rFonts w:ascii="Arial" w:cs="Arial" w:eastAsia="Arial" w:hAnsi="Arial"/>
+          <w:i w:val="1"/>
           <w:color w:val="282f3e"/>
           <w:sz w:val="18"/>
           <w:szCs w:val="18"/>
@@ -3264,23 +3274,94 @@
         <w:rPr>
           <w:rFonts w:ascii="Arial" w:cs="Arial" w:eastAsia="Arial" w:hAnsi="Arial"/>
           <w:i w:val="1"/>
-          <w:color w:val="282f3e"/>
+          <w:color w:val="1f2328"/>
           <w:sz w:val="18"/>
           <w:szCs w:val="18"/>
-          <w:rtl w:val="0"/>
-        </w:rPr>
-        <w:t xml:space="preserve">Une zone de vigilance permet d'orienter les contrôles en attirant l'attention et rappelant des informations utiles sur un endroit / une période donnés.</w:t>
-      </w:r>
-      <w:r>
-        <w:rPr>
-          <w:rtl w:val="0"/>
-        </w:rPr>
-      </w:r>
-    </w:p>
-    <w:p>
-      <w:pPr>
-        <w:rPr>
-          <w:rFonts w:ascii="Arial" w:cs="Arial" w:eastAsia="Arial" w:hAnsi="Arial"/>
+          <w:highlight w:val="white"/>
+          <w:rtl w:val="0"/>
+        </w:rPr>
+        <w:t xml:space="preserve">Les cercles représentent les actions de contrôle. Une action de contrôle est un ensemble de contrôles réalisés sur plusieurs cibles de même type, à une seule et même localisation, sur une thématique/sous thématique donnée (ex : un contrôle mouillage de 30 navires au même endroit).</w:t>
+      </w:r>
+      <w:r>
+        <w:rPr>
+          <w:rtl w:val="0"/>
+        </w:rPr>
+      </w:r>
+    </w:p>
+    <w:p>
+      <w:pPr>
+        <w:rPr>
+          <w:rFonts w:ascii="Arial" w:cs="Arial" w:eastAsia="Arial" w:hAnsi="Arial"/>
+          <w:color w:val="282f3e"/>
+          <w:sz w:val="32"/>
+          <w:szCs w:val="32"/>
+        </w:rPr>
+      </w:pPr>
+      <w:r>
+        <w:rPr>
+          <w:rtl w:val="0"/>
+        </w:rPr>
+      </w:r>
+    </w:p>
+    <w:p>
+      <w:pPr>
+        <w:rPr>
+          <w:rFonts w:ascii="Arial" w:cs="Arial" w:eastAsia="Arial" w:hAnsi="Arial"/>
+          <w:color w:val="282f3e"/>
+          <w:sz w:val="32"/>
+          <w:szCs w:val="32"/>
+        </w:rPr>
+      </w:pPr>
+      <w:r>
+        <w:br w:type="page"/>
+      </w:r>
+      <w:r>
+        <w:rPr>
+          <w:rtl w:val="0"/>
+        </w:rPr>
+      </w:r>
+    </w:p>
+    <w:p>
+      <w:pPr>
+        <w:rPr>
+          <w:rFonts w:ascii="Arial" w:cs="Arial" w:eastAsia="Arial" w:hAnsi="Arial"/>
+          <w:color w:val="282f3e"/>
+          <w:sz w:val="32"/>
+          <w:szCs w:val="32"/>
+        </w:rPr>
+      </w:pPr>
+      <w:r>
+        <w:rPr>
+          <w:rFonts w:ascii="Arial" w:cs="Arial" w:eastAsia="Arial" w:hAnsi="Arial"/>
+          <w:color w:val="282f3e"/>
+          <w:sz w:val="32"/>
+          <w:szCs w:val="32"/>
+          <w:rtl w:val="0"/>
+        </w:rPr>
+        <w:t xml:space="preserve">Unités proches</w:t>
+      </w:r>
+    </w:p>
+    <w:p>
+      <w:pPr>
+        <w:rPr>
+          <w:rFonts w:ascii="Arial" w:cs="Arial" w:eastAsia="Arial" w:hAnsi="Arial"/>
+          <w:color w:val="282f3e"/>
+          <w:sz w:val="32"/>
+          <w:szCs w:val="32"/>
+        </w:rPr>
+      </w:pPr>
+      <w:r>
+        <w:rPr>
+          <w:rtl w:val="0"/>
+        </w:rPr>
+      </w:r>
+    </w:p>
+    <w:p>
+      <w:pPr>
+        <w:spacing w:line="276" w:lineRule="auto"/>
+        <w:rPr>
+          <w:rFonts w:ascii="Arial" w:cs="Arial" w:eastAsia="Arial" w:hAnsi="Arial"/>
+          <w:i w:val="1"/>
           <w:color w:val="282f3e"/>
           <w:sz w:val="18"/>
           <w:szCs w:val="18"/>
@@ -3295,28 +3376,30 @@
           <w:szCs w:val="18"/>
           <w:rtl w:val="0"/>
         </w:rPr>
-        <w:t xml:space="preserve">Les informations consignées dans les ZV ont – contrairement aux signalements – une validité dans le temps plus longue ou récurrente.</w:t>
-      </w:r>
-      <w:r>
-        <w:rPr>
-          <w:rtl w:val="0"/>
-        </w:rPr>
-      </w:r>
-    </w:p>
-    <w:p>
-      <w:pPr>
-        <w:rPr>
-          <w:rFonts w:ascii="Arial" w:cs="Arial" w:eastAsia="Arial" w:hAnsi="Arial"/>
-          <w:b w:val="1"/>
-          <w:color w:val="3b4559"/>
-          <w:sz w:val="16"/>
-          <w:szCs w:val="16"/>
-        </w:rPr>
-      </w:pPr>
-      <w:r>
-        <w:rPr>
-          <w:rtl w:val="0"/>
-        </w:rPr>
+        <w:t xml:space="preserve">Les unités présentes sont seulement celles qui ont déclaré des actions de contrôle ou de surveillance.</w:t>
+      </w:r>
+    </w:p>
+    <w:p>
+      <w:pPr>
+        <w:spacing w:line="276" w:lineRule="auto"/>
+        <w:rPr>
+          <w:rFonts w:ascii="Arial" w:cs="Arial" w:eastAsia="Arial" w:hAnsi="Arial"/>
+          <w:i w:val="1"/>
+          <w:color w:val="282f3e"/>
+          <w:sz w:val="18"/>
+          <w:szCs w:val="18"/>
+        </w:rPr>
+      </w:pPr>
+      <w:r>
+        <w:rPr>
+          <w:rFonts w:ascii="Arial" w:cs="Arial" w:eastAsia="Arial" w:hAnsi="Arial"/>
+          <w:i w:val="1"/>
+          <w:color w:val="282f3e"/>
+          <w:sz w:val="18"/>
+          <w:szCs w:val="18"/>
+          <w:rtl w:val="0"/>
+        </w:rPr>
+        <w:t xml:space="preserve">Le décompte des actions (contrôles, infractions et PV) est uniquement ceux présents dans le périmètre de la mission, et non le nombre total effectué lors de la mission.</w:t>
       </w:r>
     </w:p>
     <w:p>
@@ -3330,331 +3413,37 @@
       </w:pPr>
       <w:r>
         <w:rPr>
-          <w:rFonts w:ascii="Arial" w:cs="Arial" w:eastAsia="Arial" w:hAnsi="Arial"/>
-          <w:sz w:val="16"/>
-          <w:szCs w:val="16"/>
-          <w:rtl w:val="0"/>
-        </w:rPr>
-        <w:t xml:space="preserve">${vigilanceAreasDetails}</w:t>
-      </w:r>
-      <w:r>
-        <w:rPr>
-          <w:rtl w:val="0"/>
-        </w:rPr>
-      </w:r>
-    </w:p>
-    <w:p>
-      <w:pPr>
-        <w:spacing w:after="240" w:before="240" w:lineRule="auto"/>
-        <w:rPr>
-          <w:rFonts w:ascii="Arial" w:cs="Arial" w:eastAsia="Arial" w:hAnsi="Arial"/>
-          <w:b w:val="1"/>
-          <w:i w:val="0"/>
-          <w:smallCaps w:val="0"/>
-          <w:strike w:val="0"/>
-          <w:color w:val="3b4559"/>
-          <w:sz w:val="16"/>
-          <w:szCs w:val="16"/>
-          <w:u w:val="none"/>
-          <w:shd w:fill="auto" w:val="clear"/>
-          <w:vertAlign w:val="baseline"/>
-        </w:rPr>
-      </w:pPr>
-      <w:r>
-        <w:rPr>
-          <w:rFonts w:ascii="Arial" w:cs="Arial" w:eastAsia="Arial" w:hAnsi="Arial"/>
-          <w:b w:val="0"/>
-          <w:i w:val="0"/>
-          <w:smallCaps w:val="0"/>
-          <w:strike w:val="0"/>
+          <w:rtl w:val="0"/>
+        </w:rPr>
+      </w:r>
+    </w:p>
+    <w:p>
+      <w:pPr>
+        <w:rPr>
+          <w:rFonts w:ascii="Arial" w:cs="Arial" w:eastAsia="Arial" w:hAnsi="Arial"/>
           <w:color w:val="282f3e"/>
           <w:sz w:val="32"/>
           <w:szCs w:val="32"/>
-          <w:u w:val="none"/>
-          <w:shd w:fill="auto" w:val="clear"/>
-          <w:vertAlign w:val="baseline"/>
-          <w:rtl w:val="0"/>
-        </w:rPr>
-        <w:t xml:space="preserve">Zones réglementaires</w:t>
-      </w:r>
-      <w:r>
-        <w:rPr>
-          <w:rFonts w:ascii="Arial" w:cs="Arial" w:eastAsia="Arial" w:hAnsi="Arial"/>
-          <w:b w:val="0"/>
-          <w:i w:val="0"/>
-          <w:smallCaps w:val="0"/>
-          <w:strike w:val="0"/>
-          <w:color w:val="515151"/>
-          <w:sz w:val="28"/>
-          <w:szCs w:val="28"/>
-          <w:u w:val="none"/>
-          <w:shd w:fill="auto" w:val="clear"/>
-          <w:vertAlign w:val="baseline"/>
-          <w:rtl w:val="0"/>
-        </w:rPr>
-        <w:t xml:space="preserve">   </w:t>
-      </w:r>
-      <w:r>
-        <w:rPr>
-          <w:rFonts w:ascii="Arial" w:cs="Arial" w:eastAsia="Arial" w:hAnsi="Arial"/>
-          <w:b w:val="1"/>
-          <w:color w:val="3b4559"/>
-          <w:sz w:val="16"/>
-          <w:szCs w:val="16"/>
-          <w:rtl w:val="0"/>
-        </w:rPr>
-        <w:t xml:space="preserve">${totalRegulatoryAreas}</w:t>
-      </w:r>
-      <w:r>
-        <w:rPr>
-          <w:rFonts w:ascii="Arial" w:cs="Arial" w:eastAsia="Arial" w:hAnsi="Arial"/>
-          <w:b w:val="1"/>
-          <w:i w:val="0"/>
-          <w:smallCaps w:val="0"/>
-          <w:strike w:val="0"/>
-          <w:color w:val="3b4559"/>
-          <w:sz w:val="16"/>
-          <w:szCs w:val="16"/>
-          <w:u w:val="none"/>
-          <w:shd w:fill="auto" w:val="clear"/>
-          <w:vertAlign w:val="baseline"/>
-          <w:rtl w:val="0"/>
-        </w:rPr>
-        <w:t xml:space="preserve"> sélectionnées</w:t>
-      </w:r>
-    </w:p>
-    <w:p>
-      <w:pPr>
-        <w:keepNext w:val="0"/>
-        <w:keepLines w:val="0"/>
-        <w:pageBreakBefore w:val="0"/>
-        <w:widowControl w:val="1"/>
-        <w:pBdr>
-          <w:top w:space="0" w:sz="0" w:val="nil"/>
-          <w:left w:space="0" w:sz="0" w:val="nil"/>
-          <w:bottom w:space="0" w:sz="0" w:val="nil"/>
-          <w:right w:space="0" w:sz="0" w:val="nil"/>
-          <w:between w:space="0" w:sz="0" w:val="nil"/>
-        </w:pBdr>
-        <w:shd w:fill="auto" w:val="clear"/>
-        <w:spacing w:after="0" w:before="0" w:line="240" w:lineRule="auto"/>
-        <w:ind w:left="0" w:right="0" w:firstLine="0"/>
-        <w:jc w:val="left"/>
-        <w:rPr>
-          <w:rFonts w:ascii="Arial" w:cs="Arial" w:eastAsia="Arial" w:hAnsi="Arial"/>
-          <w:sz w:val="16"/>
-          <w:szCs w:val="16"/>
-        </w:rPr>
-      </w:pPr>
-      <w:r>
-        <w:rPr>
-          <w:rFonts w:ascii="Arial" w:cs="Arial" w:eastAsia="Arial" w:hAnsi="Arial"/>
-          <w:sz w:val="16"/>
-          <w:szCs w:val="16"/>
-          <w:rtl w:val="0"/>
-        </w:rPr>
-        <w:t xml:space="preserve">${</w:t>
-      </w:r>
-      <w:r>
-        <w:rPr>
-          <w:rFonts w:ascii="Arial" w:cs="Arial" w:eastAsia="Arial" w:hAnsi="Arial"/>
-          <w:sz w:val="16"/>
-          <w:szCs w:val="16"/>
-          <w:rtl w:val="0"/>
-        </w:rPr>
-        <w:t xml:space="preserve">regulatoryAreasDetails</w:t>
-      </w:r>
-      <w:r>
-        <w:rPr>
-          <w:rFonts w:ascii="Arial" w:cs="Arial" w:eastAsia="Arial" w:hAnsi="Arial"/>
-          <w:sz w:val="16"/>
-          <w:szCs w:val="16"/>
-          <w:rtl w:val="0"/>
-        </w:rPr>
-        <w:t xml:space="preserve">}</w:t>
-      </w:r>
-    </w:p>
-    <w:p>
-      <w:pPr>
-        <w:keepNext w:val="0"/>
-        <w:keepLines w:val="0"/>
-        <w:pageBreakBefore w:val="0"/>
-        <w:widowControl w:val="1"/>
-        <w:pBdr>
-          <w:top w:space="0" w:sz="0" w:val="nil"/>
-          <w:left w:space="0" w:sz="0" w:val="nil"/>
-          <w:bottom w:space="0" w:sz="0" w:val="nil"/>
-          <w:right w:space="0" w:sz="0" w:val="nil"/>
-          <w:between w:space="0" w:sz="0" w:val="nil"/>
-        </w:pBdr>
-        <w:shd w:fill="auto" w:val="clear"/>
-        <w:spacing w:after="0" w:before="0" w:line="240" w:lineRule="auto"/>
-        <w:ind w:left="0" w:right="0" w:firstLine="0"/>
-        <w:jc w:val="left"/>
-        <w:rPr>
-          <w:rFonts w:ascii="Arial" w:cs="Arial" w:eastAsia="Arial" w:hAnsi="Arial"/>
-          <w:sz w:val="16"/>
-          <w:szCs w:val="16"/>
-        </w:rPr>
-      </w:pPr>
-      <w:r>
-        <w:rPr>
-          <w:rtl w:val="0"/>
-        </w:rPr>
-      </w:r>
-    </w:p>
-    <w:p>
-      <w:pPr>
-        <w:keepNext w:val="0"/>
-        <w:keepLines w:val="0"/>
-        <w:pageBreakBefore w:val="0"/>
-        <w:widowControl w:val="1"/>
-        <w:pBdr>
-          <w:top w:space="0" w:sz="0" w:val="nil"/>
-          <w:left w:space="0" w:sz="0" w:val="nil"/>
-          <w:bottom w:space="0" w:sz="0" w:val="nil"/>
-          <w:right w:space="0" w:sz="0" w:val="nil"/>
-          <w:between w:space="0" w:sz="0" w:val="nil"/>
-        </w:pBdr>
-        <w:shd w:fill="auto" w:val="clear"/>
-        <w:spacing w:after="0" w:before="0" w:line="240" w:lineRule="auto"/>
-        <w:ind w:left="0" w:right="0" w:firstLine="0"/>
-        <w:jc w:val="left"/>
-        <w:rPr>
-          <w:rFonts w:ascii="Arial" w:cs="Arial" w:eastAsia="Arial" w:hAnsi="Arial"/>
-          <w:b w:val="1"/>
-          <w:i w:val="0"/>
-          <w:smallCaps w:val="0"/>
-          <w:strike w:val="0"/>
-          <w:color w:val="3b4559"/>
-          <w:sz w:val="16"/>
-          <w:szCs w:val="16"/>
-          <w:u w:val="none"/>
-          <w:shd w:fill="auto" w:val="clear"/>
-          <w:vertAlign w:val="baseline"/>
-        </w:rPr>
-      </w:pPr>
-      <w:r>
+        </w:rPr>
+      </w:pPr>
+      <w:r>
+        <w:rPr>
+          <w:rtl w:val="0"/>
+        </w:rPr>
+      </w:r>
+    </w:p>
+    <w:p>
+      <w:pPr>
         <w:rPr>
           <w:rFonts w:ascii="Arial" w:cs="Arial" w:eastAsia="Arial" w:hAnsi="Arial"/>
           <w:color w:val="282f3e"/>
           <w:sz w:val="32"/>
           <w:szCs w:val="32"/>
-          <w:rtl w:val="0"/>
-        </w:rPr>
-        <w:t xml:space="preserve">Aires marines protégées</w:t>
-      </w:r>
-      <w:r>
-        <w:rPr>
-          <w:rFonts w:ascii="Arial" w:cs="Arial" w:eastAsia="Arial" w:hAnsi="Arial"/>
-          <w:color w:val="515151"/>
-          <w:sz w:val="28"/>
-          <w:szCs w:val="28"/>
-          <w:rtl w:val="0"/>
-        </w:rPr>
-        <w:t xml:space="preserve">   </w:t>
-      </w:r>
-      <w:r>
-        <w:rPr>
-          <w:rFonts w:ascii="Arial" w:cs="Arial" w:eastAsia="Arial" w:hAnsi="Arial"/>
-          <w:b w:val="1"/>
-          <w:color w:val="3b4559"/>
-          <w:sz w:val="16"/>
-          <w:szCs w:val="16"/>
-          <w:rtl w:val="0"/>
-        </w:rPr>
-        <w:t xml:space="preserve">${totalAmps} sélectionnées</w:t>
-      </w:r>
-      <w:r>
-        <w:rPr>
-          <w:rtl w:val="0"/>
-        </w:rPr>
-      </w:r>
-    </w:p>
-    <w:p>
-      <w:pPr>
-        <w:keepNext w:val="0"/>
-        <w:keepLines w:val="0"/>
-        <w:pageBreakBefore w:val="0"/>
-        <w:widowControl w:val="1"/>
-        <w:pBdr>
-          <w:top w:space="0" w:sz="0" w:val="nil"/>
-          <w:left w:space="0" w:sz="0" w:val="nil"/>
-          <w:bottom w:space="0" w:sz="0" w:val="nil"/>
-          <w:right w:space="0" w:sz="0" w:val="nil"/>
-          <w:between w:space="0" w:sz="0" w:val="nil"/>
-        </w:pBdr>
-        <w:shd w:fill="auto" w:val="clear"/>
-        <w:spacing w:after="0" w:before="0" w:line="240" w:lineRule="auto"/>
-        <w:ind w:left="0" w:right="0" w:firstLine="0"/>
-        <w:jc w:val="left"/>
-        <w:rPr>
-          <w:rFonts w:ascii="Arial" w:cs="Arial" w:eastAsia="Arial" w:hAnsi="Arial"/>
-          <w:b w:val="1"/>
-          <w:i w:val="0"/>
-          <w:smallCaps w:val="0"/>
-          <w:strike w:val="0"/>
-          <w:color w:val="3b4559"/>
-          <w:sz w:val="16"/>
-          <w:szCs w:val="16"/>
-          <w:u w:val="none"/>
-          <w:shd w:fill="auto" w:val="clear"/>
-          <w:vertAlign w:val="baseline"/>
-        </w:rPr>
-      </w:pPr>
-      <w:r>
-        <w:rPr>
-          <w:rtl w:val="0"/>
-        </w:rPr>
-      </w:r>
-    </w:p>
-    <w:p>
-      <w:pPr>
-        <w:rPr>
-          <w:rFonts w:ascii="Arial" w:cs="Arial" w:eastAsia="Arial" w:hAnsi="Arial"/>
-          <w:b w:val="1"/>
-          <w:color w:val="3b4559"/>
-          <w:sz w:val="16"/>
-          <w:szCs w:val="16"/>
-        </w:rPr>
-      </w:pPr>
-      <w:r>
-        <w:rPr>
-          <w:rFonts w:ascii="Arial" w:cs="Arial" w:eastAsia="Arial" w:hAnsi="Arial"/>
-          <w:sz w:val="16"/>
-          <w:szCs w:val="16"/>
-          <w:rtl w:val="0"/>
-        </w:rPr>
-        <w:t xml:space="preserve">${ampsDetails}</w:t>
-      </w:r>
-      <w:r>
-        <w:rPr>
-          <w:rtl w:val="0"/>
-        </w:rPr>
-      </w:r>
-    </w:p>
-    <w:p>
-      <w:pPr>
-        <w:rPr>
-          <w:rFonts w:ascii="Arial" w:cs="Arial" w:eastAsia="Arial" w:hAnsi="Arial"/>
-          <w:sz w:val="16"/>
-          <w:szCs w:val="16"/>
-        </w:rPr>
-      </w:pPr>
-      <w:r>
-        <w:rPr>
-          <w:rtl w:val="0"/>
-        </w:rPr>
-      </w:r>
-    </w:p>
-    <w:p>
-      <w:pPr>
-        <w:rPr>
-          <w:rFonts w:ascii="Arial" w:cs="Arial" w:eastAsia="Arial" w:hAnsi="Arial"/>
-          <w:sz w:val="16"/>
-          <w:szCs w:val="16"/>
-        </w:rPr>
-      </w:pPr>
+        </w:rPr>
+      </w:pPr>
+      <w:r>
+        <w:br w:type="page"/>
+      </w:r>
       <w:r>
         <w:rPr>
           <w:rtl w:val="0"/>
@@ -3962,12 +3751,12 @@
                 <wp:inline distB="114300" distT="114300" distL="114300" distR="114300">
                   <wp:extent cx="133106" cy="187914"/>
                   <wp:effectExtent b="0" l="0" r="0" t="0"/>
-                  <wp:docPr id="6" name="image7.png"/>
+                  <wp:docPr id="5" name="image4.png"/>
                   <a:graphic>
                     <a:graphicData uri="http://schemas.openxmlformats.org/drawingml/2006/picture">
                       <pic:pic>
                         <pic:nvPicPr>
-                          <pic:cNvPr id="0" name="image7.png"/>
+                          <pic:cNvPr id="0" name="image4.png"/>
                           <pic:cNvPicPr preferRelativeResize="0"/>
                         </pic:nvPicPr>
                         <pic:blipFill>
@@ -4085,12 +3874,12 @@
                 <wp:inline distB="114300" distT="114300" distL="114300" distR="114300">
                   <wp:extent cx="143351" cy="190500"/>
                   <wp:effectExtent b="0" l="0" r="0" t="0"/>
-                  <wp:docPr id="5" name="image4.png"/>
+                  <wp:docPr id="7" name="image5.png"/>
                   <a:graphic>
                     <a:graphicData uri="http://schemas.openxmlformats.org/drawingml/2006/picture">
                       <pic:pic>
                         <pic:nvPicPr>
-                          <pic:cNvPr id="0" name="image4.png"/>
+                          <pic:cNvPr id="0" name="image5.png"/>
                           <pic:cNvPicPr preferRelativeResize="0"/>
                         </pic:nvPicPr>
                         <pic:blipFill>
@@ -4215,12 +4004,12 @@
                 <wp:inline distB="114300" distT="114300" distL="114300" distR="114300">
                   <wp:extent cx="127000" cy="185615"/>
                   <wp:effectExtent b="0" l="0" r="0" t="0"/>
-                  <wp:docPr id="4" name="image5.png"/>
+                  <wp:docPr id="6" name="image2.png"/>
                   <a:graphic>
                     <a:graphicData uri="http://schemas.openxmlformats.org/drawingml/2006/picture">
                       <pic:pic>
                         <pic:nvPicPr>
-                          <pic:cNvPr id="0" name="image5.png"/>
+                          <pic:cNvPr id="0" name="image2.png"/>
                           <pic:cNvPicPr preferRelativeResize="0"/>
                         </pic:nvPicPr>
                         <pic:blipFill>
@@ -4338,12 +4127,12 @@
                 <wp:inline distB="114300" distT="114300" distL="114300" distR="114300">
                   <wp:extent cx="142275" cy="186736"/>
                   <wp:effectExtent b="0" l="0" r="0" t="0"/>
-                  <wp:docPr id="7" name="image3.png"/>
+                  <wp:docPr id="4" name="image1.png"/>
                   <a:graphic>
                     <a:graphicData uri="http://schemas.openxmlformats.org/drawingml/2006/picture">
                       <pic:pic>
                         <pic:nvPicPr>
-                          <pic:cNvPr id="0" name="image3.png"/>
+                          <pic:cNvPr id="0" name="image1.png"/>
                           <pic:cNvPicPr preferRelativeResize="0"/>
                         </pic:nvPicPr>
                         <pic:blipFill>
@@ -4467,12 +4256,12 @@
                 <wp:inline distB="114300" distT="114300" distL="114300" distR="114300">
                   <wp:extent cx="133833" cy="188940"/>
                   <wp:effectExtent b="0" l="0" r="0" t="0"/>
-                  <wp:docPr id="8" name="image6.png"/>
+                  <wp:docPr id="3" name="image3.png"/>
                   <a:graphic>
                     <a:graphicData uri="http://schemas.openxmlformats.org/drawingml/2006/picture">
                       <pic:pic>
                         <pic:nvPicPr>
-                          <pic:cNvPr id="0" name="image6.png"/>
+                          <pic:cNvPr id="0" name="image3.png"/>
                           <pic:cNvPicPr preferRelativeResize="0"/>
                         </pic:nvPicPr>
                         <pic:blipFill>
@@ -4590,12 +4379,12 @@
                 <wp:inline distB="114300" distT="114300" distL="114300" distR="114300">
                   <wp:extent cx="141320" cy="188427"/>
                   <wp:effectExtent b="0" l="0" r="0" t="0"/>
-                  <wp:docPr id="3" name="image2.png"/>
+                  <wp:docPr id="8" name="image7.png"/>
                   <a:graphic>
                     <a:graphicData uri="http://schemas.openxmlformats.org/drawingml/2006/picture">
                       <pic:pic>
                         <pic:nvPicPr>
-                          <pic:cNvPr id="0" name="image2.png"/>
+                          <pic:cNvPr id="0" name="image7.png"/>
                           <pic:cNvPicPr preferRelativeResize="0"/>
                         </pic:nvPicPr>
                         <pic:blipFill>
@@ -4685,88 +4474,290 @@
       <w:pPr>
         <w:rPr>
           <w:rFonts w:ascii="Arial" w:cs="Arial" w:eastAsia="Arial" w:hAnsi="Arial"/>
-          <w:b w:val="1"/>
-          <w:color w:val="282f3e"/>
-          <w:sz w:val="40"/>
-          <w:szCs w:val="40"/>
-        </w:rPr>
-      </w:pPr>
-      <w:r>
-        <w:rPr>
-          <w:rFonts w:ascii="Arial" w:cs="Arial" w:eastAsia="Arial" w:hAnsi="Arial"/>
           <w:color w:val="282f3e"/>
           <w:sz w:val="16"/>
           <w:szCs w:val="16"/>
+        </w:rPr>
+      </w:pPr>
+      <w:r>
+        <w:rPr>
+          <w:rFonts w:ascii="Arial" w:cs="Arial" w:eastAsia="Arial" w:hAnsi="Arial"/>
+          <w:color w:val="282f3e"/>
+          <w:sz w:val="16"/>
+          <w:szCs w:val="16"/>
           <w:rtl w:val="0"/>
         </w:rPr>
         <w:t xml:space="preserve">${reportingsDetails}</w:t>
       </w:r>
-      <w:r>
-        <w:rPr>
-          <w:rtl w:val="0"/>
-        </w:rPr>
-      </w:r>
-    </w:p>
-    <w:p>
-      <w:pPr>
-        <w:keepNext w:val="0"/>
-        <w:keepLines w:val="0"/>
-        <w:widowControl w:val="1"/>
-        <w:pBdr>
-          <w:top w:space="0" w:sz="0" w:val="nil"/>
-          <w:left w:space="0" w:sz="0" w:val="nil"/>
-          <w:bottom w:space="0" w:sz="0" w:val="nil"/>
-          <w:right w:space="0" w:sz="0" w:val="nil"/>
-          <w:between w:space="0" w:sz="0" w:val="nil"/>
-        </w:pBdr>
-        <w:shd w:fill="auto" w:val="clear"/>
-        <w:spacing w:after="0" w:before="0" w:line="240" w:lineRule="auto"/>
-        <w:ind w:left="0" w:right="0" w:firstLine="0"/>
-        <w:jc w:val="left"/>
+    </w:p>
+    <w:p>
+      <w:pPr>
+        <w:rPr>
+          <w:rFonts w:ascii="Arial" w:cs="Arial" w:eastAsia="Arial" w:hAnsi="Arial"/>
+          <w:color w:val="282f3e"/>
+          <w:sz w:val="16"/>
+          <w:szCs w:val="16"/>
+        </w:rPr>
+      </w:pPr>
+      <w:r>
+        <w:rPr>
+          <w:rtl w:val="0"/>
+        </w:rPr>
+      </w:r>
+    </w:p>
+    <w:p>
+      <w:pPr>
+        <w:rPr>
+          <w:rFonts w:ascii="Arial" w:cs="Arial" w:eastAsia="Arial" w:hAnsi="Arial"/>
+          <w:color w:val="282f3e"/>
+          <w:sz w:val="32"/>
+          <w:szCs w:val="32"/>
+        </w:rPr>
+      </w:pPr>
+      <w:r>
+        <w:br w:type="page"/>
+      </w:r>
+      <w:r>
+        <w:rPr>
+          <w:rtl w:val="0"/>
+        </w:rPr>
+      </w:r>
+    </w:p>
+    <w:p>
+      <w:pPr>
+        <w:rPr>
+          <w:rFonts w:ascii="Arial" w:cs="Arial" w:eastAsia="Arial" w:hAnsi="Arial"/>
+          <w:color w:val="515151"/>
+          <w:sz w:val="28"/>
+          <w:szCs w:val="28"/>
+        </w:rPr>
+      </w:pPr>
+      <w:r>
+        <w:rPr>
+          <w:rFonts w:ascii="Arial" w:cs="Arial" w:eastAsia="Arial" w:hAnsi="Arial"/>
+          <w:color w:val="282f3e"/>
+          <w:sz w:val="32"/>
+          <w:szCs w:val="32"/>
+          <w:rtl w:val="0"/>
+        </w:rPr>
+        <w:t xml:space="preserve">Zones de vigilance</w:t>
+      </w:r>
+      <w:r>
+        <w:rPr>
+          <w:rFonts w:ascii="Arial" w:cs="Arial" w:eastAsia="Arial" w:hAnsi="Arial"/>
+          <w:color w:val="515151"/>
+          <w:sz w:val="28"/>
+          <w:szCs w:val="28"/>
+          <w:rtl w:val="0"/>
+        </w:rPr>
+        <w:t xml:space="preserve">   </w:t>
+      </w:r>
+      <w:r>
         <w:rPr>
           <w:rFonts w:ascii="Arial" w:cs="Arial" w:eastAsia="Arial" w:hAnsi="Arial"/>
           <w:b w:val="1"/>
-          <w:color w:val="282f3e"/>
-          <w:sz w:val="40"/>
-          <w:szCs w:val="40"/>
-        </w:rPr>
-      </w:pPr>
-      <w:r>
-        <w:rPr>
-          <w:rtl w:val="0"/>
-        </w:rPr>
-      </w:r>
-    </w:p>
-    <w:p>
-      <w:pPr>
-        <w:keepNext w:val="0"/>
-        <w:keepLines w:val="0"/>
-        <w:widowControl w:val="1"/>
-        <w:pBdr>
-          <w:top w:space="0" w:sz="0" w:val="nil"/>
-          <w:left w:space="0" w:sz="0" w:val="nil"/>
-          <w:bottom w:space="0" w:sz="0" w:val="nil"/>
-          <w:right w:space="0" w:sz="0" w:val="nil"/>
-          <w:between w:space="0" w:sz="0" w:val="nil"/>
-        </w:pBdr>
-        <w:shd w:fill="auto" w:val="clear"/>
-        <w:spacing w:after="0" w:before="0" w:line="240" w:lineRule="auto"/>
-        <w:ind w:left="0" w:right="0" w:firstLine="0"/>
-        <w:jc w:val="left"/>
+          <w:color w:val="3b4559"/>
+          <w:sz w:val="16"/>
+          <w:szCs w:val="16"/>
+          <w:rtl w:val="0"/>
+        </w:rPr>
+        <w:t xml:space="preserve">${totalVigilanceAreas} sélectionnées</w:t>
+      </w:r>
+      <w:r>
+        <w:rPr>
+          <w:rtl w:val="0"/>
+        </w:rPr>
+      </w:r>
+    </w:p>
+    <w:p>
+      <w:pPr>
+        <w:rPr>
+          <w:rFonts w:ascii="Arial" w:cs="Arial" w:eastAsia="Arial" w:hAnsi="Arial"/>
+          <w:b w:val="1"/>
+          <w:color w:val="3b4559"/>
+          <w:sz w:val="16"/>
+          <w:szCs w:val="16"/>
+        </w:rPr>
+      </w:pPr>
+      <w:r>
+        <w:rPr>
+          <w:rtl w:val="0"/>
+        </w:rPr>
+      </w:r>
+    </w:p>
+    <w:p>
+      <w:pPr>
+        <w:rPr>
+          <w:rFonts w:ascii="Arial" w:cs="Arial" w:eastAsia="Arial" w:hAnsi="Arial"/>
+          <w:color w:val="282f3e"/>
+          <w:sz w:val="18"/>
+          <w:szCs w:val="18"/>
+        </w:rPr>
+      </w:pPr>
+      <w:r>
+        <w:rPr>
+          <w:rFonts w:ascii="Arial" w:cs="Arial" w:eastAsia="Arial" w:hAnsi="Arial"/>
+          <w:i w:val="1"/>
+          <w:color w:val="282f3e"/>
+          <w:sz w:val="18"/>
+          <w:szCs w:val="18"/>
+          <w:rtl w:val="0"/>
+        </w:rPr>
+        <w:t xml:space="preserve">Une zone de vigilance permet d'orienter les contrôles en attirant l'attention et rappelant des informations utiles sur un endroit / une période donnés.</w:t>
+      </w:r>
+      <w:r>
+        <w:rPr>
+          <w:rtl w:val="0"/>
+        </w:rPr>
+      </w:r>
+    </w:p>
+    <w:p>
+      <w:pPr>
+        <w:rPr>
+          <w:rFonts w:ascii="Arial" w:cs="Arial" w:eastAsia="Arial" w:hAnsi="Arial"/>
+          <w:color w:val="282f3e"/>
+          <w:sz w:val="18"/>
+          <w:szCs w:val="18"/>
+        </w:rPr>
+      </w:pPr>
+      <w:r>
+        <w:rPr>
+          <w:rFonts w:ascii="Arial" w:cs="Arial" w:eastAsia="Arial" w:hAnsi="Arial"/>
+          <w:i w:val="1"/>
+          <w:color w:val="282f3e"/>
+          <w:sz w:val="18"/>
+          <w:szCs w:val="18"/>
+          <w:rtl w:val="0"/>
+        </w:rPr>
+        <w:t xml:space="preserve">Les informations consignées dans les ZV ont – contrairement aux signalements – une validité dans le temps plus longue ou récurrente.</w:t>
+      </w:r>
+      <w:r>
+        <w:rPr>
+          <w:rtl w:val="0"/>
+        </w:rPr>
+      </w:r>
+    </w:p>
+    <w:p>
+      <w:pPr>
+        <w:rPr>
+          <w:rFonts w:ascii="Arial" w:cs="Arial" w:eastAsia="Arial" w:hAnsi="Arial"/>
+          <w:b w:val="1"/>
+          <w:color w:val="3b4559"/>
+          <w:sz w:val="16"/>
+          <w:szCs w:val="16"/>
+        </w:rPr>
+      </w:pPr>
+      <w:r>
+        <w:rPr>
+          <w:rtl w:val="0"/>
+        </w:rPr>
+      </w:r>
+    </w:p>
+    <w:p>
+      <w:pPr>
+        <w:rPr>
+          <w:rFonts w:ascii="Arial" w:cs="Arial" w:eastAsia="Arial" w:hAnsi="Arial"/>
+          <w:color w:val="282f3e"/>
+          <w:sz w:val="32"/>
+          <w:szCs w:val="32"/>
+        </w:rPr>
+      </w:pPr>
+      <w:r>
+        <w:rPr>
+          <w:rFonts w:ascii="Arial" w:cs="Arial" w:eastAsia="Arial" w:hAnsi="Arial"/>
+          <w:sz w:val="16"/>
+          <w:szCs w:val="16"/>
+          <w:rtl w:val="0"/>
+        </w:rPr>
+        <w:t xml:space="preserve">${vigilanceAreasDetails}</w:t>
+      </w:r>
+      <w:r>
+        <w:rPr>
+          <w:rtl w:val="0"/>
+        </w:rPr>
+      </w:r>
+    </w:p>
+    <w:p>
+      <w:pPr>
+        <w:spacing w:after="240" w:before="240" w:lineRule="auto"/>
+        <w:rPr>
+          <w:rFonts w:ascii="Arial" w:cs="Arial" w:eastAsia="Arial" w:hAnsi="Arial"/>
+          <w:color w:val="282f3e"/>
+          <w:sz w:val="32"/>
+          <w:szCs w:val="32"/>
+        </w:rPr>
+      </w:pPr>
+      <w:r>
+        <w:br w:type="page"/>
+      </w:r>
+      <w:r>
+        <w:rPr>
+          <w:rtl w:val="0"/>
+        </w:rPr>
+      </w:r>
+    </w:p>
+    <w:p>
+      <w:pPr>
+        <w:spacing w:after="240" w:before="240" w:lineRule="auto"/>
         <w:rPr>
           <w:rFonts w:ascii="Arial" w:cs="Arial" w:eastAsia="Arial" w:hAnsi="Arial"/>
           <w:b w:val="1"/>
           <w:i w:val="0"/>
           <w:smallCaps w:val="0"/>
           <w:strike w:val="0"/>
-          <w:color w:val="282f3e"/>
-          <w:sz w:val="40"/>
-          <w:szCs w:val="40"/>
+          <w:color w:val="3b4559"/>
+          <w:sz w:val="16"/>
+          <w:szCs w:val="16"/>
           <w:u w:val="none"/>
           <w:shd w:fill="auto" w:val="clear"/>
           <w:vertAlign w:val="baseline"/>
         </w:rPr>
       </w:pPr>
+      <w:r>
+        <w:rPr>
+          <w:rFonts w:ascii="Arial" w:cs="Arial" w:eastAsia="Arial" w:hAnsi="Arial"/>
+          <w:b w:val="0"/>
+          <w:i w:val="0"/>
+          <w:smallCaps w:val="0"/>
+          <w:strike w:val="0"/>
+          <w:color w:val="282f3e"/>
+          <w:sz w:val="32"/>
+          <w:szCs w:val="32"/>
+          <w:u w:val="none"/>
+          <w:shd w:fill="auto" w:val="clear"/>
+          <w:vertAlign w:val="baseline"/>
+          <w:rtl w:val="0"/>
+        </w:rPr>
+        <w:t xml:space="preserve">Zones réglementaires</w:t>
+      </w:r>
+      <w:r>
+        <w:rPr>
+          <w:rFonts w:ascii="Arial" w:cs="Arial" w:eastAsia="Arial" w:hAnsi="Arial"/>
+          <w:b w:val="0"/>
+          <w:i w:val="0"/>
+          <w:smallCaps w:val="0"/>
+          <w:strike w:val="0"/>
+          <w:color w:val="515151"/>
+          <w:sz w:val="28"/>
+          <w:szCs w:val="28"/>
+          <w:u w:val="none"/>
+          <w:shd w:fill="auto" w:val="clear"/>
+          <w:vertAlign w:val="baseline"/>
+          <w:rtl w:val="0"/>
+        </w:rPr>
+        <w:t xml:space="preserve">   </w:t>
+      </w:r>
+      <w:r>
+        <w:rPr>
+          <w:rFonts w:ascii="Arial" w:cs="Arial" w:eastAsia="Arial" w:hAnsi="Arial"/>
+          <w:b w:val="1"/>
+          <w:color w:val="3b4559"/>
+          <w:sz w:val="16"/>
+          <w:szCs w:val="16"/>
+          <w:rtl w:val="0"/>
+        </w:rPr>
+        <w:t xml:space="preserve">${totalRegulatoryAreas}</w:t>
+      </w:r>
       <w:r>
         <w:rPr>
           <w:rFonts w:ascii="Arial" w:cs="Arial" w:eastAsia="Arial" w:hAnsi="Arial"/>
@@ -4774,15 +4765,15 @@
           <w:i w:val="0"/>
           <w:smallCaps w:val="0"/>
           <w:strike w:val="0"/>
-          <w:color w:val="282f3e"/>
-          <w:sz w:val="40"/>
-          <w:szCs w:val="40"/>
+          <w:color w:val="3b4559"/>
+          <w:sz w:val="16"/>
+          <w:szCs w:val="16"/>
           <w:u w:val="none"/>
           <w:shd w:fill="auto" w:val="clear"/>
           <w:vertAlign w:val="baseline"/>
           <w:rtl w:val="0"/>
         </w:rPr>
-        <w:t xml:space="preserve">Pièces jointes</w:t>
+        <w:t xml:space="preserve"> sélectionnées</w:t>
       </w:r>
     </w:p>
     <w:p>
@@ -4804,6 +4795,327 @@
         <w:jc w:val="left"/>
         <w:rPr>
           <w:rFonts w:ascii="Arial" w:cs="Arial" w:eastAsia="Arial" w:hAnsi="Arial"/>
+          <w:sz w:val="16"/>
+          <w:szCs w:val="16"/>
+        </w:rPr>
+      </w:pPr>
+      <w:r>
+        <w:rPr>
+          <w:rFonts w:ascii="Arial" w:cs="Arial" w:eastAsia="Arial" w:hAnsi="Arial"/>
+          <w:sz w:val="16"/>
+          <w:szCs w:val="16"/>
+          <w:rtl w:val="0"/>
+        </w:rPr>
+        <w:t xml:space="preserve">${</w:t>
+      </w:r>
+      <w:r>
+        <w:rPr>
+          <w:rFonts w:ascii="Arial" w:cs="Arial" w:eastAsia="Arial" w:hAnsi="Arial"/>
+          <w:sz w:val="16"/>
+          <w:szCs w:val="16"/>
+          <w:rtl w:val="0"/>
+        </w:rPr>
+        <w:t xml:space="preserve">regulatoryAreasDetails</w:t>
+      </w:r>
+      <w:r>
+        <w:rPr>
+          <w:rFonts w:ascii="Arial" w:cs="Arial" w:eastAsia="Arial" w:hAnsi="Arial"/>
+          <w:sz w:val="16"/>
+          <w:szCs w:val="16"/>
+          <w:rtl w:val="0"/>
+        </w:rPr>
+        <w:t xml:space="preserve">}</w:t>
+      </w:r>
+    </w:p>
+    <w:p>
+      <w:pPr>
+        <w:keepNext w:val="0"/>
+        <w:keepLines w:val="0"/>
+        <w:pageBreakBefore w:val="0"/>
+        <w:widowControl w:val="1"/>
+        <w:pBdr>
+          <w:top w:space="0" w:sz="0" w:val="nil"/>
+          <w:left w:space="0" w:sz="0" w:val="nil"/>
+          <w:bottom w:space="0" w:sz="0" w:val="nil"/>
+          <w:right w:space="0" w:sz="0" w:val="nil"/>
+          <w:between w:space="0" w:sz="0" w:val="nil"/>
+        </w:pBdr>
+        <w:shd w:fill="auto" w:val="clear"/>
+        <w:spacing w:after="0" w:before="0" w:line="240" w:lineRule="auto"/>
+        <w:ind w:left="0" w:right="0" w:firstLine="0"/>
+        <w:jc w:val="left"/>
+        <w:rPr>
+          <w:rFonts w:ascii="Arial" w:cs="Arial" w:eastAsia="Arial" w:hAnsi="Arial"/>
+          <w:sz w:val="16"/>
+          <w:szCs w:val="16"/>
+        </w:rPr>
+      </w:pPr>
+      <w:r>
+        <w:rPr>
+          <w:rtl w:val="0"/>
+        </w:rPr>
+      </w:r>
+    </w:p>
+    <w:p>
+      <w:pPr>
+        <w:keepNext w:val="0"/>
+        <w:keepLines w:val="0"/>
+        <w:pageBreakBefore w:val="0"/>
+        <w:widowControl w:val="1"/>
+        <w:pBdr>
+          <w:top w:space="0" w:sz="0" w:val="nil"/>
+          <w:left w:space="0" w:sz="0" w:val="nil"/>
+          <w:bottom w:space="0" w:sz="0" w:val="nil"/>
+          <w:right w:space="0" w:sz="0" w:val="nil"/>
+          <w:between w:space="0" w:sz="0" w:val="nil"/>
+        </w:pBdr>
+        <w:shd w:fill="auto" w:val="clear"/>
+        <w:spacing w:after="0" w:before="0" w:line="240" w:lineRule="auto"/>
+        <w:ind w:left="0" w:right="0" w:firstLine="0"/>
+        <w:jc w:val="left"/>
+        <w:rPr>
+          <w:rFonts w:ascii="Arial" w:cs="Arial" w:eastAsia="Arial" w:hAnsi="Arial"/>
+          <w:color w:val="282f3e"/>
+          <w:sz w:val="32"/>
+          <w:szCs w:val="32"/>
+        </w:rPr>
+      </w:pPr>
+      <w:r>
+        <w:br w:type="page"/>
+      </w:r>
+      <w:r>
+        <w:rPr>
+          <w:rtl w:val="0"/>
+        </w:rPr>
+      </w:r>
+    </w:p>
+    <w:p>
+      <w:pPr>
+        <w:keepNext w:val="0"/>
+        <w:keepLines w:val="0"/>
+        <w:pageBreakBefore w:val="0"/>
+        <w:widowControl w:val="1"/>
+        <w:pBdr>
+          <w:top w:space="0" w:sz="0" w:val="nil"/>
+          <w:left w:space="0" w:sz="0" w:val="nil"/>
+          <w:bottom w:space="0" w:sz="0" w:val="nil"/>
+          <w:right w:space="0" w:sz="0" w:val="nil"/>
+          <w:between w:space="0" w:sz="0" w:val="nil"/>
+        </w:pBdr>
+        <w:shd w:fill="auto" w:val="clear"/>
+        <w:spacing w:after="0" w:before="0" w:line="240" w:lineRule="auto"/>
+        <w:ind w:left="0" w:right="0" w:firstLine="0"/>
+        <w:jc w:val="left"/>
+        <w:rPr>
+          <w:rFonts w:ascii="Arial" w:cs="Arial" w:eastAsia="Arial" w:hAnsi="Arial"/>
+          <w:b w:val="1"/>
+          <w:i w:val="0"/>
+          <w:smallCaps w:val="0"/>
+          <w:strike w:val="0"/>
+          <w:color w:val="3b4559"/>
+          <w:sz w:val="16"/>
+          <w:szCs w:val="16"/>
+          <w:u w:val="none"/>
+          <w:shd w:fill="auto" w:val="clear"/>
+          <w:vertAlign w:val="baseline"/>
+        </w:rPr>
+      </w:pPr>
+      <w:r>
+        <w:rPr>
+          <w:rFonts w:ascii="Arial" w:cs="Arial" w:eastAsia="Arial" w:hAnsi="Arial"/>
+          <w:color w:val="282f3e"/>
+          <w:sz w:val="32"/>
+          <w:szCs w:val="32"/>
+          <w:rtl w:val="0"/>
+        </w:rPr>
+        <w:t xml:space="preserve">Aires marines protégées</w:t>
+      </w:r>
+      <w:r>
+        <w:rPr>
+          <w:rFonts w:ascii="Arial" w:cs="Arial" w:eastAsia="Arial" w:hAnsi="Arial"/>
+          <w:color w:val="515151"/>
+          <w:sz w:val="28"/>
+          <w:szCs w:val="28"/>
+          <w:rtl w:val="0"/>
+        </w:rPr>
+        <w:t xml:space="preserve">   </w:t>
+      </w:r>
+      <w:r>
+        <w:rPr>
+          <w:rFonts w:ascii="Arial" w:cs="Arial" w:eastAsia="Arial" w:hAnsi="Arial"/>
+          <w:b w:val="1"/>
+          <w:color w:val="3b4559"/>
+          <w:sz w:val="16"/>
+          <w:szCs w:val="16"/>
+          <w:rtl w:val="0"/>
+        </w:rPr>
+        <w:t xml:space="preserve">${totalAmps} sélectionnées</w:t>
+      </w:r>
+      <w:r>
+        <w:rPr>
+          <w:rtl w:val="0"/>
+        </w:rPr>
+      </w:r>
+    </w:p>
+    <w:p>
+      <w:pPr>
+        <w:keepNext w:val="0"/>
+        <w:keepLines w:val="0"/>
+        <w:pageBreakBefore w:val="0"/>
+        <w:widowControl w:val="1"/>
+        <w:pBdr>
+          <w:top w:space="0" w:sz="0" w:val="nil"/>
+          <w:left w:space="0" w:sz="0" w:val="nil"/>
+          <w:bottom w:space="0" w:sz="0" w:val="nil"/>
+          <w:right w:space="0" w:sz="0" w:val="nil"/>
+          <w:between w:space="0" w:sz="0" w:val="nil"/>
+        </w:pBdr>
+        <w:shd w:fill="auto" w:val="clear"/>
+        <w:spacing w:after="0" w:before="0" w:line="240" w:lineRule="auto"/>
+        <w:ind w:left="0" w:right="0" w:firstLine="0"/>
+        <w:jc w:val="left"/>
+        <w:rPr>
+          <w:rFonts w:ascii="Arial" w:cs="Arial" w:eastAsia="Arial" w:hAnsi="Arial"/>
+          <w:b w:val="1"/>
+          <w:i w:val="0"/>
+          <w:smallCaps w:val="0"/>
+          <w:strike w:val="0"/>
+          <w:color w:val="3b4559"/>
+          <w:sz w:val="16"/>
+          <w:szCs w:val="16"/>
+          <w:u w:val="none"/>
+          <w:shd w:fill="auto" w:val="clear"/>
+          <w:vertAlign w:val="baseline"/>
+        </w:rPr>
+      </w:pPr>
+      <w:r>
+        <w:rPr>
+          <w:rtl w:val="0"/>
+        </w:rPr>
+      </w:r>
+    </w:p>
+    <w:p>
+      <w:pPr>
+        <w:rPr>
+          <w:rFonts w:ascii="Arial" w:cs="Arial" w:eastAsia="Arial" w:hAnsi="Arial"/>
+          <w:b w:val="1"/>
+          <w:color w:val="282f3e"/>
+          <w:sz w:val="40"/>
+          <w:szCs w:val="40"/>
+        </w:rPr>
+      </w:pPr>
+      <w:r>
+        <w:rPr>
+          <w:rFonts w:ascii="Arial" w:cs="Arial" w:eastAsia="Arial" w:hAnsi="Arial"/>
+          <w:sz w:val="16"/>
+          <w:szCs w:val="16"/>
+          <w:rtl w:val="0"/>
+        </w:rPr>
+        <w:t xml:space="preserve">${ampsDetails}</w:t>
+      </w:r>
+      <w:r>
+        <w:rPr>
+          <w:rtl w:val="0"/>
+        </w:rPr>
+      </w:r>
+    </w:p>
+    <w:p>
+      <w:pPr>
+        <w:keepNext w:val="0"/>
+        <w:keepLines w:val="0"/>
+        <w:widowControl w:val="1"/>
+        <w:pBdr>
+          <w:top w:space="0" w:sz="0" w:val="nil"/>
+          <w:left w:space="0" w:sz="0" w:val="nil"/>
+          <w:bottom w:space="0" w:sz="0" w:val="nil"/>
+          <w:right w:space="0" w:sz="0" w:val="nil"/>
+          <w:between w:space="0" w:sz="0" w:val="nil"/>
+        </w:pBdr>
+        <w:shd w:fill="auto" w:val="clear"/>
+        <w:spacing w:after="0" w:before="0" w:line="240" w:lineRule="auto"/>
+        <w:ind w:left="0" w:right="0" w:firstLine="0"/>
+        <w:jc w:val="left"/>
+        <w:rPr>
+          <w:rFonts w:ascii="Arial" w:cs="Arial" w:eastAsia="Arial" w:hAnsi="Arial"/>
+          <w:b w:val="1"/>
+          <w:color w:val="282f3e"/>
+          <w:sz w:val="40"/>
+          <w:szCs w:val="40"/>
+        </w:rPr>
+      </w:pPr>
+      <w:r>
+        <w:rPr>
+          <w:rtl w:val="0"/>
+        </w:rPr>
+      </w:r>
+    </w:p>
+    <w:p>
+      <w:pPr>
+        <w:keepNext w:val="0"/>
+        <w:keepLines w:val="0"/>
+        <w:widowControl w:val="1"/>
+        <w:pBdr>
+          <w:top w:space="0" w:sz="0" w:val="nil"/>
+          <w:left w:space="0" w:sz="0" w:val="nil"/>
+          <w:bottom w:space="0" w:sz="0" w:val="nil"/>
+          <w:right w:space="0" w:sz="0" w:val="nil"/>
+          <w:between w:space="0" w:sz="0" w:val="nil"/>
+        </w:pBdr>
+        <w:shd w:fill="auto" w:val="clear"/>
+        <w:spacing w:after="0" w:before="0" w:line="240" w:lineRule="auto"/>
+        <w:ind w:left="0" w:right="0" w:firstLine="0"/>
+        <w:jc w:val="left"/>
+        <w:rPr>
+          <w:rFonts w:ascii="Arial" w:cs="Arial" w:eastAsia="Arial" w:hAnsi="Arial"/>
+          <w:b w:val="1"/>
+          <w:i w:val="0"/>
+          <w:smallCaps w:val="0"/>
+          <w:strike w:val="0"/>
+          <w:color w:val="282f3e"/>
+          <w:sz w:val="40"/>
+          <w:szCs w:val="40"/>
+          <w:u w:val="none"/>
+          <w:shd w:fill="auto" w:val="clear"/>
+          <w:vertAlign w:val="baseline"/>
+        </w:rPr>
+      </w:pPr>
+      <w:r>
+        <w:rPr>
+          <w:rFonts w:ascii="Arial" w:cs="Arial" w:eastAsia="Arial" w:hAnsi="Arial"/>
+          <w:b w:val="1"/>
+          <w:i w:val="0"/>
+          <w:smallCaps w:val="0"/>
+          <w:strike w:val="0"/>
+          <w:color w:val="282f3e"/>
+          <w:sz w:val="40"/>
+          <w:szCs w:val="40"/>
+          <w:u w:val="none"/>
+          <w:shd w:fill="auto" w:val="clear"/>
+          <w:vertAlign w:val="baseline"/>
+          <w:rtl w:val="0"/>
+        </w:rPr>
+        <w:t xml:space="preserve">Pièces jointes</w:t>
+      </w:r>
+    </w:p>
+    <w:p>
+      <w:pPr>
+        <w:keepNext w:val="0"/>
+        <w:keepLines w:val="0"/>
+        <w:pageBreakBefore w:val="0"/>
+        <w:widowControl w:val="1"/>
+        <w:pBdr>
+          <w:top w:space="0" w:sz="0" w:val="nil"/>
+          <w:left w:space="0" w:sz="0" w:val="nil"/>
+          <w:bottom w:space="0" w:sz="0" w:val="nil"/>
+          <w:right w:space="0" w:sz="0" w:val="nil"/>
+          <w:between w:space="0" w:sz="0" w:val="nil"/>
+        </w:pBdr>
+        <w:shd w:fill="auto" w:val="clear"/>
+        <w:spacing w:after="0" w:before="0" w:line="240" w:lineRule="auto"/>
+        <w:ind w:left="0" w:right="0" w:firstLine="0"/>
+        <w:jc w:val="left"/>
+        <w:rPr>
+          <w:rFonts w:ascii="Arial" w:cs="Arial" w:eastAsia="Arial" w:hAnsi="Arial"/>
           <w:b w:val="1"/>
           <w:i w:val="0"/>
           <w:smallCaps w:val="0"/>
@@ -5155,53 +5467,6 @@
           <w:smallCaps w:val="0"/>
           <w:strike w:val="0"/>
           <w:color w:val="3b4559"/>
-          <w:sz w:val="16"/>
-          <w:szCs w:val="16"/>
-          <w:u w:val="none"/>
-          <w:shd w:fill="auto" w:val="clear"/>
-          <w:vertAlign w:val="baseline"/>
-        </w:rPr>
-      </w:pPr>
-      <w:r>
-        <w:rPr>
-          <w:rFonts w:ascii="Arial" w:cs="Arial" w:eastAsia="Arial" w:hAnsi="Arial"/>
-          <w:color w:val="282f3e"/>
-          <w:sz w:val="26"/>
-          <w:szCs w:val="26"/>
-          <w:rtl w:val="0"/>
-        </w:rPr>
-        <w:t xml:space="preserve">${images}</w:t>
-      </w:r>
-      <w:r>
-        <w:rPr>
-          <w:rtl w:val="0"/>
-        </w:rPr>
-      </w:r>
-    </w:p>
-    <w:p>
-      <w:pPr>
-        <w:keepNext w:val="0"/>
-        <w:keepLines w:val="0"/>
-        <w:pageBreakBefore w:val="0"/>
-        <w:widowControl w:val="1"/>
-        <w:pBdr>
-          <w:top w:space="0" w:sz="0" w:val="nil"/>
-          <w:left w:space="0" w:sz="0" w:val="nil"/>
-          <w:bottom w:space="0" w:sz="0" w:val="nil"/>
-          <w:right w:space="0" w:sz="0" w:val="nil"/>
-          <w:between w:space="0" w:sz="0" w:val="nil"/>
-        </w:pBdr>
-        <w:shd w:fill="auto" w:val="clear"/>
-        <w:spacing w:after="0" w:before="0" w:line="240" w:lineRule="auto"/>
-        <w:ind w:left="0" w:right="0" w:firstLine="0"/>
-        <w:jc w:val="left"/>
-        <w:rPr>
-          <w:rFonts w:ascii="Arial" w:cs="Arial" w:eastAsia="Arial" w:hAnsi="Arial"/>
-          <w:b w:val="1"/>
-          <w:i w:val="0"/>
-          <w:smallCaps w:val="0"/>
-          <w:strike w:val="0"/>
-          <w:color w:val="3b4559"/>
           <w:sz w:val="20"/>
           <w:szCs w:val="20"/>
           <w:u w:val="none"/>
@@ -5212,52 +5477,13 @@
       <w:r>
         <w:rPr>
           <w:rFonts w:ascii="Arial" w:cs="Arial" w:eastAsia="Arial" w:hAnsi="Arial"/>
-          <w:b w:val="1"/>
-          <w:i w:val="0"/>
-          <w:smallCaps w:val="0"/>
-          <w:strike w:val="0"/>
-          <w:color w:val="3b4559"/>
-          <w:sz w:val="20"/>
-          <w:szCs w:val="20"/>
-          <w:u w:val="none"/>
-          <w:shd w:fill="auto" w:val="clear"/>
-          <w:vertAlign w:val="baseline"/>
-          <w:rtl w:val="0"/>
-        </w:rPr>
-        <w:t xml:space="preserve">    </w:t>
-      </w:r>
-    </w:p>
-    <w:p>
-      <w:pPr>
-        <w:keepNext w:val="0"/>
-        <w:keepLines w:val="0"/>
-        <w:pageBreakBefore w:val="0"/>
-        <w:widowControl w:val="1"/>
-        <w:pBdr>
-          <w:top w:space="0" w:sz="0" w:val="nil"/>
-          <w:left w:space="0" w:sz="0" w:val="nil"/>
-          <w:bottom w:space="0" w:sz="0" w:val="nil"/>
-          <w:right w:space="0" w:sz="0" w:val="nil"/>
-          <w:between w:space="0" w:sz="0" w:val="nil"/>
-        </w:pBdr>
-        <w:shd w:fill="auto" w:val="clear"/>
-        <w:spacing w:after="0" w:before="0" w:line="240" w:lineRule="auto"/>
-        <w:ind w:left="0" w:right="0" w:firstLine="0"/>
-        <w:jc w:val="left"/>
-        <w:rPr>
-          <w:rFonts w:ascii="Arial" w:cs="Arial" w:eastAsia="Arial" w:hAnsi="Arial"/>
-          <w:b w:val="1"/>
-          <w:i w:val="0"/>
-          <w:smallCaps w:val="0"/>
-          <w:strike w:val="0"/>
-          <w:color w:val="3b4559"/>
-          <w:sz w:val="20"/>
-          <w:szCs w:val="20"/>
-          <w:u w:val="none"/>
-          <w:shd w:fill="auto" w:val="clear"/>
-          <w:vertAlign w:val="baseline"/>
-        </w:rPr>
-      </w:pPr>
+          <w:color w:val="282f3e"/>
+          <w:sz w:val="26"/>
+          <w:szCs w:val="26"/>
+          <w:rtl w:val="0"/>
+        </w:rPr>
+        <w:t xml:space="preserve">${images}</w:t>
+      </w:r>
       <w:r>
         <w:rPr>
           <w:rtl w:val="0"/>
@@ -5296,7 +5522,7 @@
     <w:name w:val="normal"/>
   </w:style>
   <w:style w:type="table" w:styleId="TableNormal" w:default="1">
-    <w:name w:val="Table Normal"/>
+    <w:name w:val="TableNormal"/>
   </w:style>
   <w:style w:type="paragraph" w:styleId="Heading1">
     <w:name w:val="heading 1"/>

</xml_diff>